<commit_message>
atulização da aula de 27/08/2026
</commit_message>
<xml_diff>
--- a/apostila/Projeto Space for me3.docx
+++ b/apostila/Projeto Space for me3.docx
@@ -262,6 +262,9 @@
         <w:t>.</w:t>
       </w:r>
       <w:r>
+        <w:rPr>
+          <w:noProof/>
+        </w:rPr>
         <w:drawing>
           <wp:inline distT="0" distB="0" distL="0" distR="0" wp14:anchorId="5D23C20D" wp14:editId="3FD8667B">
             <wp:extent cx="8192643" cy="400106"/>
@@ -314,6 +317,9 @@
     </w:p>
     <w:p>
       <w:r>
+        <w:rPr>
+          <w:noProof/>
+        </w:rPr>
         <w:drawing>
           <wp:inline distT="0" distB="0" distL="0" distR="0" wp14:anchorId="6387467A" wp14:editId="57A7A2BE">
             <wp:extent cx="2534004" cy="1533739"/>
@@ -382,6 +388,9 @@
         <w:br/>
       </w:r>
       <w:r>
+        <w:rPr>
+          <w:noProof/>
+        </w:rPr>
         <w:drawing>
           <wp:inline distT="0" distB="0" distL="0" distR="0" wp14:anchorId="15438FFA" wp14:editId="5BF71D12">
             <wp:extent cx="6563641" cy="476316"/>
@@ -438,6 +447,9 @@
         <w:br/>
       </w:r>
       <w:r>
+        <w:rPr>
+          <w:noProof/>
+        </w:rPr>
         <w:drawing>
           <wp:inline distT="0" distB="0" distL="0" distR="0" wp14:anchorId="696E78BF" wp14:editId="4E1B3484">
             <wp:extent cx="2534004" cy="1124107"/>
@@ -502,6 +514,9 @@
         <w:br/>
       </w:r>
       <w:r>
+        <w:rPr>
+          <w:noProof/>
+        </w:rPr>
         <w:drawing>
           <wp:inline distT="0" distB="0" distL="0" distR="0" wp14:anchorId="151563C3" wp14:editId="70A0FB84">
             <wp:extent cx="3658111" cy="1686160"/>
@@ -579,6 +594,9 @@
     </w:p>
     <w:p>
       <w:r>
+        <w:rPr>
+          <w:noProof/>
+        </w:rPr>
         <w:drawing>
           <wp:inline distT="0" distB="0" distL="0" distR="0" wp14:anchorId="38CDB95A" wp14:editId="474C8BE9">
             <wp:extent cx="9745435" cy="504895"/>
@@ -618,6 +636,9 @@
     </w:p>
     <w:p>
       <w:r>
+        <w:rPr>
+          <w:noProof/>
+        </w:rPr>
         <w:drawing>
           <wp:inline distT="0" distB="0" distL="0" distR="0" wp14:anchorId="4B45CCF2" wp14:editId="4FD44E22">
             <wp:extent cx="2610214" cy="1076475"/>
@@ -674,6 +695,9 @@
     </w:p>
     <w:p>
       <w:r>
+        <w:rPr>
+          <w:noProof/>
+        </w:rPr>
         <w:drawing>
           <wp:inline distT="0" distB="0" distL="0" distR="0" wp14:anchorId="1FAED920" wp14:editId="11CC72D3">
             <wp:extent cx="4544059" cy="2638793"/>
@@ -710,11 +734,1304 @@
           </wp:inline>
         </w:drawing>
       </w:r>
+    </w:p>
+    <w:p>
+      <w:r>
+        <w:t>9 – No</w:t>
+      </w:r>
+      <w:r>
+        <w:t>s</w:t>
+      </w:r>
+      <w:r>
+        <w:t xml:space="preserve"> itens da lista </w:t>
+      </w:r>
+      <w:r>
+        <w:t xml:space="preserve">adicionamos </w:t>
+      </w:r>
+      <w:proofErr w:type="spellStart"/>
+      <w:r>
+        <w:t>class</w:t>
+      </w:r>
+      <w:proofErr w:type="spellEnd"/>
+      <w:r>
+        <w:t xml:space="preserve"> com mesmo nome para que o comportamento se repita para todos os itens da lista.</w:t>
+      </w:r>
+    </w:p>
+    <w:p>
+      <w:r>
+        <w:t>(Os itens todos ficaram em itálico)</w:t>
+      </w:r>
+    </w:p>
+    <w:p>
+      <w:r>
+        <w:drawing>
+          <wp:inline distT="0" distB="0" distL="0" distR="0" wp14:anchorId="45D87CD1" wp14:editId="1D392ACE">
+            <wp:extent cx="5525271" cy="1867161"/>
+            <wp:effectExtent l="0" t="0" r="0" b="0"/>
+            <wp:docPr id="12" name="Imagem 12"/>
+            <wp:cNvGraphicFramePr>
+              <a:graphicFrameLocks xmlns:a="http://schemas.openxmlformats.org/drawingml/2006/main" noChangeAspect="1"/>
+            </wp:cNvGraphicFramePr>
+            <a:graphic xmlns:a="http://schemas.openxmlformats.org/drawingml/2006/main">
+              <a:graphicData uri="http://schemas.openxmlformats.org/drawingml/2006/picture">
+                <pic:pic xmlns:pic="http://schemas.openxmlformats.org/drawingml/2006/picture">
+                  <pic:nvPicPr>
+                    <pic:cNvPr id="1" name=""/>
+                    <pic:cNvPicPr/>
+                  </pic:nvPicPr>
+                  <pic:blipFill>
+                    <a:blip r:embed="rId20"/>
+                    <a:stretch>
+                      <a:fillRect/>
+                    </a:stretch>
+                  </pic:blipFill>
+                  <pic:spPr>
+                    <a:xfrm>
+                      <a:off x="0" y="0"/>
+                      <a:ext cx="5525271" cy="1867161"/>
+                    </a:xfrm>
+                    <a:prstGeom prst="rect">
+                      <a:avLst/>
+                    </a:prstGeom>
+                  </pic:spPr>
+                </pic:pic>
+              </a:graphicData>
+            </a:graphic>
+          </wp:inline>
+        </w:drawing>
+      </w:r>
+      <w:r>
+        <w:drawing>
+          <wp:inline distT="0" distB="0" distL="0" distR="0" wp14:anchorId="1F6DE4C0" wp14:editId="0BEB0705">
+            <wp:extent cx="1996225" cy="717511"/>
+            <wp:effectExtent l="0" t="0" r="4445" b="6985"/>
+            <wp:docPr id="13" name="Imagem 13"/>
+            <wp:cNvGraphicFramePr>
+              <a:graphicFrameLocks xmlns:a="http://schemas.openxmlformats.org/drawingml/2006/main" noChangeAspect="1"/>
+            </wp:cNvGraphicFramePr>
+            <a:graphic xmlns:a="http://schemas.openxmlformats.org/drawingml/2006/main">
+              <a:graphicData uri="http://schemas.openxmlformats.org/drawingml/2006/picture">
+                <pic:pic xmlns:pic="http://schemas.openxmlformats.org/drawingml/2006/picture">
+                  <pic:nvPicPr>
+                    <pic:cNvPr id="1" name=""/>
+                    <pic:cNvPicPr/>
+                  </pic:nvPicPr>
+                  <pic:blipFill>
+                    <a:blip r:embed="rId21"/>
+                    <a:stretch>
+                      <a:fillRect/>
+                    </a:stretch>
+                  </pic:blipFill>
+                  <pic:spPr>
+                    <a:xfrm>
+                      <a:off x="0" y="0"/>
+                      <a:ext cx="2363254" cy="849434"/>
+                    </a:xfrm>
+                    <a:prstGeom prst="rect">
+                      <a:avLst/>
+                    </a:prstGeom>
+                  </pic:spPr>
+                </pic:pic>
+              </a:graphicData>
+            </a:graphic>
+          </wp:inline>
+        </w:drawing>
+      </w:r>
+    </w:p>
+    <w:p>
+      <w:r>
+        <w:t xml:space="preserve">10 </w:t>
+      </w:r>
+      <w:r>
+        <w:t>–</w:t>
+      </w:r>
+      <w:r>
+        <w:t xml:space="preserve"> </w:t>
+      </w:r>
+      <w:r>
+        <w:t>Dividimos a nossa página em duas:</w:t>
+      </w:r>
+    </w:p>
+    <w:p>
+      <w:r>
+        <w:t xml:space="preserve">Primeira parte sendo a principal onde adicionamos uma </w:t>
+      </w:r>
+      <w:proofErr w:type="spellStart"/>
+      <w:r>
+        <w:t>div</w:t>
+      </w:r>
+      <w:proofErr w:type="spellEnd"/>
+      <w:r>
+        <w:t xml:space="preserve"> que iniciou acima do header e fechou </w:t>
+      </w:r>
+      <w:r>
+        <w:t xml:space="preserve">em baixo do nosso </w:t>
+      </w:r>
+      <w:r>
+        <w:t>último</w:t>
+      </w:r>
+      <w:r>
+        <w:t xml:space="preserve"> parágrafo.</w:t>
+      </w:r>
+    </w:p>
+    <w:p>
+      <w:r>
+        <w:t>E deixamos o fundo dessa divisão com a cor branca.</w:t>
+      </w:r>
+    </w:p>
+    <w:p>
+      <w:r>
+        <w:drawing>
+          <wp:inline distT="0" distB="0" distL="0" distR="0" wp14:anchorId="02526F21" wp14:editId="11E91D8A">
+            <wp:extent cx="7999436" cy="2417645"/>
+            <wp:effectExtent l="0" t="0" r="1905" b="1905"/>
+            <wp:docPr id="14" name="Imagem 14"/>
+            <wp:cNvGraphicFramePr>
+              <a:graphicFrameLocks xmlns:a="http://schemas.openxmlformats.org/drawingml/2006/main" noChangeAspect="1"/>
+            </wp:cNvGraphicFramePr>
+            <a:graphic xmlns:a="http://schemas.openxmlformats.org/drawingml/2006/main">
+              <a:graphicData uri="http://schemas.openxmlformats.org/drawingml/2006/picture">
+                <pic:pic xmlns:pic="http://schemas.openxmlformats.org/drawingml/2006/picture">
+                  <pic:nvPicPr>
+                    <pic:cNvPr id="1" name=""/>
+                    <pic:cNvPicPr/>
+                  </pic:nvPicPr>
+                  <pic:blipFill>
+                    <a:blip r:embed="rId22"/>
+                    <a:stretch>
+                      <a:fillRect/>
+                    </a:stretch>
+                  </pic:blipFill>
+                  <pic:spPr>
+                    <a:xfrm>
+                      <a:off x="0" y="0"/>
+                      <a:ext cx="8038019" cy="2429306"/>
+                    </a:xfrm>
+                    <a:prstGeom prst="rect">
+                      <a:avLst/>
+                    </a:prstGeom>
+                  </pic:spPr>
+                </pic:pic>
+              </a:graphicData>
+            </a:graphic>
+          </wp:inline>
+        </w:drawing>
+      </w:r>
+    </w:p>
+    <w:p>
+      <w:r>
+        <w:t xml:space="preserve"> </w:t>
+      </w:r>
+      <w:r>
+        <w:drawing>
+          <wp:inline distT="0" distB="0" distL="0" distR="0" wp14:anchorId="6579A244" wp14:editId="06530A29">
+            <wp:extent cx="3410426" cy="1076475"/>
+            <wp:effectExtent l="0" t="0" r="0" b="9525"/>
+            <wp:docPr id="15" name="Imagem 15"/>
+            <wp:cNvGraphicFramePr>
+              <a:graphicFrameLocks xmlns:a="http://schemas.openxmlformats.org/drawingml/2006/main" noChangeAspect="1"/>
+            </wp:cNvGraphicFramePr>
+            <a:graphic xmlns:a="http://schemas.openxmlformats.org/drawingml/2006/main">
+              <a:graphicData uri="http://schemas.openxmlformats.org/drawingml/2006/picture">
+                <pic:pic xmlns:pic="http://schemas.openxmlformats.org/drawingml/2006/picture">
+                  <pic:nvPicPr>
+                    <pic:cNvPr id="1" name=""/>
+                    <pic:cNvPicPr/>
+                  </pic:nvPicPr>
+                  <pic:blipFill>
+                    <a:blip r:embed="rId23"/>
+                    <a:stretch>
+                      <a:fillRect/>
+                    </a:stretch>
+                  </pic:blipFill>
+                  <pic:spPr>
+                    <a:xfrm>
+                      <a:off x="0" y="0"/>
+                      <a:ext cx="3410426" cy="1076475"/>
+                    </a:xfrm>
+                    <a:prstGeom prst="rect">
+                      <a:avLst/>
+                    </a:prstGeom>
+                  </pic:spPr>
+                </pic:pic>
+              </a:graphicData>
+            </a:graphic>
+          </wp:inline>
+        </w:drawing>
+      </w:r>
+    </w:p>
+    <w:p>
+      <w:r>
+        <w:t xml:space="preserve">11 – A segunda </w:t>
+      </w:r>
+      <w:proofErr w:type="spellStart"/>
+      <w:r>
+        <w:t>div</w:t>
+      </w:r>
+      <w:proofErr w:type="spellEnd"/>
+      <w:r>
+        <w:t xml:space="preserve"> sendo acima do segundo </w:t>
+      </w:r>
+      <w:r>
+        <w:t>título</w:t>
+      </w:r>
+      <w:r>
+        <w:t xml:space="preserve"> benefícios e fechando abaixo </w:t>
+      </w:r>
+      <w:r>
+        <w:t>da última lista não ordenada.</w:t>
+      </w:r>
+    </w:p>
+    <w:p>
+      <w:r>
+        <w:t>E adicionamos a cor de fundo cinza claro.</w:t>
+      </w:r>
+    </w:p>
+    <w:p>
+      <w:r>
+        <w:drawing>
+          <wp:inline distT="0" distB="0" distL="0" distR="0" wp14:anchorId="45AA3FD0" wp14:editId="2F5EE51B">
+            <wp:extent cx="4991797" cy="2038635"/>
+            <wp:effectExtent l="0" t="0" r="0" b="0"/>
+            <wp:docPr id="16" name="Imagem 16"/>
+            <wp:cNvGraphicFramePr>
+              <a:graphicFrameLocks xmlns:a="http://schemas.openxmlformats.org/drawingml/2006/main" noChangeAspect="1"/>
+            </wp:cNvGraphicFramePr>
+            <a:graphic xmlns:a="http://schemas.openxmlformats.org/drawingml/2006/main">
+              <a:graphicData uri="http://schemas.openxmlformats.org/drawingml/2006/picture">
+                <pic:pic xmlns:pic="http://schemas.openxmlformats.org/drawingml/2006/picture">
+                  <pic:nvPicPr>
+                    <pic:cNvPr id="1" name=""/>
+                    <pic:cNvPicPr/>
+                  </pic:nvPicPr>
+                  <pic:blipFill>
+                    <a:blip r:embed="rId24"/>
+                    <a:stretch>
+                      <a:fillRect/>
+                    </a:stretch>
+                  </pic:blipFill>
+                  <pic:spPr>
+                    <a:xfrm>
+                      <a:off x="0" y="0"/>
+                      <a:ext cx="4991797" cy="2038635"/>
+                    </a:xfrm>
+                    <a:prstGeom prst="rect">
+                      <a:avLst/>
+                    </a:prstGeom>
+                  </pic:spPr>
+                </pic:pic>
+              </a:graphicData>
+            </a:graphic>
+          </wp:inline>
+        </w:drawing>
+      </w:r>
+    </w:p>
+    <w:p>
+      <w:r>
+        <w:drawing>
+          <wp:inline distT="0" distB="0" distL="0" distR="0" wp14:anchorId="3858D20D" wp14:editId="427F15D0">
+            <wp:extent cx="2715004" cy="781159"/>
+            <wp:effectExtent l="0" t="0" r="9525" b="0"/>
+            <wp:docPr id="17" name="Imagem 17"/>
+            <wp:cNvGraphicFramePr>
+              <a:graphicFrameLocks xmlns:a="http://schemas.openxmlformats.org/drawingml/2006/main" noChangeAspect="1"/>
+            </wp:cNvGraphicFramePr>
+            <a:graphic xmlns:a="http://schemas.openxmlformats.org/drawingml/2006/main">
+              <a:graphicData uri="http://schemas.openxmlformats.org/drawingml/2006/picture">
+                <pic:pic xmlns:pic="http://schemas.openxmlformats.org/drawingml/2006/picture">
+                  <pic:nvPicPr>
+                    <pic:cNvPr id="1" name=""/>
+                    <pic:cNvPicPr/>
+                  </pic:nvPicPr>
+                  <pic:blipFill>
+                    <a:blip r:embed="rId25"/>
+                    <a:stretch>
+                      <a:fillRect/>
+                    </a:stretch>
+                  </pic:blipFill>
+                  <pic:spPr>
+                    <a:xfrm>
+                      <a:off x="0" y="0"/>
+                      <a:ext cx="2715004" cy="781159"/>
+                    </a:xfrm>
+                    <a:prstGeom prst="rect">
+                      <a:avLst/>
+                    </a:prstGeom>
+                  </pic:spPr>
+                </pic:pic>
+              </a:graphicData>
+            </a:graphic>
+          </wp:inline>
+        </w:drawing>
+      </w:r>
+    </w:p>
+    <w:p/>
+    <w:p>
+      <w:r>
+        <w:t xml:space="preserve">12 </w:t>
+      </w:r>
+      <w:r>
+        <w:t>–</w:t>
+      </w:r>
+      <w:r>
+        <w:t xml:space="preserve"> </w:t>
+      </w:r>
+      <w:r>
+        <w:t xml:space="preserve">Adicionamos uma imagem na </w:t>
+      </w:r>
+      <w:proofErr w:type="spellStart"/>
+      <w:r>
+        <w:t>div</w:t>
+      </w:r>
+      <w:proofErr w:type="spellEnd"/>
+      <w:r>
+        <w:t xml:space="preserve"> benefícios e reduzimos o tamanho da imagem através do </w:t>
+      </w:r>
+      <w:proofErr w:type="spellStart"/>
+      <w:r>
+        <w:t>css</w:t>
+      </w:r>
+      <w:proofErr w:type="spellEnd"/>
+      <w:r>
+        <w:t xml:space="preserve"> utilizando </w:t>
+      </w:r>
+      <w:proofErr w:type="spellStart"/>
+      <w:r>
+        <w:t>width</w:t>
+      </w:r>
+      <w:proofErr w:type="spellEnd"/>
+      <w:r>
+        <w:t>: 50%</w:t>
+      </w:r>
+      <w:r>
+        <w:t>.</w:t>
+      </w:r>
+      <w:r>
+        <w:drawing>
+          <wp:inline distT="0" distB="0" distL="0" distR="0" wp14:anchorId="27D7C863" wp14:editId="1C2F3557">
+            <wp:extent cx="8383170" cy="828791"/>
+            <wp:effectExtent l="0" t="0" r="0" b="9525"/>
+            <wp:docPr id="18" name="Imagem 18"/>
+            <wp:cNvGraphicFramePr>
+              <a:graphicFrameLocks xmlns:a="http://schemas.openxmlformats.org/drawingml/2006/main" noChangeAspect="1"/>
+            </wp:cNvGraphicFramePr>
+            <a:graphic xmlns:a="http://schemas.openxmlformats.org/drawingml/2006/main">
+              <a:graphicData uri="http://schemas.openxmlformats.org/drawingml/2006/picture">
+                <pic:pic xmlns:pic="http://schemas.openxmlformats.org/drawingml/2006/picture">
+                  <pic:nvPicPr>
+                    <pic:cNvPr id="1" name=""/>
+                    <pic:cNvPicPr/>
+                  </pic:nvPicPr>
+                  <pic:blipFill>
+                    <a:blip r:embed="rId26"/>
+                    <a:stretch>
+                      <a:fillRect/>
+                    </a:stretch>
+                  </pic:blipFill>
+                  <pic:spPr>
+                    <a:xfrm>
+                      <a:off x="0" y="0"/>
+                      <a:ext cx="8383170" cy="828791"/>
+                    </a:xfrm>
+                    <a:prstGeom prst="rect">
+                      <a:avLst/>
+                    </a:prstGeom>
+                  </pic:spPr>
+                </pic:pic>
+              </a:graphicData>
+            </a:graphic>
+          </wp:inline>
+        </w:drawing>
+      </w:r>
+    </w:p>
+    <w:p>
+      <w:r>
+        <w:drawing>
+          <wp:inline distT="0" distB="0" distL="0" distR="0" wp14:anchorId="5223B43E" wp14:editId="3EC68285">
+            <wp:extent cx="2534004" cy="914528"/>
+            <wp:effectExtent l="0" t="0" r="0" b="0"/>
+            <wp:docPr id="19" name="Imagem 19"/>
+            <wp:cNvGraphicFramePr>
+              <a:graphicFrameLocks xmlns:a="http://schemas.openxmlformats.org/drawingml/2006/main" noChangeAspect="1"/>
+            </wp:cNvGraphicFramePr>
+            <a:graphic xmlns:a="http://schemas.openxmlformats.org/drawingml/2006/main">
+              <a:graphicData uri="http://schemas.openxmlformats.org/drawingml/2006/picture">
+                <pic:pic xmlns:pic="http://schemas.openxmlformats.org/drawingml/2006/picture">
+                  <pic:nvPicPr>
+                    <pic:cNvPr id="1" name=""/>
+                    <pic:cNvPicPr/>
+                  </pic:nvPicPr>
+                  <pic:blipFill>
+                    <a:blip r:embed="rId27"/>
+                    <a:stretch>
+                      <a:fillRect/>
+                    </a:stretch>
+                  </pic:blipFill>
+                  <pic:spPr>
+                    <a:xfrm>
+                      <a:off x="0" y="0"/>
+                      <a:ext cx="2534004" cy="914528"/>
+                    </a:xfrm>
+                    <a:prstGeom prst="rect">
+                      <a:avLst/>
+                    </a:prstGeom>
+                  </pic:spPr>
+                </pic:pic>
+              </a:graphicData>
+            </a:graphic>
+          </wp:inline>
+        </w:drawing>
+      </w:r>
+    </w:p>
+    <w:p/>
+    <w:p>
+      <w:r>
+        <w:t xml:space="preserve">13- Para colocar a lista ao lado da imagem mudamos </w:t>
+      </w:r>
+      <w:r>
+        <w:t xml:space="preserve">a natureza da lista utilizando display: </w:t>
+      </w:r>
+      <w:proofErr w:type="spellStart"/>
+      <w:r>
+        <w:t>inline-block</w:t>
+      </w:r>
+      <w:proofErr w:type="spellEnd"/>
+      <w:r>
+        <w:t xml:space="preserve">  conforme imagem abaixo.</w:t>
+      </w:r>
+    </w:p>
+    <w:p/>
+    <w:p>
+      <w:r>
+        <w:drawing>
+          <wp:inline distT="0" distB="0" distL="0" distR="0" wp14:anchorId="6564ECE0" wp14:editId="6BE0385F">
+            <wp:extent cx="3562847" cy="943107"/>
+            <wp:effectExtent l="0" t="0" r="0" b="9525"/>
+            <wp:docPr id="20" name="Imagem 20"/>
+            <wp:cNvGraphicFramePr>
+              <a:graphicFrameLocks xmlns:a="http://schemas.openxmlformats.org/drawingml/2006/main" noChangeAspect="1"/>
+            </wp:cNvGraphicFramePr>
+            <a:graphic xmlns:a="http://schemas.openxmlformats.org/drawingml/2006/main">
+              <a:graphicData uri="http://schemas.openxmlformats.org/drawingml/2006/picture">
+                <pic:pic xmlns:pic="http://schemas.openxmlformats.org/drawingml/2006/picture">
+                  <pic:nvPicPr>
+                    <pic:cNvPr id="1" name=""/>
+                    <pic:cNvPicPr/>
+                  </pic:nvPicPr>
+                  <pic:blipFill>
+                    <a:blip r:embed="rId28"/>
+                    <a:stretch>
+                      <a:fillRect/>
+                    </a:stretch>
+                  </pic:blipFill>
+                  <pic:spPr>
+                    <a:xfrm>
+                      <a:off x="0" y="0"/>
+                      <a:ext cx="3562847" cy="943107"/>
+                    </a:xfrm>
+                    <a:prstGeom prst="rect">
+                      <a:avLst/>
+                    </a:prstGeom>
+                  </pic:spPr>
+                </pic:pic>
+              </a:graphicData>
+            </a:graphic>
+          </wp:inline>
+        </w:drawing>
+      </w:r>
+    </w:p>
+    <w:p>
+      <w:r>
+        <w:drawing>
+          <wp:inline distT="0" distB="0" distL="0" distR="0" wp14:anchorId="662AD7CD" wp14:editId="14A5B9C1">
+            <wp:extent cx="7849695" cy="4372585"/>
+            <wp:effectExtent l="0" t="0" r="0" b="9525"/>
+            <wp:docPr id="21" name="Imagem 21"/>
+            <wp:cNvGraphicFramePr>
+              <a:graphicFrameLocks xmlns:a="http://schemas.openxmlformats.org/drawingml/2006/main" noChangeAspect="1"/>
+            </wp:cNvGraphicFramePr>
+            <a:graphic xmlns:a="http://schemas.openxmlformats.org/drawingml/2006/main">
+              <a:graphicData uri="http://schemas.openxmlformats.org/drawingml/2006/picture">
+                <pic:pic xmlns:pic="http://schemas.openxmlformats.org/drawingml/2006/picture">
+                  <pic:nvPicPr>
+                    <pic:cNvPr id="1" name=""/>
+                    <pic:cNvPicPr/>
+                  </pic:nvPicPr>
+                  <pic:blipFill>
+                    <a:blip r:embed="rId29"/>
+                    <a:stretch>
+                      <a:fillRect/>
+                    </a:stretch>
+                  </pic:blipFill>
+                  <pic:spPr>
+                    <a:xfrm>
+                      <a:off x="0" y="0"/>
+                      <a:ext cx="7849695" cy="4372585"/>
+                    </a:xfrm>
+                    <a:prstGeom prst="rect">
+                      <a:avLst/>
+                    </a:prstGeom>
+                  </pic:spPr>
+                </pic:pic>
+              </a:graphicData>
+            </a:graphic>
+          </wp:inline>
+        </w:drawing>
+      </w:r>
+    </w:p>
+    <w:p>
+      <w:r>
+        <w:rPr>
+          <w:noProof/>
+        </w:rPr>
+        <mc:AlternateContent>
+          <mc:Choice Requires="wps">
+            <w:drawing>
+              <wp:anchor distT="0" distB="0" distL="114300" distR="114300" simplePos="0" relativeHeight="251660288" behindDoc="0" locked="0" layoutInCell="1" allowOverlap="1" wp14:anchorId="2FD4F05B" wp14:editId="573A562A">
+                <wp:simplePos x="0" y="0"/>
+                <wp:positionH relativeFrom="column">
+                  <wp:posOffset>2634264</wp:posOffset>
+                </wp:positionH>
+                <wp:positionV relativeFrom="paragraph">
+                  <wp:posOffset>448319</wp:posOffset>
+                </wp:positionV>
+                <wp:extent cx="859809" cy="600502"/>
+                <wp:effectExtent l="38100" t="0" r="16510" b="47625"/>
+                <wp:wrapNone/>
+                <wp:docPr id="23" name="Conector de Seta Reta 23"/>
+                <wp:cNvGraphicFramePr/>
+                <a:graphic xmlns:a="http://schemas.openxmlformats.org/drawingml/2006/main">
+                  <a:graphicData uri="http://schemas.microsoft.com/office/word/2010/wordprocessingShape">
+                    <wps:wsp>
+                      <wps:cNvCnPr/>
+                      <wps:spPr>
+                        <a:xfrm flipH="1">
+                          <a:off x="0" y="0"/>
+                          <a:ext cx="859809" cy="600502"/>
+                        </a:xfrm>
+                        <a:prstGeom prst="straightConnector1">
+                          <a:avLst/>
+                        </a:prstGeom>
+                        <a:ln>
+                          <a:tailEnd type="triangle"/>
+                        </a:ln>
+                      </wps:spPr>
+                      <wps:style>
+                        <a:lnRef idx="1">
+                          <a:schemeClr val="accent1"/>
+                        </a:lnRef>
+                        <a:fillRef idx="0">
+                          <a:schemeClr val="accent1"/>
+                        </a:fillRef>
+                        <a:effectRef idx="0">
+                          <a:schemeClr val="accent1"/>
+                        </a:effectRef>
+                        <a:fontRef idx="minor">
+                          <a:schemeClr val="tx1"/>
+                        </a:fontRef>
+                      </wps:style>
+                      <wps:bodyPr/>
+                    </wps:wsp>
+                  </a:graphicData>
+                </a:graphic>
+              </wp:anchor>
+            </w:drawing>
+          </mc:Choice>
+          <mc:Fallback>
+            <w:pict>
+              <v:shapetype w14:anchorId="032CFB4E" id="_x0000_t32" coordsize="21600,21600" o:spt="32" o:oned="t" path="m,l21600,21600e" filled="f">
+                <v:path arrowok="t" fillok="f" o:connecttype="none"/>
+                <o:lock v:ext="edit" shapetype="t"/>
+              </v:shapetype>
+              <v:shape id="Conector de Seta Reta 23" o:spid="_x0000_s1026" type="#_x0000_t32" style="position:absolute;margin-left:207.4pt;margin-top:35.3pt;width:67.7pt;height:47.3pt;flip:x;z-index:251660288;visibility:visible;mso-wrap-style:square;mso-wrap-distance-left:9pt;mso-wrap-distance-top:0;mso-wrap-distance-right:9pt;mso-wrap-distance-bottom:0;mso-position-horizontal:absolute;mso-position-horizontal-relative:text;mso-position-vertical:absolute;mso-position-vertical-relative:text" o:gfxdata="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" strokecolor="#4472c4 [3204]" strokeweight=".5pt">
+                <v:stroke endarrow="block" joinstyle="miter"/>
+              </v:shape>
+            </w:pict>
+          </mc:Fallback>
+        </mc:AlternateContent>
+      </w:r>
+      <w:r>
+        <w:t>1</w:t>
+      </w:r>
+      <w:r>
+        <w:t xml:space="preserve">4 – Para alinhar a lista ao topo de imagem utilizamos </w:t>
+      </w:r>
+      <w:r>
+        <w:t>os seguintes comandos</w:t>
+      </w:r>
+      <w:r>
+        <w:t>:</w:t>
+      </w:r>
+      <w:r>
+        <w:br/>
+      </w:r>
+      <w:r>
+        <w:br/>
+      </w:r>
+      <w:r>
+        <w:drawing>
+          <wp:inline distT="0" distB="0" distL="0" distR="0" wp14:anchorId="6925B900" wp14:editId="67372803">
+            <wp:extent cx="3505689" cy="1152686"/>
+            <wp:effectExtent l="0" t="0" r="0" b="9525"/>
+            <wp:docPr id="22" name="Imagem 22"/>
+            <wp:cNvGraphicFramePr>
+              <a:graphicFrameLocks xmlns:a="http://schemas.openxmlformats.org/drawingml/2006/main" noChangeAspect="1"/>
+            </wp:cNvGraphicFramePr>
+            <a:graphic xmlns:a="http://schemas.openxmlformats.org/drawingml/2006/main">
+              <a:graphicData uri="http://schemas.openxmlformats.org/drawingml/2006/picture">
+                <pic:pic xmlns:pic="http://schemas.openxmlformats.org/drawingml/2006/picture">
+                  <pic:nvPicPr>
+                    <pic:cNvPr id="1" name=""/>
+                    <pic:cNvPicPr/>
+                  </pic:nvPicPr>
+                  <pic:blipFill>
+                    <a:blip r:embed="rId30"/>
+                    <a:stretch>
+                      <a:fillRect/>
+                    </a:stretch>
+                  </pic:blipFill>
+                  <pic:spPr>
+                    <a:xfrm>
+                      <a:off x="0" y="0"/>
+                      <a:ext cx="3505689" cy="1152686"/>
+                    </a:xfrm>
+                    <a:prstGeom prst="rect">
+                      <a:avLst/>
+                    </a:prstGeom>
+                  </pic:spPr>
+                </pic:pic>
+              </a:graphicData>
+            </a:graphic>
+          </wp:inline>
+        </w:drawing>
+      </w:r>
+    </w:p>
+    <w:p/>
+    <w:p>
+      <w:r>
+        <w:drawing>
+          <wp:inline distT="0" distB="0" distL="0" distR="0" wp14:anchorId="3120C985" wp14:editId="51DFB6C0">
+            <wp:extent cx="8059275" cy="4448796"/>
+            <wp:effectExtent l="0" t="0" r="0" b="9525"/>
+            <wp:docPr id="24" name="Imagem 24"/>
+            <wp:cNvGraphicFramePr>
+              <a:graphicFrameLocks xmlns:a="http://schemas.openxmlformats.org/drawingml/2006/main" noChangeAspect="1"/>
+            </wp:cNvGraphicFramePr>
+            <a:graphic xmlns:a="http://schemas.openxmlformats.org/drawingml/2006/main">
+              <a:graphicData uri="http://schemas.openxmlformats.org/drawingml/2006/picture">
+                <pic:pic xmlns:pic="http://schemas.openxmlformats.org/drawingml/2006/picture">
+                  <pic:nvPicPr>
+                    <pic:cNvPr id="1" name=""/>
+                    <pic:cNvPicPr/>
+                  </pic:nvPicPr>
+                  <pic:blipFill>
+                    <a:blip r:embed="rId31"/>
+                    <a:stretch>
+                      <a:fillRect/>
+                    </a:stretch>
+                  </pic:blipFill>
+                  <pic:spPr>
+                    <a:xfrm>
+                      <a:off x="0" y="0"/>
+                      <a:ext cx="8059275" cy="4448796"/>
+                    </a:xfrm>
+                    <a:prstGeom prst="rect">
+                      <a:avLst/>
+                    </a:prstGeom>
+                  </pic:spPr>
+                </pic:pic>
+              </a:graphicData>
+            </a:graphic>
+          </wp:inline>
+        </w:drawing>
+      </w:r>
+    </w:p>
+    <w:p/>
+    <w:p>
+      <w:r>
+        <w:t xml:space="preserve">15 – Ainda trabalhando com a lista definimos um tamanho para que ela ocupe 20% de largura  e </w:t>
+      </w:r>
+      <w:r>
+        <w:t>colocamos um espaço externo do lado direito de 15% obtendo os seguintes resultados:</w:t>
+      </w:r>
+    </w:p>
+    <w:p/>
+    <w:p>
+      <w:r>
+        <w:rPr>
+          <w:noProof/>
+        </w:rPr>
+        <mc:AlternateContent>
+          <mc:Choice Requires="wps">
+            <w:drawing>
+              <wp:anchor distT="0" distB="0" distL="114300" distR="114300" simplePos="0" relativeHeight="251662336" behindDoc="0" locked="0" layoutInCell="1" allowOverlap="1" wp14:anchorId="4C9B9295" wp14:editId="7BC2CD63">
+                <wp:simplePos x="0" y="0"/>
+                <wp:positionH relativeFrom="column">
+                  <wp:posOffset>2804861</wp:posOffset>
+                </wp:positionH>
+                <wp:positionV relativeFrom="paragraph">
+                  <wp:posOffset>1405151</wp:posOffset>
+                </wp:positionV>
+                <wp:extent cx="996287" cy="109182"/>
+                <wp:effectExtent l="38100" t="0" r="13970" b="81915"/>
+                <wp:wrapNone/>
+                <wp:docPr id="27" name="Conector de Seta Reta 27"/>
+                <wp:cNvGraphicFramePr/>
+                <a:graphic xmlns:a="http://schemas.openxmlformats.org/drawingml/2006/main">
+                  <a:graphicData uri="http://schemas.microsoft.com/office/word/2010/wordprocessingShape">
+                    <wps:wsp>
+                      <wps:cNvCnPr/>
+                      <wps:spPr>
+                        <a:xfrm flipH="1">
+                          <a:off x="0" y="0"/>
+                          <a:ext cx="996287" cy="109182"/>
+                        </a:xfrm>
+                        <a:prstGeom prst="straightConnector1">
+                          <a:avLst/>
+                        </a:prstGeom>
+                        <a:ln>
+                          <a:tailEnd type="triangle"/>
+                        </a:ln>
+                      </wps:spPr>
+                      <wps:style>
+                        <a:lnRef idx="1">
+                          <a:schemeClr val="accent1"/>
+                        </a:lnRef>
+                        <a:fillRef idx="0">
+                          <a:schemeClr val="accent1"/>
+                        </a:fillRef>
+                        <a:effectRef idx="0">
+                          <a:schemeClr val="accent1"/>
+                        </a:effectRef>
+                        <a:fontRef idx="minor">
+                          <a:schemeClr val="tx1"/>
+                        </a:fontRef>
+                      </wps:style>
+                      <wps:bodyPr/>
+                    </wps:wsp>
+                  </a:graphicData>
+                </a:graphic>
+              </wp:anchor>
+            </w:drawing>
+          </mc:Choice>
+          <mc:Fallback>
+            <w:pict>
+              <v:shape w14:anchorId="3F5C9540" id="Conector de Seta Reta 27" o:spid="_x0000_s1026" type="#_x0000_t32" style="position:absolute;margin-left:220.85pt;margin-top:110.65pt;width:78.45pt;height:8.6pt;flip:x;z-index:251662336;visibility:visible;mso-wrap-style:square;mso-wrap-distance-left:9pt;mso-wrap-distance-top:0;mso-wrap-distance-right:9pt;mso-wrap-distance-bottom:0;mso-position-horizontal:absolute;mso-position-horizontal-relative:text;mso-position-vertical:absolute;mso-position-vertical-relative:text" o:gfxdata="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" strokecolor="#4472c4 [3204]" strokeweight=".5pt">
+                <v:stroke endarrow="block" joinstyle="miter"/>
+              </v:shape>
+            </w:pict>
+          </mc:Fallback>
+        </mc:AlternateContent>
+      </w:r>
+      <w:r>
+        <w:rPr>
+          <w:noProof/>
+        </w:rPr>
+        <mc:AlternateContent>
+          <mc:Choice Requires="wps">
+            <w:drawing>
+              <wp:anchor distT="0" distB="0" distL="114300" distR="114300" simplePos="0" relativeHeight="251661312" behindDoc="0" locked="0" layoutInCell="1" allowOverlap="1" wp14:anchorId="4A6EC163" wp14:editId="21E9D07D">
+                <wp:simplePos x="0" y="0"/>
+                <wp:positionH relativeFrom="column">
+                  <wp:posOffset>2313542</wp:posOffset>
+                </wp:positionH>
+                <wp:positionV relativeFrom="paragraph">
+                  <wp:posOffset>1050309</wp:posOffset>
+                </wp:positionV>
+                <wp:extent cx="1323833" cy="143301"/>
+                <wp:effectExtent l="38100" t="0" r="29210" b="85725"/>
+                <wp:wrapNone/>
+                <wp:docPr id="26" name="Conector de Seta Reta 26"/>
+                <wp:cNvGraphicFramePr/>
+                <a:graphic xmlns:a="http://schemas.openxmlformats.org/drawingml/2006/main">
+                  <a:graphicData uri="http://schemas.microsoft.com/office/word/2010/wordprocessingShape">
+                    <wps:wsp>
+                      <wps:cNvCnPr/>
+                      <wps:spPr>
+                        <a:xfrm flipH="1">
+                          <a:off x="0" y="0"/>
+                          <a:ext cx="1323833" cy="143301"/>
+                        </a:xfrm>
+                        <a:prstGeom prst="straightConnector1">
+                          <a:avLst/>
+                        </a:prstGeom>
+                        <a:ln>
+                          <a:tailEnd type="triangle"/>
+                        </a:ln>
+                      </wps:spPr>
+                      <wps:style>
+                        <a:lnRef idx="1">
+                          <a:schemeClr val="accent1"/>
+                        </a:lnRef>
+                        <a:fillRef idx="0">
+                          <a:schemeClr val="accent1"/>
+                        </a:fillRef>
+                        <a:effectRef idx="0">
+                          <a:schemeClr val="accent1"/>
+                        </a:effectRef>
+                        <a:fontRef idx="minor">
+                          <a:schemeClr val="tx1"/>
+                        </a:fontRef>
+                      </wps:style>
+                      <wps:bodyPr/>
+                    </wps:wsp>
+                  </a:graphicData>
+                </a:graphic>
+              </wp:anchor>
+            </w:drawing>
+          </mc:Choice>
+          <mc:Fallback>
+            <w:pict>
+              <v:shape w14:anchorId="1654A0A6" id="Conector de Seta Reta 26" o:spid="_x0000_s1026" type="#_x0000_t32" style="position:absolute;margin-left:182.15pt;margin-top:82.7pt;width:104.25pt;height:11.3pt;flip:x;z-index:251661312;visibility:visible;mso-wrap-style:square;mso-wrap-distance-left:9pt;mso-wrap-distance-top:0;mso-wrap-distance-right:9pt;mso-wrap-distance-bottom:0;mso-position-horizontal:absolute;mso-position-horizontal-relative:text;mso-position-vertical:absolute;mso-position-vertical-relative:text" o:gfxdata="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" strokecolor="#4472c4 [3204]" strokeweight=".5pt">
+                <v:stroke endarrow="block" joinstyle="miter"/>
+              </v:shape>
+            </w:pict>
+          </mc:Fallback>
+        </mc:AlternateContent>
+      </w:r>
+      <w:r>
+        <w:drawing>
+          <wp:inline distT="0" distB="0" distL="0" distR="0" wp14:anchorId="1FA3AAE6" wp14:editId="64DFF499">
+            <wp:extent cx="3820058" cy="1876687"/>
+            <wp:effectExtent l="0" t="0" r="9525" b="9525"/>
+            <wp:docPr id="25" name="Imagem 25"/>
+            <wp:cNvGraphicFramePr>
+              <a:graphicFrameLocks xmlns:a="http://schemas.openxmlformats.org/drawingml/2006/main" noChangeAspect="1"/>
+            </wp:cNvGraphicFramePr>
+            <a:graphic xmlns:a="http://schemas.openxmlformats.org/drawingml/2006/main">
+              <a:graphicData uri="http://schemas.openxmlformats.org/drawingml/2006/picture">
+                <pic:pic xmlns:pic="http://schemas.openxmlformats.org/drawingml/2006/picture">
+                  <pic:nvPicPr>
+                    <pic:cNvPr id="1" name=""/>
+                    <pic:cNvPicPr/>
+                  </pic:nvPicPr>
+                  <pic:blipFill>
+                    <a:blip r:embed="rId32"/>
+                    <a:stretch>
+                      <a:fillRect/>
+                    </a:stretch>
+                  </pic:blipFill>
+                  <pic:spPr>
+                    <a:xfrm>
+                      <a:off x="0" y="0"/>
+                      <a:ext cx="3820058" cy="1876687"/>
+                    </a:xfrm>
+                    <a:prstGeom prst="rect">
+                      <a:avLst/>
+                    </a:prstGeom>
+                  </pic:spPr>
+                </pic:pic>
+              </a:graphicData>
+            </a:graphic>
+          </wp:inline>
+        </w:drawing>
+      </w:r>
+    </w:p>
+    <w:p>
+      <w:r>
+        <w:drawing>
+          <wp:inline distT="0" distB="0" distL="0" distR="0" wp14:anchorId="40B5E31F" wp14:editId="12725731">
+            <wp:extent cx="7116183" cy="2953887"/>
+            <wp:effectExtent l="0" t="0" r="0" b="0"/>
+            <wp:docPr id="28" name="Imagem 28"/>
+            <wp:cNvGraphicFramePr>
+              <a:graphicFrameLocks xmlns:a="http://schemas.openxmlformats.org/drawingml/2006/main" noChangeAspect="1"/>
+            </wp:cNvGraphicFramePr>
+            <a:graphic xmlns:a="http://schemas.openxmlformats.org/drawingml/2006/main">
+              <a:graphicData uri="http://schemas.openxmlformats.org/drawingml/2006/picture">
+                <pic:pic xmlns:pic="http://schemas.openxmlformats.org/drawingml/2006/picture">
+                  <pic:nvPicPr>
+                    <pic:cNvPr id="1" name=""/>
+                    <pic:cNvPicPr/>
+                  </pic:nvPicPr>
+                  <pic:blipFill>
+                    <a:blip r:embed="rId33"/>
+                    <a:stretch>
+                      <a:fillRect/>
+                    </a:stretch>
+                  </pic:blipFill>
+                  <pic:spPr>
+                    <a:xfrm>
+                      <a:off x="0" y="0"/>
+                      <a:ext cx="7228299" cy="3000426"/>
+                    </a:xfrm>
+                    <a:prstGeom prst="rect">
+                      <a:avLst/>
+                    </a:prstGeom>
+                  </pic:spPr>
+                </pic:pic>
+              </a:graphicData>
+            </a:graphic>
+          </wp:inline>
+        </w:drawing>
+      </w:r>
+    </w:p>
+    <w:p>
+      <w:r>
+        <w:t xml:space="preserve">16- </w:t>
+      </w:r>
+      <w:r>
+        <w:t xml:space="preserve">Na </w:t>
+      </w:r>
+      <w:proofErr w:type="spellStart"/>
+      <w:r>
+        <w:t>div</w:t>
+      </w:r>
+      <w:proofErr w:type="spellEnd"/>
+      <w:r>
+        <w:t xml:space="preserve"> benefícios centralizamos o subtítulo h2</w:t>
+      </w:r>
+    </w:p>
+    <w:p>
+      <w:r>
+        <w:drawing>
+          <wp:inline distT="0" distB="0" distL="0" distR="0" wp14:anchorId="0DCF6F5B" wp14:editId="69EFC182">
+            <wp:extent cx="3162741" cy="1219370"/>
+            <wp:effectExtent l="0" t="0" r="0" b="0"/>
+            <wp:docPr id="29" name="Imagem 29"/>
+            <wp:cNvGraphicFramePr>
+              <a:graphicFrameLocks xmlns:a="http://schemas.openxmlformats.org/drawingml/2006/main" noChangeAspect="1"/>
+            </wp:cNvGraphicFramePr>
+            <a:graphic xmlns:a="http://schemas.openxmlformats.org/drawingml/2006/main">
+              <a:graphicData uri="http://schemas.openxmlformats.org/drawingml/2006/picture">
+                <pic:pic xmlns:pic="http://schemas.openxmlformats.org/drawingml/2006/picture">
+                  <pic:nvPicPr>
+                    <pic:cNvPr id="1" name=""/>
+                    <pic:cNvPicPr/>
+                  </pic:nvPicPr>
+                  <pic:blipFill>
+                    <a:blip r:embed="rId34"/>
+                    <a:stretch>
+                      <a:fillRect/>
+                    </a:stretch>
+                  </pic:blipFill>
+                  <pic:spPr>
+                    <a:xfrm>
+                      <a:off x="0" y="0"/>
+                      <a:ext cx="3162741" cy="1219370"/>
+                    </a:xfrm>
+                    <a:prstGeom prst="rect">
+                      <a:avLst/>
+                    </a:prstGeom>
+                  </pic:spPr>
+                </pic:pic>
+              </a:graphicData>
+            </a:graphic>
+          </wp:inline>
+        </w:drawing>
+      </w:r>
+    </w:p>
+    <w:p/>
+    <w:p>
+      <w:r>
+        <w:t xml:space="preserve">17 – </w:t>
+      </w:r>
+      <w:r>
+        <w:t>Na</w:t>
+      </w:r>
+      <w:r>
+        <w:t xml:space="preserve"> </w:t>
+      </w:r>
+      <w:proofErr w:type="spellStart"/>
+      <w:r>
+        <w:t>div</w:t>
+      </w:r>
+      <w:proofErr w:type="spellEnd"/>
+      <w:r>
+        <w:t xml:space="preserve"> principal </w:t>
+      </w:r>
+      <w:r>
+        <w:t>inserimos um espaço interno tanto para cima, direita, baixo e esquerda conforme código:</w:t>
+      </w:r>
+    </w:p>
+    <w:p>
+      <w:r>
+        <w:rPr>
+          <w:noProof/>
+        </w:rPr>
+        <mc:AlternateContent>
+          <mc:Choice Requires="wps">
+            <w:drawing>
+              <wp:anchor distT="0" distB="0" distL="114300" distR="114300" simplePos="0" relativeHeight="251663360" behindDoc="0" locked="0" layoutInCell="1" allowOverlap="1" wp14:anchorId="67E51419" wp14:editId="18AE6EAA">
+                <wp:simplePos x="0" y="0"/>
+                <wp:positionH relativeFrom="column">
+                  <wp:posOffset>2641088</wp:posOffset>
+                </wp:positionH>
+                <wp:positionV relativeFrom="paragraph">
+                  <wp:posOffset>1004456</wp:posOffset>
+                </wp:positionV>
+                <wp:extent cx="1221475" cy="88711"/>
+                <wp:effectExtent l="38100" t="0" r="17145" b="83185"/>
+                <wp:wrapNone/>
+                <wp:docPr id="31" name="Conector de Seta Reta 31"/>
+                <wp:cNvGraphicFramePr/>
+                <a:graphic xmlns:a="http://schemas.openxmlformats.org/drawingml/2006/main">
+                  <a:graphicData uri="http://schemas.microsoft.com/office/word/2010/wordprocessingShape">
+                    <wps:wsp>
+                      <wps:cNvCnPr/>
+                      <wps:spPr>
+                        <a:xfrm flipH="1">
+                          <a:off x="0" y="0"/>
+                          <a:ext cx="1221475" cy="88711"/>
+                        </a:xfrm>
+                        <a:prstGeom prst="straightConnector1">
+                          <a:avLst/>
+                        </a:prstGeom>
+                        <a:ln>
+                          <a:tailEnd type="triangle"/>
+                        </a:ln>
+                      </wps:spPr>
+                      <wps:style>
+                        <a:lnRef idx="1">
+                          <a:schemeClr val="accent1"/>
+                        </a:lnRef>
+                        <a:fillRef idx="0">
+                          <a:schemeClr val="accent1"/>
+                        </a:fillRef>
+                        <a:effectRef idx="0">
+                          <a:schemeClr val="accent1"/>
+                        </a:effectRef>
+                        <a:fontRef idx="minor">
+                          <a:schemeClr val="tx1"/>
+                        </a:fontRef>
+                      </wps:style>
+                      <wps:bodyPr/>
+                    </wps:wsp>
+                  </a:graphicData>
+                </a:graphic>
+              </wp:anchor>
+            </w:drawing>
+          </mc:Choice>
+          <mc:Fallback>
+            <w:pict>
+              <v:shape w14:anchorId="712AD8BA" id="Conector de Seta Reta 31" o:spid="_x0000_s1026" type="#_x0000_t32" style="position:absolute;margin-left:207.95pt;margin-top:79.1pt;width:96.2pt;height:7pt;flip:x;z-index:251663360;visibility:visible;mso-wrap-style:square;mso-wrap-distance-left:9pt;mso-wrap-distance-top:0;mso-wrap-distance-right:9pt;mso-wrap-distance-bottom:0;mso-position-horizontal:absolute;mso-position-horizontal-relative:text;mso-position-vertical:absolute;mso-position-vertical-relative:text" o:gfxdata="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" strokecolor="#4472c4 [3204]" strokeweight=".5pt">
+                <v:stroke endarrow="block" joinstyle="miter"/>
+              </v:shape>
+            </w:pict>
+          </mc:Fallback>
+        </mc:AlternateContent>
+      </w:r>
+      <w:r>
+        <w:drawing>
+          <wp:inline distT="0" distB="0" distL="0" distR="0" wp14:anchorId="6FB8B4A7" wp14:editId="1BF75585">
+            <wp:extent cx="4953691" cy="1676634"/>
+            <wp:effectExtent l="0" t="0" r="0" b="0"/>
+            <wp:docPr id="30" name="Imagem 30"/>
+            <wp:cNvGraphicFramePr>
+              <a:graphicFrameLocks xmlns:a="http://schemas.openxmlformats.org/drawingml/2006/main" noChangeAspect="1"/>
+            </wp:cNvGraphicFramePr>
+            <a:graphic xmlns:a="http://schemas.openxmlformats.org/drawingml/2006/main">
+              <a:graphicData uri="http://schemas.openxmlformats.org/drawingml/2006/picture">
+                <pic:pic xmlns:pic="http://schemas.openxmlformats.org/drawingml/2006/picture">
+                  <pic:nvPicPr>
+                    <pic:cNvPr id="1" name=""/>
+                    <pic:cNvPicPr/>
+                  </pic:nvPicPr>
+                  <pic:blipFill>
+                    <a:blip r:embed="rId35"/>
+                    <a:stretch>
+                      <a:fillRect/>
+                    </a:stretch>
+                  </pic:blipFill>
+                  <pic:spPr>
+                    <a:xfrm>
+                      <a:off x="0" y="0"/>
+                      <a:ext cx="4953691" cy="1676634"/>
+                    </a:xfrm>
+                    <a:prstGeom prst="rect">
+                      <a:avLst/>
+                    </a:prstGeom>
+                  </pic:spPr>
+                </pic:pic>
+              </a:graphicData>
+            </a:graphic>
+          </wp:inline>
+        </w:drawing>
+      </w:r>
+    </w:p>
+    <w:p>
+      <w:r>
+        <w:drawing>
+          <wp:inline distT="0" distB="0" distL="0" distR="0" wp14:anchorId="1CA7FEFC" wp14:editId="40DCBA40">
+            <wp:extent cx="6914157" cy="2194020"/>
+            <wp:effectExtent l="0" t="0" r="1270" b="0"/>
+            <wp:docPr id="32" name="Imagem 32"/>
+            <wp:cNvGraphicFramePr>
+              <a:graphicFrameLocks xmlns:a="http://schemas.openxmlformats.org/drawingml/2006/main" noChangeAspect="1"/>
+            </wp:cNvGraphicFramePr>
+            <a:graphic xmlns:a="http://schemas.openxmlformats.org/drawingml/2006/main">
+              <a:graphicData uri="http://schemas.openxmlformats.org/drawingml/2006/picture">
+                <pic:pic xmlns:pic="http://schemas.openxmlformats.org/drawingml/2006/picture">
+                  <pic:nvPicPr>
+                    <pic:cNvPr id="1" name=""/>
+                    <pic:cNvPicPr/>
+                  </pic:nvPicPr>
+                  <pic:blipFill>
+                    <a:blip r:embed="rId36"/>
+                    <a:stretch>
+                      <a:fillRect/>
+                    </a:stretch>
+                  </pic:blipFill>
+                  <pic:spPr>
+                    <a:xfrm>
+                      <a:off x="0" y="0"/>
+                      <a:ext cx="6966113" cy="2210507"/>
+                    </a:xfrm>
+                    <a:prstGeom prst="rect">
+                      <a:avLst/>
+                    </a:prstGeom>
+                  </pic:spPr>
+                </pic:pic>
+              </a:graphicData>
+            </a:graphic>
+          </wp:inline>
+        </w:drawing>
+      </w:r>
+    </w:p>
+    <w:p>
+      <w:r>
+        <w:t xml:space="preserve">18 – Para deixar o código mais limpo </w:t>
+      </w:r>
+      <w:r>
+        <w:t xml:space="preserve">criamos uma </w:t>
+      </w:r>
+      <w:proofErr w:type="spellStart"/>
+      <w:r>
+        <w:t>class</w:t>
+      </w:r>
+      <w:proofErr w:type="spellEnd"/>
+      <w:r>
+        <w:t xml:space="preserve"> que centraliza todos os títulos</w:t>
+      </w:r>
+      <w:r>
+        <w:t xml:space="preserve"> e</w:t>
+      </w:r>
+      <w:r>
+        <w:t xml:space="preserve"> subtítulos</w:t>
+      </w:r>
+      <w:r>
+        <w:t>.</w:t>
+      </w:r>
+    </w:p>
+    <w:p>
+      <w:r>
+        <w:drawing>
+          <wp:inline distT="0" distB="0" distL="0" distR="0" wp14:anchorId="6BAF8839" wp14:editId="4809DA55">
+            <wp:extent cx="3610479" cy="1162212"/>
+            <wp:effectExtent l="0" t="0" r="9525" b="0"/>
+            <wp:docPr id="33" name="Imagem 33"/>
+            <wp:cNvGraphicFramePr>
+              <a:graphicFrameLocks xmlns:a="http://schemas.openxmlformats.org/drawingml/2006/main" noChangeAspect="1"/>
+            </wp:cNvGraphicFramePr>
+            <a:graphic xmlns:a="http://schemas.openxmlformats.org/drawingml/2006/main">
+              <a:graphicData uri="http://schemas.openxmlformats.org/drawingml/2006/picture">
+                <pic:pic xmlns:pic="http://schemas.openxmlformats.org/drawingml/2006/picture">
+                  <pic:nvPicPr>
+                    <pic:cNvPr id="1" name=""/>
+                    <pic:cNvPicPr/>
+                  </pic:nvPicPr>
+                  <pic:blipFill>
+                    <a:blip r:embed="rId37"/>
+                    <a:stretch>
+                      <a:fillRect/>
+                    </a:stretch>
+                  </pic:blipFill>
+                  <pic:spPr>
+                    <a:xfrm>
+                      <a:off x="0" y="0"/>
+                      <a:ext cx="3610479" cy="1162212"/>
+                    </a:xfrm>
+                    <a:prstGeom prst="rect">
+                      <a:avLst/>
+                    </a:prstGeom>
+                  </pic:spPr>
+                </pic:pic>
+              </a:graphicData>
+            </a:graphic>
+          </wp:inline>
+        </w:drawing>
+      </w:r>
+    </w:p>
+    <w:p>
+      <w:r>
+        <w:drawing>
+          <wp:inline distT="0" distB="0" distL="0" distR="0" wp14:anchorId="5F807E78" wp14:editId="55481CC0">
+            <wp:extent cx="7736570" cy="716349"/>
+            <wp:effectExtent l="0" t="0" r="0" b="7620"/>
+            <wp:docPr id="34" name="Imagem 34"/>
+            <wp:cNvGraphicFramePr>
+              <a:graphicFrameLocks xmlns:a="http://schemas.openxmlformats.org/drawingml/2006/main" noChangeAspect="1"/>
+            </wp:cNvGraphicFramePr>
+            <a:graphic xmlns:a="http://schemas.openxmlformats.org/drawingml/2006/main">
+              <a:graphicData uri="http://schemas.openxmlformats.org/drawingml/2006/picture">
+                <pic:pic xmlns:pic="http://schemas.openxmlformats.org/drawingml/2006/picture">
+                  <pic:nvPicPr>
+                    <pic:cNvPr id="1" name=""/>
+                    <pic:cNvPicPr/>
+                  </pic:nvPicPr>
+                  <pic:blipFill>
+                    <a:blip r:embed="rId38"/>
+                    <a:stretch>
+                      <a:fillRect/>
+                    </a:stretch>
+                  </pic:blipFill>
+                  <pic:spPr>
+                    <a:xfrm>
+                      <a:off x="0" y="0"/>
+                      <a:ext cx="7905671" cy="732007"/>
+                    </a:xfrm>
+                    <a:prstGeom prst="rect">
+                      <a:avLst/>
+                    </a:prstGeom>
+                  </pic:spPr>
+                </pic:pic>
+              </a:graphicData>
+            </a:graphic>
+          </wp:inline>
+        </w:drawing>
+      </w:r>
+    </w:p>
+    <w:p>
+      <w:r>
+        <w:drawing>
+          <wp:inline distT="0" distB="0" distL="0" distR="0" wp14:anchorId="7CC28F08" wp14:editId="4EF6237D">
+            <wp:extent cx="7049484" cy="485843"/>
+            <wp:effectExtent l="0" t="0" r="0" b="9525"/>
+            <wp:docPr id="35" name="Imagem 35"/>
+            <wp:cNvGraphicFramePr>
+              <a:graphicFrameLocks xmlns:a="http://schemas.openxmlformats.org/drawingml/2006/main" noChangeAspect="1"/>
+            </wp:cNvGraphicFramePr>
+            <a:graphic xmlns:a="http://schemas.openxmlformats.org/drawingml/2006/main">
+              <a:graphicData uri="http://schemas.openxmlformats.org/drawingml/2006/picture">
+                <pic:pic xmlns:pic="http://schemas.openxmlformats.org/drawingml/2006/picture">
+                  <pic:nvPicPr>
+                    <pic:cNvPr id="1" name=""/>
+                    <pic:cNvPicPr/>
+                  </pic:nvPicPr>
+                  <pic:blipFill>
+                    <a:blip r:embed="rId39"/>
+                    <a:stretch>
+                      <a:fillRect/>
+                    </a:stretch>
+                  </pic:blipFill>
+                  <pic:spPr>
+                    <a:xfrm>
+                      <a:off x="0" y="0"/>
+                      <a:ext cx="7049484" cy="485843"/>
+                    </a:xfrm>
+                    <a:prstGeom prst="rect">
+                      <a:avLst/>
+                    </a:prstGeom>
+                  </pic:spPr>
+                </pic:pic>
+              </a:graphicData>
+            </a:graphic>
+          </wp:inline>
+        </w:drawing>
+      </w:r>
       <w:bookmarkStart w:id="0" w:name="_GoBack"/>
       <w:bookmarkEnd w:id="0"/>
     </w:p>
-    <w:p/>
-    <w:p/>
     <w:sectPr>
       <w:pgSz w:w="11906" w:h="16838"/>
       <w:pgMar w:top="1417" w:right="1701" w:bottom="1417" w:left="1701" w:header="708" w:footer="708" w:gutter="0"/>
@@ -1959,20 +3276,20 @@
 </file>
 
 <file path=customXml/item2.xml><?xml version="1.0" encoding="utf-8"?>
+<p:properties xmlns:p="http://schemas.microsoft.com/office/2006/metadata/properties" xmlns:xsi="http://www.w3.org/2001/XMLSchema-instance" xmlns:pc="http://schemas.microsoft.com/office/infopath/2007/PartnerControls">
+  <documentManagement>
+    <_activity xmlns="8437a765-f0a9-40aa-978b-fcc06261281f" xsi:nil="true"/>
+  </documentManagement>
+</p:properties>
+</file>
+
+<file path=customXml/item3.xml><?xml version="1.0" encoding="utf-8"?>
 <?mso-contentType ?>
 <FormTemplates xmlns="http://schemas.microsoft.com/sharepoint/v3/contenttype/forms">
   <Display>DocumentLibraryForm</Display>
   <Edit>DocumentLibraryForm</Edit>
   <New>DocumentLibraryForm</New>
 </FormTemplates>
-</file>
-
-<file path=customXml/item3.xml><?xml version="1.0" encoding="utf-8"?>
-<p:properties xmlns:p="http://schemas.microsoft.com/office/2006/metadata/properties" xmlns:xsi="http://www.w3.org/2001/XMLSchema-instance" xmlns:pc="http://schemas.microsoft.com/office/infopath/2007/PartnerControls">
-  <documentManagement>
-    <_activity xmlns="8437a765-f0a9-40aa-978b-fcc06261281f" xsi:nil="true"/>
-  </documentManagement>
-</p:properties>
 </file>
 
 <file path=customXml/item4.xml><?xml version="1.0" encoding="utf-8"?>
@@ -1999,14 +3316,6 @@
 </file>
 
 <file path=customXml/itemProps2.xml><?xml version="1.0" encoding="utf-8"?>
-<ds:datastoreItem xmlns:ds="http://schemas.openxmlformats.org/officeDocument/2006/customXml" ds:itemID="{38630907-5F1E-4561-A45F-AC7CC415CD73}">
-  <ds:schemaRefs>
-    <ds:schemaRef ds:uri="http://schemas.microsoft.com/sharepoint/v3/contenttype/forms"/>
-  </ds:schemaRefs>
-</ds:datastoreItem>
-</file>
-
-<file path=customXml/itemProps3.xml><?xml version="1.0" encoding="utf-8"?>
 <ds:datastoreItem xmlns:ds="http://schemas.openxmlformats.org/officeDocument/2006/customXml" ds:itemID="{0C9FFCBC-F2CA-4FF1-AAFC-AD3B89BB1967}">
   <ds:schemaRefs>
     <ds:schemaRef ds:uri="http://schemas.microsoft.com/office/2006/metadata/properties"/>
@@ -2016,8 +3325,16 @@
 </ds:datastoreItem>
 </file>
 
+<file path=customXml/itemProps3.xml><?xml version="1.0" encoding="utf-8"?>
+<ds:datastoreItem xmlns:ds="http://schemas.openxmlformats.org/officeDocument/2006/customXml" ds:itemID="{38630907-5F1E-4561-A45F-AC7CC415CD73}">
+  <ds:schemaRefs>
+    <ds:schemaRef ds:uri="http://schemas.microsoft.com/sharepoint/v3/contenttype/forms"/>
+  </ds:schemaRefs>
+</ds:datastoreItem>
+</file>
+
 <file path=customXml/itemProps4.xml><?xml version="1.0" encoding="utf-8"?>
-<ds:datastoreItem xmlns:ds="http://schemas.openxmlformats.org/officeDocument/2006/customXml" ds:itemID="{A21D6303-0DD9-494A-BD95-2EDE69B46522}">
+<ds:datastoreItem xmlns:ds="http://schemas.openxmlformats.org/officeDocument/2006/customXml" ds:itemID="{260C1F3C-1F19-4957-96F7-43B64847CBE1}">
   <ds:schemaRefs>
     <ds:schemaRef ds:uri="http://schemas.openxmlformats.org/officeDocument/2006/bibliography"/>
   </ds:schemaRefs>

</xml_diff>

<commit_message>
atualização da aula do dia 31/08/2026
</commit_message>
<xml_diff>
--- a/apostila/Projeto Space for me3.docx
+++ b/apostila/Projeto Space for me3.docx
@@ -764,6 +764,9 @@
     </w:p>
     <w:p>
       <w:r>
+        <w:rPr>
+          <w:noProof/>
+        </w:rPr>
         <w:drawing>
           <wp:inline distT="0" distB="0" distL="0" distR="0" wp14:anchorId="45D87CD1" wp14:editId="1D392ACE">
             <wp:extent cx="5525271" cy="1867161"/>
@@ -801,6 +804,9 @@
         </w:drawing>
       </w:r>
       <w:r>
+        <w:rPr>
+          <w:noProof/>
+        </w:rPr>
         <w:drawing>
           <wp:inline distT="0" distB="0" distL="0" distR="0" wp14:anchorId="1F6DE4C0" wp14:editId="0BEB0705">
             <wp:extent cx="1996225" cy="717511"/>
@@ -881,6 +887,9 @@
     </w:p>
     <w:p>
       <w:r>
+        <w:rPr>
+          <w:noProof/>
+        </w:rPr>
         <w:drawing>
           <wp:inline distT="0" distB="0" distL="0" distR="0" wp14:anchorId="02526F21" wp14:editId="11E91D8A">
             <wp:extent cx="7999436" cy="2417645"/>
@@ -923,6 +932,9 @@
         <w:t xml:space="preserve"> </w:t>
       </w:r>
       <w:r>
+        <w:rPr>
+          <w:noProof/>
+        </w:rPr>
         <w:drawing>
           <wp:inline distT="0" distB="0" distL="0" distR="0" wp14:anchorId="6579A244" wp14:editId="06530A29">
             <wp:extent cx="3410426" cy="1076475"/>
@@ -989,6 +1001,9 @@
     </w:p>
     <w:p>
       <w:r>
+        <w:rPr>
+          <w:noProof/>
+        </w:rPr>
         <w:drawing>
           <wp:inline distT="0" distB="0" distL="0" distR="0" wp14:anchorId="45AA3FD0" wp14:editId="2F5EE51B">
             <wp:extent cx="4991797" cy="2038635"/>
@@ -1028,6 +1043,9 @@
     </w:p>
     <w:p>
       <w:r>
+        <w:rPr>
+          <w:noProof/>
+        </w:rPr>
         <w:drawing>
           <wp:inline distT="0" distB="0" distL="0" distR="0" wp14:anchorId="3858D20D" wp14:editId="427F15D0">
             <wp:extent cx="2715004" cy="781159"/>
@@ -1107,6 +1125,9 @@
         <w:t>.</w:t>
       </w:r>
       <w:r>
+        <w:rPr>
+          <w:noProof/>
+        </w:rPr>
         <w:drawing>
           <wp:inline distT="0" distB="0" distL="0" distR="0" wp14:anchorId="27D7C863" wp14:editId="1C2F3557">
             <wp:extent cx="8383170" cy="828791"/>
@@ -1146,6 +1167,9 @@
     </w:p>
     <w:p>
       <w:r>
+        <w:rPr>
+          <w:noProof/>
+        </w:rPr>
         <w:drawing>
           <wp:inline distT="0" distB="0" distL="0" distR="0" wp14:anchorId="5223B43E" wp14:editId="3EC68285">
             <wp:extent cx="2534004" cy="914528"/>
@@ -1203,6 +1227,9 @@
     <w:p/>
     <w:p>
       <w:r>
+        <w:rPr>
+          <w:noProof/>
+        </w:rPr>
         <w:drawing>
           <wp:inline distT="0" distB="0" distL="0" distR="0" wp14:anchorId="6564ECE0" wp14:editId="6BE0385F">
             <wp:extent cx="3562847" cy="943107"/>
@@ -1242,6 +1269,9 @@
     </w:p>
     <w:p>
       <w:r>
+        <w:rPr>
+          <w:noProof/>
+        </w:rPr>
         <w:drawing>
           <wp:inline distT="0" distB="0" distL="0" distR="0" wp14:anchorId="662AD7CD" wp14:editId="14A5B9C1">
             <wp:extent cx="7849695" cy="4372585"/>
@@ -1369,6 +1399,9 @@
         <w:br/>
       </w:r>
       <w:r>
+        <w:rPr>
+          <w:noProof/>
+        </w:rPr>
         <w:drawing>
           <wp:inline distT="0" distB="0" distL="0" distR="0" wp14:anchorId="6925B900" wp14:editId="67372803">
             <wp:extent cx="3505689" cy="1152686"/>
@@ -1409,6 +1442,9 @@
     <w:p/>
     <w:p>
       <w:r>
+        <w:rPr>
+          <w:noProof/>
+        </w:rPr>
         <w:drawing>
           <wp:inline distT="0" distB="0" distL="0" distR="0" wp14:anchorId="3120C985" wp14:editId="51DFB6C0">
             <wp:extent cx="8059275" cy="4448796"/>
@@ -1590,6 +1626,9 @@
         </mc:AlternateContent>
       </w:r>
       <w:r>
+        <w:rPr>
+          <w:noProof/>
+        </w:rPr>
         <w:drawing>
           <wp:inline distT="0" distB="0" distL="0" distR="0" wp14:anchorId="1FA3AAE6" wp14:editId="64DFF499">
             <wp:extent cx="3820058" cy="1876687"/>
@@ -1629,6 +1668,9 @@
     </w:p>
     <w:p>
       <w:r>
+        <w:rPr>
+          <w:noProof/>
+        </w:rPr>
         <w:drawing>
           <wp:inline distT="0" distB="0" distL="0" distR="0" wp14:anchorId="40B5E31F" wp14:editId="12725731">
             <wp:extent cx="7116183" cy="2953887"/>
@@ -1684,6 +1726,9 @@
     </w:p>
     <w:p>
       <w:r>
+        <w:rPr>
+          <w:noProof/>
+        </w:rPr>
         <w:drawing>
           <wp:inline distT="0" distB="0" distL="0" distR="0" wp14:anchorId="0DCF6F5B" wp14:editId="69EFC182">
             <wp:extent cx="3162741" cy="1219370"/>
@@ -1812,6 +1857,9 @@
         </mc:AlternateContent>
       </w:r>
       <w:r>
+        <w:rPr>
+          <w:noProof/>
+        </w:rPr>
         <w:drawing>
           <wp:inline distT="0" distB="0" distL="0" distR="0" wp14:anchorId="6FB8B4A7" wp14:editId="1BF75585">
             <wp:extent cx="4953691" cy="1676634"/>
@@ -1851,6 +1899,9 @@
     </w:p>
     <w:p>
       <w:r>
+        <w:rPr>
+          <w:noProof/>
+        </w:rPr>
         <w:drawing>
           <wp:inline distT="0" distB="0" distL="0" distR="0" wp14:anchorId="1CA7FEFC" wp14:editId="40DCBA40">
             <wp:extent cx="6914157" cy="2194020"/>
@@ -1912,9 +1963,10 @@
       <w:r>
         <w:t>.</w:t>
       </w:r>
-    </w:p>
-    <w:p>
-      <w:r>
+      <w:r>
+        <w:rPr>
+          <w:noProof/>
+        </w:rPr>
         <w:drawing>
           <wp:inline distT="0" distB="0" distL="0" distR="0" wp14:anchorId="6BAF8839" wp14:editId="4809DA55">
             <wp:extent cx="3610479" cy="1162212"/>
@@ -1954,6 +2006,9 @@
     </w:p>
     <w:p>
       <w:r>
+        <w:rPr>
+          <w:noProof/>
+        </w:rPr>
         <w:drawing>
           <wp:inline distT="0" distB="0" distL="0" distR="0" wp14:anchorId="5F807E78" wp14:editId="55481CC0">
             <wp:extent cx="7736570" cy="716349"/>
@@ -1993,6 +2048,9 @@
     </w:p>
     <w:p>
       <w:r>
+        <w:rPr>
+          <w:noProof/>
+        </w:rPr>
         <w:drawing>
           <wp:inline distT="0" distB="0" distL="0" distR="0" wp14:anchorId="7CC28F08" wp14:editId="4EF6237D">
             <wp:extent cx="7049484" cy="485843"/>
@@ -2029,9 +2087,1236 @@
           </wp:inline>
         </w:drawing>
       </w:r>
+    </w:p>
+    <w:p/>
+    <w:p>
+      <w:r>
+        <w:t xml:space="preserve">19 – Criamos dois arquivos no projeto </w:t>
+      </w:r>
+      <w:r>
+        <w:t xml:space="preserve">produtos.html e o produtos.css e ligamos o </w:t>
+      </w:r>
+      <w:proofErr w:type="spellStart"/>
+      <w:r>
+        <w:t>css</w:t>
+      </w:r>
+      <w:proofErr w:type="spellEnd"/>
+      <w:r>
+        <w:t xml:space="preserve"> no produtos.html.</w:t>
+      </w:r>
+    </w:p>
+    <w:p>
+      <w:r>
+        <w:drawing>
+          <wp:inline distT="0" distB="0" distL="0" distR="0" wp14:anchorId="30EAB16F" wp14:editId="36A5BF93">
+            <wp:extent cx="2676899" cy="2772162"/>
+            <wp:effectExtent l="0" t="0" r="9525" b="9525"/>
+            <wp:docPr id="36" name="Imagem 36"/>
+            <wp:cNvGraphicFramePr>
+              <a:graphicFrameLocks xmlns:a="http://schemas.openxmlformats.org/drawingml/2006/main" noChangeAspect="1"/>
+            </wp:cNvGraphicFramePr>
+            <a:graphic xmlns:a="http://schemas.openxmlformats.org/drawingml/2006/main">
+              <a:graphicData uri="http://schemas.openxmlformats.org/drawingml/2006/picture">
+                <pic:pic xmlns:pic="http://schemas.openxmlformats.org/drawingml/2006/picture">
+                  <pic:nvPicPr>
+                    <pic:cNvPr id="1" name=""/>
+                    <pic:cNvPicPr/>
+                  </pic:nvPicPr>
+                  <pic:blipFill>
+                    <a:blip r:embed="rId40"/>
+                    <a:stretch>
+                      <a:fillRect/>
+                    </a:stretch>
+                  </pic:blipFill>
+                  <pic:spPr>
+                    <a:xfrm>
+                      <a:off x="0" y="0"/>
+                      <a:ext cx="2676899" cy="2772162"/>
+                    </a:xfrm>
+                    <a:prstGeom prst="rect">
+                      <a:avLst/>
+                    </a:prstGeom>
+                  </pic:spPr>
+                </pic:pic>
+              </a:graphicData>
+            </a:graphic>
+          </wp:inline>
+        </w:drawing>
+      </w:r>
+    </w:p>
+    <w:p>
+      <w:r>
+        <w:drawing>
+          <wp:inline distT="0" distB="0" distL="0" distR="0" wp14:anchorId="791B7A8C" wp14:editId="2E394220">
+            <wp:extent cx="8449854" cy="1648055"/>
+            <wp:effectExtent l="0" t="0" r="8890" b="9525"/>
+            <wp:docPr id="37" name="Imagem 37"/>
+            <wp:cNvGraphicFramePr>
+              <a:graphicFrameLocks xmlns:a="http://schemas.openxmlformats.org/drawingml/2006/main" noChangeAspect="1"/>
+            </wp:cNvGraphicFramePr>
+            <a:graphic xmlns:a="http://schemas.openxmlformats.org/drawingml/2006/main">
+              <a:graphicData uri="http://schemas.openxmlformats.org/drawingml/2006/picture">
+                <pic:pic xmlns:pic="http://schemas.openxmlformats.org/drawingml/2006/picture">
+                  <pic:nvPicPr>
+                    <pic:cNvPr id="1" name=""/>
+                    <pic:cNvPicPr/>
+                  </pic:nvPicPr>
+                  <pic:blipFill>
+                    <a:blip r:embed="rId41"/>
+                    <a:stretch>
+                      <a:fillRect/>
+                    </a:stretch>
+                  </pic:blipFill>
+                  <pic:spPr>
+                    <a:xfrm>
+                      <a:off x="0" y="0"/>
+                      <a:ext cx="8449854" cy="1648055"/>
+                    </a:xfrm>
+                    <a:prstGeom prst="rect">
+                      <a:avLst/>
+                    </a:prstGeom>
+                  </pic:spPr>
+                </pic:pic>
+              </a:graphicData>
+            </a:graphic>
+          </wp:inline>
+        </w:drawing>
+      </w:r>
+    </w:p>
+    <w:p>
+      <w:r>
+        <w:t xml:space="preserve">20- </w:t>
+      </w:r>
+      <w:r>
+        <w:t xml:space="preserve">Na pagina do produtos.html estruturamos colocando o header, </w:t>
+      </w:r>
+      <w:proofErr w:type="spellStart"/>
+      <w:r>
+        <w:t>main</w:t>
+      </w:r>
+      <w:proofErr w:type="spellEnd"/>
+      <w:r>
+        <w:t xml:space="preserve"> e </w:t>
+      </w:r>
+      <w:proofErr w:type="spellStart"/>
+      <w:r>
+        <w:t>footer</w:t>
+      </w:r>
+      <w:proofErr w:type="spellEnd"/>
+      <w:r>
+        <w:t xml:space="preserve"> dentro do header inserimos uma imagem que será o logo do site e criamos uma lista não ordenada para </w:t>
+      </w:r>
+      <w:r>
+        <w:t>que mais tarde ela será o menu do nosso site.</w:t>
+      </w:r>
+    </w:p>
+    <w:p/>
+    <w:p>
+      <w:r>
+        <w:drawing>
+          <wp:inline distT="0" distB="0" distL="0" distR="0" wp14:anchorId="3CC0FDBD" wp14:editId="52D30850">
+            <wp:extent cx="6335009" cy="2476846"/>
+            <wp:effectExtent l="0" t="0" r="0" b="0"/>
+            <wp:docPr id="38" name="Imagem 38"/>
+            <wp:cNvGraphicFramePr>
+              <a:graphicFrameLocks xmlns:a="http://schemas.openxmlformats.org/drawingml/2006/main" noChangeAspect="1"/>
+            </wp:cNvGraphicFramePr>
+            <a:graphic xmlns:a="http://schemas.openxmlformats.org/drawingml/2006/main">
+              <a:graphicData uri="http://schemas.openxmlformats.org/drawingml/2006/picture">
+                <pic:pic xmlns:pic="http://schemas.openxmlformats.org/drawingml/2006/picture">
+                  <pic:nvPicPr>
+                    <pic:cNvPr id="1" name=""/>
+                    <pic:cNvPicPr/>
+                  </pic:nvPicPr>
+                  <pic:blipFill>
+                    <a:blip r:embed="rId42"/>
+                    <a:stretch>
+                      <a:fillRect/>
+                    </a:stretch>
+                  </pic:blipFill>
+                  <pic:spPr>
+                    <a:xfrm>
+                      <a:off x="0" y="0"/>
+                      <a:ext cx="6335009" cy="2476846"/>
+                    </a:xfrm>
+                    <a:prstGeom prst="rect">
+                      <a:avLst/>
+                    </a:prstGeom>
+                  </pic:spPr>
+                </pic:pic>
+              </a:graphicData>
+            </a:graphic>
+          </wp:inline>
+        </w:drawing>
+      </w:r>
+    </w:p>
+    <w:p/>
+    <w:p>
+      <w:r>
+        <w:t xml:space="preserve"> </w:t>
+      </w:r>
+      <w:r>
+        <w:tab/>
+      </w:r>
+      <w:r>
+        <w:t xml:space="preserve">21- No produtos.css </w:t>
+      </w:r>
+      <w:r>
+        <w:t xml:space="preserve">inserimos uma cor de fundo no header e no </w:t>
+      </w:r>
+      <w:proofErr w:type="spellStart"/>
+      <w:r>
+        <w:t>html</w:t>
+      </w:r>
+      <w:proofErr w:type="spellEnd"/>
+      <w:r>
+        <w:t xml:space="preserve"> adicionamos a </w:t>
+      </w:r>
+      <w:proofErr w:type="spellStart"/>
+      <w:r>
+        <w:t>tag</w:t>
+      </w:r>
+      <w:proofErr w:type="spellEnd"/>
+      <w:r>
+        <w:t xml:space="preserve"> </w:t>
+      </w:r>
+      <w:proofErr w:type="spellStart"/>
+      <w:r>
+        <w:t>nav</w:t>
+      </w:r>
+      <w:proofErr w:type="spellEnd"/>
+      <w:r>
+        <w:t xml:space="preserve"> que significa </w:t>
+      </w:r>
+      <w:r>
+        <w:t>navegação, ou seja,</w:t>
+      </w:r>
+      <w:r>
+        <w:t xml:space="preserve"> nossa lista se tornar um menu para navegar entre as páginas.</w:t>
+      </w:r>
+    </w:p>
+    <w:p/>
+    <w:p>
+      <w:r>
+        <w:drawing>
+          <wp:inline distT="0" distB="0" distL="0" distR="0" wp14:anchorId="0CEB1699" wp14:editId="31CEAEDE">
+            <wp:extent cx="4315427" cy="1533739"/>
+            <wp:effectExtent l="0" t="0" r="9525" b="9525"/>
+            <wp:docPr id="39" name="Imagem 39"/>
+            <wp:cNvGraphicFramePr>
+              <a:graphicFrameLocks xmlns:a="http://schemas.openxmlformats.org/drawingml/2006/main" noChangeAspect="1"/>
+            </wp:cNvGraphicFramePr>
+            <a:graphic xmlns:a="http://schemas.openxmlformats.org/drawingml/2006/main">
+              <a:graphicData uri="http://schemas.openxmlformats.org/drawingml/2006/picture">
+                <pic:pic xmlns:pic="http://schemas.openxmlformats.org/drawingml/2006/picture">
+                  <pic:nvPicPr>
+                    <pic:cNvPr id="1" name=""/>
+                    <pic:cNvPicPr/>
+                  </pic:nvPicPr>
+                  <pic:blipFill>
+                    <a:blip r:embed="rId43"/>
+                    <a:stretch>
+                      <a:fillRect/>
+                    </a:stretch>
+                  </pic:blipFill>
+                  <pic:spPr>
+                    <a:xfrm>
+                      <a:off x="0" y="0"/>
+                      <a:ext cx="4315427" cy="1533739"/>
+                    </a:xfrm>
+                    <a:prstGeom prst="rect">
+                      <a:avLst/>
+                    </a:prstGeom>
+                  </pic:spPr>
+                </pic:pic>
+              </a:graphicData>
+            </a:graphic>
+          </wp:inline>
+        </w:drawing>
+      </w:r>
+    </w:p>
+    <w:p>
+      <w:r>
+        <w:drawing>
+          <wp:inline distT="0" distB="0" distL="0" distR="0" wp14:anchorId="09543AAE" wp14:editId="7F5BC8CD">
+            <wp:extent cx="5696745" cy="2800741"/>
+            <wp:effectExtent l="0" t="0" r="0" b="0"/>
+            <wp:docPr id="40" name="Imagem 40"/>
+            <wp:cNvGraphicFramePr>
+              <a:graphicFrameLocks xmlns:a="http://schemas.openxmlformats.org/drawingml/2006/main" noChangeAspect="1"/>
+            </wp:cNvGraphicFramePr>
+            <a:graphic xmlns:a="http://schemas.openxmlformats.org/drawingml/2006/main">
+              <a:graphicData uri="http://schemas.openxmlformats.org/drawingml/2006/picture">
+                <pic:pic xmlns:pic="http://schemas.openxmlformats.org/drawingml/2006/picture">
+                  <pic:nvPicPr>
+                    <pic:cNvPr id="1" name=""/>
+                    <pic:cNvPicPr/>
+                  </pic:nvPicPr>
+                  <pic:blipFill>
+                    <a:blip r:embed="rId44"/>
+                    <a:stretch>
+                      <a:fillRect/>
+                    </a:stretch>
+                  </pic:blipFill>
+                  <pic:spPr>
+                    <a:xfrm>
+                      <a:off x="0" y="0"/>
+                      <a:ext cx="5696745" cy="2800741"/>
+                    </a:xfrm>
+                    <a:prstGeom prst="rect">
+                      <a:avLst/>
+                    </a:prstGeom>
+                  </pic:spPr>
+                </pic:pic>
+              </a:graphicData>
+            </a:graphic>
+          </wp:inline>
+        </w:drawing>
+      </w:r>
+    </w:p>
+    <w:p/>
+    <w:p>
+      <w:r>
+        <w:t xml:space="preserve">22- </w:t>
+      </w:r>
+      <w:r>
+        <w:t xml:space="preserve">Na lista ordenada incluímos uma ancora a </w:t>
+      </w:r>
+      <w:proofErr w:type="spellStart"/>
+      <w:r>
+        <w:t>Tag</w:t>
+      </w:r>
+      <w:proofErr w:type="spellEnd"/>
+      <w:r>
+        <w:t xml:space="preserve"> a para criar os links entre as </w:t>
+      </w:r>
+      <w:r>
+        <w:t>páginas</w:t>
+      </w:r>
+      <w:r>
+        <w:t xml:space="preserve"> conforme imagem</w:t>
+      </w:r>
+      <w:r>
+        <w:t>.</w:t>
+      </w:r>
+    </w:p>
+    <w:p/>
+    <w:p>
+      <w:r>
+        <w:drawing>
+          <wp:inline distT="0" distB="0" distL="0" distR="0" wp14:anchorId="374C27A8" wp14:editId="7F9A2607">
+            <wp:extent cx="6506483" cy="2467319"/>
+            <wp:effectExtent l="0" t="0" r="8890" b="9525"/>
+            <wp:docPr id="41" name="Imagem 41"/>
+            <wp:cNvGraphicFramePr>
+              <a:graphicFrameLocks xmlns:a="http://schemas.openxmlformats.org/drawingml/2006/main" noChangeAspect="1"/>
+            </wp:cNvGraphicFramePr>
+            <a:graphic xmlns:a="http://schemas.openxmlformats.org/drawingml/2006/main">
+              <a:graphicData uri="http://schemas.openxmlformats.org/drawingml/2006/picture">
+                <pic:pic xmlns:pic="http://schemas.openxmlformats.org/drawingml/2006/picture">
+                  <pic:nvPicPr>
+                    <pic:cNvPr id="1" name=""/>
+                    <pic:cNvPicPr/>
+                  </pic:nvPicPr>
+                  <pic:blipFill>
+                    <a:blip r:embed="rId45"/>
+                    <a:stretch>
+                      <a:fillRect/>
+                    </a:stretch>
+                  </pic:blipFill>
+                  <pic:spPr>
+                    <a:xfrm>
+                      <a:off x="0" y="0"/>
+                      <a:ext cx="6506483" cy="2467319"/>
+                    </a:xfrm>
+                    <a:prstGeom prst="rect">
+                      <a:avLst/>
+                    </a:prstGeom>
+                  </pic:spPr>
+                </pic:pic>
+              </a:graphicData>
+            </a:graphic>
+          </wp:inline>
+        </w:drawing>
+      </w:r>
+    </w:p>
+    <w:p/>
+    <w:p>
+      <w:r>
+        <w:t xml:space="preserve">23- </w:t>
+      </w:r>
+      <w:r>
+        <w:t>Para colocar a nossa lista os itens um do lado do outr</w:t>
+      </w:r>
+      <w:r>
+        <w:t>a,</w:t>
+      </w:r>
+      <w:r>
+        <w:t xml:space="preserve"> para que assim possamos ter um menu horizontal  </w:t>
+      </w:r>
+      <w:r>
+        <w:t xml:space="preserve">utilizamos o </w:t>
+      </w:r>
+      <w:proofErr w:type="spellStart"/>
+      <w:r>
+        <w:t>css</w:t>
+      </w:r>
+      <w:proofErr w:type="spellEnd"/>
+      <w:r>
+        <w:t xml:space="preserve"> por referencia  ou seja no nosso site a onde tive </w:t>
+      </w:r>
+      <w:proofErr w:type="spellStart"/>
+      <w:r>
+        <w:t>nav</w:t>
+      </w:r>
+      <w:proofErr w:type="spellEnd"/>
+      <w:r>
+        <w:t xml:space="preserve"> e li deixar a natureza(</w:t>
+      </w:r>
+      <w:proofErr w:type="spellStart"/>
+      <w:r>
+        <w:t>diplay</w:t>
+      </w:r>
+      <w:proofErr w:type="spellEnd"/>
+      <w:r>
+        <w:t xml:space="preserve">) de forma </w:t>
+      </w:r>
+      <w:proofErr w:type="spellStart"/>
+      <w:r>
+        <w:t>inline</w:t>
+      </w:r>
+      <w:proofErr w:type="spellEnd"/>
+      <w:r>
+        <w:t xml:space="preserve"> em linha.</w:t>
+      </w:r>
+    </w:p>
+    <w:p>
+      <w:r>
+        <w:drawing>
+          <wp:inline distT="0" distB="0" distL="0" distR="0" wp14:anchorId="784003FF" wp14:editId="4AE65089">
+            <wp:extent cx="2953162" cy="1362265"/>
+            <wp:effectExtent l="0" t="0" r="0" b="9525"/>
+            <wp:docPr id="42" name="Imagem 42"/>
+            <wp:cNvGraphicFramePr>
+              <a:graphicFrameLocks xmlns:a="http://schemas.openxmlformats.org/drawingml/2006/main" noChangeAspect="1"/>
+            </wp:cNvGraphicFramePr>
+            <a:graphic xmlns:a="http://schemas.openxmlformats.org/drawingml/2006/main">
+              <a:graphicData uri="http://schemas.openxmlformats.org/drawingml/2006/picture">
+                <pic:pic xmlns:pic="http://schemas.openxmlformats.org/drawingml/2006/picture">
+                  <pic:nvPicPr>
+                    <pic:cNvPr id="1" name=""/>
+                    <pic:cNvPicPr/>
+                  </pic:nvPicPr>
+                  <pic:blipFill>
+                    <a:blip r:embed="rId46"/>
+                    <a:stretch>
+                      <a:fillRect/>
+                    </a:stretch>
+                  </pic:blipFill>
+                  <pic:spPr>
+                    <a:xfrm>
+                      <a:off x="0" y="0"/>
+                      <a:ext cx="2953162" cy="1362265"/>
+                    </a:xfrm>
+                    <a:prstGeom prst="rect">
+                      <a:avLst/>
+                    </a:prstGeom>
+                  </pic:spPr>
+                </pic:pic>
+              </a:graphicData>
+            </a:graphic>
+          </wp:inline>
+        </w:drawing>
+      </w:r>
+      <w:r>
+        <w:drawing>
+          <wp:inline distT="0" distB="0" distL="0" distR="0" wp14:anchorId="2ED0847B" wp14:editId="10772825">
+            <wp:extent cx="2743583" cy="2534004"/>
+            <wp:effectExtent l="0" t="0" r="0" b="0"/>
+            <wp:docPr id="43" name="Imagem 43"/>
+            <wp:cNvGraphicFramePr>
+              <a:graphicFrameLocks xmlns:a="http://schemas.openxmlformats.org/drawingml/2006/main" noChangeAspect="1"/>
+            </wp:cNvGraphicFramePr>
+            <a:graphic xmlns:a="http://schemas.openxmlformats.org/drawingml/2006/main">
+              <a:graphicData uri="http://schemas.openxmlformats.org/drawingml/2006/picture">
+                <pic:pic xmlns:pic="http://schemas.openxmlformats.org/drawingml/2006/picture">
+                  <pic:nvPicPr>
+                    <pic:cNvPr id="1" name=""/>
+                    <pic:cNvPicPr/>
+                  </pic:nvPicPr>
+                  <pic:blipFill>
+                    <a:blip r:embed="rId47"/>
+                    <a:stretch>
+                      <a:fillRect/>
+                    </a:stretch>
+                  </pic:blipFill>
+                  <pic:spPr>
+                    <a:xfrm>
+                      <a:off x="0" y="0"/>
+                      <a:ext cx="2743583" cy="2534004"/>
+                    </a:xfrm>
+                    <a:prstGeom prst="rect">
+                      <a:avLst/>
+                    </a:prstGeom>
+                  </pic:spPr>
+                </pic:pic>
+              </a:graphicData>
+            </a:graphic>
+          </wp:inline>
+        </w:drawing>
+      </w:r>
+    </w:p>
+    <w:p>
+      <w:r>
+        <w:t xml:space="preserve">24- </w:t>
+      </w:r>
+      <w:r>
+        <w:t xml:space="preserve">Adicionamos a nossa lista o </w:t>
+      </w:r>
+      <w:proofErr w:type="spellStart"/>
+      <w:r>
+        <w:t>uppercase</w:t>
+      </w:r>
+      <w:proofErr w:type="spellEnd"/>
+      <w:r>
+        <w:t xml:space="preserve"> para todo o texto fique </w:t>
+      </w:r>
+      <w:r>
+        <w:t xml:space="preserve">em letras maiúsculas e utilizamos a referencia do </w:t>
+      </w:r>
+      <w:proofErr w:type="spellStart"/>
+      <w:r>
+        <w:t>nav</w:t>
+      </w:r>
+      <w:proofErr w:type="spellEnd"/>
+      <w:r>
+        <w:t xml:space="preserve"> a que os textos dos </w:t>
+      </w:r>
+      <w:r>
+        <w:t>nossos links</w:t>
+      </w:r>
+      <w:r>
+        <w:t xml:space="preserve"> </w:t>
+      </w:r>
+      <w:r>
+        <w:t>e definimos que a cor seria preta o texto.</w:t>
+      </w:r>
+    </w:p>
+    <w:p/>
+    <w:p>
+      <w:r>
+        <w:drawing>
+          <wp:inline distT="0" distB="0" distL="0" distR="0" wp14:anchorId="206E3863" wp14:editId="3F75E5B6">
+            <wp:extent cx="4248743" cy="1781424"/>
+            <wp:effectExtent l="0" t="0" r="0" b="9525"/>
+            <wp:docPr id="44" name="Imagem 44"/>
+            <wp:cNvGraphicFramePr>
+              <a:graphicFrameLocks xmlns:a="http://schemas.openxmlformats.org/drawingml/2006/main" noChangeAspect="1"/>
+            </wp:cNvGraphicFramePr>
+            <a:graphic xmlns:a="http://schemas.openxmlformats.org/drawingml/2006/main">
+              <a:graphicData uri="http://schemas.openxmlformats.org/drawingml/2006/picture">
+                <pic:pic xmlns:pic="http://schemas.openxmlformats.org/drawingml/2006/picture">
+                  <pic:nvPicPr>
+                    <pic:cNvPr id="1" name=""/>
+                    <pic:cNvPicPr/>
+                  </pic:nvPicPr>
+                  <pic:blipFill>
+                    <a:blip r:embed="rId48"/>
+                    <a:stretch>
+                      <a:fillRect/>
+                    </a:stretch>
+                  </pic:blipFill>
+                  <pic:spPr>
+                    <a:xfrm>
+                      <a:off x="0" y="0"/>
+                      <a:ext cx="4248743" cy="1781424"/>
+                    </a:xfrm>
+                    <a:prstGeom prst="rect">
+                      <a:avLst/>
+                    </a:prstGeom>
+                  </pic:spPr>
+                </pic:pic>
+              </a:graphicData>
+            </a:graphic>
+          </wp:inline>
+        </w:drawing>
+      </w:r>
+    </w:p>
+    <w:p>
+      <w:r>
+        <w:t xml:space="preserve"> </w:t>
+      </w:r>
+    </w:p>
+    <w:p/>
+    <w:p/>
+    <w:p>
+      <w:r>
+        <w:t>2</w:t>
+      </w:r>
+      <w:r>
+        <w:t xml:space="preserve">5  - Ainda trabalhando com o </w:t>
+      </w:r>
+      <w:proofErr w:type="spellStart"/>
+      <w:r>
+        <w:t>nav</w:t>
+      </w:r>
+      <w:proofErr w:type="spellEnd"/>
+      <w:r>
+        <w:t xml:space="preserve"> a inserimos os seguintes comandos:</w:t>
+      </w:r>
+    </w:p>
+    <w:p>
+      <w:pPr>
+        <w:pStyle w:val="PargrafodaLista"/>
+        <w:numPr>
+          <w:ilvl w:val="0"/>
+          <w:numId w:val="3"/>
+        </w:numPr>
+      </w:pPr>
+      <w:r>
+        <w:t>Deixamos os textos mais encorpado.</w:t>
+      </w:r>
+    </w:p>
+    <w:p>
+      <w:pPr>
+        <w:pStyle w:val="PargrafodaLista"/>
+        <w:numPr>
+          <w:ilvl w:val="0"/>
+          <w:numId w:val="3"/>
+        </w:numPr>
+      </w:pPr>
+      <w:r>
+        <w:t>Aumentamos o tamanho da fonte.</w:t>
+      </w:r>
+    </w:p>
+    <w:p>
+      <w:pPr>
+        <w:pStyle w:val="PargrafodaLista"/>
+        <w:numPr>
+          <w:ilvl w:val="0"/>
+          <w:numId w:val="3"/>
+        </w:numPr>
+      </w:pPr>
+      <w:r>
+        <w:t>Tiramos a linha que sublinhava o texto.</w:t>
+      </w:r>
+    </w:p>
+    <w:p>
+      <w:pPr>
+        <w:pStyle w:val="PargrafodaLista"/>
+      </w:pPr>
+      <w:r>
+        <w:rPr>
+          <w:noProof/>
+        </w:rPr>
+        <mc:AlternateContent>
+          <mc:Choice Requires="wps">
+            <w:drawing>
+              <wp:anchor distT="0" distB="0" distL="114300" distR="114300" simplePos="0" relativeHeight="251666432" behindDoc="0" locked="0" layoutInCell="1" allowOverlap="1" wp14:anchorId="10300E0E" wp14:editId="2450D1EA">
+                <wp:simplePos x="0" y="0"/>
+                <wp:positionH relativeFrom="column">
+                  <wp:posOffset>3717696</wp:posOffset>
+                </wp:positionH>
+                <wp:positionV relativeFrom="paragraph">
+                  <wp:posOffset>1460141</wp:posOffset>
+                </wp:positionV>
+                <wp:extent cx="620779" cy="189781"/>
+                <wp:effectExtent l="38100" t="0" r="27305" b="77470"/>
+                <wp:wrapNone/>
+                <wp:docPr id="48" name="Conector de Seta Reta 48"/>
+                <wp:cNvGraphicFramePr/>
+                <a:graphic xmlns:a="http://schemas.openxmlformats.org/drawingml/2006/main">
+                  <a:graphicData uri="http://schemas.microsoft.com/office/word/2010/wordprocessingShape">
+                    <wps:wsp>
+                      <wps:cNvCnPr/>
+                      <wps:spPr>
+                        <a:xfrm flipH="1">
+                          <a:off x="0" y="0"/>
+                          <a:ext cx="620779" cy="189781"/>
+                        </a:xfrm>
+                        <a:prstGeom prst="straightConnector1">
+                          <a:avLst/>
+                        </a:prstGeom>
+                        <a:ln>
+                          <a:tailEnd type="triangle"/>
+                        </a:ln>
+                      </wps:spPr>
+                      <wps:style>
+                        <a:lnRef idx="1">
+                          <a:schemeClr val="accent1"/>
+                        </a:lnRef>
+                        <a:fillRef idx="0">
+                          <a:schemeClr val="accent1"/>
+                        </a:fillRef>
+                        <a:effectRef idx="0">
+                          <a:schemeClr val="accent1"/>
+                        </a:effectRef>
+                        <a:fontRef idx="minor">
+                          <a:schemeClr val="tx1"/>
+                        </a:fontRef>
+                      </wps:style>
+                      <wps:bodyPr/>
+                    </wps:wsp>
+                  </a:graphicData>
+                </a:graphic>
+                <wp14:sizeRelH relativeFrom="margin">
+                  <wp14:pctWidth>0</wp14:pctWidth>
+                </wp14:sizeRelH>
+                <wp14:sizeRelV relativeFrom="margin">
+                  <wp14:pctHeight>0</wp14:pctHeight>
+                </wp14:sizeRelV>
+              </wp:anchor>
+            </w:drawing>
+          </mc:Choice>
+          <mc:Fallback>
+            <w:pict>
+              <v:shapetype w14:anchorId="5B28005B" id="_x0000_t32" coordsize="21600,21600" o:spt="32" o:oned="t" path="m,l21600,21600e" filled="f">
+                <v:path arrowok="t" fillok="f" o:connecttype="none"/>
+                <o:lock v:ext="edit" shapetype="t"/>
+              </v:shapetype>
+              <v:shape id="Conector de Seta Reta 48" o:spid="_x0000_s1026" type="#_x0000_t32" style="position:absolute;margin-left:292.75pt;margin-top:114.95pt;width:48.9pt;height:14.95pt;flip:x;z-index:251666432;visibility:visible;mso-wrap-style:square;mso-width-percent:0;mso-height-percent:0;mso-wrap-distance-left:9pt;mso-wrap-distance-top:0;mso-wrap-distance-right:9pt;mso-wrap-distance-bottom:0;mso-position-horizontal:absolute;mso-position-horizontal-relative:text;mso-position-vertical:absolute;mso-position-vertical-relative:text;mso-width-percent:0;mso-height-percent:0;mso-width-relative:margin;mso-height-relative:margin" o:gfxdata="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" strokecolor="#4472c4 [3204]" strokeweight=".5pt">
+                <v:stroke endarrow="block" joinstyle="miter"/>
+              </v:shape>
+            </w:pict>
+          </mc:Fallback>
+        </mc:AlternateContent>
+      </w:r>
+      <w:r>
+        <w:rPr>
+          <w:noProof/>
+        </w:rPr>
+        <mc:AlternateContent>
+          <mc:Choice Requires="wps">
+            <w:drawing>
+              <wp:anchor distT="0" distB="0" distL="114300" distR="114300" simplePos="0" relativeHeight="251665408" behindDoc="0" locked="0" layoutInCell="1" allowOverlap="1" wp14:anchorId="7C393A35" wp14:editId="626D1023">
+                <wp:simplePos x="0" y="0"/>
+                <wp:positionH relativeFrom="column">
+                  <wp:posOffset>3174233</wp:posOffset>
+                </wp:positionH>
+                <wp:positionV relativeFrom="paragraph">
+                  <wp:posOffset>1097831</wp:posOffset>
+                </wp:positionV>
+                <wp:extent cx="1173193" cy="284672"/>
+                <wp:effectExtent l="38100" t="0" r="27305" b="77470"/>
+                <wp:wrapNone/>
+                <wp:docPr id="47" name="Conector de Seta Reta 47"/>
+                <wp:cNvGraphicFramePr/>
+                <a:graphic xmlns:a="http://schemas.openxmlformats.org/drawingml/2006/main">
+                  <a:graphicData uri="http://schemas.microsoft.com/office/word/2010/wordprocessingShape">
+                    <wps:wsp>
+                      <wps:cNvCnPr/>
+                      <wps:spPr>
+                        <a:xfrm flipH="1">
+                          <a:off x="0" y="0"/>
+                          <a:ext cx="1173193" cy="284672"/>
+                        </a:xfrm>
+                        <a:prstGeom prst="straightConnector1">
+                          <a:avLst/>
+                        </a:prstGeom>
+                        <a:ln>
+                          <a:tailEnd type="triangle"/>
+                        </a:ln>
+                      </wps:spPr>
+                      <wps:style>
+                        <a:lnRef idx="1">
+                          <a:schemeClr val="accent1"/>
+                        </a:lnRef>
+                        <a:fillRef idx="0">
+                          <a:schemeClr val="accent1"/>
+                        </a:fillRef>
+                        <a:effectRef idx="0">
+                          <a:schemeClr val="accent1"/>
+                        </a:effectRef>
+                        <a:fontRef idx="minor">
+                          <a:schemeClr val="tx1"/>
+                        </a:fontRef>
+                      </wps:style>
+                      <wps:bodyPr/>
+                    </wps:wsp>
+                  </a:graphicData>
+                </a:graphic>
+              </wp:anchor>
+            </w:drawing>
+          </mc:Choice>
+          <mc:Fallback>
+            <w:pict>
+              <v:shape w14:anchorId="3C089987" id="Conector de Seta Reta 47" o:spid="_x0000_s1026" type="#_x0000_t32" style="position:absolute;margin-left:249.95pt;margin-top:86.45pt;width:92.4pt;height:22.4pt;flip:x;z-index:251665408;visibility:visible;mso-wrap-style:square;mso-wrap-distance-left:9pt;mso-wrap-distance-top:0;mso-wrap-distance-right:9pt;mso-wrap-distance-bottom:0;mso-position-horizontal:absolute;mso-position-horizontal-relative:text;mso-position-vertical:absolute;mso-position-vertical-relative:text" o:gfxdata="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" strokecolor="#4472c4 [3204]" strokeweight=".5pt">
+                <v:stroke endarrow="block" joinstyle="miter"/>
+              </v:shape>
+            </w:pict>
+          </mc:Fallback>
+        </mc:AlternateContent>
+      </w:r>
+      <w:r>
+        <w:rPr>
+          <w:noProof/>
+        </w:rPr>
+        <mc:AlternateContent>
+          <mc:Choice Requires="wps">
+            <w:drawing>
+              <wp:anchor distT="0" distB="0" distL="114300" distR="114300" simplePos="0" relativeHeight="251664384" behindDoc="0" locked="0" layoutInCell="1" allowOverlap="1" wp14:anchorId="298A1B69" wp14:editId="3314EDC7">
+                <wp:simplePos x="0" y="0"/>
+                <wp:positionH relativeFrom="column">
+                  <wp:posOffset>3225991</wp:posOffset>
+                </wp:positionH>
+                <wp:positionV relativeFrom="paragraph">
+                  <wp:posOffset>580245</wp:posOffset>
+                </wp:positionV>
+                <wp:extent cx="992037" cy="491203"/>
+                <wp:effectExtent l="38100" t="0" r="17780" b="61595"/>
+                <wp:wrapNone/>
+                <wp:docPr id="46" name="Conector de Seta Reta 46"/>
+                <wp:cNvGraphicFramePr/>
+                <a:graphic xmlns:a="http://schemas.openxmlformats.org/drawingml/2006/main">
+                  <a:graphicData uri="http://schemas.microsoft.com/office/word/2010/wordprocessingShape">
+                    <wps:wsp>
+                      <wps:cNvCnPr/>
+                      <wps:spPr>
+                        <a:xfrm flipH="1">
+                          <a:off x="0" y="0"/>
+                          <a:ext cx="992037" cy="491203"/>
+                        </a:xfrm>
+                        <a:prstGeom prst="straightConnector1">
+                          <a:avLst/>
+                        </a:prstGeom>
+                        <a:ln>
+                          <a:tailEnd type="triangle"/>
+                        </a:ln>
+                      </wps:spPr>
+                      <wps:style>
+                        <a:lnRef idx="1">
+                          <a:schemeClr val="accent1"/>
+                        </a:lnRef>
+                        <a:fillRef idx="0">
+                          <a:schemeClr val="accent1"/>
+                        </a:fillRef>
+                        <a:effectRef idx="0">
+                          <a:schemeClr val="accent1"/>
+                        </a:effectRef>
+                        <a:fontRef idx="minor">
+                          <a:schemeClr val="tx1"/>
+                        </a:fontRef>
+                      </wps:style>
+                      <wps:bodyPr/>
+                    </wps:wsp>
+                  </a:graphicData>
+                </a:graphic>
+                <wp14:sizeRelH relativeFrom="margin">
+                  <wp14:pctWidth>0</wp14:pctWidth>
+                </wp14:sizeRelH>
+                <wp14:sizeRelV relativeFrom="margin">
+                  <wp14:pctHeight>0</wp14:pctHeight>
+                </wp14:sizeRelV>
+              </wp:anchor>
+            </w:drawing>
+          </mc:Choice>
+          <mc:Fallback>
+            <w:pict>
+              <v:shape w14:anchorId="568E2E53" id="Conector de Seta Reta 46" o:spid="_x0000_s1026" type="#_x0000_t32" style="position:absolute;margin-left:254pt;margin-top:45.7pt;width:78.1pt;height:38.7pt;flip:x;z-index:251664384;visibility:visible;mso-wrap-style:square;mso-width-percent:0;mso-height-percent:0;mso-wrap-distance-left:9pt;mso-wrap-distance-top:0;mso-wrap-distance-right:9pt;mso-wrap-distance-bottom:0;mso-position-horizontal:absolute;mso-position-horizontal-relative:text;mso-position-vertical:absolute;mso-position-vertical-relative:text;mso-width-percent:0;mso-height-percent:0;mso-width-relative:margin;mso-height-relative:margin" o:gfxdata="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" strokecolor="#4472c4 [3204]" strokeweight=".5pt">
+                <v:stroke endarrow="block" joinstyle="miter"/>
+              </v:shape>
+            </w:pict>
+          </mc:Fallback>
+        </mc:AlternateContent>
+      </w:r>
+      <w:r>
+        <w:drawing>
+          <wp:inline distT="0" distB="0" distL="0" distR="0" wp14:anchorId="62FF9312" wp14:editId="01B9FA33">
+            <wp:extent cx="3905795" cy="2305372"/>
+            <wp:effectExtent l="0" t="0" r="0" b="0"/>
+            <wp:docPr id="45" name="Imagem 45"/>
+            <wp:cNvGraphicFramePr>
+              <a:graphicFrameLocks xmlns:a="http://schemas.openxmlformats.org/drawingml/2006/main" noChangeAspect="1"/>
+            </wp:cNvGraphicFramePr>
+            <a:graphic xmlns:a="http://schemas.openxmlformats.org/drawingml/2006/main">
+              <a:graphicData uri="http://schemas.openxmlformats.org/drawingml/2006/picture">
+                <pic:pic xmlns:pic="http://schemas.openxmlformats.org/drawingml/2006/picture">
+                  <pic:nvPicPr>
+                    <pic:cNvPr id="1" name=""/>
+                    <pic:cNvPicPr/>
+                  </pic:nvPicPr>
+                  <pic:blipFill>
+                    <a:blip r:embed="rId49"/>
+                    <a:stretch>
+                      <a:fillRect/>
+                    </a:stretch>
+                  </pic:blipFill>
+                  <pic:spPr>
+                    <a:xfrm>
+                      <a:off x="0" y="0"/>
+                      <a:ext cx="3905795" cy="2305372"/>
+                    </a:xfrm>
+                    <a:prstGeom prst="rect">
+                      <a:avLst/>
+                    </a:prstGeom>
+                  </pic:spPr>
+                </pic:pic>
+              </a:graphicData>
+            </a:graphic>
+          </wp:inline>
+        </w:drawing>
+      </w:r>
+      <w:r>
+        <w:br/>
+      </w:r>
+    </w:p>
+    <w:p>
+      <w:r>
+        <w:t xml:space="preserve">26- </w:t>
+      </w:r>
+      <w:r>
+        <w:t>Para melhor o espaço entre os itens do menu utilizamos o seguinte código:</w:t>
+      </w:r>
+    </w:p>
+    <w:p>
+      <w:r>
+        <w:rPr>
+          <w:noProof/>
+        </w:rPr>
+        <mc:AlternateContent>
+          <mc:Choice Requires="wps">
+            <w:drawing>
+              <wp:anchor distT="0" distB="0" distL="114300" distR="114300" simplePos="0" relativeHeight="251667456" behindDoc="0" locked="0" layoutInCell="1" allowOverlap="1" wp14:anchorId="21E0BDCA" wp14:editId="0D914C38">
+                <wp:simplePos x="0" y="0"/>
+                <wp:positionH relativeFrom="column">
+                  <wp:posOffset>2786045</wp:posOffset>
+                </wp:positionH>
+                <wp:positionV relativeFrom="paragraph">
+                  <wp:posOffset>231452</wp:posOffset>
+                </wp:positionV>
+                <wp:extent cx="845388" cy="422694"/>
+                <wp:effectExtent l="38100" t="0" r="31115" b="53975"/>
+                <wp:wrapNone/>
+                <wp:docPr id="50" name="Conector de Seta Reta 50"/>
+                <wp:cNvGraphicFramePr/>
+                <a:graphic xmlns:a="http://schemas.openxmlformats.org/drawingml/2006/main">
+                  <a:graphicData uri="http://schemas.microsoft.com/office/word/2010/wordprocessingShape">
+                    <wps:wsp>
+                      <wps:cNvCnPr/>
+                      <wps:spPr>
+                        <a:xfrm flipH="1">
+                          <a:off x="0" y="0"/>
+                          <a:ext cx="845388" cy="422694"/>
+                        </a:xfrm>
+                        <a:prstGeom prst="straightConnector1">
+                          <a:avLst/>
+                        </a:prstGeom>
+                        <a:ln>
+                          <a:tailEnd type="triangle"/>
+                        </a:ln>
+                      </wps:spPr>
+                      <wps:style>
+                        <a:lnRef idx="1">
+                          <a:schemeClr val="accent1"/>
+                        </a:lnRef>
+                        <a:fillRef idx="0">
+                          <a:schemeClr val="accent1"/>
+                        </a:fillRef>
+                        <a:effectRef idx="0">
+                          <a:schemeClr val="accent1"/>
+                        </a:effectRef>
+                        <a:fontRef idx="minor">
+                          <a:schemeClr val="tx1"/>
+                        </a:fontRef>
+                      </wps:style>
+                      <wps:bodyPr/>
+                    </wps:wsp>
+                  </a:graphicData>
+                </a:graphic>
+              </wp:anchor>
+            </w:drawing>
+          </mc:Choice>
+          <mc:Fallback>
+            <w:pict>
+              <v:shape w14:anchorId="0AFCA08B" id="Conector de Seta Reta 50" o:spid="_x0000_s1026" type="#_x0000_t32" style="position:absolute;margin-left:219.35pt;margin-top:18.2pt;width:66.55pt;height:33.3pt;flip:x;z-index:251667456;visibility:visible;mso-wrap-style:square;mso-wrap-distance-left:9pt;mso-wrap-distance-top:0;mso-wrap-distance-right:9pt;mso-wrap-distance-bottom:0;mso-position-horizontal:absolute;mso-position-horizontal-relative:text;mso-position-vertical:absolute;mso-position-vertical-relative:text" o:gfxdata="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" strokecolor="#4472c4 [3204]" strokeweight=".5pt">
+                <v:stroke endarrow="block" joinstyle="miter"/>
+              </v:shape>
+            </w:pict>
+          </mc:Fallback>
+        </mc:AlternateContent>
+      </w:r>
+      <w:r>
+        <w:drawing>
+          <wp:inline distT="0" distB="0" distL="0" distR="0" wp14:anchorId="44E12AC9" wp14:editId="0D33279B">
+            <wp:extent cx="3667637" cy="1257475"/>
+            <wp:effectExtent l="0" t="0" r="9525" b="0"/>
+            <wp:docPr id="49" name="Imagem 49"/>
+            <wp:cNvGraphicFramePr>
+              <a:graphicFrameLocks xmlns:a="http://schemas.openxmlformats.org/drawingml/2006/main" noChangeAspect="1"/>
+            </wp:cNvGraphicFramePr>
+            <a:graphic xmlns:a="http://schemas.openxmlformats.org/drawingml/2006/main">
+              <a:graphicData uri="http://schemas.openxmlformats.org/drawingml/2006/picture">
+                <pic:pic xmlns:pic="http://schemas.openxmlformats.org/drawingml/2006/picture">
+                  <pic:nvPicPr>
+                    <pic:cNvPr id="1" name=""/>
+                    <pic:cNvPicPr/>
+                  </pic:nvPicPr>
+                  <pic:blipFill>
+                    <a:blip r:embed="rId50"/>
+                    <a:stretch>
+                      <a:fillRect/>
+                    </a:stretch>
+                  </pic:blipFill>
+                  <pic:spPr>
+                    <a:xfrm>
+                      <a:off x="0" y="0"/>
+                      <a:ext cx="3667637" cy="1257475"/>
+                    </a:xfrm>
+                    <a:prstGeom prst="rect">
+                      <a:avLst/>
+                    </a:prstGeom>
+                  </pic:spPr>
+                </pic:pic>
+              </a:graphicData>
+            </a:graphic>
+          </wp:inline>
+        </w:drawing>
+      </w:r>
+    </w:p>
+    <w:p>
+      <w:r>
+        <w:drawing>
+          <wp:inline distT="0" distB="0" distL="0" distR="0" wp14:anchorId="57A30D9C" wp14:editId="254DF8C2">
+            <wp:extent cx="5001323" cy="2610214"/>
+            <wp:effectExtent l="0" t="0" r="8890" b="0"/>
+            <wp:docPr id="51" name="Imagem 51"/>
+            <wp:cNvGraphicFramePr>
+              <a:graphicFrameLocks xmlns:a="http://schemas.openxmlformats.org/drawingml/2006/main" noChangeAspect="1"/>
+            </wp:cNvGraphicFramePr>
+            <a:graphic xmlns:a="http://schemas.openxmlformats.org/drawingml/2006/main">
+              <a:graphicData uri="http://schemas.openxmlformats.org/drawingml/2006/picture">
+                <pic:pic xmlns:pic="http://schemas.openxmlformats.org/drawingml/2006/picture">
+                  <pic:nvPicPr>
+                    <pic:cNvPr id="1" name=""/>
+                    <pic:cNvPicPr/>
+                  </pic:nvPicPr>
+                  <pic:blipFill>
+                    <a:blip r:embed="rId51"/>
+                    <a:stretch>
+                      <a:fillRect/>
+                    </a:stretch>
+                  </pic:blipFill>
+                  <pic:spPr>
+                    <a:xfrm>
+                      <a:off x="0" y="0"/>
+                      <a:ext cx="5001323" cy="2610214"/>
+                    </a:xfrm>
+                    <a:prstGeom prst="rect">
+                      <a:avLst/>
+                    </a:prstGeom>
+                  </pic:spPr>
+                </pic:pic>
+              </a:graphicData>
+            </a:graphic>
+          </wp:inline>
+        </w:drawing>
+      </w:r>
+    </w:p>
+    <w:p>
+      <w:r>
+        <w:t>27</w:t>
+      </w:r>
+      <w:r>
+        <w:t xml:space="preserve"> -  Para resetar o CSS do navegador utilizamos o </w:t>
+      </w:r>
+      <w:proofErr w:type="spellStart"/>
+      <w:r>
+        <w:t>reset.Css</w:t>
+      </w:r>
+      <w:proofErr w:type="spellEnd"/>
+      <w:r>
+        <w:t xml:space="preserve">  onde tiramos do seguinte site:</w:t>
+      </w:r>
+      <w:r>
+        <w:br/>
+      </w:r>
+      <w:hyperlink r:id="rId52" w:history="1">
+        <w:r>
+          <w:rPr>
+            <w:rStyle w:val="Hyperlink"/>
+          </w:rPr>
+          <w:t>https://meyerweb.com/eric/tools/css/reset/</w:t>
+        </w:r>
+      </w:hyperlink>
+      <w:r>
+        <w:t xml:space="preserve"> </w:t>
+      </w:r>
+    </w:p>
+    <w:p>
+      <w:r>
+        <w:drawing>
+          <wp:inline distT="0" distB="0" distL="0" distR="0" wp14:anchorId="76DC49C4" wp14:editId="7C06E514">
+            <wp:extent cx="3724795" cy="4105848"/>
+            <wp:effectExtent l="0" t="0" r="9525" b="9525"/>
+            <wp:docPr id="52" name="Imagem 52"/>
+            <wp:cNvGraphicFramePr>
+              <a:graphicFrameLocks xmlns:a="http://schemas.openxmlformats.org/drawingml/2006/main" noChangeAspect="1"/>
+            </wp:cNvGraphicFramePr>
+            <a:graphic xmlns:a="http://schemas.openxmlformats.org/drawingml/2006/main">
+              <a:graphicData uri="http://schemas.openxmlformats.org/drawingml/2006/picture">
+                <pic:pic xmlns:pic="http://schemas.openxmlformats.org/drawingml/2006/picture">
+                  <pic:nvPicPr>
+                    <pic:cNvPr id="1" name=""/>
+                    <pic:cNvPicPr/>
+                  </pic:nvPicPr>
+                  <pic:blipFill>
+                    <a:blip r:embed="rId53"/>
+                    <a:stretch>
+                      <a:fillRect/>
+                    </a:stretch>
+                  </pic:blipFill>
+                  <pic:spPr>
+                    <a:xfrm>
+                      <a:off x="0" y="0"/>
+                      <a:ext cx="3724795" cy="4105848"/>
+                    </a:xfrm>
+                    <a:prstGeom prst="rect">
+                      <a:avLst/>
+                    </a:prstGeom>
+                  </pic:spPr>
+                </pic:pic>
+              </a:graphicData>
+            </a:graphic>
+          </wp:inline>
+        </w:drawing>
+      </w:r>
+      <w:r>
+        <w:drawing>
+          <wp:inline distT="0" distB="0" distL="0" distR="0" wp14:anchorId="569ED869" wp14:editId="1819AE99">
+            <wp:extent cx="4964384" cy="2577272"/>
+            <wp:effectExtent l="0" t="0" r="8255" b="0"/>
+            <wp:docPr id="53" name="Imagem 53"/>
+            <wp:cNvGraphicFramePr>
+              <a:graphicFrameLocks xmlns:a="http://schemas.openxmlformats.org/drawingml/2006/main" noChangeAspect="1"/>
+            </wp:cNvGraphicFramePr>
+            <a:graphic xmlns:a="http://schemas.openxmlformats.org/drawingml/2006/main">
+              <a:graphicData uri="http://schemas.openxmlformats.org/drawingml/2006/picture">
+                <pic:pic xmlns:pic="http://schemas.openxmlformats.org/drawingml/2006/picture">
+                  <pic:nvPicPr>
+                    <pic:cNvPr id="1" name=""/>
+                    <pic:cNvPicPr/>
+                  </pic:nvPicPr>
+                  <pic:blipFill>
+                    <a:blip r:embed="rId54"/>
+                    <a:stretch>
+                      <a:fillRect/>
+                    </a:stretch>
+                  </pic:blipFill>
+                  <pic:spPr>
+                    <a:xfrm>
+                      <a:off x="0" y="0"/>
+                      <a:ext cx="5002994" cy="2597316"/>
+                    </a:xfrm>
+                    <a:prstGeom prst="rect">
+                      <a:avLst/>
+                    </a:prstGeom>
+                  </pic:spPr>
+                </pic:pic>
+              </a:graphicData>
+            </a:graphic>
+          </wp:inline>
+        </w:drawing>
+      </w:r>
+    </w:p>
+    <w:p>
+      <w:r>
+        <w:t>Criamos um arquivo chamado reset.css e adicionamos ao nosso site</w:t>
+      </w:r>
+      <w:r>
+        <w:t xml:space="preserve"> ele retirou todo o </w:t>
+      </w:r>
+      <w:proofErr w:type="spellStart"/>
+      <w:r>
+        <w:t>css</w:t>
+      </w:r>
+      <w:proofErr w:type="spellEnd"/>
+      <w:r>
+        <w:t xml:space="preserve"> do navegador deixando apenas o nosso </w:t>
+      </w:r>
+      <w:proofErr w:type="spellStart"/>
+      <w:r>
+        <w:t>css</w:t>
+      </w:r>
+      <w:proofErr w:type="spellEnd"/>
+      <w:r>
+        <w:t>.</w:t>
+      </w:r>
+    </w:p>
+    <w:p>
+      <w:r>
+        <w:drawing>
+          <wp:inline distT="0" distB="0" distL="0" distR="0" wp14:anchorId="1EBC974D" wp14:editId="44052B1B">
+            <wp:extent cx="9116697" cy="2410161"/>
+            <wp:effectExtent l="0" t="0" r="8255" b="9525"/>
+            <wp:docPr id="54" name="Imagem 54"/>
+            <wp:cNvGraphicFramePr>
+              <a:graphicFrameLocks xmlns:a="http://schemas.openxmlformats.org/drawingml/2006/main" noChangeAspect="1"/>
+            </wp:cNvGraphicFramePr>
+            <a:graphic xmlns:a="http://schemas.openxmlformats.org/drawingml/2006/main">
+              <a:graphicData uri="http://schemas.openxmlformats.org/drawingml/2006/picture">
+                <pic:pic xmlns:pic="http://schemas.openxmlformats.org/drawingml/2006/picture">
+                  <pic:nvPicPr>
+                    <pic:cNvPr id="1" name=""/>
+                    <pic:cNvPicPr/>
+                  </pic:nvPicPr>
+                  <pic:blipFill>
+                    <a:blip r:embed="rId55"/>
+                    <a:stretch>
+                      <a:fillRect/>
+                    </a:stretch>
+                  </pic:blipFill>
+                  <pic:spPr>
+                    <a:xfrm>
+                      <a:off x="0" y="0"/>
+                      <a:ext cx="9116697" cy="2410161"/>
+                    </a:xfrm>
+                    <a:prstGeom prst="rect">
+                      <a:avLst/>
+                    </a:prstGeom>
+                  </pic:spPr>
+                </pic:pic>
+              </a:graphicData>
+            </a:graphic>
+          </wp:inline>
+        </w:drawing>
+      </w:r>
+    </w:p>
+    <w:p>
+      <w:pPr>
+        <w:rPr>
+          <w:u w:val="single"/>
+        </w:rPr>
+      </w:pPr>
+      <w:proofErr w:type="spellStart"/>
+      <w:r>
+        <w:t>Obs</w:t>
+      </w:r>
+      <w:proofErr w:type="spellEnd"/>
+      <w:r>
+        <w:t xml:space="preserve">: O reset sempre tem que ficar em cima do nosso </w:t>
+      </w:r>
+      <w:proofErr w:type="spellStart"/>
+      <w:r>
+        <w:t>css</w:t>
+      </w:r>
+      <w:proofErr w:type="spellEnd"/>
+      <w:r>
+        <w:t xml:space="preserve"> senão ele ira resetar o </w:t>
+      </w:r>
+      <w:proofErr w:type="spellStart"/>
+      <w:r>
+        <w:t>css</w:t>
+      </w:r>
+      <w:proofErr w:type="spellEnd"/>
+      <w:r>
+        <w:t xml:space="preserve"> que estamos trabalhando em nossa página.</w:t>
+      </w:r>
       <w:bookmarkStart w:id="0" w:name="_GoBack"/>
       <w:bookmarkEnd w:id="0"/>
     </w:p>
+    <w:p/>
+    <w:p/>
+    <w:p/>
     <w:sectPr>
       <w:pgSz w:w="11906" w:h="16838"/>
       <w:pgMar w:top="1417" w:right="1701" w:bottom="1417" w:left="1701" w:header="708" w:footer="708" w:gutter="0"/>
@@ -2270,11 +3555,127 @@
       </w:rPr>
     </w:lvl>
   </w:abstractNum>
+  <w:abstractNum w:abstractNumId="2" w15:restartNumberingAfterBreak="0">
+    <w:nsid w:val="7A8B0754"/>
+    <w:multiLevelType w:val="hybridMultilevel"/>
+    <w:tmpl w:val="01DCCEC8"/>
+    <w:lvl w:ilvl="0" w:tplc="1B12EAE6">
+      <w:start w:val="25"/>
+      <w:numFmt w:val="bullet"/>
+      <w:lvlText w:val=""/>
+      <w:lvlJc w:val="left"/>
+      <w:pPr>
+        <w:ind w:left="720" w:hanging="360"/>
+      </w:pPr>
+      <w:rPr>
+        <w:rFonts w:ascii="Symbol" w:eastAsiaTheme="minorHAnsi" w:hAnsi="Symbol" w:cstheme="minorBidi" w:hint="default"/>
+      </w:rPr>
+    </w:lvl>
+    <w:lvl w:ilvl="1" w:tplc="04160003" w:tentative="1">
+      <w:start w:val="1"/>
+      <w:numFmt w:val="bullet"/>
+      <w:lvlText w:val="o"/>
+      <w:lvlJc w:val="left"/>
+      <w:pPr>
+        <w:ind w:left="1440" w:hanging="360"/>
+      </w:pPr>
+      <w:rPr>
+        <w:rFonts w:ascii="Courier New" w:hAnsi="Courier New" w:cs="Courier New" w:hint="default"/>
+      </w:rPr>
+    </w:lvl>
+    <w:lvl w:ilvl="2" w:tplc="04160005" w:tentative="1">
+      <w:start w:val="1"/>
+      <w:numFmt w:val="bullet"/>
+      <w:lvlText w:val=""/>
+      <w:lvlJc w:val="left"/>
+      <w:pPr>
+        <w:ind w:left="2160" w:hanging="360"/>
+      </w:pPr>
+      <w:rPr>
+        <w:rFonts w:ascii="Wingdings" w:hAnsi="Wingdings" w:hint="default"/>
+      </w:rPr>
+    </w:lvl>
+    <w:lvl w:ilvl="3" w:tplc="04160001" w:tentative="1">
+      <w:start w:val="1"/>
+      <w:numFmt w:val="bullet"/>
+      <w:lvlText w:val=""/>
+      <w:lvlJc w:val="left"/>
+      <w:pPr>
+        <w:ind w:left="2880" w:hanging="360"/>
+      </w:pPr>
+      <w:rPr>
+        <w:rFonts w:ascii="Symbol" w:hAnsi="Symbol" w:hint="default"/>
+      </w:rPr>
+    </w:lvl>
+    <w:lvl w:ilvl="4" w:tplc="04160003" w:tentative="1">
+      <w:start w:val="1"/>
+      <w:numFmt w:val="bullet"/>
+      <w:lvlText w:val="o"/>
+      <w:lvlJc w:val="left"/>
+      <w:pPr>
+        <w:ind w:left="3600" w:hanging="360"/>
+      </w:pPr>
+      <w:rPr>
+        <w:rFonts w:ascii="Courier New" w:hAnsi="Courier New" w:cs="Courier New" w:hint="default"/>
+      </w:rPr>
+    </w:lvl>
+    <w:lvl w:ilvl="5" w:tplc="04160005" w:tentative="1">
+      <w:start w:val="1"/>
+      <w:numFmt w:val="bullet"/>
+      <w:lvlText w:val=""/>
+      <w:lvlJc w:val="left"/>
+      <w:pPr>
+        <w:ind w:left="4320" w:hanging="360"/>
+      </w:pPr>
+      <w:rPr>
+        <w:rFonts w:ascii="Wingdings" w:hAnsi="Wingdings" w:hint="default"/>
+      </w:rPr>
+    </w:lvl>
+    <w:lvl w:ilvl="6" w:tplc="04160001" w:tentative="1">
+      <w:start w:val="1"/>
+      <w:numFmt w:val="bullet"/>
+      <w:lvlText w:val=""/>
+      <w:lvlJc w:val="left"/>
+      <w:pPr>
+        <w:ind w:left="5040" w:hanging="360"/>
+      </w:pPr>
+      <w:rPr>
+        <w:rFonts w:ascii="Symbol" w:hAnsi="Symbol" w:hint="default"/>
+      </w:rPr>
+    </w:lvl>
+    <w:lvl w:ilvl="7" w:tplc="04160003" w:tentative="1">
+      <w:start w:val="1"/>
+      <w:numFmt w:val="bullet"/>
+      <w:lvlText w:val="o"/>
+      <w:lvlJc w:val="left"/>
+      <w:pPr>
+        <w:ind w:left="5760" w:hanging="360"/>
+      </w:pPr>
+      <w:rPr>
+        <w:rFonts w:ascii="Courier New" w:hAnsi="Courier New" w:cs="Courier New" w:hint="default"/>
+      </w:rPr>
+    </w:lvl>
+    <w:lvl w:ilvl="8" w:tplc="04160005" w:tentative="1">
+      <w:start w:val="1"/>
+      <w:numFmt w:val="bullet"/>
+      <w:lvlText w:val=""/>
+      <w:lvlJc w:val="left"/>
+      <w:pPr>
+        <w:ind w:left="6480" w:hanging="360"/>
+      </w:pPr>
+      <w:rPr>
+        <w:rFonts w:ascii="Wingdings" w:hAnsi="Wingdings" w:hint="default"/>
+      </w:rPr>
+    </w:lvl>
+  </w:abstractNum>
   <w:num w:numId="1">
     <w:abstractNumId w:val="1"/>
   </w:num>
   <w:num w:numId="2">
     <w:abstractNumId w:val="0"/>
+  </w:num>
+  <w:num w:numId="3">
+    <w:abstractNumId w:val="2"/>
   </w:num>
 </w:numbering>
 </file>
@@ -3276,20 +4677,20 @@
 </file>
 
 <file path=customXml/item2.xml><?xml version="1.0" encoding="utf-8"?>
-<p:properties xmlns:p="http://schemas.microsoft.com/office/2006/metadata/properties" xmlns:xsi="http://www.w3.org/2001/XMLSchema-instance" xmlns:pc="http://schemas.microsoft.com/office/infopath/2007/PartnerControls">
-  <documentManagement>
-    <_activity xmlns="8437a765-f0a9-40aa-978b-fcc06261281f" xsi:nil="true"/>
-  </documentManagement>
-</p:properties>
-</file>
-
-<file path=customXml/item3.xml><?xml version="1.0" encoding="utf-8"?>
 <?mso-contentType ?>
 <FormTemplates xmlns="http://schemas.microsoft.com/sharepoint/v3/contenttype/forms">
   <Display>DocumentLibraryForm</Display>
   <Edit>DocumentLibraryForm</Edit>
   <New>DocumentLibraryForm</New>
 </FormTemplates>
+</file>
+
+<file path=customXml/item3.xml><?xml version="1.0" encoding="utf-8"?>
+<p:properties xmlns:p="http://schemas.microsoft.com/office/2006/metadata/properties" xmlns:xsi="http://www.w3.org/2001/XMLSchema-instance" xmlns:pc="http://schemas.microsoft.com/office/infopath/2007/PartnerControls">
+  <documentManagement>
+    <_activity xmlns="8437a765-f0a9-40aa-978b-fcc06261281f" xsi:nil="true"/>
+  </documentManagement>
+</p:properties>
 </file>
 
 <file path=customXml/item4.xml><?xml version="1.0" encoding="utf-8"?>
@@ -3316,6 +4717,14 @@
 </file>
 
 <file path=customXml/itemProps2.xml><?xml version="1.0" encoding="utf-8"?>
+<ds:datastoreItem xmlns:ds="http://schemas.openxmlformats.org/officeDocument/2006/customXml" ds:itemID="{38630907-5F1E-4561-A45F-AC7CC415CD73}">
+  <ds:schemaRefs>
+    <ds:schemaRef ds:uri="http://schemas.microsoft.com/sharepoint/v3/contenttype/forms"/>
+  </ds:schemaRefs>
+</ds:datastoreItem>
+</file>
+
+<file path=customXml/itemProps3.xml><?xml version="1.0" encoding="utf-8"?>
 <ds:datastoreItem xmlns:ds="http://schemas.openxmlformats.org/officeDocument/2006/customXml" ds:itemID="{0C9FFCBC-F2CA-4FF1-AAFC-AD3B89BB1967}">
   <ds:schemaRefs>
     <ds:schemaRef ds:uri="http://schemas.microsoft.com/office/2006/metadata/properties"/>
@@ -3325,16 +4734,8 @@
 </ds:datastoreItem>
 </file>
 
-<file path=customXml/itemProps3.xml><?xml version="1.0" encoding="utf-8"?>
-<ds:datastoreItem xmlns:ds="http://schemas.openxmlformats.org/officeDocument/2006/customXml" ds:itemID="{38630907-5F1E-4561-A45F-AC7CC415CD73}">
-  <ds:schemaRefs>
-    <ds:schemaRef ds:uri="http://schemas.microsoft.com/sharepoint/v3/contenttype/forms"/>
-  </ds:schemaRefs>
-</ds:datastoreItem>
-</file>
-
 <file path=customXml/itemProps4.xml><?xml version="1.0" encoding="utf-8"?>
-<ds:datastoreItem xmlns:ds="http://schemas.openxmlformats.org/officeDocument/2006/customXml" ds:itemID="{260C1F3C-1F19-4957-96F7-43B64847CBE1}">
+<ds:datastoreItem xmlns:ds="http://schemas.openxmlformats.org/officeDocument/2006/customXml" ds:itemID="{283F24CB-B8B5-485B-8815-E0B8508F75F8}">
   <ds:schemaRefs>
     <ds:schemaRef ds:uri="http://schemas.openxmlformats.org/officeDocument/2006/bibliography"/>
   </ds:schemaRefs>

</xml_diff>

<commit_message>
atualização da aula do dia 01/09/2026
</commit_message>
<xml_diff>
--- a/apostila/Projeto Space for me3.docx
+++ b/apostila/Projeto Space for me3.docx
@@ -2107,6 +2107,9 @@
     </w:p>
     <w:p>
       <w:r>
+        <w:rPr>
+          <w:noProof/>
+        </w:rPr>
         <w:drawing>
           <wp:inline distT="0" distB="0" distL="0" distR="0" wp14:anchorId="30EAB16F" wp14:editId="36A5BF93">
             <wp:extent cx="2676899" cy="2772162"/>
@@ -2146,6 +2149,9 @@
     </w:p>
     <w:p>
       <w:r>
+        <w:rPr>
+          <w:noProof/>
+        </w:rPr>
         <w:drawing>
           <wp:inline distT="0" distB="0" distL="0" distR="0" wp14:anchorId="791B7A8C" wp14:editId="2E394220">
             <wp:extent cx="8449854" cy="1648055"/>
@@ -2213,6 +2219,9 @@
     <w:p/>
     <w:p>
       <w:r>
+        <w:rPr>
+          <w:noProof/>
+        </w:rPr>
         <w:drawing>
           <wp:inline distT="0" distB="0" distL="0" distR="0" wp14:anchorId="3CC0FDBD" wp14:editId="52D30850">
             <wp:extent cx="6335009" cy="2476846"/>
@@ -2298,6 +2307,9 @@
     <w:p/>
     <w:p>
       <w:r>
+        <w:rPr>
+          <w:noProof/>
+        </w:rPr>
         <w:drawing>
           <wp:inline distT="0" distB="0" distL="0" distR="0" wp14:anchorId="0CEB1699" wp14:editId="31CEAEDE">
             <wp:extent cx="4315427" cy="1533739"/>
@@ -2337,6 +2349,9 @@
     </w:p>
     <w:p>
       <w:r>
+        <w:rPr>
+          <w:noProof/>
+        </w:rPr>
         <w:drawing>
           <wp:inline distT="0" distB="0" distL="0" distR="0" wp14:anchorId="09543AAE" wp14:editId="7F5BC8CD">
             <wp:extent cx="5696745" cy="2800741"/>
@@ -2403,6 +2418,9 @@
     <w:p/>
     <w:p>
       <w:r>
+        <w:rPr>
+          <w:noProof/>
+        </w:rPr>
         <w:drawing>
           <wp:inline distT="0" distB="0" distL="0" distR="0" wp14:anchorId="374C27A8" wp14:editId="7F9A2607">
             <wp:extent cx="6506483" cy="2467319"/>
@@ -2463,7 +2481,15 @@
       </w:r>
       <w:proofErr w:type="spellEnd"/>
       <w:r>
-        <w:t xml:space="preserve"> por referencia  ou seja no nosso site a onde tive </w:t>
+        <w:t xml:space="preserve"> por </w:t>
+      </w:r>
+      <w:proofErr w:type="spellStart"/>
+      <w:r>
+        <w:t>referencia</w:t>
+      </w:r>
+      <w:proofErr w:type="spellEnd"/>
+      <w:r>
+        <w:t xml:space="preserve">  ou seja no nosso site a onde tive </w:t>
       </w:r>
       <w:proofErr w:type="spellStart"/>
       <w:r>
@@ -2492,6 +2518,9 @@
     </w:p>
     <w:p>
       <w:r>
+        <w:rPr>
+          <w:noProof/>
+        </w:rPr>
         <w:drawing>
           <wp:inline distT="0" distB="0" distL="0" distR="0" wp14:anchorId="784003FF" wp14:editId="4AE65089">
             <wp:extent cx="2953162" cy="1362265"/>
@@ -2529,6 +2558,9 @@
         </w:drawing>
       </w:r>
       <w:r>
+        <w:rPr>
+          <w:noProof/>
+        </w:rPr>
         <w:drawing>
           <wp:inline distT="0" distB="0" distL="0" distR="0" wp14:anchorId="2ED0847B" wp14:editId="10772825">
             <wp:extent cx="2743583" cy="2534004"/>
@@ -2582,7 +2614,15 @@
         <w:t xml:space="preserve"> para todo o texto fique </w:t>
       </w:r>
       <w:r>
-        <w:t xml:space="preserve">em letras maiúsculas e utilizamos a referencia do </w:t>
+        <w:t xml:space="preserve">em letras maiúsculas e utilizamos a </w:t>
+      </w:r>
+      <w:proofErr w:type="spellStart"/>
+      <w:r>
+        <w:t>referencia</w:t>
+      </w:r>
+      <w:proofErr w:type="spellEnd"/>
+      <w:r>
+        <w:t xml:space="preserve"> do </w:t>
       </w:r>
       <w:proofErr w:type="spellStart"/>
       <w:r>
@@ -2605,6 +2645,9 @@
     <w:p/>
     <w:p>
       <w:r>
+        <w:rPr>
+          <w:noProof/>
+        </w:rPr>
         <w:drawing>
           <wp:inline distT="0" distB="0" distL="0" distR="0" wp14:anchorId="206E3863" wp14:editId="3F75E5B6">
             <wp:extent cx="4248743" cy="1781424"/>
@@ -2920,6 +2963,9 @@
         </mc:AlternateContent>
       </w:r>
       <w:r>
+        <w:rPr>
+          <w:noProof/>
+        </w:rPr>
         <w:drawing>
           <wp:inline distT="0" distB="0" distL="0" distR="0" wp14:anchorId="62FF9312" wp14:editId="01B9FA33">
             <wp:extent cx="3905795" cy="2305372"/>
@@ -3036,6 +3082,9 @@
         </mc:AlternateContent>
       </w:r>
       <w:r>
+        <w:rPr>
+          <w:noProof/>
+        </w:rPr>
         <w:drawing>
           <wp:inline distT="0" distB="0" distL="0" distR="0" wp14:anchorId="44E12AC9" wp14:editId="0D33279B">
             <wp:extent cx="3667637" cy="1257475"/>
@@ -3075,6 +3124,9 @@
     </w:p>
     <w:p>
       <w:r>
+        <w:rPr>
+          <w:noProof/>
+        </w:rPr>
         <w:drawing>
           <wp:inline distT="0" distB="0" distL="0" distR="0" wp14:anchorId="57A30D9C" wp14:editId="254DF8C2">
             <wp:extent cx="5001323" cy="2610214"/>
@@ -3144,6 +3196,9 @@
     </w:p>
     <w:p>
       <w:r>
+        <w:rPr>
+          <w:noProof/>
+        </w:rPr>
         <w:drawing>
           <wp:inline distT="0" distB="0" distL="0" distR="0" wp14:anchorId="76DC49C4" wp14:editId="7C06E514">
             <wp:extent cx="3724795" cy="4105848"/>
@@ -3181,6 +3236,9 @@
         </w:drawing>
       </w:r>
       <w:r>
+        <w:rPr>
+          <w:noProof/>
+        </w:rPr>
         <w:drawing>
           <wp:inline distT="0" distB="0" distL="0" distR="0" wp14:anchorId="569ED869" wp14:editId="1819AE99">
             <wp:extent cx="4964384" cy="2577272"/>
@@ -3244,6 +3302,9 @@
     </w:p>
     <w:p>
       <w:r>
+        <w:rPr>
+          <w:noProof/>
+        </w:rPr>
         <w:drawing>
           <wp:inline distT="0" distB="0" distL="0" distR="0" wp14:anchorId="1EBC974D" wp14:editId="44052B1B">
             <wp:extent cx="9116697" cy="2410161"/>
@@ -3282,41 +3343,917 @@
       </w:r>
     </w:p>
     <w:p>
+      <w:proofErr w:type="spellStart"/>
+      <w:r>
+        <w:t>Obs</w:t>
+      </w:r>
+      <w:proofErr w:type="spellEnd"/>
+      <w:r>
+        <w:t xml:space="preserve">: O reset sempre tem que ficar em cima do nosso </w:t>
+      </w:r>
+      <w:proofErr w:type="spellStart"/>
+      <w:r>
+        <w:t>css</w:t>
+      </w:r>
+      <w:proofErr w:type="spellEnd"/>
+      <w:r>
+        <w:t xml:space="preserve"> senão ele </w:t>
+      </w:r>
+      <w:r>
+        <w:t>irá</w:t>
+      </w:r>
+      <w:r>
+        <w:t xml:space="preserve"> resetar o </w:t>
+      </w:r>
+      <w:proofErr w:type="spellStart"/>
+      <w:r>
+        <w:t>css</w:t>
+      </w:r>
+      <w:proofErr w:type="spellEnd"/>
+      <w:r>
+        <w:t xml:space="preserve"> que estamos trabalhando em nossa página.</w:t>
+      </w:r>
+    </w:p>
+    <w:p>
       <w:pPr>
         <w:rPr>
           <w:u w:val="single"/>
         </w:rPr>
       </w:pPr>
-      <w:proofErr w:type="spellStart"/>
-      <w:r>
-        <w:t>Obs</w:t>
-      </w:r>
-      <w:proofErr w:type="spellEnd"/>
-      <w:r>
-        <w:t xml:space="preserve">: O reset sempre tem que ficar em cima do nosso </w:t>
-      </w:r>
-      <w:proofErr w:type="spellStart"/>
-      <w:r>
-        <w:t>css</w:t>
-      </w:r>
-      <w:proofErr w:type="spellEnd"/>
-      <w:r>
-        <w:t xml:space="preserve"> senão ele ira resetar o </w:t>
-      </w:r>
-      <w:proofErr w:type="spellStart"/>
-      <w:r>
-        <w:t>css</w:t>
-      </w:r>
-      <w:proofErr w:type="spellEnd"/>
-      <w:r>
-        <w:t xml:space="preserve"> que estamos trabalhando em nossa página.</w:t>
-      </w:r>
+    </w:p>
+    <w:p>
+      <w:pPr>
+        <w:jc w:val="center"/>
+        <w:rPr>
+          <w:u w:val="single"/>
+        </w:rPr>
+      </w:pPr>
+    </w:p>
+    <w:p>
+      <w:pPr>
+        <w:jc w:val="center"/>
+      </w:pPr>
+      <w:r>
+        <w:t>28 – Trabalhando com posicionamento</w:t>
+      </w:r>
+    </w:p>
+    <w:p>
+      <w:r>
+        <w:t xml:space="preserve">Queremos centralizar o nosso menu e a imagem dentro do header para </w:t>
+      </w:r>
+      <w:r>
+        <w:t>vimos 3 tipos de posicionamento:</w:t>
+      </w:r>
+      <w:r>
+        <w:br/>
+      </w:r>
+      <w:r>
+        <w:br/>
+      </w:r>
+      <w:proofErr w:type="spellStart"/>
+      <w:r>
+        <w:t>Static</w:t>
+      </w:r>
+      <w:proofErr w:type="spellEnd"/>
+      <w:r>
+        <w:t>: Ele fica fixo na posição de orig</w:t>
+      </w:r>
+      <w:r>
+        <w:t>em.</w:t>
+      </w:r>
+    </w:p>
+    <w:p>
+      <w:proofErr w:type="spellStart"/>
+      <w:r>
+        <w:t>Relative</w:t>
+      </w:r>
+      <w:proofErr w:type="spellEnd"/>
+      <w:r>
+        <w:t>: Ele anda conforme sua posição original.</w:t>
+      </w:r>
+    </w:p>
+    <w:p>
+      <w:proofErr w:type="spellStart"/>
+      <w:r>
+        <w:t>Absolute</w:t>
+      </w:r>
+      <w:proofErr w:type="spellEnd"/>
+      <w:r>
+        <w:t>: Ele anda conforme a posição a</w:t>
+      </w:r>
+      <w:r>
+        <w:t>b</w:t>
+      </w:r>
+      <w:r>
+        <w:t>soluta do site.</w:t>
+      </w:r>
+    </w:p>
+    <w:p/>
+    <w:p>
+      <w:r>
+        <w:t>29</w:t>
+      </w:r>
+      <w:r>
+        <w:t xml:space="preserve"> – Ao centralizar a altura do menu dentro do header utilizamos o </w:t>
+      </w:r>
+      <w:r>
+        <w:t xml:space="preserve">inspecionador de código </w:t>
+      </w:r>
+      <w:r>
+        <w:t xml:space="preserve">ou </w:t>
+      </w:r>
+      <w:proofErr w:type="spellStart"/>
+      <w:r>
+        <w:t>devtool</w:t>
+      </w:r>
+      <w:proofErr w:type="spellEnd"/>
+      <w:r>
+        <w:t xml:space="preserve"> para saber a altura do elemento dentro do header apertando o f12</w:t>
+      </w:r>
+    </w:p>
+    <w:p>
+      <w:r>
+        <w:rPr>
+          <w:noProof/>
+        </w:rPr>
+        <mc:AlternateContent>
+          <mc:Choice Requires="wps">
+            <w:drawing>
+              <wp:anchor distT="0" distB="0" distL="114300" distR="114300" simplePos="0" relativeHeight="251668480" behindDoc="0" locked="0" layoutInCell="1" allowOverlap="1" wp14:anchorId="038B31BF" wp14:editId="3B42A9C6">
+                <wp:simplePos x="0" y="0"/>
+                <wp:positionH relativeFrom="column">
+                  <wp:posOffset>1257300</wp:posOffset>
+                </wp:positionH>
+                <wp:positionV relativeFrom="paragraph">
+                  <wp:posOffset>136525</wp:posOffset>
+                </wp:positionV>
+                <wp:extent cx="1114425" cy="1371600"/>
+                <wp:effectExtent l="38100" t="0" r="28575" b="57150"/>
+                <wp:wrapNone/>
+                <wp:docPr id="56" name="Conector de Seta Reta 56"/>
+                <wp:cNvGraphicFramePr/>
+                <a:graphic xmlns:a="http://schemas.openxmlformats.org/drawingml/2006/main">
+                  <a:graphicData uri="http://schemas.microsoft.com/office/word/2010/wordprocessingShape">
+                    <wps:wsp>
+                      <wps:cNvCnPr/>
+                      <wps:spPr>
+                        <a:xfrm flipH="1">
+                          <a:off x="0" y="0"/>
+                          <a:ext cx="1114425" cy="1371600"/>
+                        </a:xfrm>
+                        <a:prstGeom prst="straightConnector1">
+                          <a:avLst/>
+                        </a:prstGeom>
+                        <a:ln>
+                          <a:tailEnd type="triangle"/>
+                        </a:ln>
+                      </wps:spPr>
+                      <wps:style>
+                        <a:lnRef idx="1">
+                          <a:schemeClr val="accent1"/>
+                        </a:lnRef>
+                        <a:fillRef idx="0">
+                          <a:schemeClr val="accent1"/>
+                        </a:fillRef>
+                        <a:effectRef idx="0">
+                          <a:schemeClr val="accent1"/>
+                        </a:effectRef>
+                        <a:fontRef idx="minor">
+                          <a:schemeClr val="tx1"/>
+                        </a:fontRef>
+                      </wps:style>
+                      <wps:bodyPr/>
+                    </wps:wsp>
+                  </a:graphicData>
+                </a:graphic>
+              </wp:anchor>
+            </w:drawing>
+          </mc:Choice>
+          <mc:Fallback>
+            <w:pict>
+              <v:shapetype w14:anchorId="3E7A4585" id="_x0000_t32" coordsize="21600,21600" o:spt="32" o:oned="t" path="m,l21600,21600e" filled="f">
+                <v:path arrowok="t" fillok="f" o:connecttype="none"/>
+                <o:lock v:ext="edit" shapetype="t"/>
+              </v:shapetype>
+              <v:shape id="Conector de Seta Reta 56" o:spid="_x0000_s1026" type="#_x0000_t32" style="position:absolute;margin-left:99pt;margin-top:10.75pt;width:87.75pt;height:108pt;flip:x;z-index:251668480;visibility:visible;mso-wrap-style:square;mso-wrap-distance-left:9pt;mso-wrap-distance-top:0;mso-wrap-distance-right:9pt;mso-wrap-distance-bottom:0;mso-position-horizontal:absolute;mso-position-horizontal-relative:text;mso-position-vertical:absolute;mso-position-vertical-relative:text" o:gfxdata="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" strokecolor="#4472c4 [3204]" strokeweight=".5pt">
+                <v:stroke endarrow="block" joinstyle="miter"/>
+              </v:shape>
+            </w:pict>
+          </mc:Fallback>
+        </mc:AlternateContent>
+      </w:r>
+      <w:r>
+        <w:drawing>
+          <wp:inline distT="0" distB="0" distL="0" distR="0" wp14:anchorId="6E770DDD" wp14:editId="2F5DE36E">
+            <wp:extent cx="5193665" cy="2897731"/>
+            <wp:effectExtent l="0" t="0" r="6985" b="0"/>
+            <wp:docPr id="55" name="Imagem 55"/>
+            <wp:cNvGraphicFramePr>
+              <a:graphicFrameLocks xmlns:a="http://schemas.openxmlformats.org/drawingml/2006/main" noChangeAspect="1"/>
+            </wp:cNvGraphicFramePr>
+            <a:graphic xmlns:a="http://schemas.openxmlformats.org/drawingml/2006/main">
+              <a:graphicData uri="http://schemas.openxmlformats.org/drawingml/2006/picture">
+                <pic:pic xmlns:pic="http://schemas.openxmlformats.org/drawingml/2006/picture">
+                  <pic:nvPicPr>
+                    <pic:cNvPr id="1" name=""/>
+                    <pic:cNvPicPr/>
+                  </pic:nvPicPr>
+                  <pic:blipFill>
+                    <a:blip r:embed="rId56"/>
+                    <a:stretch>
+                      <a:fillRect/>
+                    </a:stretch>
+                  </pic:blipFill>
+                  <pic:spPr>
+                    <a:xfrm>
+                      <a:off x="0" y="0"/>
+                      <a:ext cx="5230466" cy="2918264"/>
+                    </a:xfrm>
+                    <a:prstGeom prst="rect">
+                      <a:avLst/>
+                    </a:prstGeom>
+                  </pic:spPr>
+                </pic:pic>
+              </a:graphicData>
+            </a:graphic>
+          </wp:inline>
+        </w:drawing>
+      </w:r>
+      <w:r>
+        <w:t xml:space="preserve"> </w:t>
+      </w:r>
+    </w:p>
+    <w:p>
+      <w:r>
+        <w:rPr>
+          <w:noProof/>
+        </w:rPr>
+        <mc:AlternateContent>
+          <mc:Choice Requires="wps">
+            <w:drawing>
+              <wp:anchor distT="0" distB="0" distL="114300" distR="114300" simplePos="0" relativeHeight="251669504" behindDoc="0" locked="0" layoutInCell="1" allowOverlap="1" wp14:anchorId="2C6CFF9A" wp14:editId="7BAA946B">
+                <wp:simplePos x="0" y="0"/>
+                <wp:positionH relativeFrom="column">
+                  <wp:posOffset>1609724</wp:posOffset>
+                </wp:positionH>
+                <wp:positionV relativeFrom="paragraph">
+                  <wp:posOffset>357505</wp:posOffset>
+                </wp:positionV>
+                <wp:extent cx="1971675" cy="990600"/>
+                <wp:effectExtent l="38100" t="0" r="28575" b="57150"/>
+                <wp:wrapNone/>
+                <wp:docPr id="58" name="Conector de Seta Reta 58"/>
+                <wp:cNvGraphicFramePr/>
+                <a:graphic xmlns:a="http://schemas.openxmlformats.org/drawingml/2006/main">
+                  <a:graphicData uri="http://schemas.microsoft.com/office/word/2010/wordprocessingShape">
+                    <wps:wsp>
+                      <wps:cNvCnPr/>
+                      <wps:spPr>
+                        <a:xfrm flipH="1">
+                          <a:off x="0" y="0"/>
+                          <a:ext cx="1971675" cy="990600"/>
+                        </a:xfrm>
+                        <a:prstGeom prst="straightConnector1">
+                          <a:avLst/>
+                        </a:prstGeom>
+                        <a:ln>
+                          <a:tailEnd type="triangle"/>
+                        </a:ln>
+                      </wps:spPr>
+                      <wps:style>
+                        <a:lnRef idx="1">
+                          <a:schemeClr val="accent1"/>
+                        </a:lnRef>
+                        <a:fillRef idx="0">
+                          <a:schemeClr val="accent1"/>
+                        </a:fillRef>
+                        <a:effectRef idx="0">
+                          <a:schemeClr val="accent1"/>
+                        </a:effectRef>
+                        <a:fontRef idx="minor">
+                          <a:schemeClr val="tx1"/>
+                        </a:fontRef>
+                      </wps:style>
+                      <wps:bodyPr/>
+                    </wps:wsp>
+                  </a:graphicData>
+                </a:graphic>
+                <wp14:sizeRelH relativeFrom="margin">
+                  <wp14:pctWidth>0</wp14:pctWidth>
+                </wp14:sizeRelH>
+                <wp14:sizeRelV relativeFrom="margin">
+                  <wp14:pctHeight>0</wp14:pctHeight>
+                </wp14:sizeRelV>
+              </wp:anchor>
+            </w:drawing>
+          </mc:Choice>
+          <mc:Fallback>
+            <w:pict>
+              <v:shape w14:anchorId="52AE6D20" id="Conector de Seta Reta 58" o:spid="_x0000_s1026" type="#_x0000_t32" style="position:absolute;margin-left:126.75pt;margin-top:28.15pt;width:155.25pt;height:78pt;flip:x;z-index:251669504;visibility:visible;mso-wrap-style:square;mso-width-percent:0;mso-height-percent:0;mso-wrap-distance-left:9pt;mso-wrap-distance-top:0;mso-wrap-distance-right:9pt;mso-wrap-distance-bottom:0;mso-position-horizontal:absolute;mso-position-horizontal-relative:text;mso-position-vertical:absolute;mso-position-vertical-relative:text;mso-width-percent:0;mso-height-percent:0;mso-width-relative:margin;mso-height-relative:margin" o:gfxdata="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" strokecolor="#4472c4 [3204]" strokeweight=".5pt">
+                <v:stroke endarrow="block" joinstyle="miter"/>
+              </v:shape>
+            </w:pict>
+          </mc:Fallback>
+        </mc:AlternateContent>
+      </w:r>
+      <w:r>
+        <w:t>Conforme imagem acima verificamos que é 253px   a altura do header então divi</w:t>
+      </w:r>
+      <w:r>
+        <w:t xml:space="preserve">dimos esse valor  e colocamos em nosso código 126px </w:t>
+      </w:r>
+    </w:p>
+    <w:p>
+      <w:r>
+        <w:rPr>
+          <w:noProof/>
+        </w:rPr>
+        <mc:AlternateContent>
+          <mc:Choice Requires="wps">
+            <w:drawing>
+              <wp:anchor distT="0" distB="0" distL="114300" distR="114300" simplePos="0" relativeHeight="251670528" behindDoc="0" locked="0" layoutInCell="1" allowOverlap="1" wp14:anchorId="3BADD80B" wp14:editId="4B713363">
+                <wp:simplePos x="0" y="0"/>
+                <wp:positionH relativeFrom="column">
+                  <wp:posOffset>10858500</wp:posOffset>
+                </wp:positionH>
+                <wp:positionV relativeFrom="paragraph">
+                  <wp:posOffset>985520</wp:posOffset>
+                </wp:positionV>
+                <wp:extent cx="19050" cy="390525"/>
+                <wp:effectExtent l="57150" t="0" r="57150" b="47625"/>
+                <wp:wrapNone/>
+                <wp:docPr id="60" name="Conector de Seta Reta 60"/>
+                <wp:cNvGraphicFramePr/>
+                <a:graphic xmlns:a="http://schemas.openxmlformats.org/drawingml/2006/main">
+                  <a:graphicData uri="http://schemas.microsoft.com/office/word/2010/wordprocessingShape">
+                    <wps:wsp>
+                      <wps:cNvCnPr/>
+                      <wps:spPr>
+                        <a:xfrm>
+                          <a:off x="0" y="0"/>
+                          <a:ext cx="19050" cy="390525"/>
+                        </a:xfrm>
+                        <a:prstGeom prst="straightConnector1">
+                          <a:avLst/>
+                        </a:prstGeom>
+                        <a:ln>
+                          <a:tailEnd type="triangle"/>
+                        </a:ln>
+                      </wps:spPr>
+                      <wps:style>
+                        <a:lnRef idx="1">
+                          <a:schemeClr val="accent1"/>
+                        </a:lnRef>
+                        <a:fillRef idx="0">
+                          <a:schemeClr val="accent1"/>
+                        </a:fillRef>
+                        <a:effectRef idx="0">
+                          <a:schemeClr val="accent1"/>
+                        </a:effectRef>
+                        <a:fontRef idx="minor">
+                          <a:schemeClr val="tx1"/>
+                        </a:fontRef>
+                      </wps:style>
+                      <wps:bodyPr/>
+                    </wps:wsp>
+                  </a:graphicData>
+                </a:graphic>
+              </wp:anchor>
+            </w:drawing>
+          </mc:Choice>
+          <mc:Fallback>
+            <w:pict>
+              <v:shape w14:anchorId="3C34EEF6" id="Conector de Seta Reta 60" o:spid="_x0000_s1026" type="#_x0000_t32" style="position:absolute;margin-left:855pt;margin-top:77.6pt;width:1.5pt;height:30.75pt;z-index:251670528;visibility:visible;mso-wrap-style:square;mso-wrap-distance-left:9pt;mso-wrap-distance-top:0;mso-wrap-distance-right:9pt;mso-wrap-distance-bottom:0;mso-position-horizontal:absolute;mso-position-horizontal-relative:text;mso-position-vertical:absolute;mso-position-vertical-relative:text" o:gfxdata="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" strokecolor="#4472c4 [3204]" strokeweight=".5pt">
+                <v:stroke endarrow="block" joinstyle="miter"/>
+              </v:shape>
+            </w:pict>
+          </mc:Fallback>
+        </mc:AlternateContent>
+      </w:r>
+      <w:r>
+        <w:drawing>
+          <wp:inline distT="0" distB="0" distL="0" distR="0" wp14:anchorId="6F447F1C" wp14:editId="671FB30E">
+            <wp:extent cx="3638550" cy="1952625"/>
+            <wp:effectExtent l="0" t="0" r="0" b="9525"/>
+            <wp:docPr id="57" name="Imagem 57"/>
+            <wp:cNvGraphicFramePr>
+              <a:graphicFrameLocks xmlns:a="http://schemas.openxmlformats.org/drawingml/2006/main" noChangeAspect="1"/>
+            </wp:cNvGraphicFramePr>
+            <a:graphic xmlns:a="http://schemas.openxmlformats.org/drawingml/2006/main">
+              <a:graphicData uri="http://schemas.openxmlformats.org/drawingml/2006/picture">
+                <pic:pic xmlns:pic="http://schemas.openxmlformats.org/drawingml/2006/picture">
+                  <pic:nvPicPr>
+                    <pic:cNvPr id="1" name=""/>
+                    <pic:cNvPicPr/>
+                  </pic:nvPicPr>
+                  <pic:blipFill>
+                    <a:blip r:embed="rId57"/>
+                    <a:stretch>
+                      <a:fillRect/>
+                    </a:stretch>
+                  </pic:blipFill>
+                  <pic:spPr>
+                    <a:xfrm>
+                      <a:off x="0" y="0"/>
+                      <a:ext cx="3639064" cy="1952901"/>
+                    </a:xfrm>
+                    <a:prstGeom prst="rect">
+                      <a:avLst/>
+                    </a:prstGeom>
+                  </pic:spPr>
+                </pic:pic>
+              </a:graphicData>
+            </a:graphic>
+          </wp:inline>
+        </w:drawing>
+      </w:r>
+      <w:r>
+        <w:drawing>
+          <wp:inline distT="0" distB="0" distL="0" distR="0" wp14:anchorId="7B73A903" wp14:editId="2FA6B944">
+            <wp:extent cx="7562850" cy="1081297"/>
+            <wp:effectExtent l="0" t="0" r="0" b="5080"/>
+            <wp:docPr id="59" name="Imagem 59"/>
+            <wp:cNvGraphicFramePr>
+              <a:graphicFrameLocks xmlns:a="http://schemas.openxmlformats.org/drawingml/2006/main" noChangeAspect="1"/>
+            </wp:cNvGraphicFramePr>
+            <a:graphic xmlns:a="http://schemas.openxmlformats.org/drawingml/2006/main">
+              <a:graphicData uri="http://schemas.openxmlformats.org/drawingml/2006/picture">
+                <pic:pic xmlns:pic="http://schemas.openxmlformats.org/drawingml/2006/picture">
+                  <pic:nvPicPr>
+                    <pic:cNvPr id="1" name=""/>
+                    <pic:cNvPicPr/>
+                  </pic:nvPicPr>
+                  <pic:blipFill>
+                    <a:blip r:embed="rId58"/>
+                    <a:stretch>
+                      <a:fillRect/>
+                    </a:stretch>
+                  </pic:blipFill>
+                  <pic:spPr>
+                    <a:xfrm>
+                      <a:off x="0" y="0"/>
+                      <a:ext cx="7887212" cy="1127673"/>
+                    </a:xfrm>
+                    <a:prstGeom prst="rect">
+                      <a:avLst/>
+                    </a:prstGeom>
+                  </pic:spPr>
+                </pic:pic>
+              </a:graphicData>
+            </a:graphic>
+          </wp:inline>
+        </w:drawing>
+      </w:r>
+    </w:p>
+    <w:p/>
+    <w:p/>
+    <w:p>
+      <w:r>
+        <w:rPr>
+          <w:noProof/>
+        </w:rPr>
+        <mc:AlternateContent>
+          <mc:Choice Requires="wps">
+            <w:drawing>
+              <wp:anchor distT="0" distB="0" distL="114300" distR="114300" simplePos="0" relativeHeight="251671552" behindDoc="0" locked="0" layoutInCell="1" allowOverlap="1" wp14:anchorId="70E07107" wp14:editId="7FAFDF78">
+                <wp:simplePos x="0" y="0"/>
+                <wp:positionH relativeFrom="column">
+                  <wp:posOffset>2661920</wp:posOffset>
+                </wp:positionH>
+                <wp:positionV relativeFrom="paragraph">
+                  <wp:posOffset>136525</wp:posOffset>
+                </wp:positionV>
+                <wp:extent cx="2779395" cy="672465"/>
+                <wp:effectExtent l="38100" t="0" r="20955" b="70485"/>
+                <wp:wrapNone/>
+                <wp:docPr id="62" name="Conector de Seta Reta 62"/>
+                <wp:cNvGraphicFramePr/>
+                <a:graphic xmlns:a="http://schemas.openxmlformats.org/drawingml/2006/main">
+                  <a:graphicData uri="http://schemas.microsoft.com/office/word/2010/wordprocessingShape">
+                    <wps:wsp>
+                      <wps:cNvCnPr/>
+                      <wps:spPr>
+                        <a:xfrm flipH="1">
+                          <a:off x="0" y="0"/>
+                          <a:ext cx="2779395" cy="672465"/>
+                        </a:xfrm>
+                        <a:prstGeom prst="straightConnector1">
+                          <a:avLst/>
+                        </a:prstGeom>
+                        <a:ln>
+                          <a:tailEnd type="triangle"/>
+                        </a:ln>
+                      </wps:spPr>
+                      <wps:style>
+                        <a:lnRef idx="1">
+                          <a:schemeClr val="accent1"/>
+                        </a:lnRef>
+                        <a:fillRef idx="0">
+                          <a:schemeClr val="accent1"/>
+                        </a:fillRef>
+                        <a:effectRef idx="0">
+                          <a:schemeClr val="accent1"/>
+                        </a:effectRef>
+                        <a:fontRef idx="minor">
+                          <a:schemeClr val="tx1"/>
+                        </a:fontRef>
+                      </wps:style>
+                      <wps:bodyPr/>
+                    </wps:wsp>
+                  </a:graphicData>
+                </a:graphic>
+              </wp:anchor>
+            </w:drawing>
+          </mc:Choice>
+          <mc:Fallback>
+            <w:pict>
+              <v:shape w14:anchorId="325AF8CE" id="Conector de Seta Reta 62" o:spid="_x0000_s1026" type="#_x0000_t32" style="position:absolute;margin-left:209.6pt;margin-top:10.75pt;width:218.85pt;height:52.95pt;flip:x;z-index:251671552;visibility:visible;mso-wrap-style:square;mso-wrap-distance-left:9pt;mso-wrap-distance-top:0;mso-wrap-distance-right:9pt;mso-wrap-distance-bottom:0;mso-position-horizontal:absolute;mso-position-horizontal-relative:text;mso-position-vertical:absolute;mso-position-vertical-relative:text" o:gfxdata="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" strokecolor="#4472c4 [3204]" strokeweight=".5pt">
+                <v:stroke endarrow="block" joinstyle="miter"/>
+              </v:shape>
+            </w:pict>
+          </mc:Fallback>
+        </mc:AlternateContent>
+      </w:r>
+      <w:r>
+        <w:t>30 – Para centralizar o logo e nossa lista(menu</w:t>
+      </w:r>
+      <w:r>
+        <w:t xml:space="preserve">) envolvemos eles dentro de uma </w:t>
+      </w:r>
+      <w:proofErr w:type="spellStart"/>
+      <w:r>
+        <w:t>div</w:t>
+      </w:r>
+      <w:proofErr w:type="spellEnd"/>
+      <w:r>
+        <w:t xml:space="preserve"> chamada caixa.</w:t>
+      </w:r>
+    </w:p>
+    <w:p>
+      <w:r>
+        <w:drawing>
+          <wp:inline distT="0" distB="0" distL="0" distR="0" wp14:anchorId="764E3C23" wp14:editId="3265FBB5">
+            <wp:extent cx="7421011" cy="3372321"/>
+            <wp:effectExtent l="0" t="0" r="8890" b="0"/>
+            <wp:docPr id="61" name="Imagem 61"/>
+            <wp:cNvGraphicFramePr>
+              <a:graphicFrameLocks xmlns:a="http://schemas.openxmlformats.org/drawingml/2006/main" noChangeAspect="1"/>
+            </wp:cNvGraphicFramePr>
+            <a:graphic xmlns:a="http://schemas.openxmlformats.org/drawingml/2006/main">
+              <a:graphicData uri="http://schemas.openxmlformats.org/drawingml/2006/picture">
+                <pic:pic xmlns:pic="http://schemas.openxmlformats.org/drawingml/2006/picture">
+                  <pic:nvPicPr>
+                    <pic:cNvPr id="1" name=""/>
+                    <pic:cNvPicPr/>
+                  </pic:nvPicPr>
+                  <pic:blipFill>
+                    <a:blip r:embed="rId59"/>
+                    <a:stretch>
+                      <a:fillRect/>
+                    </a:stretch>
+                  </pic:blipFill>
+                  <pic:spPr>
+                    <a:xfrm>
+                      <a:off x="0" y="0"/>
+                      <a:ext cx="7421011" cy="3372321"/>
+                    </a:xfrm>
+                    <a:prstGeom prst="rect">
+                      <a:avLst/>
+                    </a:prstGeom>
+                  </pic:spPr>
+                </pic:pic>
+              </a:graphicData>
+            </a:graphic>
+          </wp:inline>
+        </w:drawing>
+      </w:r>
+    </w:p>
+    <w:p/>
+    <w:p>
+      <w:r>
+        <w:t xml:space="preserve">31 – E definimos uma largura para </w:t>
+      </w:r>
+      <w:proofErr w:type="spellStart"/>
+      <w:r>
+        <w:t>div</w:t>
+      </w:r>
+      <w:proofErr w:type="spellEnd"/>
+      <w:r>
+        <w:t xml:space="preserve"> caixa</w:t>
+      </w:r>
+      <w:r>
+        <w:t>,</w:t>
+      </w:r>
+      <w:r>
+        <w:t xml:space="preserve"> </w:t>
+      </w:r>
+      <w:r>
+        <w:t>deixando uma medida padrão</w:t>
+      </w:r>
+      <w:r>
+        <w:t xml:space="preserve"> e centralizamos tanto a o logo com a lista utilizando o </w:t>
+      </w:r>
+      <w:proofErr w:type="spellStart"/>
+      <w:r>
+        <w:t>margin</w:t>
+      </w:r>
+      <w:proofErr w:type="spellEnd"/>
+      <w:r>
+        <w:t>: 0 auto.</w:t>
+      </w:r>
+      <w:r>
+        <w:t xml:space="preserve"> </w:t>
+      </w:r>
+    </w:p>
+    <w:p>
+      <w:r>
+        <w:t xml:space="preserve">Como header estava utilizando position </w:t>
+      </w:r>
+      <w:proofErr w:type="spellStart"/>
+      <w:r>
+        <w:t>absolute</w:t>
+      </w:r>
+      <w:proofErr w:type="spellEnd"/>
+      <w:r>
+        <w:t xml:space="preserve"> na </w:t>
+      </w:r>
+      <w:proofErr w:type="spellStart"/>
+      <w:r>
+        <w:t>div</w:t>
+      </w:r>
+      <w:proofErr w:type="spellEnd"/>
+      <w:r>
+        <w:t xml:space="preserve"> </w:t>
+      </w:r>
+      <w:r>
+        <w:t xml:space="preserve">se fez necessário colocar position </w:t>
+      </w:r>
+      <w:proofErr w:type="spellStart"/>
+      <w:r>
+        <w:t>relatative</w:t>
+      </w:r>
+      <w:proofErr w:type="spellEnd"/>
+      <w:r>
+        <w:t xml:space="preserve"> para que lista ficasse centralizada automaticamente </w:t>
+      </w:r>
+      <w:r>
+        <w:t xml:space="preserve">tanto para direita como para </w:t>
+      </w:r>
+      <w:proofErr w:type="spellStart"/>
+      <w:r>
+        <w:t>esqueda</w:t>
+      </w:r>
+      <w:proofErr w:type="spellEnd"/>
+      <w:r>
+        <w:t>.</w:t>
+      </w:r>
+    </w:p>
+    <w:p>
+      <w:r>
+        <w:drawing>
+          <wp:inline distT="0" distB="0" distL="0" distR="0" wp14:anchorId="31CA984A" wp14:editId="4441188A">
+            <wp:extent cx="3781953" cy="1962424"/>
+            <wp:effectExtent l="0" t="0" r="9525" b="0"/>
+            <wp:docPr id="63" name="Imagem 63"/>
+            <wp:cNvGraphicFramePr>
+              <a:graphicFrameLocks xmlns:a="http://schemas.openxmlformats.org/drawingml/2006/main" noChangeAspect="1"/>
+            </wp:cNvGraphicFramePr>
+            <a:graphic xmlns:a="http://schemas.openxmlformats.org/drawingml/2006/main">
+              <a:graphicData uri="http://schemas.openxmlformats.org/drawingml/2006/picture">
+                <pic:pic xmlns:pic="http://schemas.openxmlformats.org/drawingml/2006/picture">
+                  <pic:nvPicPr>
+                    <pic:cNvPr id="1" name=""/>
+                    <pic:cNvPicPr/>
+                  </pic:nvPicPr>
+                  <pic:blipFill>
+                    <a:blip r:embed="rId60"/>
+                    <a:stretch>
+                      <a:fillRect/>
+                    </a:stretch>
+                  </pic:blipFill>
+                  <pic:spPr>
+                    <a:xfrm>
+                      <a:off x="0" y="0"/>
+                      <a:ext cx="3781953" cy="1962424"/>
+                    </a:xfrm>
+                    <a:prstGeom prst="rect">
+                      <a:avLst/>
+                    </a:prstGeom>
+                  </pic:spPr>
+                </pic:pic>
+              </a:graphicData>
+            </a:graphic>
+          </wp:inline>
+        </w:drawing>
+      </w:r>
+      <w:r>
+        <w:t xml:space="preserve"> </w:t>
+      </w:r>
+      <w:r>
+        <w:tab/>
+      </w:r>
+    </w:p>
+    <w:p>
+      <w:r>
+        <w:drawing>
+          <wp:inline distT="0" distB="0" distL="0" distR="0" wp14:anchorId="255AF8C5" wp14:editId="1043AB85">
+            <wp:extent cx="7099095" cy="1479906"/>
+            <wp:effectExtent l="0" t="0" r="6985" b="6350"/>
+            <wp:docPr id="64" name="Imagem 64"/>
+            <wp:cNvGraphicFramePr>
+              <a:graphicFrameLocks xmlns:a="http://schemas.openxmlformats.org/drawingml/2006/main" noChangeAspect="1"/>
+            </wp:cNvGraphicFramePr>
+            <a:graphic xmlns:a="http://schemas.openxmlformats.org/drawingml/2006/main">
+              <a:graphicData uri="http://schemas.openxmlformats.org/drawingml/2006/picture">
+                <pic:pic xmlns:pic="http://schemas.openxmlformats.org/drawingml/2006/picture">
+                  <pic:nvPicPr>
+                    <pic:cNvPr id="1" name=""/>
+                    <pic:cNvPicPr/>
+                  </pic:nvPicPr>
+                  <pic:blipFill>
+                    <a:blip r:embed="rId61"/>
+                    <a:stretch>
+                      <a:fillRect/>
+                    </a:stretch>
+                  </pic:blipFill>
+                  <pic:spPr>
+                    <a:xfrm>
+                      <a:off x="0" y="0"/>
+                      <a:ext cx="7159571" cy="1492513"/>
+                    </a:xfrm>
+                    <a:prstGeom prst="rect">
+                      <a:avLst/>
+                    </a:prstGeom>
+                  </pic:spPr>
+                </pic:pic>
+              </a:graphicData>
+            </a:graphic>
+          </wp:inline>
+        </w:drawing>
+      </w:r>
+    </w:p>
+    <w:p/>
+    <w:p>
+      <w:r>
+        <w:t xml:space="preserve">32 – Para melhorar o espaço interno do header utilizamos o </w:t>
+      </w:r>
+      <w:proofErr w:type="spellStart"/>
+      <w:r>
+        <w:t>padding</w:t>
+      </w:r>
+      <w:proofErr w:type="spellEnd"/>
+      <w:r>
+        <w:t xml:space="preserve"> tanto para cima com para baixo conforme imagem do código.</w:t>
+      </w:r>
+    </w:p>
+    <w:p>
+      <w:r>
+        <w:rPr>
+          <w:noProof/>
+        </w:rPr>
+        <mc:AlternateContent>
+          <mc:Choice Requires="wps">
+            <w:drawing>
+              <wp:anchor distT="0" distB="0" distL="114300" distR="114300" simplePos="0" relativeHeight="251672576" behindDoc="0" locked="0" layoutInCell="1" allowOverlap="1" wp14:anchorId="08314A7C" wp14:editId="211C4FA6">
+                <wp:simplePos x="0" y="0"/>
+                <wp:positionH relativeFrom="column">
+                  <wp:posOffset>2779522</wp:posOffset>
+                </wp:positionH>
+                <wp:positionV relativeFrom="paragraph">
+                  <wp:posOffset>174092</wp:posOffset>
+                </wp:positionV>
+                <wp:extent cx="1923898" cy="899769"/>
+                <wp:effectExtent l="38100" t="0" r="19685" b="53340"/>
+                <wp:wrapNone/>
+                <wp:docPr id="66" name="Conector de Seta Reta 66"/>
+                <wp:cNvGraphicFramePr/>
+                <a:graphic xmlns:a="http://schemas.openxmlformats.org/drawingml/2006/main">
+                  <a:graphicData uri="http://schemas.microsoft.com/office/word/2010/wordprocessingShape">
+                    <wps:wsp>
+                      <wps:cNvCnPr/>
+                      <wps:spPr>
+                        <a:xfrm flipH="1">
+                          <a:off x="0" y="0"/>
+                          <a:ext cx="1923898" cy="899769"/>
+                        </a:xfrm>
+                        <a:prstGeom prst="straightConnector1">
+                          <a:avLst/>
+                        </a:prstGeom>
+                        <a:ln>
+                          <a:tailEnd type="triangle"/>
+                        </a:ln>
+                      </wps:spPr>
+                      <wps:style>
+                        <a:lnRef idx="1">
+                          <a:schemeClr val="accent1"/>
+                        </a:lnRef>
+                        <a:fillRef idx="0">
+                          <a:schemeClr val="accent1"/>
+                        </a:fillRef>
+                        <a:effectRef idx="0">
+                          <a:schemeClr val="accent1"/>
+                        </a:effectRef>
+                        <a:fontRef idx="minor">
+                          <a:schemeClr val="tx1"/>
+                        </a:fontRef>
+                      </wps:style>
+                      <wps:bodyPr/>
+                    </wps:wsp>
+                  </a:graphicData>
+                </a:graphic>
+              </wp:anchor>
+            </w:drawing>
+          </mc:Choice>
+          <mc:Fallback>
+            <w:pict>
+              <v:shape w14:anchorId="2FDCF09C" id="Conector de Seta Reta 66" o:spid="_x0000_s1026" type="#_x0000_t32" style="position:absolute;margin-left:218.85pt;margin-top:13.7pt;width:151.5pt;height:70.85pt;flip:x;z-index:251672576;visibility:visible;mso-wrap-style:square;mso-wrap-distance-left:9pt;mso-wrap-distance-top:0;mso-wrap-distance-right:9pt;mso-wrap-distance-bottom:0;mso-position-horizontal:absolute;mso-position-horizontal-relative:text;mso-position-vertical:absolute;mso-position-vertical-relative:text" o:gfxdata="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" strokecolor="#4472c4 [3204]" strokeweight=".5pt">
+                <v:stroke endarrow="block" joinstyle="miter"/>
+              </v:shape>
+            </w:pict>
+          </mc:Fallback>
+        </mc:AlternateContent>
+      </w:r>
+      <w:r>
+        <w:drawing>
+          <wp:inline distT="0" distB="0" distL="0" distR="0" wp14:anchorId="4A2D2F6F" wp14:editId="42819635">
+            <wp:extent cx="4715533" cy="1676634"/>
+            <wp:effectExtent l="0" t="0" r="8890" b="0"/>
+            <wp:docPr id="65" name="Imagem 65"/>
+            <wp:cNvGraphicFramePr>
+              <a:graphicFrameLocks xmlns:a="http://schemas.openxmlformats.org/drawingml/2006/main" noChangeAspect="1"/>
+            </wp:cNvGraphicFramePr>
+            <a:graphic xmlns:a="http://schemas.openxmlformats.org/drawingml/2006/main">
+              <a:graphicData uri="http://schemas.openxmlformats.org/drawingml/2006/picture">
+                <pic:pic xmlns:pic="http://schemas.openxmlformats.org/drawingml/2006/picture">
+                  <pic:nvPicPr>
+                    <pic:cNvPr id="1" name=""/>
+                    <pic:cNvPicPr/>
+                  </pic:nvPicPr>
+                  <pic:blipFill>
+                    <a:blip r:embed="rId62"/>
+                    <a:stretch>
+                      <a:fillRect/>
+                    </a:stretch>
+                  </pic:blipFill>
+                  <pic:spPr>
+                    <a:xfrm>
+                      <a:off x="0" y="0"/>
+                      <a:ext cx="4715533" cy="1676634"/>
+                    </a:xfrm>
+                    <a:prstGeom prst="rect">
+                      <a:avLst/>
+                    </a:prstGeom>
+                  </pic:spPr>
+                </pic:pic>
+              </a:graphicData>
+            </a:graphic>
+          </wp:inline>
+        </w:drawing>
+      </w:r>
+    </w:p>
+    <w:p>
+      <w:r>
+        <w:drawing>
+          <wp:inline distT="0" distB="0" distL="0" distR="0" wp14:anchorId="30EEF7DE" wp14:editId="5AA7CFE5">
+            <wp:extent cx="8262900" cy="1642194"/>
+            <wp:effectExtent l="0" t="0" r="5080" b="0"/>
+            <wp:docPr id="67" name="Imagem 67"/>
+            <wp:cNvGraphicFramePr>
+              <a:graphicFrameLocks xmlns:a="http://schemas.openxmlformats.org/drawingml/2006/main" noChangeAspect="1"/>
+            </wp:cNvGraphicFramePr>
+            <a:graphic xmlns:a="http://schemas.openxmlformats.org/drawingml/2006/main">
+              <a:graphicData uri="http://schemas.openxmlformats.org/drawingml/2006/picture">
+                <pic:pic xmlns:pic="http://schemas.openxmlformats.org/drawingml/2006/picture">
+                  <pic:nvPicPr>
+                    <pic:cNvPr id="1" name=""/>
+                    <pic:cNvPicPr/>
+                  </pic:nvPicPr>
+                  <pic:blipFill>
+                    <a:blip r:embed="rId63"/>
+                    <a:stretch>
+                      <a:fillRect/>
+                    </a:stretch>
+                  </pic:blipFill>
+                  <pic:spPr>
+                    <a:xfrm>
+                      <a:off x="0" y="0"/>
+                      <a:ext cx="8346641" cy="1658837"/>
+                    </a:xfrm>
+                    <a:prstGeom prst="rect">
+                      <a:avLst/>
+                    </a:prstGeom>
+                  </pic:spPr>
+                </pic:pic>
+              </a:graphicData>
+            </a:graphic>
+          </wp:inline>
+        </w:drawing>
+      </w:r>
+    </w:p>
+    <w:p>
       <w:bookmarkStart w:id="0" w:name="_GoBack"/>
       <w:bookmarkEnd w:id="0"/>
     </w:p>
-    <w:p/>
-    <w:p/>
-    <w:p/>
     <w:sectPr>
       <w:pgSz w:w="11906" w:h="16838"/>
       <w:pgMar w:top="1417" w:right="1701" w:bottom="1417" w:left="1701" w:header="708" w:footer="708" w:gutter="0"/>
@@ -4438,6 +5375,23 @@
 </file>
 
 <file path=customXml/item1.xml><?xml version="1.0" encoding="utf-8"?>
+<?mso-contentType ?>
+<FormTemplates xmlns="http://schemas.microsoft.com/sharepoint/v3/contenttype/forms">
+  <Display>DocumentLibraryForm</Display>
+  <Edit>DocumentLibraryForm</Edit>
+  <New>DocumentLibraryForm</New>
+</FormTemplates>
+</file>
+
+<file path=customXml/item2.xml><?xml version="1.0" encoding="utf-8"?>
+<p:properties xmlns:p="http://schemas.microsoft.com/office/2006/metadata/properties" xmlns:xsi="http://www.w3.org/2001/XMLSchema-instance" xmlns:pc="http://schemas.microsoft.com/office/infopath/2007/PartnerControls">
+  <documentManagement>
+    <_activity xmlns="8437a765-f0a9-40aa-978b-fcc06261281f" xsi:nil="true"/>
+  </documentManagement>
+</p:properties>
+</file>
+
+<file path=customXml/item3.xml><?xml version="1.0" encoding="utf-8"?>
 <ct:contentTypeSchema xmlns:ct="http://schemas.microsoft.com/office/2006/metadata/contentType" xmlns:ma="http://schemas.microsoft.com/office/2006/metadata/properties/metaAttributes" ct:_="" ma:_="" ma:contentTypeName="Documento" ma:contentTypeID="0x01010034B17ED9C83E394791ACA33DA9287452" ma:contentTypeVersion="16" ma:contentTypeDescription="Crie um novo documento." ma:contentTypeScope="" ma:versionID="d36ce64b1b29120840e9f9b956471cbb">
   <xsd:schema xmlns:xsd="http://www.w3.org/2001/XMLSchema" xmlns:xs="http://www.w3.org/2001/XMLSchema" xmlns:p="http://schemas.microsoft.com/office/2006/metadata/properties" xmlns:ns3="8437a765-f0a9-40aa-978b-fcc06261281f" xmlns:ns4="e78d8b06-d887-4705-9cec-751f2fb2cee2" targetNamespace="http://schemas.microsoft.com/office/2006/metadata/properties" ma:root="true" ma:fieldsID="ab1d645bb15f72c0dfc8a8f602f1de6b" ns3:_="" ns4:_="">
     <xsd:import namespace="8437a765-f0a9-40aa-978b-fcc06261281f"/>
@@ -4676,28 +5630,29 @@
 </ct:contentTypeSchema>
 </file>
 
-<file path=customXml/item2.xml><?xml version="1.0" encoding="utf-8"?>
-<?mso-contentType ?>
-<FormTemplates xmlns="http://schemas.microsoft.com/sharepoint/v3/contenttype/forms">
-  <Display>DocumentLibraryForm</Display>
-  <Edit>DocumentLibraryForm</Edit>
-  <New>DocumentLibraryForm</New>
-</FormTemplates>
-</file>
-
-<file path=customXml/item3.xml><?xml version="1.0" encoding="utf-8"?>
-<p:properties xmlns:p="http://schemas.microsoft.com/office/2006/metadata/properties" xmlns:xsi="http://www.w3.org/2001/XMLSchema-instance" xmlns:pc="http://schemas.microsoft.com/office/infopath/2007/PartnerControls">
-  <documentManagement>
-    <_activity xmlns="8437a765-f0a9-40aa-978b-fcc06261281f" xsi:nil="true"/>
-  </documentManagement>
-</p:properties>
-</file>
-
 <file path=customXml/item4.xml><?xml version="1.0" encoding="utf-8"?>
 <b:Sources xmlns:b="http://schemas.openxmlformats.org/officeDocument/2006/bibliography" xmlns="http://schemas.openxmlformats.org/officeDocument/2006/bibliography" SelectedStyle="\APASixthEditionOfficeOnline.xsl" StyleName="APA" Version="6"/>
 </file>
 
 <file path=customXml/itemProps1.xml><?xml version="1.0" encoding="utf-8"?>
+<ds:datastoreItem xmlns:ds="http://schemas.openxmlformats.org/officeDocument/2006/customXml" ds:itemID="{38630907-5F1E-4561-A45F-AC7CC415CD73}">
+  <ds:schemaRefs>
+    <ds:schemaRef ds:uri="http://schemas.microsoft.com/sharepoint/v3/contenttype/forms"/>
+  </ds:schemaRefs>
+</ds:datastoreItem>
+</file>
+
+<file path=customXml/itemProps2.xml><?xml version="1.0" encoding="utf-8"?>
+<ds:datastoreItem xmlns:ds="http://schemas.openxmlformats.org/officeDocument/2006/customXml" ds:itemID="{0C9FFCBC-F2CA-4FF1-AAFC-AD3B89BB1967}">
+  <ds:schemaRefs>
+    <ds:schemaRef ds:uri="http://schemas.microsoft.com/office/2006/metadata/properties"/>
+    <ds:schemaRef ds:uri="http://schemas.microsoft.com/office/infopath/2007/PartnerControls"/>
+    <ds:schemaRef ds:uri="8437a765-f0a9-40aa-978b-fcc06261281f"/>
+  </ds:schemaRefs>
+</ds:datastoreItem>
+</file>
+
+<file path=customXml/itemProps3.xml><?xml version="1.0" encoding="utf-8"?>
 <ds:datastoreItem xmlns:ds="http://schemas.openxmlformats.org/officeDocument/2006/customXml" ds:itemID="{5D63F5B6-DF50-4CAF-997C-1D8B1776178E}">
   <ds:schemaRefs>
     <ds:schemaRef ds:uri="http://schemas.microsoft.com/office/2006/metadata/contentType"/>
@@ -4716,26 +5671,8 @@
 </ds:datastoreItem>
 </file>
 
-<file path=customXml/itemProps2.xml><?xml version="1.0" encoding="utf-8"?>
-<ds:datastoreItem xmlns:ds="http://schemas.openxmlformats.org/officeDocument/2006/customXml" ds:itemID="{38630907-5F1E-4561-A45F-AC7CC415CD73}">
-  <ds:schemaRefs>
-    <ds:schemaRef ds:uri="http://schemas.microsoft.com/sharepoint/v3/contenttype/forms"/>
-  </ds:schemaRefs>
-</ds:datastoreItem>
-</file>
-
-<file path=customXml/itemProps3.xml><?xml version="1.0" encoding="utf-8"?>
-<ds:datastoreItem xmlns:ds="http://schemas.openxmlformats.org/officeDocument/2006/customXml" ds:itemID="{0C9FFCBC-F2CA-4FF1-AAFC-AD3B89BB1967}">
-  <ds:schemaRefs>
-    <ds:schemaRef ds:uri="http://schemas.microsoft.com/office/2006/metadata/properties"/>
-    <ds:schemaRef ds:uri="http://schemas.microsoft.com/office/infopath/2007/PartnerControls"/>
-    <ds:schemaRef ds:uri="8437a765-f0a9-40aa-978b-fcc06261281f"/>
-  </ds:schemaRefs>
-</ds:datastoreItem>
-</file>
-
 <file path=customXml/itemProps4.xml><?xml version="1.0" encoding="utf-8"?>
-<ds:datastoreItem xmlns:ds="http://schemas.openxmlformats.org/officeDocument/2006/customXml" ds:itemID="{283F24CB-B8B5-485B-8815-E0B8508F75F8}">
+<ds:datastoreItem xmlns:ds="http://schemas.openxmlformats.org/officeDocument/2006/customXml" ds:itemID="{9D5BA650-55E7-4786-AC59-C71CF20E0E21}">
   <ds:schemaRefs>
     <ds:schemaRef ds:uri="http://schemas.openxmlformats.org/officeDocument/2006/bibliography"/>
   </ds:schemaRefs>

</xml_diff>

<commit_message>
atualização da aula 03/09/2026
</commit_message>
<xml_diff>
--- a/apostila/Projeto Space for me3.docx
+++ b/apostila/Projeto Space for me3.docx
@@ -3543,6 +3543,9 @@
         </mc:AlternateContent>
       </w:r>
       <w:r>
+        <w:rPr>
+          <w:noProof/>
+        </w:rPr>
         <w:drawing>
           <wp:inline distT="0" distB="0" distL="0" distR="0" wp14:anchorId="6E770DDD" wp14:editId="2F5DE36E">
             <wp:extent cx="5193665" cy="2897731"/>
@@ -3731,6 +3734,9 @@
         </mc:AlternateContent>
       </w:r>
       <w:r>
+        <w:rPr>
+          <w:noProof/>
+        </w:rPr>
         <w:drawing>
           <wp:inline distT="0" distB="0" distL="0" distR="0" wp14:anchorId="6F447F1C" wp14:editId="671FB30E">
             <wp:extent cx="3638550" cy="1952625"/>
@@ -3768,6 +3774,9 @@
         </w:drawing>
       </w:r>
       <w:r>
+        <w:rPr>
+          <w:noProof/>
+        </w:rPr>
         <w:drawing>
           <wp:inline distT="0" distB="0" distL="0" distR="0" wp14:anchorId="7B73A903" wp14:editId="2FA6B944">
             <wp:extent cx="7562850" cy="1081297"/>
@@ -3891,6 +3900,9 @@
     </w:p>
     <w:p>
       <w:r>
+        <w:rPr>
+          <w:noProof/>
+        </w:rPr>
         <w:drawing>
           <wp:inline distT="0" distB="0" distL="0" distR="0" wp14:anchorId="764E3C23" wp14:editId="3265FBB5">
             <wp:extent cx="7421011" cy="3372321"/>
@@ -4010,6 +4022,9 @@
     </w:p>
     <w:p>
       <w:r>
+        <w:rPr>
+          <w:noProof/>
+        </w:rPr>
         <w:drawing>
           <wp:inline distT="0" distB="0" distL="0" distR="0" wp14:anchorId="31CA984A" wp14:editId="4441188A">
             <wp:extent cx="3781953" cy="1962424"/>
@@ -4055,6 +4070,9 @@
     </w:p>
     <w:p>
       <w:r>
+        <w:rPr>
+          <w:noProof/>
+        </w:rPr>
         <w:drawing>
           <wp:inline distT="0" distB="0" distL="0" distR="0" wp14:anchorId="255AF8C5" wp14:editId="1043AB85">
             <wp:extent cx="7099095" cy="1479906"/>
@@ -4174,6 +4192,9 @@
         </mc:AlternateContent>
       </w:r>
       <w:r>
+        <w:rPr>
+          <w:noProof/>
+        </w:rPr>
         <w:drawing>
           <wp:inline distT="0" distB="0" distL="0" distR="0" wp14:anchorId="4A2D2F6F" wp14:editId="42819635">
             <wp:extent cx="4715533" cy="1676634"/>
@@ -4213,6 +4234,9 @@
     </w:p>
     <w:p>
       <w:r>
+        <w:rPr>
+          <w:noProof/>
+        </w:rPr>
         <w:drawing>
           <wp:inline distT="0" distB="0" distL="0" distR="0" wp14:anchorId="30EEF7DE" wp14:editId="5AA7CFE5">
             <wp:extent cx="8262900" cy="1642194"/>
@@ -4250,10 +4274,1098 @@
         </w:drawing>
       </w:r>
     </w:p>
+    <w:p/>
+    <w:p>
+      <w:r>
+        <w:t xml:space="preserve">33- </w:t>
+      </w:r>
+      <w:r>
+        <w:t xml:space="preserve">Dentro do </w:t>
+      </w:r>
+      <w:proofErr w:type="spellStart"/>
+      <w:r>
+        <w:t>main</w:t>
+      </w:r>
+      <w:proofErr w:type="spellEnd"/>
+      <w:r>
+        <w:t xml:space="preserve"> criamos uma lista não ordenada que inserimos os itens com subtítulo, imagem e </w:t>
+      </w:r>
+      <w:r>
+        <w:t>parágrafo</w:t>
+      </w:r>
+      <w:r>
+        <w:t>:</w:t>
+      </w:r>
+    </w:p>
+    <w:p/>
+    <w:p>
+      <w:r>
+        <w:drawing>
+          <wp:inline distT="0" distB="0" distL="0" distR="0" wp14:anchorId="5BE901BF" wp14:editId="14F4E4C4">
+            <wp:extent cx="5401429" cy="4134427"/>
+            <wp:effectExtent l="0" t="0" r="8890" b="0"/>
+            <wp:docPr id="68" name="Imagem 68"/>
+            <wp:cNvGraphicFramePr>
+              <a:graphicFrameLocks xmlns:a="http://schemas.openxmlformats.org/drawingml/2006/main" noChangeAspect="1"/>
+            </wp:cNvGraphicFramePr>
+            <a:graphic xmlns:a="http://schemas.openxmlformats.org/drawingml/2006/main">
+              <a:graphicData uri="http://schemas.openxmlformats.org/drawingml/2006/picture">
+                <pic:pic xmlns:pic="http://schemas.openxmlformats.org/drawingml/2006/picture">
+                  <pic:nvPicPr>
+                    <pic:cNvPr id="1" name=""/>
+                    <pic:cNvPicPr/>
+                  </pic:nvPicPr>
+                  <pic:blipFill>
+                    <a:blip r:embed="rId64"/>
+                    <a:stretch>
+                      <a:fillRect/>
+                    </a:stretch>
+                  </pic:blipFill>
+                  <pic:spPr>
+                    <a:xfrm>
+                      <a:off x="0" y="0"/>
+                      <a:ext cx="5401429" cy="4134427"/>
+                    </a:xfrm>
+                    <a:prstGeom prst="rect">
+                      <a:avLst/>
+                    </a:prstGeom>
+                  </pic:spPr>
+                </pic:pic>
+              </a:graphicData>
+            </a:graphic>
+          </wp:inline>
+        </w:drawing>
+      </w:r>
+    </w:p>
+    <w:p/>
+    <w:p>
+      <w:r>
+        <w:t xml:space="preserve">34- Para colocar os itens da lista de produtos um ao lado do outro </w:t>
+      </w:r>
+      <w:r>
+        <w:t xml:space="preserve">adicionamos um </w:t>
+      </w:r>
+      <w:proofErr w:type="spellStart"/>
+      <w:r>
+        <w:t>class</w:t>
+      </w:r>
+      <w:proofErr w:type="spellEnd"/>
+      <w:r>
+        <w:t xml:space="preserve"> no </w:t>
+      </w:r>
+      <w:proofErr w:type="spellStart"/>
+      <w:r>
+        <w:t>html</w:t>
+      </w:r>
+      <w:proofErr w:type="spellEnd"/>
+      <w:r>
+        <w:t xml:space="preserve"> chamada produtos e no </w:t>
+      </w:r>
+      <w:proofErr w:type="spellStart"/>
+      <w:r>
+        <w:t>css</w:t>
+      </w:r>
+      <w:proofErr w:type="spellEnd"/>
+      <w:r>
+        <w:t xml:space="preserve"> mudamos a natureza da lista para </w:t>
+      </w:r>
+      <w:proofErr w:type="spellStart"/>
+      <w:r>
+        <w:t>inline-block</w:t>
+      </w:r>
+      <w:proofErr w:type="spellEnd"/>
+      <w:r>
+        <w:t>.</w:t>
+      </w:r>
+    </w:p>
+    <w:p/>
+    <w:p>
+      <w:r>
+        <w:drawing>
+          <wp:inline distT="0" distB="0" distL="0" distR="0" wp14:anchorId="1F235A92" wp14:editId="2A565C8C">
+            <wp:extent cx="5191850" cy="3877216"/>
+            <wp:effectExtent l="0" t="0" r="8890" b="9525"/>
+            <wp:docPr id="69" name="Imagem 69"/>
+            <wp:cNvGraphicFramePr>
+              <a:graphicFrameLocks xmlns:a="http://schemas.openxmlformats.org/drawingml/2006/main" noChangeAspect="1"/>
+            </wp:cNvGraphicFramePr>
+            <a:graphic xmlns:a="http://schemas.openxmlformats.org/drawingml/2006/main">
+              <a:graphicData uri="http://schemas.openxmlformats.org/drawingml/2006/picture">
+                <pic:pic xmlns:pic="http://schemas.openxmlformats.org/drawingml/2006/picture">
+                  <pic:nvPicPr>
+                    <pic:cNvPr id="1" name=""/>
+                    <pic:cNvPicPr/>
+                  </pic:nvPicPr>
+                  <pic:blipFill>
+                    <a:blip r:embed="rId65"/>
+                    <a:stretch>
+                      <a:fillRect/>
+                    </a:stretch>
+                  </pic:blipFill>
+                  <pic:spPr>
+                    <a:xfrm>
+                      <a:off x="0" y="0"/>
+                      <a:ext cx="5191850" cy="3877216"/>
+                    </a:xfrm>
+                    <a:prstGeom prst="rect">
+                      <a:avLst/>
+                    </a:prstGeom>
+                  </pic:spPr>
+                </pic:pic>
+              </a:graphicData>
+            </a:graphic>
+          </wp:inline>
+        </w:drawing>
+      </w:r>
+      <w:r>
+        <w:drawing>
+          <wp:inline distT="0" distB="0" distL="0" distR="0" wp14:anchorId="0C4C236C" wp14:editId="5FF7AD0A">
+            <wp:extent cx="2715004" cy="1086002"/>
+            <wp:effectExtent l="0" t="0" r="0" b="0"/>
+            <wp:docPr id="70" name="Imagem 70"/>
+            <wp:cNvGraphicFramePr>
+              <a:graphicFrameLocks xmlns:a="http://schemas.openxmlformats.org/drawingml/2006/main" noChangeAspect="1"/>
+            </wp:cNvGraphicFramePr>
+            <a:graphic xmlns:a="http://schemas.openxmlformats.org/drawingml/2006/main">
+              <a:graphicData uri="http://schemas.openxmlformats.org/drawingml/2006/picture">
+                <pic:pic xmlns:pic="http://schemas.openxmlformats.org/drawingml/2006/picture">
+                  <pic:nvPicPr>
+                    <pic:cNvPr id="1" name=""/>
+                    <pic:cNvPicPr/>
+                  </pic:nvPicPr>
+                  <pic:blipFill>
+                    <a:blip r:embed="rId66"/>
+                    <a:stretch>
+                      <a:fillRect/>
+                    </a:stretch>
+                  </pic:blipFill>
+                  <pic:spPr>
+                    <a:xfrm>
+                      <a:off x="0" y="0"/>
+                      <a:ext cx="2715004" cy="1086002"/>
+                    </a:xfrm>
+                    <a:prstGeom prst="rect">
+                      <a:avLst/>
+                    </a:prstGeom>
+                  </pic:spPr>
+                </pic:pic>
+              </a:graphicData>
+            </a:graphic>
+          </wp:inline>
+        </w:drawing>
+      </w:r>
+    </w:p>
+    <w:p>
+      <w:r>
+        <w:drawing>
+          <wp:inline distT="0" distB="0" distL="0" distR="0" wp14:anchorId="14FF4960" wp14:editId="709811E5">
+            <wp:extent cx="4008730" cy="1315720"/>
+            <wp:effectExtent l="0" t="0" r="0" b="0"/>
+            <wp:docPr id="71" name="Imagem 71"/>
+            <wp:cNvGraphicFramePr>
+              <a:graphicFrameLocks xmlns:a="http://schemas.openxmlformats.org/drawingml/2006/main" noChangeAspect="1"/>
+            </wp:cNvGraphicFramePr>
+            <a:graphic xmlns:a="http://schemas.openxmlformats.org/drawingml/2006/main">
+              <a:graphicData uri="http://schemas.openxmlformats.org/drawingml/2006/picture">
+                <pic:pic xmlns:pic="http://schemas.openxmlformats.org/drawingml/2006/picture">
+                  <pic:nvPicPr>
+                    <pic:cNvPr id="1" name=""/>
+                    <pic:cNvPicPr/>
+                  </pic:nvPicPr>
+                  <pic:blipFill>
+                    <a:blip r:embed="rId67"/>
+                    <a:stretch>
+                      <a:fillRect/>
+                    </a:stretch>
+                  </pic:blipFill>
+                  <pic:spPr>
+                    <a:xfrm>
+                      <a:off x="0" y="0"/>
+                      <a:ext cx="4237874" cy="1390928"/>
+                    </a:xfrm>
+                    <a:prstGeom prst="rect">
+                      <a:avLst/>
+                    </a:prstGeom>
+                  </pic:spPr>
+                </pic:pic>
+              </a:graphicData>
+            </a:graphic>
+          </wp:inline>
+        </w:drawing>
+      </w:r>
+    </w:p>
+    <w:p/>
+    <w:p>
+      <w:r>
+        <w:t xml:space="preserve">35 </w:t>
+      </w:r>
+      <w:r>
+        <w:t xml:space="preserve">– Para centraliza a nossa lista de produtos na </w:t>
+      </w:r>
+      <w:proofErr w:type="spellStart"/>
+      <w:r>
+        <w:t>class</w:t>
+      </w:r>
+      <w:proofErr w:type="spellEnd"/>
+      <w:r>
+        <w:t xml:space="preserve"> produtos demos uma largura de 940px e utilizamos </w:t>
+      </w:r>
+      <w:r>
+        <w:t xml:space="preserve">o </w:t>
+      </w:r>
+      <w:proofErr w:type="spellStart"/>
+      <w:r>
+        <w:t>margin</w:t>
+      </w:r>
+      <w:proofErr w:type="spellEnd"/>
+      <w:r>
+        <w:t>: 0 auto.</w:t>
+      </w:r>
+    </w:p>
+    <w:p>
+      <w:r>
+        <w:rPr>
+          <w:noProof/>
+        </w:rPr>
+        <mc:AlternateContent>
+          <mc:Choice Requires="wps">
+            <w:drawing>
+              <wp:anchor distT="0" distB="0" distL="114300" distR="114300" simplePos="0" relativeHeight="251673600" behindDoc="0" locked="0" layoutInCell="1" allowOverlap="1" wp14:anchorId="2AE03C24" wp14:editId="45237C12">
+                <wp:simplePos x="0" y="0"/>
+                <wp:positionH relativeFrom="column">
+                  <wp:posOffset>2830728</wp:posOffset>
+                </wp:positionH>
+                <wp:positionV relativeFrom="paragraph">
+                  <wp:posOffset>635356</wp:posOffset>
+                </wp:positionV>
+                <wp:extent cx="490119" cy="190195"/>
+                <wp:effectExtent l="0" t="0" r="81915" b="57785"/>
+                <wp:wrapNone/>
+                <wp:docPr id="74" name="Conector de Seta Reta 74"/>
+                <wp:cNvGraphicFramePr/>
+                <a:graphic xmlns:a="http://schemas.openxmlformats.org/drawingml/2006/main">
+                  <a:graphicData uri="http://schemas.microsoft.com/office/word/2010/wordprocessingShape">
+                    <wps:wsp>
+                      <wps:cNvCnPr/>
+                      <wps:spPr>
+                        <a:xfrm>
+                          <a:off x="0" y="0"/>
+                          <a:ext cx="490119" cy="190195"/>
+                        </a:xfrm>
+                        <a:prstGeom prst="straightConnector1">
+                          <a:avLst/>
+                        </a:prstGeom>
+                        <a:ln>
+                          <a:tailEnd type="triangle"/>
+                        </a:ln>
+                      </wps:spPr>
+                      <wps:style>
+                        <a:lnRef idx="1">
+                          <a:schemeClr val="accent1"/>
+                        </a:lnRef>
+                        <a:fillRef idx="0">
+                          <a:schemeClr val="accent1"/>
+                        </a:fillRef>
+                        <a:effectRef idx="0">
+                          <a:schemeClr val="accent1"/>
+                        </a:effectRef>
+                        <a:fontRef idx="minor">
+                          <a:schemeClr val="tx1"/>
+                        </a:fontRef>
+                      </wps:style>
+                      <wps:bodyPr/>
+                    </wps:wsp>
+                  </a:graphicData>
+                </a:graphic>
+              </wp:anchor>
+            </w:drawing>
+          </mc:Choice>
+          <mc:Fallback>
+            <w:pict>
+              <v:shapetype w14:anchorId="6A2A889E" id="_x0000_t32" coordsize="21600,21600" o:spt="32" o:oned="t" path="m,l21600,21600e" filled="f">
+                <v:path arrowok="t" fillok="f" o:connecttype="none"/>
+                <o:lock v:ext="edit" shapetype="t"/>
+              </v:shapetype>
+              <v:shape id="Conector de Seta Reta 74" o:spid="_x0000_s1026" type="#_x0000_t32" style="position:absolute;margin-left:222.9pt;margin-top:50.05pt;width:38.6pt;height:15pt;z-index:251673600;visibility:visible;mso-wrap-style:square;mso-wrap-distance-left:9pt;mso-wrap-distance-top:0;mso-wrap-distance-right:9pt;mso-wrap-distance-bottom:0;mso-position-horizontal:absolute;mso-position-horizontal-relative:text;mso-position-vertical:absolute;mso-position-vertical-relative:text" o:gfxdata="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" strokecolor="#4472c4 [3204]" strokeweight=".5pt">
+                <v:stroke endarrow="block" joinstyle="miter"/>
+              </v:shape>
+            </w:pict>
+          </mc:Fallback>
+        </mc:AlternateContent>
+      </w:r>
+      <w:r>
+        <w:drawing>
+          <wp:inline distT="0" distB="0" distL="0" distR="0" wp14:anchorId="36D1F2F6" wp14:editId="2F62AAA6">
+            <wp:extent cx="2791215" cy="1438476"/>
+            <wp:effectExtent l="0" t="0" r="9525" b="9525"/>
+            <wp:docPr id="72" name="Imagem 72"/>
+            <wp:cNvGraphicFramePr>
+              <a:graphicFrameLocks xmlns:a="http://schemas.openxmlformats.org/drawingml/2006/main" noChangeAspect="1"/>
+            </wp:cNvGraphicFramePr>
+            <a:graphic xmlns:a="http://schemas.openxmlformats.org/drawingml/2006/main">
+              <a:graphicData uri="http://schemas.openxmlformats.org/drawingml/2006/picture">
+                <pic:pic xmlns:pic="http://schemas.openxmlformats.org/drawingml/2006/picture">
+                  <pic:nvPicPr>
+                    <pic:cNvPr id="1" name=""/>
+                    <pic:cNvPicPr/>
+                  </pic:nvPicPr>
+                  <pic:blipFill>
+                    <a:blip r:embed="rId68"/>
+                    <a:stretch>
+                      <a:fillRect/>
+                    </a:stretch>
+                  </pic:blipFill>
+                  <pic:spPr>
+                    <a:xfrm>
+                      <a:off x="0" y="0"/>
+                      <a:ext cx="2791215" cy="1438476"/>
+                    </a:xfrm>
+                    <a:prstGeom prst="rect">
+                      <a:avLst/>
+                    </a:prstGeom>
+                  </pic:spPr>
+                </pic:pic>
+              </a:graphicData>
+            </a:graphic>
+          </wp:inline>
+        </w:drawing>
+      </w:r>
+      <w:r>
+        <w:drawing>
+          <wp:inline distT="0" distB="0" distL="0" distR="0" wp14:anchorId="6C288E26" wp14:editId="2CEB5398">
+            <wp:extent cx="3247390" cy="1479188"/>
+            <wp:effectExtent l="0" t="0" r="0" b="6985"/>
+            <wp:docPr id="73" name="Imagem 73"/>
+            <wp:cNvGraphicFramePr>
+              <a:graphicFrameLocks xmlns:a="http://schemas.openxmlformats.org/drawingml/2006/main" noChangeAspect="1"/>
+            </wp:cNvGraphicFramePr>
+            <a:graphic xmlns:a="http://schemas.openxmlformats.org/drawingml/2006/main">
+              <a:graphicData uri="http://schemas.openxmlformats.org/drawingml/2006/picture">
+                <pic:pic xmlns:pic="http://schemas.openxmlformats.org/drawingml/2006/picture">
+                  <pic:nvPicPr>
+                    <pic:cNvPr id="1" name=""/>
+                    <pic:cNvPicPr/>
+                  </pic:nvPicPr>
+                  <pic:blipFill>
+                    <a:blip r:embed="rId69"/>
+                    <a:stretch>
+                      <a:fillRect/>
+                    </a:stretch>
+                  </pic:blipFill>
+                  <pic:spPr>
+                    <a:xfrm>
+                      <a:off x="0" y="0"/>
+                      <a:ext cx="3335151" cy="1519163"/>
+                    </a:xfrm>
+                    <a:prstGeom prst="rect">
+                      <a:avLst/>
+                    </a:prstGeom>
+                  </pic:spPr>
+                </pic:pic>
+              </a:graphicData>
+            </a:graphic>
+          </wp:inline>
+        </w:drawing>
+      </w:r>
+    </w:p>
+    <w:p/>
+    <w:p/>
+    <w:p/>
+    <w:p>
+      <w:r>
+        <w:t>Para ce</w:t>
+      </w:r>
+      <w:r>
+        <w:t xml:space="preserve">ntralizar o texto de cada item da lista utilizamos o </w:t>
+      </w:r>
+      <w:proofErr w:type="spellStart"/>
+      <w:r>
+        <w:t>text-align:center</w:t>
+      </w:r>
+      <w:proofErr w:type="spellEnd"/>
+      <w:r>
+        <w:t xml:space="preserve"> </w:t>
+      </w:r>
+      <w:proofErr w:type="gramStart"/>
+      <w:r>
+        <w:t>no produtos</w:t>
+      </w:r>
+      <w:proofErr w:type="gramEnd"/>
+      <w:r>
+        <w:t xml:space="preserve"> li;</w:t>
+      </w:r>
+    </w:p>
+    <w:p/>
+    <w:p>
+      <w:r>
+        <w:drawing>
+          <wp:inline distT="0" distB="0" distL="0" distR="0" wp14:anchorId="6607F7E2" wp14:editId="5ABD8778">
+            <wp:extent cx="3277057" cy="1695687"/>
+            <wp:effectExtent l="0" t="0" r="0" b="0"/>
+            <wp:docPr id="75" name="Imagem 75"/>
+            <wp:cNvGraphicFramePr>
+              <a:graphicFrameLocks xmlns:a="http://schemas.openxmlformats.org/drawingml/2006/main" noChangeAspect="1"/>
+            </wp:cNvGraphicFramePr>
+            <a:graphic xmlns:a="http://schemas.openxmlformats.org/drawingml/2006/main">
+              <a:graphicData uri="http://schemas.openxmlformats.org/drawingml/2006/picture">
+                <pic:pic xmlns:pic="http://schemas.openxmlformats.org/drawingml/2006/picture">
+                  <pic:nvPicPr>
+                    <pic:cNvPr id="1" name=""/>
+                    <pic:cNvPicPr/>
+                  </pic:nvPicPr>
+                  <pic:blipFill>
+                    <a:blip r:embed="rId70"/>
+                    <a:stretch>
+                      <a:fillRect/>
+                    </a:stretch>
+                  </pic:blipFill>
+                  <pic:spPr>
+                    <a:xfrm>
+                      <a:off x="0" y="0"/>
+                      <a:ext cx="3277057" cy="1695687"/>
+                    </a:xfrm>
+                    <a:prstGeom prst="rect">
+                      <a:avLst/>
+                    </a:prstGeom>
+                  </pic:spPr>
+                </pic:pic>
+              </a:graphicData>
+            </a:graphic>
+          </wp:inline>
+        </w:drawing>
+      </w:r>
+      <w:r>
+        <w:drawing>
+          <wp:inline distT="0" distB="0" distL="0" distR="0" wp14:anchorId="3F9F8CD5" wp14:editId="486EFFFF">
+            <wp:extent cx="5098011" cy="1585189"/>
+            <wp:effectExtent l="0" t="0" r="7620" b="0"/>
+            <wp:docPr id="76" name="Imagem 76"/>
+            <wp:cNvGraphicFramePr>
+              <a:graphicFrameLocks xmlns:a="http://schemas.openxmlformats.org/drawingml/2006/main" noChangeAspect="1"/>
+            </wp:cNvGraphicFramePr>
+            <a:graphic xmlns:a="http://schemas.openxmlformats.org/drawingml/2006/main">
+              <a:graphicData uri="http://schemas.openxmlformats.org/drawingml/2006/picture">
+                <pic:pic xmlns:pic="http://schemas.openxmlformats.org/drawingml/2006/picture">
+                  <pic:nvPicPr>
+                    <pic:cNvPr id="1" name=""/>
+                    <pic:cNvPicPr/>
+                  </pic:nvPicPr>
+                  <pic:blipFill>
+                    <a:blip r:embed="rId71"/>
+                    <a:stretch>
+                      <a:fillRect/>
+                    </a:stretch>
+                  </pic:blipFill>
+                  <pic:spPr>
+                    <a:xfrm>
+                      <a:off x="0" y="0"/>
+                      <a:ext cx="5134197" cy="1596441"/>
+                    </a:xfrm>
+                    <a:prstGeom prst="rect">
+                      <a:avLst/>
+                    </a:prstGeom>
+                  </pic:spPr>
+                </pic:pic>
+              </a:graphicData>
+            </a:graphic>
+          </wp:inline>
+        </w:drawing>
+      </w:r>
+    </w:p>
+    <w:p/>
+    <w:p>
+      <w:r>
+        <w:rPr>
+          <w:noProof/>
+        </w:rPr>
+        <mc:AlternateContent>
+          <mc:Choice Requires="wps">
+            <w:drawing>
+              <wp:anchor distT="0" distB="0" distL="114300" distR="114300" simplePos="0" relativeHeight="251675648" behindDoc="0" locked="0" layoutInCell="1" allowOverlap="1" wp14:anchorId="6B1BBD09" wp14:editId="4D8BC522">
+                <wp:simplePos x="0" y="0"/>
+                <wp:positionH relativeFrom="column">
+                  <wp:posOffset>2735631</wp:posOffset>
+                </wp:positionH>
+                <wp:positionV relativeFrom="paragraph">
+                  <wp:posOffset>213081</wp:posOffset>
+                </wp:positionV>
+                <wp:extent cx="3525926" cy="1623974"/>
+                <wp:effectExtent l="38100" t="0" r="17780" b="52705"/>
+                <wp:wrapNone/>
+                <wp:docPr id="79" name="Conector de Seta Reta 79"/>
+                <wp:cNvGraphicFramePr/>
+                <a:graphic xmlns:a="http://schemas.openxmlformats.org/drawingml/2006/main">
+                  <a:graphicData uri="http://schemas.microsoft.com/office/word/2010/wordprocessingShape">
+                    <wps:wsp>
+                      <wps:cNvCnPr/>
+                      <wps:spPr>
+                        <a:xfrm flipH="1">
+                          <a:off x="0" y="0"/>
+                          <a:ext cx="3525926" cy="1623974"/>
+                        </a:xfrm>
+                        <a:prstGeom prst="straightConnector1">
+                          <a:avLst/>
+                        </a:prstGeom>
+                        <a:ln>
+                          <a:tailEnd type="triangle"/>
+                        </a:ln>
+                      </wps:spPr>
+                      <wps:style>
+                        <a:lnRef idx="1">
+                          <a:schemeClr val="accent1"/>
+                        </a:lnRef>
+                        <a:fillRef idx="0">
+                          <a:schemeClr val="accent1"/>
+                        </a:fillRef>
+                        <a:effectRef idx="0">
+                          <a:schemeClr val="accent1"/>
+                        </a:effectRef>
+                        <a:fontRef idx="minor">
+                          <a:schemeClr val="tx1"/>
+                        </a:fontRef>
+                      </wps:style>
+                      <wps:bodyPr/>
+                    </wps:wsp>
+                  </a:graphicData>
+                </a:graphic>
+              </wp:anchor>
+            </w:drawing>
+          </mc:Choice>
+          <mc:Fallback>
+            <w:pict>
+              <v:shape w14:anchorId="2F1725FF" id="Conector de Seta Reta 79" o:spid="_x0000_s1026" type="#_x0000_t32" style="position:absolute;margin-left:215.4pt;margin-top:16.8pt;width:277.65pt;height:127.85pt;flip:x;z-index:251675648;visibility:visible;mso-wrap-style:square;mso-wrap-distance-left:9pt;mso-wrap-distance-top:0;mso-wrap-distance-right:9pt;mso-wrap-distance-bottom:0;mso-position-horizontal:absolute;mso-position-horizontal-relative:text;mso-position-vertical:absolute;mso-position-vertical-relative:text" o:gfxdata="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" strokecolor="#4472c4 [3204]" strokeweight=".5pt">
+                <v:stroke endarrow="block" joinstyle="miter"/>
+              </v:shape>
+            </w:pict>
+          </mc:Fallback>
+        </mc:AlternateContent>
+      </w:r>
+      <w:r>
+        <w:t>36</w:t>
+      </w:r>
+      <w:r>
+        <w:t xml:space="preserve"> -  Determinamos que cada item da lista produtos ocupara 30% de largura e alinhamos o texto na parte superior.</w:t>
+      </w:r>
+    </w:p>
+    <w:p>
+      <w:r>
+        <w:rPr>
+          <w:noProof/>
+        </w:rPr>
+        <mc:AlternateContent>
+          <mc:Choice Requires="wps">
+            <w:drawing>
+              <wp:anchor distT="0" distB="0" distL="114300" distR="114300" simplePos="0" relativeHeight="251674624" behindDoc="0" locked="0" layoutInCell="1" allowOverlap="1" wp14:anchorId="23C6C752" wp14:editId="108E2704">
+                <wp:simplePos x="0" y="0"/>
+                <wp:positionH relativeFrom="column">
+                  <wp:posOffset>1638351</wp:posOffset>
+                </wp:positionH>
+                <wp:positionV relativeFrom="paragraph">
+                  <wp:posOffset>80010</wp:posOffset>
+                </wp:positionV>
+                <wp:extent cx="1631289" cy="1075334"/>
+                <wp:effectExtent l="38100" t="0" r="26670" b="48895"/>
+                <wp:wrapNone/>
+                <wp:docPr id="78" name="Conector de Seta Reta 78"/>
+                <wp:cNvGraphicFramePr/>
+                <a:graphic xmlns:a="http://schemas.openxmlformats.org/drawingml/2006/main">
+                  <a:graphicData uri="http://schemas.microsoft.com/office/word/2010/wordprocessingShape">
+                    <wps:wsp>
+                      <wps:cNvCnPr/>
+                      <wps:spPr>
+                        <a:xfrm flipH="1">
+                          <a:off x="0" y="0"/>
+                          <a:ext cx="1631289" cy="1075334"/>
+                        </a:xfrm>
+                        <a:prstGeom prst="straightConnector1">
+                          <a:avLst/>
+                        </a:prstGeom>
+                        <a:ln>
+                          <a:tailEnd type="triangle"/>
+                        </a:ln>
+                      </wps:spPr>
+                      <wps:style>
+                        <a:lnRef idx="1">
+                          <a:schemeClr val="accent1"/>
+                        </a:lnRef>
+                        <a:fillRef idx="0">
+                          <a:schemeClr val="accent1"/>
+                        </a:fillRef>
+                        <a:effectRef idx="0">
+                          <a:schemeClr val="accent1"/>
+                        </a:effectRef>
+                        <a:fontRef idx="minor">
+                          <a:schemeClr val="tx1"/>
+                        </a:fontRef>
+                      </wps:style>
+                      <wps:bodyPr/>
+                    </wps:wsp>
+                  </a:graphicData>
+                </a:graphic>
+              </wp:anchor>
+            </w:drawing>
+          </mc:Choice>
+          <mc:Fallback>
+            <w:pict>
+              <v:shape w14:anchorId="08BD388E" id="Conector de Seta Reta 78" o:spid="_x0000_s1026" type="#_x0000_t32" style="position:absolute;margin-left:129pt;margin-top:6.3pt;width:128.45pt;height:84.65pt;flip:x;z-index:251674624;visibility:visible;mso-wrap-style:square;mso-wrap-distance-left:9pt;mso-wrap-distance-top:0;mso-wrap-distance-right:9pt;mso-wrap-distance-bottom:0;mso-position-horizontal:absolute;mso-position-horizontal-relative:text;mso-position-vertical:absolute;mso-position-vertical-relative:text" o:gfxdata="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" strokecolor="#4472c4 [3204]" strokeweight=".5pt">
+                <v:stroke endarrow="block" joinstyle="miter"/>
+              </v:shape>
+            </w:pict>
+          </mc:Fallback>
+        </mc:AlternateContent>
+      </w:r>
+      <w:r>
+        <w:drawing>
+          <wp:inline distT="0" distB="0" distL="0" distR="0" wp14:anchorId="05EB9EFB" wp14:editId="3B3EC353">
+            <wp:extent cx="3296110" cy="2381582"/>
+            <wp:effectExtent l="0" t="0" r="0" b="0"/>
+            <wp:docPr id="77" name="Imagem 77"/>
+            <wp:cNvGraphicFramePr>
+              <a:graphicFrameLocks xmlns:a="http://schemas.openxmlformats.org/drawingml/2006/main" noChangeAspect="1"/>
+            </wp:cNvGraphicFramePr>
+            <a:graphic xmlns:a="http://schemas.openxmlformats.org/drawingml/2006/main">
+              <a:graphicData uri="http://schemas.openxmlformats.org/drawingml/2006/picture">
+                <pic:pic xmlns:pic="http://schemas.openxmlformats.org/drawingml/2006/picture">
+                  <pic:nvPicPr>
+                    <pic:cNvPr id="1" name=""/>
+                    <pic:cNvPicPr/>
+                  </pic:nvPicPr>
+                  <pic:blipFill>
+                    <a:blip r:embed="rId72"/>
+                    <a:stretch>
+                      <a:fillRect/>
+                    </a:stretch>
+                  </pic:blipFill>
+                  <pic:spPr>
+                    <a:xfrm>
+                      <a:off x="0" y="0"/>
+                      <a:ext cx="3296110" cy="2381582"/>
+                    </a:xfrm>
+                    <a:prstGeom prst="rect">
+                      <a:avLst/>
+                    </a:prstGeom>
+                  </pic:spPr>
+                </pic:pic>
+              </a:graphicData>
+            </a:graphic>
+          </wp:inline>
+        </w:drawing>
+      </w:r>
+    </w:p>
+    <w:p/>
+    <w:p>
+      <w:r>
+        <w:t xml:space="preserve">37 – </w:t>
+      </w:r>
+      <w:r>
+        <w:t>Utilizamos</w:t>
+      </w:r>
+      <w:r>
+        <w:t xml:space="preserve"> o </w:t>
+      </w:r>
+      <w:proofErr w:type="spellStart"/>
+      <w:r>
+        <w:t>css</w:t>
+      </w:r>
+      <w:proofErr w:type="spellEnd"/>
+      <w:r>
+        <w:t xml:space="preserve"> através de </w:t>
+      </w:r>
+      <w:r>
+        <w:t>referência</w:t>
+      </w:r>
+      <w:r>
+        <w:t xml:space="preserve">  </w:t>
+      </w:r>
+      <w:r>
+        <w:t xml:space="preserve">por exemplo  utilizamos o nome da </w:t>
+      </w:r>
+      <w:proofErr w:type="spellStart"/>
+      <w:r>
+        <w:t>class</w:t>
+      </w:r>
+      <w:proofErr w:type="spellEnd"/>
+      <w:r>
+        <w:t xml:space="preserve"> e o elemento.</w:t>
+      </w:r>
+    </w:p>
+    <w:p>
+      <w:r>
+        <w:t>Aumentando o tamanho da fonte e deixando o texto mais encorpado.</w:t>
+      </w:r>
+    </w:p>
+    <w:p/>
+    <w:p>
+      <w:r>
+        <w:drawing>
+          <wp:inline distT="0" distB="0" distL="0" distR="0" wp14:anchorId="49AEF39E" wp14:editId="57C4BD9A">
+            <wp:extent cx="3477110" cy="1581371"/>
+            <wp:effectExtent l="0" t="0" r="0" b="0"/>
+            <wp:docPr id="80" name="Imagem 80"/>
+            <wp:cNvGraphicFramePr>
+              <a:graphicFrameLocks xmlns:a="http://schemas.openxmlformats.org/drawingml/2006/main" noChangeAspect="1"/>
+            </wp:cNvGraphicFramePr>
+            <a:graphic xmlns:a="http://schemas.openxmlformats.org/drawingml/2006/main">
+              <a:graphicData uri="http://schemas.openxmlformats.org/drawingml/2006/picture">
+                <pic:pic xmlns:pic="http://schemas.openxmlformats.org/drawingml/2006/picture">
+                  <pic:nvPicPr>
+                    <pic:cNvPr id="1" name=""/>
+                    <pic:cNvPicPr/>
+                  </pic:nvPicPr>
+                  <pic:blipFill>
+                    <a:blip r:embed="rId73"/>
+                    <a:stretch>
+                      <a:fillRect/>
+                    </a:stretch>
+                  </pic:blipFill>
+                  <pic:spPr>
+                    <a:xfrm>
+                      <a:off x="0" y="0"/>
+                      <a:ext cx="3477110" cy="1581371"/>
+                    </a:xfrm>
+                    <a:prstGeom prst="rect">
+                      <a:avLst/>
+                    </a:prstGeom>
+                  </pic:spPr>
+                </pic:pic>
+              </a:graphicData>
+            </a:graphic>
+          </wp:inline>
+        </w:drawing>
+      </w:r>
+    </w:p>
+    <w:p>
+      <w:r>
+        <w:t xml:space="preserve">38 </w:t>
+      </w:r>
+      <w:r>
+        <w:t>–</w:t>
+      </w:r>
+      <w:r>
+        <w:t xml:space="preserve"> </w:t>
+      </w:r>
+      <w:r>
+        <w:t xml:space="preserve">Nos parágrafos da lista dos produtos adicionamos as </w:t>
+      </w:r>
+      <w:proofErr w:type="spellStart"/>
+      <w:r>
+        <w:t>class</w:t>
+      </w:r>
+      <w:proofErr w:type="spellEnd"/>
+      <w:r>
+        <w:t xml:space="preserve"> </w:t>
+      </w:r>
+      <w:proofErr w:type="spellStart"/>
+      <w:r>
+        <w:t>descricao</w:t>
+      </w:r>
+      <w:proofErr w:type="spellEnd"/>
+      <w:r>
+        <w:t xml:space="preserve"> e </w:t>
+      </w:r>
+      <w:proofErr w:type="spellStart"/>
+      <w:r>
+        <w:t>preco</w:t>
+      </w:r>
+      <w:proofErr w:type="spellEnd"/>
+      <w:r>
+        <w:t xml:space="preserve"> para trabalhar com </w:t>
+      </w:r>
+      <w:r>
+        <w:t>esses dois elementos</w:t>
+      </w:r>
+      <w:r>
+        <w:t xml:space="preserve"> conforme código abaixo:</w:t>
+      </w:r>
+    </w:p>
+    <w:p>
+      <w:r>
+        <w:drawing>
+          <wp:inline distT="0" distB="0" distL="0" distR="0" wp14:anchorId="49D09E3A" wp14:editId="6352FD1F">
+            <wp:extent cx="3991532" cy="2896004"/>
+            <wp:effectExtent l="0" t="0" r="9525" b="0"/>
+            <wp:docPr id="81" name="Imagem 81"/>
+            <wp:cNvGraphicFramePr>
+              <a:graphicFrameLocks xmlns:a="http://schemas.openxmlformats.org/drawingml/2006/main" noChangeAspect="1"/>
+            </wp:cNvGraphicFramePr>
+            <a:graphic xmlns:a="http://schemas.openxmlformats.org/drawingml/2006/main">
+              <a:graphicData uri="http://schemas.openxmlformats.org/drawingml/2006/picture">
+                <pic:pic xmlns:pic="http://schemas.openxmlformats.org/drawingml/2006/picture">
+                  <pic:nvPicPr>
+                    <pic:cNvPr id="1" name=""/>
+                    <pic:cNvPicPr/>
+                  </pic:nvPicPr>
+                  <pic:blipFill>
+                    <a:blip r:embed="rId74"/>
+                    <a:stretch>
+                      <a:fillRect/>
+                    </a:stretch>
+                  </pic:blipFill>
+                  <pic:spPr>
+                    <a:xfrm>
+                      <a:off x="0" y="0"/>
+                      <a:ext cx="3991532" cy="2896004"/>
+                    </a:xfrm>
+                    <a:prstGeom prst="rect">
+                      <a:avLst/>
+                    </a:prstGeom>
+                  </pic:spPr>
+                </pic:pic>
+              </a:graphicData>
+            </a:graphic>
+          </wp:inline>
+        </w:drawing>
+      </w:r>
+    </w:p>
+    <w:p>
+      <w:r>
+        <w:tab/>
+      </w:r>
+      <w:r>
+        <w:t xml:space="preserve">39-  </w:t>
+      </w:r>
+      <w:proofErr w:type="gramStart"/>
+      <w:r>
+        <w:t>No produtos</w:t>
+      </w:r>
+      <w:proofErr w:type="gramEnd"/>
+      <w:r>
+        <w:t xml:space="preserve"> li inserimos uma cor de fundo e demos uma </w:t>
+      </w:r>
+      <w:r>
+        <w:t>distância</w:t>
+      </w:r>
+      <w:r>
+        <w:t xml:space="preserve"> de 1.5% tanto para direita como para esquerda </w:t>
+      </w:r>
+      <w:r>
+        <w:t xml:space="preserve"> utilizando </w:t>
+      </w:r>
+      <w:proofErr w:type="spellStart"/>
+      <w:r>
+        <w:t>margin</w:t>
+      </w:r>
+      <w:proofErr w:type="spellEnd"/>
+      <w:r>
+        <w:t>.</w:t>
+      </w:r>
+    </w:p>
+    <w:p>
+      <w:r>
+        <w:rPr>
+          <w:noProof/>
+        </w:rPr>
+        <mc:AlternateContent>
+          <mc:Choice Requires="wps">
+            <w:drawing>
+              <wp:anchor distT="0" distB="0" distL="114300" distR="114300" simplePos="0" relativeHeight="251677696" behindDoc="0" locked="0" layoutInCell="1" allowOverlap="1" wp14:anchorId="7A9336CC" wp14:editId="7625648F">
+                <wp:simplePos x="0" y="0"/>
+                <wp:positionH relativeFrom="column">
+                  <wp:posOffset>2464968</wp:posOffset>
+                </wp:positionH>
+                <wp:positionV relativeFrom="paragraph">
+                  <wp:posOffset>1988337</wp:posOffset>
+                </wp:positionV>
+                <wp:extent cx="1865376" cy="146304"/>
+                <wp:effectExtent l="38100" t="0" r="20955" b="82550"/>
+                <wp:wrapNone/>
+                <wp:docPr id="84" name="Conector de Seta Reta 84"/>
+                <wp:cNvGraphicFramePr/>
+                <a:graphic xmlns:a="http://schemas.openxmlformats.org/drawingml/2006/main">
+                  <a:graphicData uri="http://schemas.microsoft.com/office/word/2010/wordprocessingShape">
+                    <wps:wsp>
+                      <wps:cNvCnPr/>
+                      <wps:spPr>
+                        <a:xfrm flipH="1">
+                          <a:off x="0" y="0"/>
+                          <a:ext cx="1865376" cy="146304"/>
+                        </a:xfrm>
+                        <a:prstGeom prst="straightConnector1">
+                          <a:avLst/>
+                        </a:prstGeom>
+                        <a:ln>
+                          <a:tailEnd type="triangle"/>
+                        </a:ln>
+                      </wps:spPr>
+                      <wps:style>
+                        <a:lnRef idx="1">
+                          <a:schemeClr val="accent1"/>
+                        </a:lnRef>
+                        <a:fillRef idx="0">
+                          <a:schemeClr val="accent1"/>
+                        </a:fillRef>
+                        <a:effectRef idx="0">
+                          <a:schemeClr val="accent1"/>
+                        </a:effectRef>
+                        <a:fontRef idx="minor">
+                          <a:schemeClr val="tx1"/>
+                        </a:fontRef>
+                      </wps:style>
+                      <wps:bodyPr/>
+                    </wps:wsp>
+                  </a:graphicData>
+                </a:graphic>
+              </wp:anchor>
+            </w:drawing>
+          </mc:Choice>
+          <mc:Fallback>
+            <w:pict>
+              <v:shape w14:anchorId="27B95F6E" id="Conector de Seta Reta 84" o:spid="_x0000_s1026" type="#_x0000_t32" style="position:absolute;margin-left:194.1pt;margin-top:156.55pt;width:146.9pt;height:11.5pt;flip:x;z-index:251677696;visibility:visible;mso-wrap-style:square;mso-wrap-distance-left:9pt;mso-wrap-distance-top:0;mso-wrap-distance-right:9pt;mso-wrap-distance-bottom:0;mso-position-horizontal:absolute;mso-position-horizontal-relative:text;mso-position-vertical:absolute;mso-position-vertical-relative:text" o:gfxdata="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" strokecolor="#4472c4 [3204]" strokeweight=".5pt">
+                <v:stroke endarrow="block" joinstyle="miter"/>
+              </v:shape>
+            </w:pict>
+          </mc:Fallback>
+        </mc:AlternateContent>
+      </w:r>
+      <w:r>
+        <w:rPr>
+          <w:noProof/>
+        </w:rPr>
+        <mc:AlternateContent>
+          <mc:Choice Requires="wps">
+            <w:drawing>
+              <wp:anchor distT="0" distB="0" distL="114300" distR="114300" simplePos="0" relativeHeight="251676672" behindDoc="0" locked="0" layoutInCell="1" allowOverlap="1" wp14:anchorId="639DB5AF" wp14:editId="450D31BF">
+                <wp:simplePos x="0" y="0"/>
+                <wp:positionH relativeFrom="column">
+                  <wp:posOffset>3679292</wp:posOffset>
+                </wp:positionH>
+                <wp:positionV relativeFrom="paragraph">
+                  <wp:posOffset>1476273</wp:posOffset>
+                </wp:positionV>
+                <wp:extent cx="680313" cy="336500"/>
+                <wp:effectExtent l="38100" t="0" r="24765" b="64135"/>
+                <wp:wrapNone/>
+                <wp:docPr id="83" name="Conector de Seta Reta 83"/>
+                <wp:cNvGraphicFramePr/>
+                <a:graphic xmlns:a="http://schemas.openxmlformats.org/drawingml/2006/main">
+                  <a:graphicData uri="http://schemas.microsoft.com/office/word/2010/wordprocessingShape">
+                    <wps:wsp>
+                      <wps:cNvCnPr/>
+                      <wps:spPr>
+                        <a:xfrm flipH="1">
+                          <a:off x="0" y="0"/>
+                          <a:ext cx="680313" cy="336500"/>
+                        </a:xfrm>
+                        <a:prstGeom prst="straightConnector1">
+                          <a:avLst/>
+                        </a:prstGeom>
+                        <a:ln>
+                          <a:tailEnd type="triangle"/>
+                        </a:ln>
+                      </wps:spPr>
+                      <wps:style>
+                        <a:lnRef idx="1">
+                          <a:schemeClr val="accent1"/>
+                        </a:lnRef>
+                        <a:fillRef idx="0">
+                          <a:schemeClr val="accent1"/>
+                        </a:fillRef>
+                        <a:effectRef idx="0">
+                          <a:schemeClr val="accent1"/>
+                        </a:effectRef>
+                        <a:fontRef idx="minor">
+                          <a:schemeClr val="tx1"/>
+                        </a:fontRef>
+                      </wps:style>
+                      <wps:bodyPr/>
+                    </wps:wsp>
+                  </a:graphicData>
+                </a:graphic>
+              </wp:anchor>
+            </w:drawing>
+          </mc:Choice>
+          <mc:Fallback>
+            <w:pict>
+              <v:shape w14:anchorId="1A1A4A40" id="Conector de Seta Reta 83" o:spid="_x0000_s1026" type="#_x0000_t32" style="position:absolute;margin-left:289.7pt;margin-top:116.25pt;width:53.55pt;height:26.5pt;flip:x;z-index:251676672;visibility:visible;mso-wrap-style:square;mso-wrap-distance-left:9pt;mso-wrap-distance-top:0;mso-wrap-distance-right:9pt;mso-wrap-distance-bottom:0;mso-position-horizontal:absolute;mso-position-horizontal-relative:text;mso-position-vertical:absolute;mso-position-vertical-relative:text" o:gfxdata="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" strokecolor="#4472c4 [3204]" strokeweight=".5pt">
+                <v:stroke endarrow="block" joinstyle="miter"/>
+              </v:shape>
+            </w:pict>
+          </mc:Fallback>
+        </mc:AlternateContent>
+      </w:r>
+      <w:r>
+        <w:drawing>
+          <wp:inline distT="0" distB="0" distL="0" distR="0" wp14:anchorId="34742512" wp14:editId="66BEFD14">
+            <wp:extent cx="4391638" cy="2838846"/>
+            <wp:effectExtent l="0" t="0" r="9525" b="0"/>
+            <wp:docPr id="82" name="Imagem 82"/>
+            <wp:cNvGraphicFramePr>
+              <a:graphicFrameLocks xmlns:a="http://schemas.openxmlformats.org/drawingml/2006/main" noChangeAspect="1"/>
+            </wp:cNvGraphicFramePr>
+            <a:graphic xmlns:a="http://schemas.openxmlformats.org/drawingml/2006/main">
+              <a:graphicData uri="http://schemas.openxmlformats.org/drawingml/2006/picture">
+                <pic:pic xmlns:pic="http://schemas.openxmlformats.org/drawingml/2006/picture">
+                  <pic:nvPicPr>
+                    <pic:cNvPr id="1" name=""/>
+                    <pic:cNvPicPr/>
+                  </pic:nvPicPr>
+                  <pic:blipFill>
+                    <a:blip r:embed="rId75"/>
+                    <a:stretch>
+                      <a:fillRect/>
+                    </a:stretch>
+                  </pic:blipFill>
+                  <pic:spPr>
+                    <a:xfrm>
+                      <a:off x="0" y="0"/>
+                      <a:ext cx="4391638" cy="2838846"/>
+                    </a:xfrm>
+                    <a:prstGeom prst="rect">
+                      <a:avLst/>
+                    </a:prstGeom>
+                  </pic:spPr>
+                </pic:pic>
+              </a:graphicData>
+            </a:graphic>
+          </wp:inline>
+        </w:drawing>
+      </w:r>
+      <w:r>
+        <w:drawing>
+          <wp:inline distT="0" distB="0" distL="0" distR="0" wp14:anchorId="1F3A833C" wp14:editId="5560423A">
+            <wp:extent cx="3998372" cy="1273890"/>
+            <wp:effectExtent l="0" t="0" r="2540" b="2540"/>
+            <wp:docPr id="85" name="Imagem 85"/>
+            <wp:cNvGraphicFramePr>
+              <a:graphicFrameLocks xmlns:a="http://schemas.openxmlformats.org/drawingml/2006/main" noChangeAspect="1"/>
+            </wp:cNvGraphicFramePr>
+            <a:graphic xmlns:a="http://schemas.openxmlformats.org/drawingml/2006/main">
+              <a:graphicData uri="http://schemas.openxmlformats.org/drawingml/2006/picture">
+                <pic:pic xmlns:pic="http://schemas.openxmlformats.org/drawingml/2006/picture">
+                  <pic:nvPicPr>
+                    <pic:cNvPr id="1" name=""/>
+                    <pic:cNvPicPr/>
+                  </pic:nvPicPr>
+                  <pic:blipFill>
+                    <a:blip r:embed="rId76"/>
+                    <a:stretch>
+                      <a:fillRect/>
+                    </a:stretch>
+                  </pic:blipFill>
+                  <pic:spPr>
+                    <a:xfrm>
+                      <a:off x="0" y="0"/>
+                      <a:ext cx="4065788" cy="1295369"/>
+                    </a:xfrm>
+                    <a:prstGeom prst="rect">
+                      <a:avLst/>
+                    </a:prstGeom>
+                  </pic:spPr>
+                </pic:pic>
+              </a:graphicData>
+            </a:graphic>
+          </wp:inline>
+        </w:drawing>
+      </w:r>
+    </w:p>
+    <w:p/>
+    <w:p/>
+    <w:p/>
     <w:p>
       <w:bookmarkStart w:id="0" w:name="_GoBack"/>
       <w:bookmarkEnd w:id="0"/>
     </w:p>
+    <w:p/>
     <w:sectPr>
       <w:pgSz w:w="11906" w:h="16838"/>
       <w:pgMar w:top="1417" w:right="1701" w:bottom="1417" w:left="1701" w:header="708" w:footer="708" w:gutter="0"/>
@@ -5375,23 +6487,6 @@
 </file>
 
 <file path=customXml/item1.xml><?xml version="1.0" encoding="utf-8"?>
-<?mso-contentType ?>
-<FormTemplates xmlns="http://schemas.microsoft.com/sharepoint/v3/contenttype/forms">
-  <Display>DocumentLibraryForm</Display>
-  <Edit>DocumentLibraryForm</Edit>
-  <New>DocumentLibraryForm</New>
-</FormTemplates>
-</file>
-
-<file path=customXml/item2.xml><?xml version="1.0" encoding="utf-8"?>
-<p:properties xmlns:p="http://schemas.microsoft.com/office/2006/metadata/properties" xmlns:xsi="http://www.w3.org/2001/XMLSchema-instance" xmlns:pc="http://schemas.microsoft.com/office/infopath/2007/PartnerControls">
-  <documentManagement>
-    <_activity xmlns="8437a765-f0a9-40aa-978b-fcc06261281f" xsi:nil="true"/>
-  </documentManagement>
-</p:properties>
-</file>
-
-<file path=customXml/item3.xml><?xml version="1.0" encoding="utf-8"?>
 <ct:contentTypeSchema xmlns:ct="http://schemas.microsoft.com/office/2006/metadata/contentType" xmlns:ma="http://schemas.microsoft.com/office/2006/metadata/properties/metaAttributes" ct:_="" ma:_="" ma:contentTypeName="Documento" ma:contentTypeID="0x01010034B17ED9C83E394791ACA33DA9287452" ma:contentTypeVersion="16" ma:contentTypeDescription="Crie um novo documento." ma:contentTypeScope="" ma:versionID="d36ce64b1b29120840e9f9b956471cbb">
   <xsd:schema xmlns:xsd="http://www.w3.org/2001/XMLSchema" xmlns:xs="http://www.w3.org/2001/XMLSchema" xmlns:p="http://schemas.microsoft.com/office/2006/metadata/properties" xmlns:ns3="8437a765-f0a9-40aa-978b-fcc06261281f" xmlns:ns4="e78d8b06-d887-4705-9cec-751f2fb2cee2" targetNamespace="http://schemas.microsoft.com/office/2006/metadata/properties" ma:root="true" ma:fieldsID="ab1d645bb15f72c0dfc8a8f602f1de6b" ns3:_="" ns4:_="">
     <xsd:import namespace="8437a765-f0a9-40aa-978b-fcc06261281f"/>
@@ -5630,29 +6725,28 @@
 </ct:contentTypeSchema>
 </file>
 
+<file path=customXml/item2.xml><?xml version="1.0" encoding="utf-8"?>
+<?mso-contentType ?>
+<FormTemplates xmlns="http://schemas.microsoft.com/sharepoint/v3/contenttype/forms">
+  <Display>DocumentLibraryForm</Display>
+  <Edit>DocumentLibraryForm</Edit>
+  <New>DocumentLibraryForm</New>
+</FormTemplates>
+</file>
+
+<file path=customXml/item3.xml><?xml version="1.0" encoding="utf-8"?>
+<p:properties xmlns:p="http://schemas.microsoft.com/office/2006/metadata/properties" xmlns:xsi="http://www.w3.org/2001/XMLSchema-instance" xmlns:pc="http://schemas.microsoft.com/office/infopath/2007/PartnerControls">
+  <documentManagement>
+    <_activity xmlns="8437a765-f0a9-40aa-978b-fcc06261281f" xsi:nil="true"/>
+  </documentManagement>
+</p:properties>
+</file>
+
 <file path=customXml/item4.xml><?xml version="1.0" encoding="utf-8"?>
 <b:Sources xmlns:b="http://schemas.openxmlformats.org/officeDocument/2006/bibliography" xmlns="http://schemas.openxmlformats.org/officeDocument/2006/bibliography" SelectedStyle="\APASixthEditionOfficeOnline.xsl" StyleName="APA" Version="6"/>
 </file>
 
 <file path=customXml/itemProps1.xml><?xml version="1.0" encoding="utf-8"?>
-<ds:datastoreItem xmlns:ds="http://schemas.openxmlformats.org/officeDocument/2006/customXml" ds:itemID="{38630907-5F1E-4561-A45F-AC7CC415CD73}">
-  <ds:schemaRefs>
-    <ds:schemaRef ds:uri="http://schemas.microsoft.com/sharepoint/v3/contenttype/forms"/>
-  </ds:schemaRefs>
-</ds:datastoreItem>
-</file>
-
-<file path=customXml/itemProps2.xml><?xml version="1.0" encoding="utf-8"?>
-<ds:datastoreItem xmlns:ds="http://schemas.openxmlformats.org/officeDocument/2006/customXml" ds:itemID="{0C9FFCBC-F2CA-4FF1-AAFC-AD3B89BB1967}">
-  <ds:schemaRefs>
-    <ds:schemaRef ds:uri="http://schemas.microsoft.com/office/2006/metadata/properties"/>
-    <ds:schemaRef ds:uri="http://schemas.microsoft.com/office/infopath/2007/PartnerControls"/>
-    <ds:schemaRef ds:uri="8437a765-f0a9-40aa-978b-fcc06261281f"/>
-  </ds:schemaRefs>
-</ds:datastoreItem>
-</file>
-
-<file path=customXml/itemProps3.xml><?xml version="1.0" encoding="utf-8"?>
 <ds:datastoreItem xmlns:ds="http://schemas.openxmlformats.org/officeDocument/2006/customXml" ds:itemID="{5D63F5B6-DF50-4CAF-997C-1D8B1776178E}">
   <ds:schemaRefs>
     <ds:schemaRef ds:uri="http://schemas.microsoft.com/office/2006/metadata/contentType"/>
@@ -5671,8 +6765,26 @@
 </ds:datastoreItem>
 </file>
 
+<file path=customXml/itemProps2.xml><?xml version="1.0" encoding="utf-8"?>
+<ds:datastoreItem xmlns:ds="http://schemas.openxmlformats.org/officeDocument/2006/customXml" ds:itemID="{38630907-5F1E-4561-A45F-AC7CC415CD73}">
+  <ds:schemaRefs>
+    <ds:schemaRef ds:uri="http://schemas.microsoft.com/sharepoint/v3/contenttype/forms"/>
+  </ds:schemaRefs>
+</ds:datastoreItem>
+</file>
+
+<file path=customXml/itemProps3.xml><?xml version="1.0" encoding="utf-8"?>
+<ds:datastoreItem xmlns:ds="http://schemas.openxmlformats.org/officeDocument/2006/customXml" ds:itemID="{0C9FFCBC-F2CA-4FF1-AAFC-AD3B89BB1967}">
+  <ds:schemaRefs>
+    <ds:schemaRef ds:uri="http://schemas.microsoft.com/office/2006/metadata/properties"/>
+    <ds:schemaRef ds:uri="http://schemas.microsoft.com/office/infopath/2007/PartnerControls"/>
+    <ds:schemaRef ds:uri="8437a765-f0a9-40aa-978b-fcc06261281f"/>
+  </ds:schemaRefs>
+</ds:datastoreItem>
+</file>
+
 <file path=customXml/itemProps4.xml><?xml version="1.0" encoding="utf-8"?>
-<ds:datastoreItem xmlns:ds="http://schemas.openxmlformats.org/officeDocument/2006/customXml" ds:itemID="{9D5BA650-55E7-4786-AC59-C71CF20E0E21}">
+<ds:datastoreItem xmlns:ds="http://schemas.openxmlformats.org/officeDocument/2006/customXml" ds:itemID="{ADDCE7A5-5A58-4D18-8951-E5C8C13B07E7}">
   <ds:schemaRefs>
     <ds:schemaRef ds:uri="http://schemas.openxmlformats.org/officeDocument/2006/bibliography"/>
   </ds:schemaRefs>

</xml_diff>

<commit_message>
atualização da aula dia 08/09/2026
</commit_message>
<xml_diff>
--- a/apostila/Projeto Space for me3.docx
+++ b/apostila/Projeto Space for me3.docx
@@ -4300,6 +4300,9 @@
     <w:p/>
     <w:p>
       <w:r>
+        <w:rPr>
+          <w:noProof/>
+        </w:rPr>
         <w:drawing>
           <wp:inline distT="0" distB="0" distL="0" distR="0" wp14:anchorId="5BE901BF" wp14:editId="14F4E4C4">
             <wp:extent cx="5401429" cy="4134427"/>
@@ -4381,6 +4384,9 @@
     <w:p/>
     <w:p>
       <w:r>
+        <w:rPr>
+          <w:noProof/>
+        </w:rPr>
         <w:drawing>
           <wp:inline distT="0" distB="0" distL="0" distR="0" wp14:anchorId="1F235A92" wp14:editId="2A565C8C">
             <wp:extent cx="5191850" cy="3877216"/>
@@ -4418,6 +4424,9 @@
         </w:drawing>
       </w:r>
       <w:r>
+        <w:rPr>
+          <w:noProof/>
+        </w:rPr>
         <w:drawing>
           <wp:inline distT="0" distB="0" distL="0" distR="0" wp14:anchorId="0C4C236C" wp14:editId="5FF7AD0A">
             <wp:extent cx="2715004" cy="1086002"/>
@@ -4457,6 +4466,9 @@
     </w:p>
     <w:p>
       <w:r>
+        <w:rPr>
+          <w:noProof/>
+        </w:rPr>
         <w:drawing>
           <wp:inline distT="0" distB="0" distL="0" distR="0" wp14:anchorId="14FF4960" wp14:editId="709811E5">
             <wp:extent cx="4008730" cy="1315720"/>
@@ -4594,6 +4606,9 @@
         </mc:AlternateContent>
       </w:r>
       <w:r>
+        <w:rPr>
+          <w:noProof/>
+        </w:rPr>
         <w:drawing>
           <wp:inline distT="0" distB="0" distL="0" distR="0" wp14:anchorId="36D1F2F6" wp14:editId="2F62AAA6">
             <wp:extent cx="2791215" cy="1438476"/>
@@ -4631,6 +4646,9 @@
         </w:drawing>
       </w:r>
       <w:r>
+        <w:rPr>
+          <w:noProof/>
+        </w:rPr>
         <w:drawing>
           <wp:inline distT="0" distB="0" distL="0" distR="0" wp14:anchorId="6C288E26" wp14:editId="2CEB5398">
             <wp:extent cx="3247390" cy="1479188"/>
@@ -4698,6 +4716,9 @@
     <w:p/>
     <w:p>
       <w:r>
+        <w:rPr>
+          <w:noProof/>
+        </w:rPr>
         <w:drawing>
           <wp:inline distT="0" distB="0" distL="0" distR="0" wp14:anchorId="6607F7E2" wp14:editId="5ABD8778">
             <wp:extent cx="3277057" cy="1695687"/>
@@ -4735,6 +4756,9 @@
         </w:drawing>
       </w:r>
       <w:r>
+        <w:rPr>
+          <w:noProof/>
+        </w:rPr>
         <w:drawing>
           <wp:inline distT="0" distB="0" distL="0" distR="0" wp14:anchorId="3F9F8CD5" wp14:editId="486EFFFF">
             <wp:extent cx="5098011" cy="1585189"/>
@@ -4915,6 +4939,9 @@
         </mc:AlternateContent>
       </w:r>
       <w:r>
+        <w:rPr>
+          <w:noProof/>
+        </w:rPr>
         <w:drawing>
           <wp:inline distT="0" distB="0" distL="0" distR="0" wp14:anchorId="05EB9EFB" wp14:editId="3B3EC353">
             <wp:extent cx="3296110" cy="2381582"/>
@@ -4997,6 +5024,9 @@
     <w:p/>
     <w:p>
       <w:r>
+        <w:rPr>
+          <w:noProof/>
+        </w:rPr>
         <w:drawing>
           <wp:inline distT="0" distB="0" distL="0" distR="0" wp14:anchorId="49AEF39E" wp14:editId="57C4BD9A">
             <wp:extent cx="3477110" cy="1581371"/>
@@ -5080,6 +5110,9 @@
     </w:p>
     <w:p>
       <w:r>
+        <w:rPr>
+          <w:noProof/>
+        </w:rPr>
         <w:drawing>
           <wp:inline distT="0" distB="0" distL="0" distR="0" wp14:anchorId="49D09E3A" wp14:editId="6352FD1F">
             <wp:extent cx="3991532" cy="2896004"/>
@@ -5284,6 +5317,9 @@
         </mc:AlternateContent>
       </w:r>
       <w:r>
+        <w:rPr>
+          <w:noProof/>
+        </w:rPr>
         <w:drawing>
           <wp:inline distT="0" distB="0" distL="0" distR="0" wp14:anchorId="34742512" wp14:editId="66BEFD14">
             <wp:extent cx="4391638" cy="2838846"/>
@@ -5321,6 +5357,9 @@
         </w:drawing>
       </w:r>
       <w:r>
+        <w:rPr>
+          <w:noProof/>
+        </w:rPr>
         <w:drawing>
           <wp:inline distT="0" distB="0" distL="0" distR="0" wp14:anchorId="1F3A833C" wp14:editId="5560423A">
             <wp:extent cx="3998372" cy="1273890"/>
@@ -5360,12 +5399,1011 @@
     </w:p>
     <w:p/>
     <w:p/>
+    <w:p>
+      <w:r>
+        <w:t xml:space="preserve">40 – Na </w:t>
+      </w:r>
+      <w:proofErr w:type="spellStart"/>
+      <w:r>
+        <w:t>class</w:t>
+      </w:r>
+      <w:proofErr w:type="spellEnd"/>
+      <w:r>
+        <w:t xml:space="preserve"> produtos inserimos um e</w:t>
+      </w:r>
+      <w:r>
+        <w:t>s</w:t>
+      </w:r>
+      <w:r>
+        <w:t>paço interno que aumentou o tamanho tanto para cima como</w:t>
+      </w:r>
+      <w:r>
+        <w:t xml:space="preserve"> para</w:t>
+      </w:r>
+      <w:r>
+        <w:t xml:space="preserve"> </w:t>
+      </w:r>
+      <w:r>
+        <w:t>baixo.</w:t>
+      </w:r>
+    </w:p>
+    <w:p>
+      <w:r>
+        <w:rPr>
+          <w:noProof/>
+        </w:rPr>
+        <mc:AlternateContent>
+          <mc:Choice Requires="wps">
+            <w:drawing>
+              <wp:anchor distT="0" distB="0" distL="114300" distR="114300" simplePos="0" relativeHeight="251678720" behindDoc="0" locked="0" layoutInCell="1" allowOverlap="1" wp14:anchorId="4FEE0CE4" wp14:editId="23FCB616">
+                <wp:simplePos x="0" y="0"/>
+                <wp:positionH relativeFrom="column">
+                  <wp:posOffset>2634264</wp:posOffset>
+                </wp:positionH>
+                <wp:positionV relativeFrom="paragraph">
+                  <wp:posOffset>89715</wp:posOffset>
+                </wp:positionV>
+                <wp:extent cx="846162" cy="1050878"/>
+                <wp:effectExtent l="38100" t="0" r="30480" b="54610"/>
+                <wp:wrapNone/>
+                <wp:docPr id="87" name="Conector de Seta Reta 87"/>
+                <wp:cNvGraphicFramePr/>
+                <a:graphic xmlns:a="http://schemas.openxmlformats.org/drawingml/2006/main">
+                  <a:graphicData uri="http://schemas.microsoft.com/office/word/2010/wordprocessingShape">
+                    <wps:wsp>
+                      <wps:cNvCnPr/>
+                      <wps:spPr>
+                        <a:xfrm flipH="1">
+                          <a:off x="0" y="0"/>
+                          <a:ext cx="846162" cy="1050878"/>
+                        </a:xfrm>
+                        <a:prstGeom prst="straightConnector1">
+                          <a:avLst/>
+                        </a:prstGeom>
+                        <a:ln>
+                          <a:tailEnd type="triangle"/>
+                        </a:ln>
+                      </wps:spPr>
+                      <wps:style>
+                        <a:lnRef idx="1">
+                          <a:schemeClr val="accent1"/>
+                        </a:lnRef>
+                        <a:fillRef idx="0">
+                          <a:schemeClr val="accent1"/>
+                        </a:fillRef>
+                        <a:effectRef idx="0">
+                          <a:schemeClr val="accent1"/>
+                        </a:effectRef>
+                        <a:fontRef idx="minor">
+                          <a:schemeClr val="tx1"/>
+                        </a:fontRef>
+                      </wps:style>
+                      <wps:bodyPr/>
+                    </wps:wsp>
+                  </a:graphicData>
+                </a:graphic>
+              </wp:anchor>
+            </w:drawing>
+          </mc:Choice>
+          <mc:Fallback>
+            <w:pict>
+              <v:shapetype w14:anchorId="59388D03" id="_x0000_t32" coordsize="21600,21600" o:spt="32" o:oned="t" path="m,l21600,21600e" filled="f">
+                <v:path arrowok="t" fillok="f" o:connecttype="none"/>
+                <o:lock v:ext="edit" shapetype="t"/>
+              </v:shapetype>
+              <v:shape id="Conector de Seta Reta 87" o:spid="_x0000_s1026" type="#_x0000_t32" style="position:absolute;margin-left:207.4pt;margin-top:7.05pt;width:66.65pt;height:82.75pt;flip:x;z-index:251678720;visibility:visible;mso-wrap-style:square;mso-wrap-distance-left:9pt;mso-wrap-distance-top:0;mso-wrap-distance-right:9pt;mso-wrap-distance-bottom:0;mso-position-horizontal:absolute;mso-position-horizontal-relative:text;mso-position-vertical:absolute;mso-position-vertical-relative:text" o:gfxdata="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" strokecolor="#4472c4 [3204]" strokeweight=".5pt">
+                <v:stroke endarrow="block" joinstyle="miter"/>
+              </v:shape>
+            </w:pict>
+          </mc:Fallback>
+        </mc:AlternateContent>
+      </w:r>
+      <w:r>
+        <w:drawing>
+          <wp:inline distT="0" distB="0" distL="0" distR="0" wp14:anchorId="3BEE5EA3" wp14:editId="42B172F9">
+            <wp:extent cx="3553321" cy="2038635"/>
+            <wp:effectExtent l="0" t="0" r="0" b="0"/>
+            <wp:docPr id="86" name="Imagem 86"/>
+            <wp:cNvGraphicFramePr>
+              <a:graphicFrameLocks xmlns:a="http://schemas.openxmlformats.org/drawingml/2006/main" noChangeAspect="1"/>
+            </wp:cNvGraphicFramePr>
+            <a:graphic xmlns:a="http://schemas.openxmlformats.org/drawingml/2006/main">
+              <a:graphicData uri="http://schemas.openxmlformats.org/drawingml/2006/picture">
+                <pic:pic xmlns:pic="http://schemas.openxmlformats.org/drawingml/2006/picture">
+                  <pic:nvPicPr>
+                    <pic:cNvPr id="1" name=""/>
+                    <pic:cNvPicPr/>
+                  </pic:nvPicPr>
+                  <pic:blipFill>
+                    <a:blip r:embed="rId77"/>
+                    <a:stretch>
+                      <a:fillRect/>
+                    </a:stretch>
+                  </pic:blipFill>
+                  <pic:spPr>
+                    <a:xfrm>
+                      <a:off x="0" y="0"/>
+                      <a:ext cx="3553321" cy="2038635"/>
+                    </a:xfrm>
+                    <a:prstGeom prst="rect">
+                      <a:avLst/>
+                    </a:prstGeom>
+                  </pic:spPr>
+                </pic:pic>
+              </a:graphicData>
+            </a:graphic>
+          </wp:inline>
+        </w:drawing>
+      </w:r>
+      <w:r>
+        <w:drawing>
+          <wp:inline distT="0" distB="0" distL="0" distR="0" wp14:anchorId="201BCD92" wp14:editId="51228823">
+            <wp:extent cx="3091384" cy="1555845"/>
+            <wp:effectExtent l="0" t="0" r="0" b="6350"/>
+            <wp:docPr id="88" name="Imagem 88"/>
+            <wp:cNvGraphicFramePr>
+              <a:graphicFrameLocks xmlns:a="http://schemas.openxmlformats.org/drawingml/2006/main" noChangeAspect="1"/>
+            </wp:cNvGraphicFramePr>
+            <a:graphic xmlns:a="http://schemas.openxmlformats.org/drawingml/2006/main">
+              <a:graphicData uri="http://schemas.openxmlformats.org/drawingml/2006/picture">
+                <pic:pic xmlns:pic="http://schemas.openxmlformats.org/drawingml/2006/picture">
+                  <pic:nvPicPr>
+                    <pic:cNvPr id="1" name=""/>
+                    <pic:cNvPicPr/>
+                  </pic:nvPicPr>
+                  <pic:blipFill>
+                    <a:blip r:embed="rId78"/>
+                    <a:stretch>
+                      <a:fillRect/>
+                    </a:stretch>
+                  </pic:blipFill>
+                  <pic:spPr>
+                    <a:xfrm>
+                      <a:off x="0" y="0"/>
+                      <a:ext cx="3167678" cy="1594243"/>
+                    </a:xfrm>
+                    <a:prstGeom prst="rect">
+                      <a:avLst/>
+                    </a:prstGeom>
+                  </pic:spPr>
+                </pic:pic>
+              </a:graphicData>
+            </a:graphic>
+          </wp:inline>
+        </w:drawing>
+      </w:r>
+    </w:p>
     <w:p/>
     <w:p>
+      <w:r>
+        <w:t xml:space="preserve">41 </w:t>
+      </w:r>
+      <w:r>
+        <w:t>–</w:t>
+      </w:r>
+      <w:r>
+        <w:t xml:space="preserve"> </w:t>
+      </w:r>
+      <w:r>
+        <w:t>Nos produtos</w:t>
+      </w:r>
+      <w:r>
+        <w:t xml:space="preserve"> li adicionamos um espaço interno p</w:t>
+      </w:r>
+      <w:r>
+        <w:t xml:space="preserve">ara cima com para baixo e  para direita e esquerda </w:t>
+      </w:r>
+    </w:p>
+    <w:p>
+      <w:r>
+        <w:drawing>
+          <wp:inline distT="0" distB="0" distL="0" distR="0" wp14:anchorId="1E47B657" wp14:editId="402AE38C">
+            <wp:extent cx="4286848" cy="3801005"/>
+            <wp:effectExtent l="0" t="0" r="0" b="9525"/>
+            <wp:docPr id="90" name="Imagem 90"/>
+            <wp:cNvGraphicFramePr>
+              <a:graphicFrameLocks xmlns:a="http://schemas.openxmlformats.org/drawingml/2006/main" noChangeAspect="1"/>
+            </wp:cNvGraphicFramePr>
+            <a:graphic xmlns:a="http://schemas.openxmlformats.org/drawingml/2006/main">
+              <a:graphicData uri="http://schemas.openxmlformats.org/drawingml/2006/picture">
+                <pic:pic xmlns:pic="http://schemas.openxmlformats.org/drawingml/2006/picture">
+                  <pic:nvPicPr>
+                    <pic:cNvPr id="1" name=""/>
+                    <pic:cNvPicPr/>
+                  </pic:nvPicPr>
+                  <pic:blipFill>
+                    <a:blip r:embed="rId79"/>
+                    <a:stretch>
+                      <a:fillRect/>
+                    </a:stretch>
+                  </pic:blipFill>
+                  <pic:spPr>
+                    <a:xfrm>
+                      <a:off x="0" y="0"/>
+                      <a:ext cx="4286848" cy="3801005"/>
+                    </a:xfrm>
+                    <a:prstGeom prst="rect">
+                      <a:avLst/>
+                    </a:prstGeom>
+                  </pic:spPr>
+                </pic:pic>
+              </a:graphicData>
+            </a:graphic>
+          </wp:inline>
+        </w:drawing>
+      </w:r>
+      <w:r>
+        <w:drawing>
+          <wp:inline distT="0" distB="0" distL="0" distR="0" wp14:anchorId="4EE881E7" wp14:editId="1985FD3E">
+            <wp:extent cx="2466975" cy="3101946"/>
+            <wp:effectExtent l="0" t="0" r="0" b="3810"/>
+            <wp:docPr id="91" name="Imagem 91"/>
+            <wp:cNvGraphicFramePr>
+              <a:graphicFrameLocks xmlns:a="http://schemas.openxmlformats.org/drawingml/2006/main" noChangeAspect="1"/>
+            </wp:cNvGraphicFramePr>
+            <a:graphic xmlns:a="http://schemas.openxmlformats.org/drawingml/2006/main">
+              <a:graphicData uri="http://schemas.openxmlformats.org/drawingml/2006/picture">
+                <pic:pic xmlns:pic="http://schemas.openxmlformats.org/drawingml/2006/picture">
+                  <pic:nvPicPr>
+                    <pic:cNvPr id="1" name=""/>
+                    <pic:cNvPicPr/>
+                  </pic:nvPicPr>
+                  <pic:blipFill>
+                    <a:blip r:embed="rId80"/>
+                    <a:stretch>
+                      <a:fillRect/>
+                    </a:stretch>
+                  </pic:blipFill>
+                  <pic:spPr>
+                    <a:xfrm flipH="1">
+                      <a:off x="0" y="0"/>
+                      <a:ext cx="2498310" cy="3141346"/>
+                    </a:xfrm>
+                    <a:prstGeom prst="rect">
+                      <a:avLst/>
+                    </a:prstGeom>
+                  </pic:spPr>
+                </pic:pic>
+              </a:graphicData>
+            </a:graphic>
+          </wp:inline>
+        </w:drawing>
+      </w:r>
+    </w:p>
+    <w:p/>
+    <w:p>
+      <w:r>
+        <w:t>42- Para ajustar o espaço utilizamos o box-</w:t>
+      </w:r>
+      <w:proofErr w:type="spellStart"/>
+      <w:r>
+        <w:t>s</w:t>
+      </w:r>
+      <w:r>
+        <w:t>izing</w:t>
+      </w:r>
+      <w:proofErr w:type="spellEnd"/>
+      <w:r>
+        <w:t xml:space="preserve">  onde ele </w:t>
+      </w:r>
+      <w:r>
+        <w:t>automaticamente ajustou o espaço.</w:t>
+      </w:r>
+    </w:p>
+    <w:p>
+      <w:r>
+        <w:rPr>
+          <w:noProof/>
+        </w:rPr>
+        <mc:AlternateContent>
+          <mc:Choice Requires="wps">
+            <w:drawing>
+              <wp:anchor distT="0" distB="0" distL="114300" distR="114300" simplePos="0" relativeHeight="251679744" behindDoc="0" locked="0" layoutInCell="1" allowOverlap="1" wp14:anchorId="185DFD3C" wp14:editId="55AF3BC2">
+                <wp:simplePos x="0" y="0"/>
+                <wp:positionH relativeFrom="column">
+                  <wp:posOffset>3152879</wp:posOffset>
+                </wp:positionH>
+                <wp:positionV relativeFrom="paragraph">
+                  <wp:posOffset>2157531</wp:posOffset>
+                </wp:positionV>
+                <wp:extent cx="1030406" cy="47767"/>
+                <wp:effectExtent l="38100" t="38100" r="17780" b="85725"/>
+                <wp:wrapNone/>
+                <wp:docPr id="94" name="Conector de Seta Reta 94"/>
+                <wp:cNvGraphicFramePr/>
+                <a:graphic xmlns:a="http://schemas.openxmlformats.org/drawingml/2006/main">
+                  <a:graphicData uri="http://schemas.microsoft.com/office/word/2010/wordprocessingShape">
+                    <wps:wsp>
+                      <wps:cNvCnPr/>
+                      <wps:spPr>
+                        <a:xfrm flipH="1">
+                          <a:off x="0" y="0"/>
+                          <a:ext cx="1030406" cy="47767"/>
+                        </a:xfrm>
+                        <a:prstGeom prst="straightConnector1">
+                          <a:avLst/>
+                        </a:prstGeom>
+                        <a:ln>
+                          <a:tailEnd type="triangle"/>
+                        </a:ln>
+                      </wps:spPr>
+                      <wps:style>
+                        <a:lnRef idx="1">
+                          <a:schemeClr val="accent1"/>
+                        </a:lnRef>
+                        <a:fillRef idx="0">
+                          <a:schemeClr val="accent1"/>
+                        </a:fillRef>
+                        <a:effectRef idx="0">
+                          <a:schemeClr val="accent1"/>
+                        </a:effectRef>
+                        <a:fontRef idx="minor">
+                          <a:schemeClr val="tx1"/>
+                        </a:fontRef>
+                      </wps:style>
+                      <wps:bodyPr/>
+                    </wps:wsp>
+                  </a:graphicData>
+                </a:graphic>
+              </wp:anchor>
+            </w:drawing>
+          </mc:Choice>
+          <mc:Fallback>
+            <w:pict>
+              <v:shape w14:anchorId="41AB54A9" id="Conector de Seta Reta 94" o:spid="_x0000_s1026" type="#_x0000_t32" style="position:absolute;margin-left:248.25pt;margin-top:169.9pt;width:81.15pt;height:3.75pt;flip:x;z-index:251679744;visibility:visible;mso-wrap-style:square;mso-wrap-distance-left:9pt;mso-wrap-distance-top:0;mso-wrap-distance-right:9pt;mso-wrap-distance-bottom:0;mso-position-horizontal:absolute;mso-position-horizontal-relative:text;mso-position-vertical:absolute;mso-position-vertical-relative:text" o:gfxdata="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" strokecolor="#4472c4 [3204]" strokeweight=".5pt">
+                <v:stroke endarrow="block" joinstyle="miter"/>
+              </v:shape>
+            </w:pict>
+          </mc:Fallback>
+        </mc:AlternateContent>
+      </w:r>
+      <w:r>
+        <w:drawing>
+          <wp:inline distT="0" distB="0" distL="0" distR="0" wp14:anchorId="3C36B1C0" wp14:editId="38BD3B67">
+            <wp:extent cx="4314825" cy="3449045"/>
+            <wp:effectExtent l="0" t="0" r="0" b="0"/>
+            <wp:docPr id="92" name="Imagem 92"/>
+            <wp:cNvGraphicFramePr>
+              <a:graphicFrameLocks xmlns:a="http://schemas.openxmlformats.org/drawingml/2006/main" noChangeAspect="1"/>
+            </wp:cNvGraphicFramePr>
+            <a:graphic xmlns:a="http://schemas.openxmlformats.org/drawingml/2006/main">
+              <a:graphicData uri="http://schemas.openxmlformats.org/drawingml/2006/picture">
+                <pic:pic xmlns:pic="http://schemas.openxmlformats.org/drawingml/2006/picture">
+                  <pic:nvPicPr>
+                    <pic:cNvPr id="1" name=""/>
+                    <pic:cNvPicPr/>
+                  </pic:nvPicPr>
+                  <pic:blipFill>
+                    <a:blip r:embed="rId81"/>
+                    <a:stretch>
+                      <a:fillRect/>
+                    </a:stretch>
+                  </pic:blipFill>
+                  <pic:spPr>
+                    <a:xfrm>
+                      <a:off x="0" y="0"/>
+                      <a:ext cx="4334940" cy="3465124"/>
+                    </a:xfrm>
+                    <a:prstGeom prst="rect">
+                      <a:avLst/>
+                    </a:prstGeom>
+                  </pic:spPr>
+                </pic:pic>
+              </a:graphicData>
+            </a:graphic>
+          </wp:inline>
+        </w:drawing>
+      </w:r>
+      <w:r>
+        <w:drawing>
+          <wp:inline distT="0" distB="0" distL="0" distR="0" wp14:anchorId="6703F689" wp14:editId="11FAC49E">
+            <wp:extent cx="3250802" cy="1366340"/>
+            <wp:effectExtent l="0" t="0" r="6985" b="5715"/>
+            <wp:docPr id="93" name="Imagem 93"/>
+            <wp:cNvGraphicFramePr>
+              <a:graphicFrameLocks xmlns:a="http://schemas.openxmlformats.org/drawingml/2006/main" noChangeAspect="1"/>
+            </wp:cNvGraphicFramePr>
+            <a:graphic xmlns:a="http://schemas.openxmlformats.org/drawingml/2006/main">
+              <a:graphicData uri="http://schemas.openxmlformats.org/drawingml/2006/picture">
+                <pic:pic xmlns:pic="http://schemas.openxmlformats.org/drawingml/2006/picture">
+                  <pic:nvPicPr>
+                    <pic:cNvPr id="1" name=""/>
+                    <pic:cNvPicPr/>
+                  </pic:nvPicPr>
+                  <pic:blipFill>
+                    <a:blip r:embed="rId82"/>
+                    <a:stretch>
+                      <a:fillRect/>
+                    </a:stretch>
+                  </pic:blipFill>
+                  <pic:spPr>
+                    <a:xfrm>
+                      <a:off x="0" y="0"/>
+                      <a:ext cx="3309386" cy="1390963"/>
+                    </a:xfrm>
+                    <a:prstGeom prst="rect">
+                      <a:avLst/>
+                    </a:prstGeom>
+                  </pic:spPr>
+                </pic:pic>
+              </a:graphicData>
+            </a:graphic>
+          </wp:inline>
+        </w:drawing>
+      </w:r>
+    </w:p>
+    <w:p/>
+    <w:p>
+      <w:r>
+        <w:t>43 – Para arrumar o espaço</w:t>
+      </w:r>
+      <w:r>
+        <w:t xml:space="preserve"> entre o texto e o preço colocamos um espaço externo na </w:t>
+      </w:r>
+      <w:proofErr w:type="spellStart"/>
+      <w:r>
+        <w:t>class</w:t>
+      </w:r>
+      <w:proofErr w:type="spellEnd"/>
+      <w:r>
+        <w:t xml:space="preserve"> </w:t>
+      </w:r>
+      <w:proofErr w:type="spellStart"/>
+      <w:r>
+        <w:t>preco</w:t>
+      </w:r>
+      <w:proofErr w:type="spellEnd"/>
+      <w:r>
+        <w:t xml:space="preserve"> conforme imagem.</w:t>
+      </w:r>
+    </w:p>
+    <w:p>
+      <w:r>
+        <w:rPr>
+          <w:noProof/>
+        </w:rPr>
+        <mc:AlternateContent>
+          <mc:Choice Requires="wps">
+            <w:drawing>
+              <wp:anchor distT="0" distB="0" distL="114300" distR="114300" simplePos="0" relativeHeight="251680768" behindDoc="0" locked="0" layoutInCell="1" allowOverlap="1" wp14:anchorId="322807CE" wp14:editId="436ED71A">
+                <wp:simplePos x="0" y="0"/>
+                <wp:positionH relativeFrom="column">
+                  <wp:posOffset>2729799</wp:posOffset>
+                </wp:positionH>
+                <wp:positionV relativeFrom="paragraph">
+                  <wp:posOffset>831623</wp:posOffset>
+                </wp:positionV>
+                <wp:extent cx="818865" cy="109182"/>
+                <wp:effectExtent l="38100" t="0" r="19685" b="81915"/>
+                <wp:wrapNone/>
+                <wp:docPr id="97" name="Conector de Seta Reta 97"/>
+                <wp:cNvGraphicFramePr/>
+                <a:graphic xmlns:a="http://schemas.openxmlformats.org/drawingml/2006/main">
+                  <a:graphicData uri="http://schemas.microsoft.com/office/word/2010/wordprocessingShape">
+                    <wps:wsp>
+                      <wps:cNvCnPr/>
+                      <wps:spPr>
+                        <a:xfrm flipH="1">
+                          <a:off x="0" y="0"/>
+                          <a:ext cx="818865" cy="109182"/>
+                        </a:xfrm>
+                        <a:prstGeom prst="straightConnector1">
+                          <a:avLst/>
+                        </a:prstGeom>
+                        <a:ln>
+                          <a:tailEnd type="triangle"/>
+                        </a:ln>
+                      </wps:spPr>
+                      <wps:style>
+                        <a:lnRef idx="1">
+                          <a:schemeClr val="accent1"/>
+                        </a:lnRef>
+                        <a:fillRef idx="0">
+                          <a:schemeClr val="accent1"/>
+                        </a:fillRef>
+                        <a:effectRef idx="0">
+                          <a:schemeClr val="accent1"/>
+                        </a:effectRef>
+                        <a:fontRef idx="minor">
+                          <a:schemeClr val="tx1"/>
+                        </a:fontRef>
+                      </wps:style>
+                      <wps:bodyPr/>
+                    </wps:wsp>
+                  </a:graphicData>
+                </a:graphic>
+              </wp:anchor>
+            </w:drawing>
+          </mc:Choice>
+          <mc:Fallback>
+            <w:pict>
+              <v:shape w14:anchorId="36E51C80" id="Conector de Seta Reta 97" o:spid="_x0000_s1026" type="#_x0000_t32" style="position:absolute;margin-left:214.95pt;margin-top:65.5pt;width:64.5pt;height:8.6pt;flip:x;z-index:251680768;visibility:visible;mso-wrap-style:square;mso-wrap-distance-left:9pt;mso-wrap-distance-top:0;mso-wrap-distance-right:9pt;mso-wrap-distance-bottom:0;mso-position-horizontal:absolute;mso-position-horizontal-relative:text;mso-position-vertical:absolute;mso-position-vertical-relative:text" o:gfxdata="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" strokecolor="#4472c4 [3204]" strokeweight=".5pt">
+                <v:stroke endarrow="block" joinstyle="miter"/>
+              </v:shape>
+            </w:pict>
+          </mc:Fallback>
+        </mc:AlternateContent>
+      </w:r>
+      <w:r>
+        <w:drawing>
+          <wp:inline distT="0" distB="0" distL="0" distR="0" wp14:anchorId="3701A6D1" wp14:editId="556983E1">
+            <wp:extent cx="3524742" cy="1638529"/>
+            <wp:effectExtent l="0" t="0" r="0" b="0"/>
+            <wp:docPr id="96" name="Imagem 96"/>
+            <wp:cNvGraphicFramePr>
+              <a:graphicFrameLocks xmlns:a="http://schemas.openxmlformats.org/drawingml/2006/main" noChangeAspect="1"/>
+            </wp:cNvGraphicFramePr>
+            <a:graphic xmlns:a="http://schemas.openxmlformats.org/drawingml/2006/main">
+              <a:graphicData uri="http://schemas.openxmlformats.org/drawingml/2006/picture">
+                <pic:pic xmlns:pic="http://schemas.openxmlformats.org/drawingml/2006/picture">
+                  <pic:nvPicPr>
+                    <pic:cNvPr id="1" name=""/>
+                    <pic:cNvPicPr/>
+                  </pic:nvPicPr>
+                  <pic:blipFill>
+                    <a:blip r:embed="rId83"/>
+                    <a:stretch>
+                      <a:fillRect/>
+                    </a:stretch>
+                  </pic:blipFill>
+                  <pic:spPr>
+                    <a:xfrm>
+                      <a:off x="0" y="0"/>
+                      <a:ext cx="3524742" cy="1638529"/>
+                    </a:xfrm>
+                    <a:prstGeom prst="rect">
+                      <a:avLst/>
+                    </a:prstGeom>
+                  </pic:spPr>
+                </pic:pic>
+              </a:graphicData>
+            </a:graphic>
+          </wp:inline>
+        </w:drawing>
+      </w:r>
+    </w:p>
+    <w:p/>
+    <w:p>
+      <w:r>
+        <w:t xml:space="preserve">44 </w:t>
+      </w:r>
+      <w:r>
+        <w:t>–</w:t>
+      </w:r>
+      <w:r>
+        <w:t xml:space="preserve"> Tir</w:t>
+      </w:r>
+      <w:r>
+        <w:t xml:space="preserve">amos a cor de fundo dos </w:t>
+      </w:r>
+      <w:proofErr w:type="spellStart"/>
+      <w:r>
+        <w:t>produlos</w:t>
+      </w:r>
+      <w:proofErr w:type="spellEnd"/>
+      <w:r>
+        <w:t xml:space="preserve"> li e adicionamos um</w:t>
+      </w:r>
+      <w:r>
+        <w:t>a</w:t>
+      </w:r>
+      <w:r>
+        <w:t xml:space="preserve"> borda conforme código</w:t>
+      </w:r>
+      <w:r>
+        <w:t>.</w:t>
+      </w:r>
+    </w:p>
+    <w:p>
+      <w:r>
+        <w:rPr>
+          <w:noProof/>
+        </w:rPr>
+        <mc:AlternateContent>
+          <mc:Choice Requires="wps">
+            <w:drawing>
+              <wp:anchor distT="0" distB="0" distL="114300" distR="114300" simplePos="0" relativeHeight="251681792" behindDoc="0" locked="0" layoutInCell="1" allowOverlap="1" wp14:anchorId="4CB9989C" wp14:editId="2D12202C">
+                <wp:simplePos x="0" y="0"/>
+                <wp:positionH relativeFrom="column">
+                  <wp:posOffset>2258950</wp:posOffset>
+                </wp:positionH>
+                <wp:positionV relativeFrom="paragraph">
+                  <wp:posOffset>1342760</wp:posOffset>
+                </wp:positionV>
+                <wp:extent cx="484495" cy="259051"/>
+                <wp:effectExtent l="38100" t="0" r="30480" b="65405"/>
+                <wp:wrapNone/>
+                <wp:docPr id="99" name="Conector de Seta Reta 99"/>
+                <wp:cNvGraphicFramePr/>
+                <a:graphic xmlns:a="http://schemas.openxmlformats.org/drawingml/2006/main">
+                  <a:graphicData uri="http://schemas.microsoft.com/office/word/2010/wordprocessingShape">
+                    <wps:wsp>
+                      <wps:cNvCnPr/>
+                      <wps:spPr>
+                        <a:xfrm flipH="1">
+                          <a:off x="0" y="0"/>
+                          <a:ext cx="484495" cy="259051"/>
+                        </a:xfrm>
+                        <a:prstGeom prst="straightConnector1">
+                          <a:avLst/>
+                        </a:prstGeom>
+                        <a:ln>
+                          <a:tailEnd type="triangle"/>
+                        </a:ln>
+                      </wps:spPr>
+                      <wps:style>
+                        <a:lnRef idx="1">
+                          <a:schemeClr val="accent1"/>
+                        </a:lnRef>
+                        <a:fillRef idx="0">
+                          <a:schemeClr val="accent1"/>
+                        </a:fillRef>
+                        <a:effectRef idx="0">
+                          <a:schemeClr val="accent1"/>
+                        </a:effectRef>
+                        <a:fontRef idx="minor">
+                          <a:schemeClr val="tx1"/>
+                        </a:fontRef>
+                      </wps:style>
+                      <wps:bodyPr/>
+                    </wps:wsp>
+                  </a:graphicData>
+                </a:graphic>
+                <wp14:sizeRelH relativeFrom="margin">
+                  <wp14:pctWidth>0</wp14:pctWidth>
+                </wp14:sizeRelH>
+                <wp14:sizeRelV relativeFrom="margin">
+                  <wp14:pctHeight>0</wp14:pctHeight>
+                </wp14:sizeRelV>
+              </wp:anchor>
+            </w:drawing>
+          </mc:Choice>
+          <mc:Fallback>
+            <w:pict>
+              <v:shape w14:anchorId="4B7DDB33" id="Conector de Seta Reta 99" o:spid="_x0000_s1026" type="#_x0000_t32" style="position:absolute;margin-left:177.85pt;margin-top:105.75pt;width:38.15pt;height:20.4pt;flip:x;z-index:251681792;visibility:visible;mso-wrap-style:square;mso-width-percent:0;mso-height-percent:0;mso-wrap-distance-left:9pt;mso-wrap-distance-top:0;mso-wrap-distance-right:9pt;mso-wrap-distance-bottom:0;mso-position-horizontal:absolute;mso-position-horizontal-relative:text;mso-position-vertical:absolute;mso-position-vertical-relative:text;mso-width-percent:0;mso-height-percent:0;mso-width-relative:margin;mso-height-relative:margin" o:gfxdata="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" strokecolor="#4472c4 [3204]" strokeweight=".5pt">
+                <v:stroke endarrow="block" joinstyle="miter"/>
+              </v:shape>
+            </w:pict>
+          </mc:Fallback>
+        </mc:AlternateContent>
+      </w:r>
+      <w:r>
+        <w:drawing>
+          <wp:inline distT="0" distB="0" distL="0" distR="0" wp14:anchorId="0A11B8F4" wp14:editId="12E209CF">
+            <wp:extent cx="2811550" cy="2203801"/>
+            <wp:effectExtent l="0" t="0" r="8255" b="6350"/>
+            <wp:docPr id="98" name="Imagem 98"/>
+            <wp:cNvGraphicFramePr>
+              <a:graphicFrameLocks xmlns:a="http://schemas.openxmlformats.org/drawingml/2006/main" noChangeAspect="1"/>
+            </wp:cNvGraphicFramePr>
+            <a:graphic xmlns:a="http://schemas.openxmlformats.org/drawingml/2006/main">
+              <a:graphicData uri="http://schemas.openxmlformats.org/drawingml/2006/picture">
+                <pic:pic xmlns:pic="http://schemas.openxmlformats.org/drawingml/2006/picture">
+                  <pic:nvPicPr>
+                    <pic:cNvPr id="1" name=""/>
+                    <pic:cNvPicPr/>
+                  </pic:nvPicPr>
+                  <pic:blipFill>
+                    <a:blip r:embed="rId84"/>
+                    <a:stretch>
+                      <a:fillRect/>
+                    </a:stretch>
+                  </pic:blipFill>
+                  <pic:spPr>
+                    <a:xfrm>
+                      <a:off x="0" y="0"/>
+                      <a:ext cx="2871337" cy="2250664"/>
+                    </a:xfrm>
+                    <a:prstGeom prst="rect">
+                      <a:avLst/>
+                    </a:prstGeom>
+                  </pic:spPr>
+                </pic:pic>
+              </a:graphicData>
+            </a:graphic>
+          </wp:inline>
+        </w:drawing>
+      </w:r>
+      <w:r>
+        <w:drawing>
+          <wp:inline distT="0" distB="0" distL="0" distR="0" wp14:anchorId="22F521D1" wp14:editId="00376A52">
+            <wp:extent cx="5077403" cy="2331634"/>
+            <wp:effectExtent l="0" t="0" r="0" b="0"/>
+            <wp:docPr id="100" name="Imagem 100"/>
+            <wp:cNvGraphicFramePr>
+              <a:graphicFrameLocks xmlns:a="http://schemas.openxmlformats.org/drawingml/2006/main" noChangeAspect="1"/>
+            </wp:cNvGraphicFramePr>
+            <a:graphic xmlns:a="http://schemas.openxmlformats.org/drawingml/2006/main">
+              <a:graphicData uri="http://schemas.openxmlformats.org/drawingml/2006/picture">
+                <pic:pic xmlns:pic="http://schemas.openxmlformats.org/drawingml/2006/picture">
+                  <pic:nvPicPr>
+                    <pic:cNvPr id="1" name=""/>
+                    <pic:cNvPicPr/>
+                  </pic:nvPicPr>
+                  <pic:blipFill>
+                    <a:blip r:embed="rId85"/>
+                    <a:stretch>
+                      <a:fillRect/>
+                    </a:stretch>
+                  </pic:blipFill>
+                  <pic:spPr>
+                    <a:xfrm>
+                      <a:off x="0" y="0"/>
+                      <a:ext cx="5126043" cy="2353970"/>
+                    </a:xfrm>
+                    <a:prstGeom prst="rect">
+                      <a:avLst/>
+                    </a:prstGeom>
+                  </pic:spPr>
+                </pic:pic>
+              </a:graphicData>
+            </a:graphic>
+          </wp:inline>
+        </w:drawing>
+      </w:r>
+    </w:p>
+    <w:p/>
+    <w:p/>
+    <w:p>
+      <w:r>
+        <w:t xml:space="preserve">45- </w:t>
+      </w:r>
+      <w:r>
+        <w:t>Arredondamos os cantos da nossa borda utilizando o border-radius:10px</w:t>
+      </w:r>
+    </w:p>
+    <w:p>
+      <w:r>
+        <w:drawing>
+          <wp:inline distT="0" distB="0" distL="0" distR="0" wp14:anchorId="4CCA7CDF" wp14:editId="5667F625">
+            <wp:extent cx="3896436" cy="3262526"/>
+            <wp:effectExtent l="0" t="0" r="8890" b="0"/>
+            <wp:docPr id="101" name="Imagem 101"/>
+            <wp:cNvGraphicFramePr>
+              <a:graphicFrameLocks xmlns:a="http://schemas.openxmlformats.org/drawingml/2006/main" noChangeAspect="1"/>
+            </wp:cNvGraphicFramePr>
+            <a:graphic xmlns:a="http://schemas.openxmlformats.org/drawingml/2006/main">
+              <a:graphicData uri="http://schemas.openxmlformats.org/drawingml/2006/picture">
+                <pic:pic xmlns:pic="http://schemas.openxmlformats.org/drawingml/2006/picture">
+                  <pic:nvPicPr>
+                    <pic:cNvPr id="1" name=""/>
+                    <pic:cNvPicPr/>
+                  </pic:nvPicPr>
+                  <pic:blipFill>
+                    <a:blip r:embed="rId86"/>
+                    <a:stretch>
+                      <a:fillRect/>
+                    </a:stretch>
+                  </pic:blipFill>
+                  <pic:spPr>
+                    <a:xfrm>
+                      <a:off x="0" y="0"/>
+                      <a:ext cx="3911129" cy="3274829"/>
+                    </a:xfrm>
+                    <a:prstGeom prst="rect">
+                      <a:avLst/>
+                    </a:prstGeom>
+                  </pic:spPr>
+                </pic:pic>
+              </a:graphicData>
+            </a:graphic>
+          </wp:inline>
+        </w:drawing>
+      </w:r>
+    </w:p>
+    <w:p/>
+    <w:p>
+      <w:r>
+        <w:t xml:space="preserve">46- </w:t>
+      </w:r>
+      <w:r>
+        <w:t xml:space="preserve">Vamos trabalhar com comportamento quando o usuário ao passar o mouse sobre o elemento ele realiza uma ação nessa situação </w:t>
+      </w:r>
+      <w:r>
+        <w:t xml:space="preserve">vamos trabalhar com o menu ao passar o mouse o elemento muda de cor utilizando o </w:t>
+      </w:r>
+      <w:proofErr w:type="spellStart"/>
+      <w:r>
+        <w:t>hover</w:t>
+      </w:r>
+      <w:proofErr w:type="spellEnd"/>
+      <w:r>
+        <w:t>.</w:t>
+      </w:r>
+    </w:p>
+    <w:p>
+      <w:r>
+        <w:drawing>
+          <wp:inline distT="0" distB="0" distL="0" distR="0" wp14:anchorId="1739BFD8" wp14:editId="1D818A9A">
+            <wp:extent cx="2953162" cy="1209844"/>
+            <wp:effectExtent l="0" t="0" r="0" b="9525"/>
+            <wp:docPr id="102" name="Imagem 102"/>
+            <wp:cNvGraphicFramePr>
+              <a:graphicFrameLocks xmlns:a="http://schemas.openxmlformats.org/drawingml/2006/main" noChangeAspect="1"/>
+            </wp:cNvGraphicFramePr>
+            <a:graphic xmlns:a="http://schemas.openxmlformats.org/drawingml/2006/main">
+              <a:graphicData uri="http://schemas.openxmlformats.org/drawingml/2006/picture">
+                <pic:pic xmlns:pic="http://schemas.openxmlformats.org/drawingml/2006/picture">
+                  <pic:nvPicPr>
+                    <pic:cNvPr id="1" name=""/>
+                    <pic:cNvPicPr/>
+                  </pic:nvPicPr>
+                  <pic:blipFill>
+                    <a:blip r:embed="rId87"/>
+                    <a:stretch>
+                      <a:fillRect/>
+                    </a:stretch>
+                  </pic:blipFill>
+                  <pic:spPr>
+                    <a:xfrm>
+                      <a:off x="0" y="0"/>
+                      <a:ext cx="2953162" cy="1209844"/>
+                    </a:xfrm>
+                    <a:prstGeom prst="rect">
+                      <a:avLst/>
+                    </a:prstGeom>
+                  </pic:spPr>
+                </pic:pic>
+              </a:graphicData>
+            </a:graphic>
+          </wp:inline>
+        </w:drawing>
+      </w:r>
+      <w:r>
+        <w:drawing>
+          <wp:inline distT="0" distB="0" distL="0" distR="0" wp14:anchorId="0EA7E063" wp14:editId="645BEE9E">
+            <wp:extent cx="4694261" cy="1306322"/>
+            <wp:effectExtent l="0" t="0" r="0" b="8255"/>
+            <wp:docPr id="103" name="Imagem 103"/>
+            <wp:cNvGraphicFramePr>
+              <a:graphicFrameLocks xmlns:a="http://schemas.openxmlformats.org/drawingml/2006/main" noChangeAspect="1"/>
+            </wp:cNvGraphicFramePr>
+            <a:graphic xmlns:a="http://schemas.openxmlformats.org/drawingml/2006/main">
+              <a:graphicData uri="http://schemas.openxmlformats.org/drawingml/2006/picture">
+                <pic:pic xmlns:pic="http://schemas.openxmlformats.org/drawingml/2006/picture">
+                  <pic:nvPicPr>
+                    <pic:cNvPr id="1" name=""/>
+                    <pic:cNvPicPr/>
+                  </pic:nvPicPr>
+                  <pic:blipFill>
+                    <a:blip r:embed="rId88"/>
+                    <a:stretch>
+                      <a:fillRect/>
+                    </a:stretch>
+                  </pic:blipFill>
+                  <pic:spPr>
+                    <a:xfrm>
+                      <a:off x="0" y="0"/>
+                      <a:ext cx="4721154" cy="1313806"/>
+                    </a:xfrm>
+                    <a:prstGeom prst="rect">
+                      <a:avLst/>
+                    </a:prstGeom>
+                  </pic:spPr>
+                </pic:pic>
+              </a:graphicData>
+            </a:graphic>
+          </wp:inline>
+        </w:drawing>
+      </w:r>
+    </w:p>
+    <w:p>
+      <w:r>
+        <w:t xml:space="preserve">47 </w:t>
+      </w:r>
+      <w:r>
+        <w:t>–</w:t>
+      </w:r>
+      <w:r>
+        <w:t xml:space="preserve"> </w:t>
+      </w:r>
+      <w:r>
+        <w:t xml:space="preserve">Ainda trabalhando com </w:t>
+      </w:r>
+      <w:proofErr w:type="spellStart"/>
+      <w:r>
+        <w:t>hover</w:t>
+      </w:r>
+      <w:proofErr w:type="spellEnd"/>
+      <w:r>
+        <w:t xml:space="preserve"> ao passar o mouse adicionamos uma linha em cada item do menu</w:t>
+      </w:r>
+    </w:p>
+    <w:p>
+      <w:r>
+        <w:drawing>
+          <wp:inline distT="0" distB="0" distL="0" distR="0" wp14:anchorId="09A5BD0D" wp14:editId="3652545F">
+            <wp:extent cx="4410691" cy="1333686"/>
+            <wp:effectExtent l="0" t="0" r="9525" b="0"/>
+            <wp:docPr id="104" name="Imagem 104"/>
+            <wp:cNvGraphicFramePr>
+              <a:graphicFrameLocks xmlns:a="http://schemas.openxmlformats.org/drawingml/2006/main" noChangeAspect="1"/>
+            </wp:cNvGraphicFramePr>
+            <a:graphic xmlns:a="http://schemas.openxmlformats.org/drawingml/2006/main">
+              <a:graphicData uri="http://schemas.openxmlformats.org/drawingml/2006/picture">
+                <pic:pic xmlns:pic="http://schemas.openxmlformats.org/drawingml/2006/picture">
+                  <pic:nvPicPr>
+                    <pic:cNvPr id="1" name=""/>
+                    <pic:cNvPicPr/>
+                  </pic:nvPicPr>
+                  <pic:blipFill>
+                    <a:blip r:embed="rId89"/>
+                    <a:stretch>
+                      <a:fillRect/>
+                    </a:stretch>
+                  </pic:blipFill>
+                  <pic:spPr>
+                    <a:xfrm>
+                      <a:off x="0" y="0"/>
+                      <a:ext cx="4410691" cy="1333686"/>
+                    </a:xfrm>
+                    <a:prstGeom prst="rect">
+                      <a:avLst/>
+                    </a:prstGeom>
+                  </pic:spPr>
+                </pic:pic>
+              </a:graphicData>
+            </a:graphic>
+          </wp:inline>
+        </w:drawing>
+      </w:r>
+    </w:p>
+    <w:p/>
+    <w:p>
+      <w:r>
+        <w:t xml:space="preserve">48 </w:t>
+      </w:r>
+      <w:r>
+        <w:t>–</w:t>
+      </w:r>
+      <w:r>
+        <w:t xml:space="preserve"> </w:t>
+      </w:r>
+      <w:r>
+        <w:t>Mudamos a cor da borda ao passar o mouse</w:t>
+      </w:r>
+    </w:p>
+    <w:p>
+      <w:r>
+        <w:drawing>
+          <wp:inline distT="0" distB="0" distL="0" distR="0" wp14:anchorId="65D6F113" wp14:editId="01EB624A">
+            <wp:extent cx="3915321" cy="1228896"/>
+            <wp:effectExtent l="0" t="0" r="9525" b="9525"/>
+            <wp:docPr id="105" name="Imagem 105"/>
+            <wp:cNvGraphicFramePr>
+              <a:graphicFrameLocks xmlns:a="http://schemas.openxmlformats.org/drawingml/2006/main" noChangeAspect="1"/>
+            </wp:cNvGraphicFramePr>
+            <a:graphic xmlns:a="http://schemas.openxmlformats.org/drawingml/2006/main">
+              <a:graphicData uri="http://schemas.openxmlformats.org/drawingml/2006/picture">
+                <pic:pic xmlns:pic="http://schemas.openxmlformats.org/drawingml/2006/picture">
+                  <pic:nvPicPr>
+                    <pic:cNvPr id="1" name=""/>
+                    <pic:cNvPicPr/>
+                  </pic:nvPicPr>
+                  <pic:blipFill>
+                    <a:blip r:embed="rId90"/>
+                    <a:stretch>
+                      <a:fillRect/>
+                    </a:stretch>
+                  </pic:blipFill>
+                  <pic:spPr>
+                    <a:xfrm>
+                      <a:off x="0" y="0"/>
+                      <a:ext cx="3915321" cy="1228896"/>
+                    </a:xfrm>
+                    <a:prstGeom prst="rect">
+                      <a:avLst/>
+                    </a:prstGeom>
+                  </pic:spPr>
+                </pic:pic>
+              </a:graphicData>
+            </a:graphic>
+          </wp:inline>
+        </w:drawing>
+      </w:r>
       <w:bookmarkStart w:id="0" w:name="_GoBack"/>
       <w:bookmarkEnd w:id="0"/>
     </w:p>
-    <w:p/>
     <w:sectPr>
       <w:pgSz w:w="11906" w:h="16838"/>
       <w:pgMar w:top="1417" w:right="1701" w:bottom="1417" w:left="1701" w:header="708" w:footer="708" w:gutter="0"/>
@@ -6487,6 +7525,14 @@
 </file>
 
 <file path=customXml/item1.xml><?xml version="1.0" encoding="utf-8"?>
+<p:properties xmlns:p="http://schemas.microsoft.com/office/2006/metadata/properties" xmlns:xsi="http://www.w3.org/2001/XMLSchema-instance" xmlns:pc="http://schemas.microsoft.com/office/infopath/2007/PartnerControls">
+  <documentManagement>
+    <_activity xmlns="8437a765-f0a9-40aa-978b-fcc06261281f" xsi:nil="true"/>
+  </documentManagement>
+</p:properties>
+</file>
+
+<file path=customXml/item2.xml><?xml version="1.0" encoding="utf-8"?>
 <ct:contentTypeSchema xmlns:ct="http://schemas.microsoft.com/office/2006/metadata/contentType" xmlns:ma="http://schemas.microsoft.com/office/2006/metadata/properties/metaAttributes" ct:_="" ma:_="" ma:contentTypeName="Documento" ma:contentTypeID="0x01010034B17ED9C83E394791ACA33DA9287452" ma:contentTypeVersion="16" ma:contentTypeDescription="Crie um novo documento." ma:contentTypeScope="" ma:versionID="d36ce64b1b29120840e9f9b956471cbb">
   <xsd:schema xmlns:xsd="http://www.w3.org/2001/XMLSchema" xmlns:xs="http://www.w3.org/2001/XMLSchema" xmlns:p="http://schemas.microsoft.com/office/2006/metadata/properties" xmlns:ns3="8437a765-f0a9-40aa-978b-fcc06261281f" xmlns:ns4="e78d8b06-d887-4705-9cec-751f2fb2cee2" targetNamespace="http://schemas.microsoft.com/office/2006/metadata/properties" ma:root="true" ma:fieldsID="ab1d645bb15f72c0dfc8a8f602f1de6b" ns3:_="" ns4:_="">
     <xsd:import namespace="8437a765-f0a9-40aa-978b-fcc06261281f"/>
@@ -6725,7 +7771,7 @@
 </ct:contentTypeSchema>
 </file>
 
-<file path=customXml/item2.xml><?xml version="1.0" encoding="utf-8"?>
+<file path=customXml/item3.xml><?xml version="1.0" encoding="utf-8"?>
 <?mso-contentType ?>
 <FormTemplates xmlns="http://schemas.microsoft.com/sharepoint/v3/contenttype/forms">
   <Display>DocumentLibraryForm</Display>
@@ -6734,19 +7780,21 @@
 </FormTemplates>
 </file>
 
-<file path=customXml/item3.xml><?xml version="1.0" encoding="utf-8"?>
-<p:properties xmlns:p="http://schemas.microsoft.com/office/2006/metadata/properties" xmlns:xsi="http://www.w3.org/2001/XMLSchema-instance" xmlns:pc="http://schemas.microsoft.com/office/infopath/2007/PartnerControls">
-  <documentManagement>
-    <_activity xmlns="8437a765-f0a9-40aa-978b-fcc06261281f" xsi:nil="true"/>
-  </documentManagement>
-</p:properties>
-</file>
-
 <file path=customXml/item4.xml><?xml version="1.0" encoding="utf-8"?>
 <b:Sources xmlns:b="http://schemas.openxmlformats.org/officeDocument/2006/bibliography" xmlns="http://schemas.openxmlformats.org/officeDocument/2006/bibliography" SelectedStyle="\APASixthEditionOfficeOnline.xsl" StyleName="APA" Version="6"/>
 </file>
 
 <file path=customXml/itemProps1.xml><?xml version="1.0" encoding="utf-8"?>
+<ds:datastoreItem xmlns:ds="http://schemas.openxmlformats.org/officeDocument/2006/customXml" ds:itemID="{0C9FFCBC-F2CA-4FF1-AAFC-AD3B89BB1967}">
+  <ds:schemaRefs>
+    <ds:schemaRef ds:uri="http://schemas.microsoft.com/office/2006/metadata/properties"/>
+    <ds:schemaRef ds:uri="http://schemas.microsoft.com/office/infopath/2007/PartnerControls"/>
+    <ds:schemaRef ds:uri="8437a765-f0a9-40aa-978b-fcc06261281f"/>
+  </ds:schemaRefs>
+</ds:datastoreItem>
+</file>
+
+<file path=customXml/itemProps2.xml><?xml version="1.0" encoding="utf-8"?>
 <ds:datastoreItem xmlns:ds="http://schemas.openxmlformats.org/officeDocument/2006/customXml" ds:itemID="{5D63F5B6-DF50-4CAF-997C-1D8B1776178E}">
   <ds:schemaRefs>
     <ds:schemaRef ds:uri="http://schemas.microsoft.com/office/2006/metadata/contentType"/>
@@ -6765,7 +7813,7 @@
 </ds:datastoreItem>
 </file>
 
-<file path=customXml/itemProps2.xml><?xml version="1.0" encoding="utf-8"?>
+<file path=customXml/itemProps3.xml><?xml version="1.0" encoding="utf-8"?>
 <ds:datastoreItem xmlns:ds="http://schemas.openxmlformats.org/officeDocument/2006/customXml" ds:itemID="{38630907-5F1E-4561-A45F-AC7CC415CD73}">
   <ds:schemaRefs>
     <ds:schemaRef ds:uri="http://schemas.microsoft.com/sharepoint/v3/contenttype/forms"/>
@@ -6773,18 +7821,8 @@
 </ds:datastoreItem>
 </file>
 
-<file path=customXml/itemProps3.xml><?xml version="1.0" encoding="utf-8"?>
-<ds:datastoreItem xmlns:ds="http://schemas.openxmlformats.org/officeDocument/2006/customXml" ds:itemID="{0C9FFCBC-F2CA-4FF1-AAFC-AD3B89BB1967}">
-  <ds:schemaRefs>
-    <ds:schemaRef ds:uri="http://schemas.microsoft.com/office/2006/metadata/properties"/>
-    <ds:schemaRef ds:uri="http://schemas.microsoft.com/office/infopath/2007/PartnerControls"/>
-    <ds:schemaRef ds:uri="8437a765-f0a9-40aa-978b-fcc06261281f"/>
-  </ds:schemaRefs>
-</ds:datastoreItem>
-</file>
-
 <file path=customXml/itemProps4.xml><?xml version="1.0" encoding="utf-8"?>
-<ds:datastoreItem xmlns:ds="http://schemas.openxmlformats.org/officeDocument/2006/customXml" ds:itemID="{ADDCE7A5-5A58-4D18-8951-E5C8C13B07E7}">
+<ds:datastoreItem xmlns:ds="http://schemas.openxmlformats.org/officeDocument/2006/customXml" ds:itemID="{31FB7E2A-B012-47F2-B022-062F6B5765C5}">
   <ds:schemaRefs>
     <ds:schemaRef ds:uri="http://schemas.openxmlformats.org/officeDocument/2006/bibliography"/>
   </ds:schemaRefs>

</xml_diff>

<commit_message>
atualização da página produtos.html
</commit_message>
<xml_diff>
--- a/apostila/Projeto Space for me3.docx
+++ b/apostila/Projeto Space for me3.docx
@@ -5499,6 +5499,9 @@
         </mc:AlternateContent>
       </w:r>
       <w:r>
+        <w:rPr>
+          <w:noProof/>
+        </w:rPr>
         <w:drawing>
           <wp:inline distT="0" distB="0" distL="0" distR="0" wp14:anchorId="3BEE5EA3" wp14:editId="42B172F9">
             <wp:extent cx="3553321" cy="2038635"/>
@@ -5536,6 +5539,9 @@
         </w:drawing>
       </w:r>
       <w:r>
+        <w:rPr>
+          <w:noProof/>
+        </w:rPr>
         <w:drawing>
           <wp:inline distT="0" distB="0" distL="0" distR="0" wp14:anchorId="201BCD92" wp14:editId="51228823">
             <wp:extent cx="3091384" cy="1555845"/>
@@ -5596,6 +5602,9 @@
     </w:p>
     <w:p>
       <w:r>
+        <w:rPr>
+          <w:noProof/>
+        </w:rPr>
         <w:drawing>
           <wp:inline distT="0" distB="0" distL="0" distR="0" wp14:anchorId="1E47B657" wp14:editId="402AE38C">
             <wp:extent cx="4286848" cy="3801005"/>
@@ -5633,6 +5642,9 @@
         </w:drawing>
       </w:r>
       <w:r>
+        <w:rPr>
+          <w:noProof/>
+        </w:rPr>
         <w:drawing>
           <wp:inline distT="0" distB="0" distL="0" distR="0" wp14:anchorId="4EE881E7" wp14:editId="1985FD3E">
             <wp:extent cx="2466975" cy="3101946"/>
@@ -5758,6 +5770,9 @@
         </mc:AlternateContent>
       </w:r>
       <w:r>
+        <w:rPr>
+          <w:noProof/>
+        </w:rPr>
         <w:drawing>
           <wp:inline distT="0" distB="0" distL="0" distR="0" wp14:anchorId="3C36B1C0" wp14:editId="38BD3B67">
             <wp:extent cx="4314825" cy="3449045"/>
@@ -5795,6 +5810,9 @@
         </w:drawing>
       </w:r>
       <w:r>
+        <w:rPr>
+          <w:noProof/>
+        </w:rPr>
         <w:drawing>
           <wp:inline distT="0" distB="0" distL="0" distR="0" wp14:anchorId="6703F689" wp14:editId="11FAC49E">
             <wp:extent cx="3250802" cy="1366340"/>
@@ -5925,6 +5943,9 @@
         </mc:AlternateContent>
       </w:r>
       <w:r>
+        <w:rPr>
+          <w:noProof/>
+        </w:rPr>
         <w:drawing>
           <wp:inline distT="0" distB="0" distL="0" distR="0" wp14:anchorId="3701A6D1" wp14:editId="556983E1">
             <wp:extent cx="3524742" cy="1638529"/>
@@ -6068,6 +6089,9 @@
         </mc:AlternateContent>
       </w:r>
       <w:r>
+        <w:rPr>
+          <w:noProof/>
+        </w:rPr>
         <w:drawing>
           <wp:inline distT="0" distB="0" distL="0" distR="0" wp14:anchorId="0A11B8F4" wp14:editId="12E209CF">
             <wp:extent cx="2811550" cy="2203801"/>
@@ -6105,6 +6129,9 @@
         </w:drawing>
       </w:r>
       <w:r>
+        <w:rPr>
+          <w:noProof/>
+        </w:rPr>
         <w:drawing>
           <wp:inline distT="0" distB="0" distL="0" distR="0" wp14:anchorId="22F521D1" wp14:editId="00376A52">
             <wp:extent cx="5077403" cy="2331634"/>
@@ -6154,6 +6181,9 @@
     </w:p>
     <w:p>
       <w:r>
+        <w:rPr>
+          <w:noProof/>
+        </w:rPr>
         <w:drawing>
           <wp:inline distT="0" distB="0" distL="0" distR="0" wp14:anchorId="4CCA7CDF" wp14:editId="5667F625">
             <wp:extent cx="3896436" cy="3262526"/>
@@ -6213,6 +6243,9 @@
     </w:p>
     <w:p>
       <w:r>
+        <w:rPr>
+          <w:noProof/>
+        </w:rPr>
         <w:drawing>
           <wp:inline distT="0" distB="0" distL="0" distR="0" wp14:anchorId="1739BFD8" wp14:editId="1D818A9A">
             <wp:extent cx="2953162" cy="1209844"/>
@@ -6250,6 +6283,9 @@
         </w:drawing>
       </w:r>
       <w:r>
+        <w:rPr>
+          <w:noProof/>
+        </w:rPr>
         <w:drawing>
           <wp:inline distT="0" distB="0" distL="0" distR="0" wp14:anchorId="0EA7E063" wp14:editId="645BEE9E">
             <wp:extent cx="4694261" cy="1306322"/>
@@ -6311,6 +6347,9 @@
     </w:p>
     <w:p>
       <w:r>
+        <w:rPr>
+          <w:noProof/>
+        </w:rPr>
         <w:drawing>
           <wp:inline distT="0" distB="0" distL="0" distR="0" wp14:anchorId="09A5BD0D" wp14:editId="3652545F">
             <wp:extent cx="4410691" cy="1333686"/>
@@ -6365,6 +6404,9 @@
     </w:p>
     <w:p>
       <w:r>
+        <w:rPr>
+          <w:noProof/>
+        </w:rPr>
         <w:drawing>
           <wp:inline distT="0" distB="0" distL="0" distR="0" wp14:anchorId="65D6F113" wp14:editId="01EB624A">
             <wp:extent cx="3915321" cy="1228896"/>
@@ -6401,9 +6443,359 @@
           </wp:inline>
         </w:drawing>
       </w:r>
+    </w:p>
+    <w:p/>
+    <w:p>
+      <w:r>
+        <w:t xml:space="preserve"> </w:t>
+      </w:r>
+      <w:r>
+        <w:t>49- Mudamos a cor da borda ao cli</w:t>
+      </w:r>
+      <w:r>
+        <w:t xml:space="preserve">car sobre ela utilizando o </w:t>
+      </w:r>
+      <w:proofErr w:type="spellStart"/>
+      <w:r>
+        <w:t>active</w:t>
+      </w:r>
+      <w:proofErr w:type="spellEnd"/>
+      <w:r>
+        <w:t>.</w:t>
+      </w:r>
+    </w:p>
+    <w:p>
+      <w:r>
+        <w:drawing>
+          <wp:inline distT="0" distB="0" distL="0" distR="0" wp14:anchorId="54B8D145" wp14:editId="514118E2">
+            <wp:extent cx="3753374" cy="1257475"/>
+            <wp:effectExtent l="0" t="0" r="0" b="0"/>
+            <wp:docPr id="89" name="Imagem 89"/>
+            <wp:cNvGraphicFramePr>
+              <a:graphicFrameLocks xmlns:a="http://schemas.openxmlformats.org/drawingml/2006/main" noChangeAspect="1"/>
+            </wp:cNvGraphicFramePr>
+            <a:graphic xmlns:a="http://schemas.openxmlformats.org/drawingml/2006/main">
+              <a:graphicData uri="http://schemas.openxmlformats.org/drawingml/2006/picture">
+                <pic:pic xmlns:pic="http://schemas.openxmlformats.org/drawingml/2006/picture">
+                  <pic:nvPicPr>
+                    <pic:cNvPr id="1" name=""/>
+                    <pic:cNvPicPr/>
+                  </pic:nvPicPr>
+                  <pic:blipFill>
+                    <a:blip r:embed="rId91"/>
+                    <a:stretch>
+                      <a:fillRect/>
+                    </a:stretch>
+                  </pic:blipFill>
+                  <pic:spPr>
+                    <a:xfrm>
+                      <a:off x="0" y="0"/>
+                      <a:ext cx="3753374" cy="1257475"/>
+                    </a:xfrm>
+                    <a:prstGeom prst="rect">
+                      <a:avLst/>
+                    </a:prstGeom>
+                  </pic:spPr>
+                </pic:pic>
+              </a:graphicData>
+            </a:graphic>
+          </wp:inline>
+        </w:drawing>
+      </w:r>
+    </w:p>
+    <w:p>
+      <w:r>
+        <w:tab/>
+      </w:r>
+      <w:r>
+        <w:drawing>
+          <wp:inline distT="0" distB="0" distL="0" distR="0" wp14:anchorId="45603FE7" wp14:editId="76FD4238">
+            <wp:extent cx="6442446" cy="3083825"/>
+            <wp:effectExtent l="0" t="0" r="0" b="2540"/>
+            <wp:docPr id="95" name="Imagem 95"/>
+            <wp:cNvGraphicFramePr>
+              <a:graphicFrameLocks xmlns:a="http://schemas.openxmlformats.org/drawingml/2006/main" noChangeAspect="1"/>
+            </wp:cNvGraphicFramePr>
+            <a:graphic xmlns:a="http://schemas.openxmlformats.org/drawingml/2006/main">
+              <a:graphicData uri="http://schemas.openxmlformats.org/drawingml/2006/picture">
+                <pic:pic xmlns:pic="http://schemas.openxmlformats.org/drawingml/2006/picture">
+                  <pic:nvPicPr>
+                    <pic:cNvPr id="1" name=""/>
+                    <pic:cNvPicPr/>
+                  </pic:nvPicPr>
+                  <pic:blipFill>
+                    <a:blip r:embed="rId92"/>
+                    <a:stretch>
+                      <a:fillRect/>
+                    </a:stretch>
+                  </pic:blipFill>
+                  <pic:spPr>
+                    <a:xfrm>
+                      <a:off x="0" y="0"/>
+                      <a:ext cx="6478246" cy="3100961"/>
+                    </a:xfrm>
+                    <a:prstGeom prst="rect">
+                      <a:avLst/>
+                    </a:prstGeom>
+                  </pic:spPr>
+                </pic:pic>
+              </a:graphicData>
+            </a:graphic>
+          </wp:inline>
+        </w:drawing>
+      </w:r>
+    </w:p>
+    <w:p>
+      <w:r>
+        <w:t xml:space="preserve">50 </w:t>
+      </w:r>
+      <w:r>
+        <w:t>–</w:t>
+      </w:r>
+      <w:r>
+        <w:t xml:space="preserve"> </w:t>
+      </w:r>
+      <w:r>
+        <w:t xml:space="preserve">Agora vamos deixar a nossa página mais interativa colocando um </w:t>
+      </w:r>
+      <w:proofErr w:type="spellStart"/>
+      <w:r>
+        <w:t>hover</w:t>
+      </w:r>
+      <w:proofErr w:type="spellEnd"/>
+      <w:r>
+        <w:t xml:space="preserve"> no título, </w:t>
+      </w:r>
+      <w:r>
+        <w:t>ou seja, vamos passar o mouse ele vai aumentar de tamanho passando uma impressão que a imagem está se movendo.</w:t>
+      </w:r>
+    </w:p>
+    <w:p>
+      <w:r>
+        <w:drawing>
+          <wp:inline distT="0" distB="0" distL="0" distR="0" wp14:anchorId="4AFA1DBA" wp14:editId="78533DC3">
+            <wp:extent cx="3134162" cy="1181265"/>
+            <wp:effectExtent l="0" t="0" r="0" b="0"/>
+            <wp:docPr id="106" name="Imagem 106"/>
+            <wp:cNvGraphicFramePr>
+              <a:graphicFrameLocks xmlns:a="http://schemas.openxmlformats.org/drawingml/2006/main" noChangeAspect="1"/>
+            </wp:cNvGraphicFramePr>
+            <a:graphic xmlns:a="http://schemas.openxmlformats.org/drawingml/2006/main">
+              <a:graphicData uri="http://schemas.openxmlformats.org/drawingml/2006/picture">
+                <pic:pic xmlns:pic="http://schemas.openxmlformats.org/drawingml/2006/picture">
+                  <pic:nvPicPr>
+                    <pic:cNvPr id="1" name=""/>
+                    <pic:cNvPicPr/>
+                  </pic:nvPicPr>
+                  <pic:blipFill>
+                    <a:blip r:embed="rId93"/>
+                    <a:stretch>
+                      <a:fillRect/>
+                    </a:stretch>
+                  </pic:blipFill>
+                  <pic:spPr>
+                    <a:xfrm>
+                      <a:off x="0" y="0"/>
+                      <a:ext cx="3134162" cy="1181265"/>
+                    </a:xfrm>
+                    <a:prstGeom prst="rect">
+                      <a:avLst/>
+                    </a:prstGeom>
+                  </pic:spPr>
+                </pic:pic>
+              </a:graphicData>
+            </a:graphic>
+          </wp:inline>
+        </w:drawing>
+      </w:r>
+    </w:p>
+    <w:p/>
+    <w:p>
+      <w:r>
+        <w:t xml:space="preserve">51 </w:t>
+      </w:r>
+      <w:r>
+        <w:t>–</w:t>
+      </w:r>
+      <w:r>
+        <w:t xml:space="preserve"> </w:t>
+      </w:r>
+      <w:r>
+        <w:t xml:space="preserve">Adicionamos uma imagem ao </w:t>
+      </w:r>
+      <w:proofErr w:type="spellStart"/>
+      <w:r>
+        <w:t>footer</w:t>
+      </w:r>
+      <w:proofErr w:type="spellEnd"/>
+      <w:r>
+        <w:t xml:space="preserve"> conforme código.</w:t>
+      </w:r>
+    </w:p>
+    <w:p>
+      <w:r>
+        <w:drawing>
+          <wp:inline distT="0" distB="0" distL="0" distR="0" wp14:anchorId="19BE3E3E" wp14:editId="32668CC4">
+            <wp:extent cx="6230219" cy="933580"/>
+            <wp:effectExtent l="0" t="0" r="0" b="0"/>
+            <wp:docPr id="107" name="Imagem 107"/>
+            <wp:cNvGraphicFramePr>
+              <a:graphicFrameLocks xmlns:a="http://schemas.openxmlformats.org/drawingml/2006/main" noChangeAspect="1"/>
+            </wp:cNvGraphicFramePr>
+            <a:graphic xmlns:a="http://schemas.openxmlformats.org/drawingml/2006/main">
+              <a:graphicData uri="http://schemas.openxmlformats.org/drawingml/2006/picture">
+                <pic:pic xmlns:pic="http://schemas.openxmlformats.org/drawingml/2006/picture">
+                  <pic:nvPicPr>
+                    <pic:cNvPr id="1" name=""/>
+                    <pic:cNvPicPr/>
+                  </pic:nvPicPr>
+                  <pic:blipFill>
+                    <a:blip r:embed="rId94"/>
+                    <a:stretch>
+                      <a:fillRect/>
+                    </a:stretch>
+                  </pic:blipFill>
+                  <pic:spPr>
+                    <a:xfrm>
+                      <a:off x="0" y="0"/>
+                      <a:ext cx="6230219" cy="933580"/>
+                    </a:xfrm>
+                    <a:prstGeom prst="rect">
+                      <a:avLst/>
+                    </a:prstGeom>
+                  </pic:spPr>
+                </pic:pic>
+              </a:graphicData>
+            </a:graphic>
+          </wp:inline>
+        </w:drawing>
+      </w:r>
+    </w:p>
+    <w:p>
+      <w:r>
+        <w:t xml:space="preserve">52 -  Como a imagem de </w:t>
+      </w:r>
+      <w:proofErr w:type="spellStart"/>
+      <w:r>
+        <w:t>footer</w:t>
+      </w:r>
+      <w:proofErr w:type="spellEnd"/>
+      <w:r>
+        <w:t xml:space="preserve"> e branca precisamos adicionar uma cor de fundo.</w:t>
+      </w:r>
+    </w:p>
+    <w:p>
+      <w:r>
+        <w:drawing>
+          <wp:inline distT="0" distB="0" distL="0" distR="0" wp14:anchorId="726FABF8" wp14:editId="41254CF8">
+            <wp:extent cx="4039164" cy="1305107"/>
+            <wp:effectExtent l="0" t="0" r="0" b="9525"/>
+            <wp:docPr id="108" name="Imagem 108"/>
+            <wp:cNvGraphicFramePr>
+              <a:graphicFrameLocks xmlns:a="http://schemas.openxmlformats.org/drawingml/2006/main" noChangeAspect="1"/>
+            </wp:cNvGraphicFramePr>
+            <a:graphic xmlns:a="http://schemas.openxmlformats.org/drawingml/2006/main">
+              <a:graphicData uri="http://schemas.openxmlformats.org/drawingml/2006/picture">
+                <pic:pic xmlns:pic="http://schemas.openxmlformats.org/drawingml/2006/picture">
+                  <pic:nvPicPr>
+                    <pic:cNvPr id="1" name=""/>
+                    <pic:cNvPicPr/>
+                  </pic:nvPicPr>
+                  <pic:blipFill>
+                    <a:blip r:embed="rId95"/>
+                    <a:stretch>
+                      <a:fillRect/>
+                    </a:stretch>
+                  </pic:blipFill>
+                  <pic:spPr>
+                    <a:xfrm>
+                      <a:off x="0" y="0"/>
+                      <a:ext cx="4039164" cy="1305107"/>
+                    </a:xfrm>
+                    <a:prstGeom prst="rect">
+                      <a:avLst/>
+                    </a:prstGeom>
+                  </pic:spPr>
+                </pic:pic>
+              </a:graphicData>
+            </a:graphic>
+          </wp:inline>
+        </w:drawing>
+      </w:r>
+    </w:p>
+    <w:p>
+      <w:r>
+        <w:t>53</w:t>
+      </w:r>
+      <w:r>
+        <w:t xml:space="preserve"> </w:t>
+      </w:r>
+      <w:r>
+        <w:t>–</w:t>
+      </w:r>
+      <w:r>
+        <w:t xml:space="preserve"> </w:t>
+      </w:r>
+      <w:r>
+        <w:t xml:space="preserve">Inserimos um parágrafo no </w:t>
+      </w:r>
+      <w:proofErr w:type="spellStart"/>
+      <w:r>
+        <w:t>footer</w:t>
+      </w:r>
+      <w:proofErr w:type="spellEnd"/>
+      <w:r>
+        <w:t xml:space="preserve"> </w:t>
+      </w:r>
+      <w:r>
+        <w:t>e centralizamos os conteúdos dentro dele.</w:t>
+      </w:r>
+    </w:p>
+    <w:p>
+      <w:r>
+        <w:drawing>
+          <wp:inline distT="0" distB="0" distL="0" distR="0" wp14:anchorId="4F577C16" wp14:editId="6A403354">
+            <wp:extent cx="6620799" cy="1295581"/>
+            <wp:effectExtent l="0" t="0" r="0" b="0"/>
+            <wp:docPr id="109" name="Imagem 109"/>
+            <wp:cNvGraphicFramePr>
+              <a:graphicFrameLocks xmlns:a="http://schemas.openxmlformats.org/drawingml/2006/main" noChangeAspect="1"/>
+            </wp:cNvGraphicFramePr>
+            <a:graphic xmlns:a="http://schemas.openxmlformats.org/drawingml/2006/main">
+              <a:graphicData uri="http://schemas.openxmlformats.org/drawingml/2006/picture">
+                <pic:pic xmlns:pic="http://schemas.openxmlformats.org/drawingml/2006/picture">
+                  <pic:nvPicPr>
+                    <pic:cNvPr id="1" name=""/>
+                    <pic:cNvPicPr/>
+                  </pic:nvPicPr>
+                  <pic:blipFill>
+                    <a:blip r:embed="rId96"/>
+                    <a:stretch>
+                      <a:fillRect/>
+                    </a:stretch>
+                  </pic:blipFill>
+                  <pic:spPr>
+                    <a:xfrm>
+                      <a:off x="0" y="0"/>
+                      <a:ext cx="6620799" cy="1295581"/>
+                    </a:xfrm>
+                    <a:prstGeom prst="rect">
+                      <a:avLst/>
+                    </a:prstGeom>
+                  </pic:spPr>
+                </pic:pic>
+              </a:graphicData>
+            </a:graphic>
+          </wp:inline>
+        </w:drawing>
+      </w:r>
       <w:bookmarkStart w:id="0" w:name="_GoBack"/>
       <w:bookmarkEnd w:id="0"/>
     </w:p>
+    <w:p/>
+    <w:p/>
+    <w:p/>
+    <w:p/>
     <w:sectPr>
       <w:pgSz w:w="11906" w:h="16838"/>
       <w:pgMar w:top="1417" w:right="1701" w:bottom="1417" w:left="1701" w:header="708" w:footer="708" w:gutter="0"/>
@@ -7525,6 +7917,15 @@
 </file>
 
 <file path=customXml/item1.xml><?xml version="1.0" encoding="utf-8"?>
+<?mso-contentType ?>
+<FormTemplates xmlns="http://schemas.microsoft.com/sharepoint/v3/contenttype/forms">
+  <Display>DocumentLibraryForm</Display>
+  <Edit>DocumentLibraryForm</Edit>
+  <New>DocumentLibraryForm</New>
+</FormTemplates>
+</file>
+
+<file path=customXml/item2.xml><?xml version="1.0" encoding="utf-8"?>
 <p:properties xmlns:p="http://schemas.microsoft.com/office/2006/metadata/properties" xmlns:xsi="http://www.w3.org/2001/XMLSchema-instance" xmlns:pc="http://schemas.microsoft.com/office/infopath/2007/PartnerControls">
   <documentManagement>
     <_activity xmlns="8437a765-f0a9-40aa-978b-fcc06261281f" xsi:nil="true"/>
@@ -7532,7 +7933,7 @@
 </p:properties>
 </file>
 
-<file path=customXml/item2.xml><?xml version="1.0" encoding="utf-8"?>
+<file path=customXml/item3.xml><?xml version="1.0" encoding="utf-8"?>
 <ct:contentTypeSchema xmlns:ct="http://schemas.microsoft.com/office/2006/metadata/contentType" xmlns:ma="http://schemas.microsoft.com/office/2006/metadata/properties/metaAttributes" ct:_="" ma:_="" ma:contentTypeName="Documento" ma:contentTypeID="0x01010034B17ED9C83E394791ACA33DA9287452" ma:contentTypeVersion="16" ma:contentTypeDescription="Crie um novo documento." ma:contentTypeScope="" ma:versionID="d36ce64b1b29120840e9f9b956471cbb">
   <xsd:schema xmlns:xsd="http://www.w3.org/2001/XMLSchema" xmlns:xs="http://www.w3.org/2001/XMLSchema" xmlns:p="http://schemas.microsoft.com/office/2006/metadata/properties" xmlns:ns3="8437a765-f0a9-40aa-978b-fcc06261281f" xmlns:ns4="e78d8b06-d887-4705-9cec-751f2fb2cee2" targetNamespace="http://schemas.microsoft.com/office/2006/metadata/properties" ma:root="true" ma:fieldsID="ab1d645bb15f72c0dfc8a8f602f1de6b" ns3:_="" ns4:_="">
     <xsd:import namespace="8437a765-f0a9-40aa-978b-fcc06261281f"/>
@@ -7771,20 +8172,19 @@
 </ct:contentTypeSchema>
 </file>
 
-<file path=customXml/item3.xml><?xml version="1.0" encoding="utf-8"?>
-<?mso-contentType ?>
-<FormTemplates xmlns="http://schemas.microsoft.com/sharepoint/v3/contenttype/forms">
-  <Display>DocumentLibraryForm</Display>
-  <Edit>DocumentLibraryForm</Edit>
-  <New>DocumentLibraryForm</New>
-</FormTemplates>
-</file>
-
 <file path=customXml/item4.xml><?xml version="1.0" encoding="utf-8"?>
 <b:Sources xmlns:b="http://schemas.openxmlformats.org/officeDocument/2006/bibliography" xmlns="http://schemas.openxmlformats.org/officeDocument/2006/bibliography" SelectedStyle="\APASixthEditionOfficeOnline.xsl" StyleName="APA" Version="6"/>
 </file>
 
 <file path=customXml/itemProps1.xml><?xml version="1.0" encoding="utf-8"?>
+<ds:datastoreItem xmlns:ds="http://schemas.openxmlformats.org/officeDocument/2006/customXml" ds:itemID="{38630907-5F1E-4561-A45F-AC7CC415CD73}">
+  <ds:schemaRefs>
+    <ds:schemaRef ds:uri="http://schemas.microsoft.com/sharepoint/v3/contenttype/forms"/>
+  </ds:schemaRefs>
+</ds:datastoreItem>
+</file>
+
+<file path=customXml/itemProps2.xml><?xml version="1.0" encoding="utf-8"?>
 <ds:datastoreItem xmlns:ds="http://schemas.openxmlformats.org/officeDocument/2006/customXml" ds:itemID="{0C9FFCBC-F2CA-4FF1-AAFC-AD3B89BB1967}">
   <ds:schemaRefs>
     <ds:schemaRef ds:uri="http://schemas.microsoft.com/office/2006/metadata/properties"/>
@@ -7794,7 +8194,7 @@
 </ds:datastoreItem>
 </file>
 
-<file path=customXml/itemProps2.xml><?xml version="1.0" encoding="utf-8"?>
+<file path=customXml/itemProps3.xml><?xml version="1.0" encoding="utf-8"?>
 <ds:datastoreItem xmlns:ds="http://schemas.openxmlformats.org/officeDocument/2006/customXml" ds:itemID="{5D63F5B6-DF50-4CAF-997C-1D8B1776178E}">
   <ds:schemaRefs>
     <ds:schemaRef ds:uri="http://schemas.microsoft.com/office/2006/metadata/contentType"/>
@@ -7813,16 +8213,8 @@
 </ds:datastoreItem>
 </file>
 
-<file path=customXml/itemProps3.xml><?xml version="1.0" encoding="utf-8"?>
-<ds:datastoreItem xmlns:ds="http://schemas.openxmlformats.org/officeDocument/2006/customXml" ds:itemID="{38630907-5F1E-4561-A45F-AC7CC415CD73}">
-  <ds:schemaRefs>
-    <ds:schemaRef ds:uri="http://schemas.microsoft.com/sharepoint/v3/contenttype/forms"/>
-  </ds:schemaRefs>
-</ds:datastoreItem>
-</file>
-
 <file path=customXml/itemProps4.xml><?xml version="1.0" encoding="utf-8"?>
-<ds:datastoreItem xmlns:ds="http://schemas.openxmlformats.org/officeDocument/2006/customXml" ds:itemID="{31FB7E2A-B012-47F2-B022-062F6B5765C5}">
+<ds:datastoreItem xmlns:ds="http://schemas.openxmlformats.org/officeDocument/2006/customXml" ds:itemID="{268C2A7E-956E-484D-B443-EE426086A6F7}">
   <ds:schemaRefs>
     <ds:schemaRef ds:uri="http://schemas.openxmlformats.org/officeDocument/2006/bibliography"/>
   </ds:schemaRefs>

</xml_diff>

<commit_message>
atualização do projeto 11/09/2026
</commit_message>
<xml_diff>
--- a/apostila/Projeto Space for me3.docx
+++ b/apostila/Projeto Space for me3.docx
@@ -6466,6 +6466,9 @@
     </w:p>
     <w:p>
       <w:r>
+        <w:rPr>
+          <w:noProof/>
+        </w:rPr>
         <w:drawing>
           <wp:inline distT="0" distB="0" distL="0" distR="0" wp14:anchorId="54B8D145" wp14:editId="514118E2">
             <wp:extent cx="3753374" cy="1257475"/>
@@ -6508,6 +6511,9 @@
         <w:tab/>
       </w:r>
       <w:r>
+        <w:rPr>
+          <w:noProof/>
+        </w:rPr>
         <w:drawing>
           <wp:inline distT="0" distB="0" distL="0" distR="0" wp14:anchorId="45603FE7" wp14:editId="76FD4238">
             <wp:extent cx="6442446" cy="3083825"/>
@@ -6572,6 +6578,9 @@
     </w:p>
     <w:p>
       <w:r>
+        <w:rPr>
+          <w:noProof/>
+        </w:rPr>
         <w:drawing>
           <wp:inline distT="0" distB="0" distL="0" distR="0" wp14:anchorId="4AFA1DBA" wp14:editId="78533DC3">
             <wp:extent cx="3134162" cy="1181265"/>
@@ -6634,6 +6643,9 @@
     </w:p>
     <w:p>
       <w:r>
+        <w:rPr>
+          <w:noProof/>
+        </w:rPr>
         <w:drawing>
           <wp:inline distT="0" distB="0" distL="0" distR="0" wp14:anchorId="19BE3E3E" wp14:editId="32668CC4">
             <wp:extent cx="6230219" cy="933580"/>
@@ -6686,6 +6698,9 @@
     </w:p>
     <w:p>
       <w:r>
+        <w:rPr>
+          <w:noProof/>
+        </w:rPr>
         <w:drawing>
           <wp:inline distT="0" distB="0" distL="0" distR="0" wp14:anchorId="726FABF8" wp14:editId="41254CF8">
             <wp:extent cx="4039164" cy="1305107"/>
@@ -6753,6 +6768,9 @@
     </w:p>
     <w:p>
       <w:r>
+        <w:rPr>
+          <w:noProof/>
+        </w:rPr>
         <w:drawing>
           <wp:inline distT="0" distB="0" distL="0" distR="0" wp14:anchorId="4F577C16" wp14:editId="6A403354">
             <wp:extent cx="6620799" cy="1295581"/>
@@ -6789,12 +6807,388 @@
           </wp:inline>
         </w:drawing>
       </w:r>
+    </w:p>
+    <w:p/>
+    <w:p>
+      <w:r>
+        <w:rPr>
+          <w:noProof/>
+        </w:rPr>
+        <mc:AlternateContent>
+          <mc:Choice Requires="wps">
+            <w:drawing>
+              <wp:anchor distT="0" distB="0" distL="114300" distR="114300" simplePos="0" relativeHeight="251683840" behindDoc="0" locked="0" layoutInCell="1" allowOverlap="1" wp14:anchorId="49DEE367" wp14:editId="61B2DDEB">
+                <wp:simplePos x="0" y="0"/>
+                <wp:positionH relativeFrom="column">
+                  <wp:posOffset>2368133</wp:posOffset>
+                </wp:positionH>
+                <wp:positionV relativeFrom="paragraph">
+                  <wp:posOffset>157062</wp:posOffset>
+                </wp:positionV>
+                <wp:extent cx="3671248" cy="1289713"/>
+                <wp:effectExtent l="38100" t="0" r="24765" b="62865"/>
+                <wp:wrapNone/>
+                <wp:docPr id="112" name="Conector de Seta Reta 112"/>
+                <wp:cNvGraphicFramePr/>
+                <a:graphic xmlns:a="http://schemas.openxmlformats.org/drawingml/2006/main">
+                  <a:graphicData uri="http://schemas.microsoft.com/office/word/2010/wordprocessingShape">
+                    <wps:wsp>
+                      <wps:cNvCnPr/>
+                      <wps:spPr>
+                        <a:xfrm flipH="1">
+                          <a:off x="0" y="0"/>
+                          <a:ext cx="3671248" cy="1289713"/>
+                        </a:xfrm>
+                        <a:prstGeom prst="straightConnector1">
+                          <a:avLst/>
+                        </a:prstGeom>
+                        <a:ln>
+                          <a:tailEnd type="triangle"/>
+                        </a:ln>
+                      </wps:spPr>
+                      <wps:style>
+                        <a:lnRef idx="1">
+                          <a:schemeClr val="accent1"/>
+                        </a:lnRef>
+                        <a:fillRef idx="0">
+                          <a:schemeClr val="accent1"/>
+                        </a:fillRef>
+                        <a:effectRef idx="0">
+                          <a:schemeClr val="accent1"/>
+                        </a:effectRef>
+                        <a:fontRef idx="minor">
+                          <a:schemeClr val="tx1"/>
+                        </a:fontRef>
+                      </wps:style>
+                      <wps:bodyPr/>
+                    </wps:wsp>
+                  </a:graphicData>
+                </a:graphic>
+              </wp:anchor>
+            </w:drawing>
+          </mc:Choice>
+          <mc:Fallback>
+            <w:pict>
+              <v:shapetype w14:anchorId="699B91AA" id="_x0000_t32" coordsize="21600,21600" o:spt="32" o:oned="t" path="m,l21600,21600e" filled="f">
+                <v:path arrowok="t" fillok="f" o:connecttype="none"/>
+                <o:lock v:ext="edit" shapetype="t"/>
+              </v:shapetype>
+              <v:shape id="Conector de Seta Reta 112" o:spid="_x0000_s1026" type="#_x0000_t32" style="position:absolute;margin-left:186.45pt;margin-top:12.35pt;width:289.05pt;height:101.55pt;flip:x;z-index:251683840;visibility:visible;mso-wrap-style:square;mso-wrap-distance-left:9pt;mso-wrap-distance-top:0;mso-wrap-distance-right:9pt;mso-wrap-distance-bottom:0;mso-position-horizontal:absolute;mso-position-horizontal-relative:text;mso-position-vertical:absolute;mso-position-vertical-relative:text" o:gfxdata="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" strokecolor="#4472c4 [3204]" strokeweight=".5pt">
+                <v:stroke endarrow="block" joinstyle="miter"/>
+              </v:shape>
+            </w:pict>
+          </mc:Fallback>
+        </mc:AlternateContent>
+      </w:r>
+      <w:r>
+        <w:t xml:space="preserve">54 – Inserindo uma imagem de fundo no site ao contrario do </w:t>
+      </w:r>
+      <w:proofErr w:type="spellStart"/>
+      <w:r>
+        <w:t>html</w:t>
+      </w:r>
+      <w:proofErr w:type="spellEnd"/>
+      <w:r>
+        <w:t xml:space="preserve"> </w:t>
+      </w:r>
+      <w:r>
+        <w:t xml:space="preserve">colocamos uma imagem de fundo pelo CSS  e quando realizamos tal função a natureza da imagem e ficar se repetindo no site. </w:t>
+      </w:r>
+    </w:p>
+    <w:p>
+      <w:r>
+        <w:rPr>
+          <w:noProof/>
+        </w:rPr>
+        <mc:AlternateContent>
+          <mc:Choice Requires="wps">
+            <w:drawing>
+              <wp:anchor distT="0" distB="0" distL="114300" distR="114300" simplePos="0" relativeHeight="251682816" behindDoc="0" locked="0" layoutInCell="1" allowOverlap="1" wp14:anchorId="0BE5D61C" wp14:editId="5CB6C53E">
+                <wp:simplePos x="0" y="0"/>
+                <wp:positionH relativeFrom="column">
+                  <wp:posOffset>34366</wp:posOffset>
+                </wp:positionH>
+                <wp:positionV relativeFrom="paragraph">
+                  <wp:posOffset>135946</wp:posOffset>
+                </wp:positionV>
+                <wp:extent cx="464024" cy="1091821"/>
+                <wp:effectExtent l="0" t="0" r="50800" b="51435"/>
+                <wp:wrapNone/>
+                <wp:docPr id="111" name="Conector de Seta Reta 111"/>
+                <wp:cNvGraphicFramePr/>
+                <a:graphic xmlns:a="http://schemas.openxmlformats.org/drawingml/2006/main">
+                  <a:graphicData uri="http://schemas.microsoft.com/office/word/2010/wordprocessingShape">
+                    <wps:wsp>
+                      <wps:cNvCnPr/>
+                      <wps:spPr>
+                        <a:xfrm>
+                          <a:off x="0" y="0"/>
+                          <a:ext cx="464024" cy="1091821"/>
+                        </a:xfrm>
+                        <a:prstGeom prst="straightConnector1">
+                          <a:avLst/>
+                        </a:prstGeom>
+                        <a:ln>
+                          <a:tailEnd type="triangle"/>
+                        </a:ln>
+                      </wps:spPr>
+                      <wps:style>
+                        <a:lnRef idx="1">
+                          <a:schemeClr val="accent1"/>
+                        </a:lnRef>
+                        <a:fillRef idx="0">
+                          <a:schemeClr val="accent1"/>
+                        </a:fillRef>
+                        <a:effectRef idx="0">
+                          <a:schemeClr val="accent1"/>
+                        </a:effectRef>
+                        <a:fontRef idx="minor">
+                          <a:schemeClr val="tx1"/>
+                        </a:fontRef>
+                      </wps:style>
+                      <wps:bodyPr/>
+                    </wps:wsp>
+                  </a:graphicData>
+                </a:graphic>
+              </wp:anchor>
+            </w:drawing>
+          </mc:Choice>
+          <mc:Fallback>
+            <w:pict>
+              <v:shape w14:anchorId="272276BC" id="Conector de Seta Reta 111" o:spid="_x0000_s1026" type="#_x0000_t32" style="position:absolute;margin-left:2.7pt;margin-top:10.7pt;width:36.55pt;height:85.95pt;z-index:251682816;visibility:visible;mso-wrap-style:square;mso-wrap-distance-left:9pt;mso-wrap-distance-top:0;mso-wrap-distance-right:9pt;mso-wrap-distance-bottom:0;mso-position-horizontal:absolute;mso-position-horizontal-relative:text;mso-position-vertical:absolute;mso-position-vertical-relative:text" o:gfxdata="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" strokecolor="#4472c4 [3204]" strokeweight=".5pt">
+                <v:stroke endarrow="block" joinstyle="miter"/>
+              </v:shape>
+            </w:pict>
+          </mc:Fallback>
+        </mc:AlternateContent>
+      </w:r>
+      <w:r>
+        <w:t>Se não quisemos que isso aconteça precisamos adicionar o comando</w:t>
+      </w:r>
+      <w:r>
+        <w:t>.</w:t>
+      </w:r>
+    </w:p>
+    <w:p>
+      <w:r>
+        <w:drawing>
+          <wp:inline distT="0" distB="0" distL="0" distR="0" wp14:anchorId="3A2CAA85" wp14:editId="5E9692EC">
+            <wp:extent cx="4934639" cy="2067213"/>
+            <wp:effectExtent l="0" t="0" r="0" b="9525"/>
+            <wp:docPr id="110" name="Imagem 110"/>
+            <wp:cNvGraphicFramePr>
+              <a:graphicFrameLocks xmlns:a="http://schemas.openxmlformats.org/drawingml/2006/main" noChangeAspect="1"/>
+            </wp:cNvGraphicFramePr>
+            <a:graphic xmlns:a="http://schemas.openxmlformats.org/drawingml/2006/main">
+              <a:graphicData uri="http://schemas.openxmlformats.org/drawingml/2006/picture">
+                <pic:pic xmlns:pic="http://schemas.openxmlformats.org/drawingml/2006/picture">
+                  <pic:nvPicPr>
+                    <pic:cNvPr id="1" name=""/>
+                    <pic:cNvPicPr/>
+                  </pic:nvPicPr>
+                  <pic:blipFill>
+                    <a:blip r:embed="rId97"/>
+                    <a:stretch>
+                      <a:fillRect/>
+                    </a:stretch>
+                  </pic:blipFill>
+                  <pic:spPr>
+                    <a:xfrm>
+                      <a:off x="0" y="0"/>
+                      <a:ext cx="4934639" cy="2067213"/>
+                    </a:xfrm>
+                    <a:prstGeom prst="rect">
+                      <a:avLst/>
+                    </a:prstGeom>
+                  </pic:spPr>
+                </pic:pic>
+              </a:graphicData>
+            </a:graphic>
+          </wp:inline>
+        </w:drawing>
+      </w:r>
+    </w:p>
+    <w:p/>
+    <w:p>
+      <w:r>
+        <w:t xml:space="preserve">55 </w:t>
+      </w:r>
+      <w:r>
+        <w:t xml:space="preserve">– No </w:t>
+      </w:r>
+      <w:proofErr w:type="spellStart"/>
+      <w:r>
+        <w:t>footer</w:t>
+      </w:r>
+      <w:proofErr w:type="spellEnd"/>
+      <w:r>
+        <w:t xml:space="preserve"> após colocamos uma imagem de fundo preta se fez necessário mudar a cor da letra do </w:t>
+      </w:r>
+      <w:r>
+        <w:t>parágrafo</w:t>
+      </w:r>
+      <w:r>
+        <w:t>(White)</w:t>
+      </w:r>
+      <w:r>
+        <w:t>.</w:t>
+      </w:r>
+    </w:p>
+    <w:p>
+      <w:r>
+        <w:t xml:space="preserve">       Aumentamos o espaço interno tanto para cima como para baixo e diminuímos o tamanho da fonte </w:t>
+      </w:r>
+    </w:p>
+    <w:p>
+      <w:r>
+        <w:drawing>
+          <wp:inline distT="0" distB="0" distL="0" distR="0" wp14:anchorId="7C9204EF" wp14:editId="08D44A46">
+            <wp:extent cx="5048955" cy="2629267"/>
+            <wp:effectExtent l="0" t="0" r="0" b="0"/>
+            <wp:docPr id="113" name="Imagem 113"/>
+            <wp:cNvGraphicFramePr>
+              <a:graphicFrameLocks xmlns:a="http://schemas.openxmlformats.org/drawingml/2006/main" noChangeAspect="1"/>
+            </wp:cNvGraphicFramePr>
+            <a:graphic xmlns:a="http://schemas.openxmlformats.org/drawingml/2006/main">
+              <a:graphicData uri="http://schemas.openxmlformats.org/drawingml/2006/picture">
+                <pic:pic xmlns:pic="http://schemas.openxmlformats.org/drawingml/2006/picture">
+                  <pic:nvPicPr>
+                    <pic:cNvPr id="1" name=""/>
+                    <pic:cNvPicPr/>
+                  </pic:nvPicPr>
+                  <pic:blipFill>
+                    <a:blip r:embed="rId98"/>
+                    <a:stretch>
+                      <a:fillRect/>
+                    </a:stretch>
+                  </pic:blipFill>
+                  <pic:spPr>
+                    <a:xfrm>
+                      <a:off x="0" y="0"/>
+                      <a:ext cx="5048955" cy="2629267"/>
+                    </a:xfrm>
+                    <a:prstGeom prst="rect">
+                      <a:avLst/>
+                    </a:prstGeom>
+                  </pic:spPr>
+                </pic:pic>
+              </a:graphicData>
+            </a:graphic>
+          </wp:inline>
+        </w:drawing>
+      </w:r>
+    </w:p>
+    <w:p>
+      <w:r>
+        <w:t xml:space="preserve">56- </w:t>
+      </w:r>
+      <w:r>
+        <w:t>Criamos a página contatos.html e contatos.css copiamos o cabeçalho(header) da página produtos e colocamos na página contato</w:t>
+      </w:r>
+      <w:r>
+        <w:t xml:space="preserve"> e repetimos o mesmo processo do </w:t>
+      </w:r>
+      <w:proofErr w:type="spellStart"/>
+      <w:r>
+        <w:t>css</w:t>
+      </w:r>
+      <w:proofErr w:type="spellEnd"/>
+      <w:r>
+        <w:t xml:space="preserve"> </w:t>
+      </w:r>
+      <w:r>
+        <w:t>com isso finalizando o menu que já estava pronto.</w:t>
+      </w:r>
+    </w:p>
+    <w:p/>
+    <w:p>
+      <w:r>
+        <w:drawing>
+          <wp:inline distT="0" distB="0" distL="0" distR="0" wp14:anchorId="513D0C3D" wp14:editId="2E0B71E7">
+            <wp:extent cx="7744906" cy="3477110"/>
+            <wp:effectExtent l="0" t="0" r="8890" b="9525"/>
+            <wp:docPr id="114" name="Imagem 114"/>
+            <wp:cNvGraphicFramePr>
+              <a:graphicFrameLocks xmlns:a="http://schemas.openxmlformats.org/drawingml/2006/main" noChangeAspect="1"/>
+            </wp:cNvGraphicFramePr>
+            <a:graphic xmlns:a="http://schemas.openxmlformats.org/drawingml/2006/main">
+              <a:graphicData uri="http://schemas.openxmlformats.org/drawingml/2006/picture">
+                <pic:pic xmlns:pic="http://schemas.openxmlformats.org/drawingml/2006/picture">
+                  <pic:nvPicPr>
+                    <pic:cNvPr id="1" name=""/>
+                    <pic:cNvPicPr/>
+                  </pic:nvPicPr>
+                  <pic:blipFill>
+                    <a:blip r:embed="rId99"/>
+                    <a:stretch>
+                      <a:fillRect/>
+                    </a:stretch>
+                  </pic:blipFill>
+                  <pic:spPr>
+                    <a:xfrm>
+                      <a:off x="0" y="0"/>
+                      <a:ext cx="7744906" cy="3477110"/>
+                    </a:xfrm>
+                    <a:prstGeom prst="rect">
+                      <a:avLst/>
+                    </a:prstGeom>
+                  </pic:spPr>
+                </pic:pic>
+              </a:graphicData>
+            </a:graphic>
+          </wp:inline>
+        </w:drawing>
+      </w:r>
+    </w:p>
+    <w:p>
+      <w:r>
+        <w:drawing>
+          <wp:inline distT="0" distB="0" distL="0" distR="0" wp14:anchorId="1BE895A4" wp14:editId="44C1734B">
+            <wp:extent cx="3801005" cy="5391902"/>
+            <wp:effectExtent l="0" t="0" r="9525" b="0"/>
+            <wp:docPr id="115" name="Imagem 115"/>
+            <wp:cNvGraphicFramePr>
+              <a:graphicFrameLocks xmlns:a="http://schemas.openxmlformats.org/drawingml/2006/main" noChangeAspect="1"/>
+            </wp:cNvGraphicFramePr>
+            <a:graphic xmlns:a="http://schemas.openxmlformats.org/drawingml/2006/main">
+              <a:graphicData uri="http://schemas.openxmlformats.org/drawingml/2006/picture">
+                <pic:pic xmlns:pic="http://schemas.openxmlformats.org/drawingml/2006/picture">
+                  <pic:nvPicPr>
+                    <pic:cNvPr id="1" name=""/>
+                    <pic:cNvPicPr/>
+                  </pic:nvPicPr>
+                  <pic:blipFill>
+                    <a:blip r:embed="rId100"/>
+                    <a:stretch>
+                      <a:fillRect/>
+                    </a:stretch>
+                  </pic:blipFill>
+                  <pic:spPr>
+                    <a:xfrm>
+                      <a:off x="0" y="0"/>
+                      <a:ext cx="3801005" cy="5391902"/>
+                    </a:xfrm>
+                    <a:prstGeom prst="rect">
+                      <a:avLst/>
+                    </a:prstGeom>
+                  </pic:spPr>
+                </pic:pic>
+              </a:graphicData>
+            </a:graphic>
+          </wp:inline>
+        </w:drawing>
+      </w:r>
+    </w:p>
+    <w:p>
       <w:bookmarkStart w:id="0" w:name="_GoBack"/>
       <w:bookmarkEnd w:id="0"/>
     </w:p>
     <w:p/>
-    <w:p/>
-    <w:p/>
+    <w:p>
+      <w:r>
+        <w:t xml:space="preserve"> </w:t>
+      </w:r>
+    </w:p>
     <w:p/>
     <w:sectPr>
       <w:pgSz w:w="11906" w:h="16838"/>
@@ -7917,23 +8311,6 @@
 </file>
 
 <file path=customXml/item1.xml><?xml version="1.0" encoding="utf-8"?>
-<?mso-contentType ?>
-<FormTemplates xmlns="http://schemas.microsoft.com/sharepoint/v3/contenttype/forms">
-  <Display>DocumentLibraryForm</Display>
-  <Edit>DocumentLibraryForm</Edit>
-  <New>DocumentLibraryForm</New>
-</FormTemplates>
-</file>
-
-<file path=customXml/item2.xml><?xml version="1.0" encoding="utf-8"?>
-<p:properties xmlns:p="http://schemas.microsoft.com/office/2006/metadata/properties" xmlns:xsi="http://www.w3.org/2001/XMLSchema-instance" xmlns:pc="http://schemas.microsoft.com/office/infopath/2007/PartnerControls">
-  <documentManagement>
-    <_activity xmlns="8437a765-f0a9-40aa-978b-fcc06261281f" xsi:nil="true"/>
-  </documentManagement>
-</p:properties>
-</file>
-
-<file path=customXml/item3.xml><?xml version="1.0" encoding="utf-8"?>
 <ct:contentTypeSchema xmlns:ct="http://schemas.microsoft.com/office/2006/metadata/contentType" xmlns:ma="http://schemas.microsoft.com/office/2006/metadata/properties/metaAttributes" ct:_="" ma:_="" ma:contentTypeName="Documento" ma:contentTypeID="0x01010034B17ED9C83E394791ACA33DA9287452" ma:contentTypeVersion="16" ma:contentTypeDescription="Crie um novo documento." ma:contentTypeScope="" ma:versionID="d36ce64b1b29120840e9f9b956471cbb">
   <xsd:schema xmlns:xsd="http://www.w3.org/2001/XMLSchema" xmlns:xs="http://www.w3.org/2001/XMLSchema" xmlns:p="http://schemas.microsoft.com/office/2006/metadata/properties" xmlns:ns3="8437a765-f0a9-40aa-978b-fcc06261281f" xmlns:ns4="e78d8b06-d887-4705-9cec-751f2fb2cee2" targetNamespace="http://schemas.microsoft.com/office/2006/metadata/properties" ma:root="true" ma:fieldsID="ab1d645bb15f72c0dfc8a8f602f1de6b" ns3:_="" ns4:_="">
     <xsd:import namespace="8437a765-f0a9-40aa-978b-fcc06261281f"/>
@@ -8172,29 +8549,28 @@
 </ct:contentTypeSchema>
 </file>
 
+<file path=customXml/item2.xml><?xml version="1.0" encoding="utf-8"?>
+<?mso-contentType ?>
+<FormTemplates xmlns="http://schemas.microsoft.com/sharepoint/v3/contenttype/forms">
+  <Display>DocumentLibraryForm</Display>
+  <Edit>DocumentLibraryForm</Edit>
+  <New>DocumentLibraryForm</New>
+</FormTemplates>
+</file>
+
+<file path=customXml/item3.xml><?xml version="1.0" encoding="utf-8"?>
+<p:properties xmlns:p="http://schemas.microsoft.com/office/2006/metadata/properties" xmlns:xsi="http://www.w3.org/2001/XMLSchema-instance" xmlns:pc="http://schemas.microsoft.com/office/infopath/2007/PartnerControls">
+  <documentManagement>
+    <_activity xmlns="8437a765-f0a9-40aa-978b-fcc06261281f" xsi:nil="true"/>
+  </documentManagement>
+</p:properties>
+</file>
+
 <file path=customXml/item4.xml><?xml version="1.0" encoding="utf-8"?>
 <b:Sources xmlns:b="http://schemas.openxmlformats.org/officeDocument/2006/bibliography" xmlns="http://schemas.openxmlformats.org/officeDocument/2006/bibliography" SelectedStyle="\APASixthEditionOfficeOnline.xsl" StyleName="APA" Version="6"/>
 </file>
 
 <file path=customXml/itemProps1.xml><?xml version="1.0" encoding="utf-8"?>
-<ds:datastoreItem xmlns:ds="http://schemas.openxmlformats.org/officeDocument/2006/customXml" ds:itemID="{38630907-5F1E-4561-A45F-AC7CC415CD73}">
-  <ds:schemaRefs>
-    <ds:schemaRef ds:uri="http://schemas.microsoft.com/sharepoint/v3/contenttype/forms"/>
-  </ds:schemaRefs>
-</ds:datastoreItem>
-</file>
-
-<file path=customXml/itemProps2.xml><?xml version="1.0" encoding="utf-8"?>
-<ds:datastoreItem xmlns:ds="http://schemas.openxmlformats.org/officeDocument/2006/customXml" ds:itemID="{0C9FFCBC-F2CA-4FF1-AAFC-AD3B89BB1967}">
-  <ds:schemaRefs>
-    <ds:schemaRef ds:uri="http://schemas.microsoft.com/office/2006/metadata/properties"/>
-    <ds:schemaRef ds:uri="http://schemas.microsoft.com/office/infopath/2007/PartnerControls"/>
-    <ds:schemaRef ds:uri="8437a765-f0a9-40aa-978b-fcc06261281f"/>
-  </ds:schemaRefs>
-</ds:datastoreItem>
-</file>
-
-<file path=customXml/itemProps3.xml><?xml version="1.0" encoding="utf-8"?>
 <ds:datastoreItem xmlns:ds="http://schemas.openxmlformats.org/officeDocument/2006/customXml" ds:itemID="{5D63F5B6-DF50-4CAF-997C-1D8B1776178E}">
   <ds:schemaRefs>
     <ds:schemaRef ds:uri="http://schemas.microsoft.com/office/2006/metadata/contentType"/>
@@ -8213,8 +8589,26 @@
 </ds:datastoreItem>
 </file>
 
+<file path=customXml/itemProps2.xml><?xml version="1.0" encoding="utf-8"?>
+<ds:datastoreItem xmlns:ds="http://schemas.openxmlformats.org/officeDocument/2006/customXml" ds:itemID="{38630907-5F1E-4561-A45F-AC7CC415CD73}">
+  <ds:schemaRefs>
+    <ds:schemaRef ds:uri="http://schemas.microsoft.com/sharepoint/v3/contenttype/forms"/>
+  </ds:schemaRefs>
+</ds:datastoreItem>
+</file>
+
+<file path=customXml/itemProps3.xml><?xml version="1.0" encoding="utf-8"?>
+<ds:datastoreItem xmlns:ds="http://schemas.openxmlformats.org/officeDocument/2006/customXml" ds:itemID="{0C9FFCBC-F2CA-4FF1-AAFC-AD3B89BB1967}">
+  <ds:schemaRefs>
+    <ds:schemaRef ds:uri="http://schemas.microsoft.com/office/2006/metadata/properties"/>
+    <ds:schemaRef ds:uri="http://schemas.microsoft.com/office/infopath/2007/PartnerControls"/>
+    <ds:schemaRef ds:uri="8437a765-f0a9-40aa-978b-fcc06261281f"/>
+  </ds:schemaRefs>
+</ds:datastoreItem>
+</file>
+
 <file path=customXml/itemProps4.xml><?xml version="1.0" encoding="utf-8"?>
-<ds:datastoreItem xmlns:ds="http://schemas.openxmlformats.org/officeDocument/2006/customXml" ds:itemID="{268C2A7E-956E-484D-B443-EE426086A6F7}">
+<ds:datastoreItem xmlns:ds="http://schemas.openxmlformats.org/officeDocument/2006/customXml" ds:itemID="{3A0F5C4C-A51E-451E-B35F-7E2D8141D8D5}">
   <ds:schemaRefs>
     <ds:schemaRef ds:uri="http://schemas.openxmlformats.org/officeDocument/2006/bibliography"/>
   </ds:schemaRefs>

</xml_diff>

<commit_message>
Atualização da aula dia 14/09/2026
</commit_message>
<xml_diff>
--- a/apostila/Projeto Space for me3.docx
+++ b/apostila/Projeto Space for me3.docx
@@ -6881,7 +6881,15 @@
         </mc:AlternateContent>
       </w:r>
       <w:r>
-        <w:t xml:space="preserve">54 – Inserindo uma imagem de fundo no site ao contrario do </w:t>
+        <w:t xml:space="preserve">54 – Inserindo uma imagem de fundo no site ao </w:t>
+      </w:r>
+      <w:proofErr w:type="spellStart"/>
+      <w:r>
+        <w:t>contrario</w:t>
+      </w:r>
+      <w:proofErr w:type="spellEnd"/>
+      <w:r>
+        <w:t xml:space="preserve"> do </w:t>
       </w:r>
       <w:proofErr w:type="spellStart"/>
       <w:r>
@@ -6971,6 +6979,9 @@
     </w:p>
     <w:p>
       <w:r>
+        <w:rPr>
+          <w:noProof/>
+        </w:rPr>
         <w:drawing>
           <wp:inline distT="0" distB="0" distL="0" distR="0" wp14:anchorId="3A2CAA85" wp14:editId="5E9692EC">
             <wp:extent cx="4934639" cy="2067213"/>
@@ -7041,6 +7052,9 @@
     </w:p>
     <w:p>
       <w:r>
+        <w:rPr>
+          <w:noProof/>
+        </w:rPr>
         <w:drawing>
           <wp:inline distT="0" distB="0" distL="0" distR="0" wp14:anchorId="7C9204EF" wp14:editId="08D44A46">
             <wp:extent cx="5048955" cy="2629267"/>
@@ -7103,6 +7117,9 @@
     <w:p/>
     <w:p>
       <w:r>
+        <w:rPr>
+          <w:noProof/>
+        </w:rPr>
         <w:drawing>
           <wp:inline distT="0" distB="0" distL="0" distR="0" wp14:anchorId="513D0C3D" wp14:editId="2E0B71E7">
             <wp:extent cx="7744906" cy="3477110"/>
@@ -7142,6 +7159,9 @@
     </w:p>
     <w:p>
       <w:r>
+        <w:rPr>
+          <w:noProof/>
+        </w:rPr>
         <w:drawing>
           <wp:inline distT="0" distB="0" distL="0" distR="0" wp14:anchorId="1BE895A4" wp14:editId="44C1734B">
             <wp:extent cx="3801005" cy="5391902"/>
@@ -7180,15 +7200,563 @@
       </w:r>
     </w:p>
     <w:p>
+      <w:r>
+        <w:t xml:space="preserve">57 – Na página contato.html inserimos o </w:t>
+      </w:r>
+      <w:proofErr w:type="spellStart"/>
+      <w:r>
+        <w:t>main</w:t>
+      </w:r>
+      <w:proofErr w:type="spellEnd"/>
+      <w:r>
+        <w:t xml:space="preserve"> dentro dele adicionamos o </w:t>
+      </w:r>
+      <w:proofErr w:type="spellStart"/>
+      <w:r>
+        <w:t>form</w:t>
+      </w:r>
+      <w:proofErr w:type="spellEnd"/>
+      <w:r>
+        <w:t xml:space="preserve"> e começamos a trabalhar com </w:t>
+      </w:r>
+      <w:proofErr w:type="spellStart"/>
+      <w:r>
+        <w:t>label</w:t>
+      </w:r>
+      <w:proofErr w:type="spellEnd"/>
+      <w:r>
+        <w:t>(</w:t>
+      </w:r>
+      <w:r>
+        <w:t>etiqueta) e input de texto.</w:t>
+      </w:r>
+    </w:p>
+    <w:p>
+      <w:r>
+        <w:drawing>
+          <wp:inline distT="0" distB="0" distL="0" distR="0" wp14:anchorId="2870196B" wp14:editId="204C3C51">
+            <wp:extent cx="4987402" cy="2242043"/>
+            <wp:effectExtent l="0" t="0" r="3810" b="6350"/>
+            <wp:docPr id="116" name="Imagem 116"/>
+            <wp:cNvGraphicFramePr>
+              <a:graphicFrameLocks xmlns:a="http://schemas.openxmlformats.org/drawingml/2006/main" noChangeAspect="1"/>
+            </wp:cNvGraphicFramePr>
+            <a:graphic xmlns:a="http://schemas.openxmlformats.org/drawingml/2006/main">
+              <a:graphicData uri="http://schemas.openxmlformats.org/drawingml/2006/picture">
+                <pic:pic xmlns:pic="http://schemas.openxmlformats.org/drawingml/2006/picture">
+                  <pic:nvPicPr>
+                    <pic:cNvPr id="1" name=""/>
+                    <pic:cNvPicPr/>
+                  </pic:nvPicPr>
+                  <pic:blipFill>
+                    <a:blip r:embed="rId101"/>
+                    <a:stretch>
+                      <a:fillRect/>
+                    </a:stretch>
+                  </pic:blipFill>
+                  <pic:spPr>
+                    <a:xfrm>
+                      <a:off x="0" y="0"/>
+                      <a:ext cx="5009563" cy="2252005"/>
+                    </a:xfrm>
+                    <a:prstGeom prst="rect">
+                      <a:avLst/>
+                    </a:prstGeom>
+                  </pic:spPr>
+                </pic:pic>
+              </a:graphicData>
+            </a:graphic>
+          </wp:inline>
+        </w:drawing>
+      </w:r>
+    </w:p>
+    <w:p/>
+    <w:p>
+      <w:r>
+        <w:rPr>
+          <w:noProof/>
+        </w:rPr>
+        <mc:AlternateContent>
+          <mc:Choice Requires="wps">
+            <w:drawing>
+              <wp:anchor distT="0" distB="0" distL="114300" distR="114300" simplePos="0" relativeHeight="251685888" behindDoc="0" locked="0" layoutInCell="1" allowOverlap="1" wp14:anchorId="607A7A85" wp14:editId="26D098F9">
+                <wp:simplePos x="0" y="0"/>
+                <wp:positionH relativeFrom="column">
+                  <wp:posOffset>2750270</wp:posOffset>
+                </wp:positionH>
+                <wp:positionV relativeFrom="paragraph">
+                  <wp:posOffset>177772</wp:posOffset>
+                </wp:positionV>
+                <wp:extent cx="2415654" cy="818865"/>
+                <wp:effectExtent l="38100" t="0" r="22860" b="76835"/>
+                <wp:wrapNone/>
+                <wp:docPr id="119" name="Conector de Seta Reta 119"/>
+                <wp:cNvGraphicFramePr/>
+                <a:graphic xmlns:a="http://schemas.openxmlformats.org/drawingml/2006/main">
+                  <a:graphicData uri="http://schemas.microsoft.com/office/word/2010/wordprocessingShape">
+                    <wps:wsp>
+                      <wps:cNvCnPr/>
+                      <wps:spPr>
+                        <a:xfrm flipH="1">
+                          <a:off x="0" y="0"/>
+                          <a:ext cx="2415654" cy="818865"/>
+                        </a:xfrm>
+                        <a:prstGeom prst="straightConnector1">
+                          <a:avLst/>
+                        </a:prstGeom>
+                        <a:ln>
+                          <a:tailEnd type="triangle"/>
+                        </a:ln>
+                      </wps:spPr>
+                      <wps:style>
+                        <a:lnRef idx="1">
+                          <a:schemeClr val="accent1"/>
+                        </a:lnRef>
+                        <a:fillRef idx="0">
+                          <a:schemeClr val="accent1"/>
+                        </a:fillRef>
+                        <a:effectRef idx="0">
+                          <a:schemeClr val="accent1"/>
+                        </a:effectRef>
+                        <a:fontRef idx="minor">
+                          <a:schemeClr val="tx1"/>
+                        </a:fontRef>
+                      </wps:style>
+                      <wps:bodyPr/>
+                    </wps:wsp>
+                  </a:graphicData>
+                </a:graphic>
+              </wp:anchor>
+            </w:drawing>
+          </mc:Choice>
+          <mc:Fallback>
+            <w:pict>
+              <v:shapetype w14:anchorId="3EA85ED0" id="_x0000_t32" coordsize="21600,21600" o:spt="32" o:oned="t" path="m,l21600,21600e" filled="f">
+                <v:path arrowok="t" fillok="f" o:connecttype="none"/>
+                <o:lock v:ext="edit" shapetype="t"/>
+              </v:shapetype>
+              <v:shape id="Conector de Seta Reta 119" o:spid="_x0000_s1026" type="#_x0000_t32" style="position:absolute;margin-left:216.55pt;margin-top:14pt;width:190.2pt;height:64.5pt;flip:x;z-index:251685888;visibility:visible;mso-wrap-style:square;mso-wrap-distance-left:9pt;mso-wrap-distance-top:0;mso-wrap-distance-right:9pt;mso-wrap-distance-bottom:0;mso-position-horizontal:absolute;mso-position-horizontal-relative:text;mso-position-vertical:absolute;mso-position-vertical-relative:text" o:gfxdata="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" strokecolor="#4472c4 [3204]" strokeweight=".5pt">
+                <v:stroke endarrow="block" joinstyle="miter"/>
+              </v:shape>
+            </w:pict>
+          </mc:Fallback>
+        </mc:AlternateContent>
+      </w:r>
+      <w:r>
+        <w:rPr>
+          <w:noProof/>
+        </w:rPr>
+        <mc:AlternateContent>
+          <mc:Choice Requires="wps">
+            <w:drawing>
+              <wp:anchor distT="0" distB="0" distL="114300" distR="114300" simplePos="0" relativeHeight="251684864" behindDoc="0" locked="0" layoutInCell="1" allowOverlap="1" wp14:anchorId="724F7CC1" wp14:editId="43893D8B">
+                <wp:simplePos x="0" y="0"/>
+                <wp:positionH relativeFrom="column">
+                  <wp:posOffset>2927691</wp:posOffset>
+                </wp:positionH>
+                <wp:positionV relativeFrom="paragraph">
+                  <wp:posOffset>177772</wp:posOffset>
+                </wp:positionV>
+                <wp:extent cx="1453487" cy="504967"/>
+                <wp:effectExtent l="38100" t="0" r="13970" b="66675"/>
+                <wp:wrapNone/>
+                <wp:docPr id="118" name="Conector de Seta Reta 118"/>
+                <wp:cNvGraphicFramePr/>
+                <a:graphic xmlns:a="http://schemas.openxmlformats.org/drawingml/2006/main">
+                  <a:graphicData uri="http://schemas.microsoft.com/office/word/2010/wordprocessingShape">
+                    <wps:wsp>
+                      <wps:cNvCnPr/>
+                      <wps:spPr>
+                        <a:xfrm flipH="1">
+                          <a:off x="0" y="0"/>
+                          <a:ext cx="1453487" cy="504967"/>
+                        </a:xfrm>
+                        <a:prstGeom prst="straightConnector1">
+                          <a:avLst/>
+                        </a:prstGeom>
+                        <a:ln>
+                          <a:tailEnd type="triangle"/>
+                        </a:ln>
+                      </wps:spPr>
+                      <wps:style>
+                        <a:lnRef idx="1">
+                          <a:schemeClr val="accent1"/>
+                        </a:lnRef>
+                        <a:fillRef idx="0">
+                          <a:schemeClr val="accent1"/>
+                        </a:fillRef>
+                        <a:effectRef idx="0">
+                          <a:schemeClr val="accent1"/>
+                        </a:effectRef>
+                        <a:fontRef idx="minor">
+                          <a:schemeClr val="tx1"/>
+                        </a:fontRef>
+                      </wps:style>
+                      <wps:bodyPr/>
+                    </wps:wsp>
+                  </a:graphicData>
+                </a:graphic>
+              </wp:anchor>
+            </w:drawing>
+          </mc:Choice>
+          <mc:Fallback>
+            <w:pict>
+              <v:shape w14:anchorId="4433963E" id="Conector de Seta Reta 118" o:spid="_x0000_s1026" type="#_x0000_t32" style="position:absolute;margin-left:230.55pt;margin-top:14pt;width:114.45pt;height:39.75pt;flip:x;z-index:251684864;visibility:visible;mso-wrap-style:square;mso-wrap-distance-left:9pt;mso-wrap-distance-top:0;mso-wrap-distance-right:9pt;mso-wrap-distance-bottom:0;mso-position-horizontal:absolute;mso-position-horizontal-relative:text;mso-position-vertical:absolute;mso-position-vertical-relative:text" o:gfxdata="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" strokecolor="#4472c4 [3204]" strokeweight=".5pt">
+                <v:stroke endarrow="block" joinstyle="miter"/>
+              </v:shape>
+            </w:pict>
+          </mc:Fallback>
+        </mc:AlternateContent>
+      </w:r>
+      <w:r>
+        <w:t xml:space="preserve">58 – Para unir o </w:t>
+      </w:r>
+      <w:proofErr w:type="spellStart"/>
+      <w:r>
+        <w:t>label</w:t>
+      </w:r>
+      <w:proofErr w:type="spellEnd"/>
+      <w:r>
+        <w:t xml:space="preserve"> com input adicionamos o mesmo nome tanto no for da </w:t>
+      </w:r>
+      <w:proofErr w:type="spellStart"/>
+      <w:r>
+        <w:t>label</w:t>
+      </w:r>
+      <w:proofErr w:type="spellEnd"/>
+      <w:r>
+        <w:t xml:space="preserve"> com no id do input.</w:t>
+      </w:r>
+    </w:p>
+    <w:p>
+      <w:r>
+        <w:drawing>
+          <wp:inline distT="0" distB="0" distL="0" distR="0" wp14:anchorId="0AF45C8B" wp14:editId="5B8EF505">
+            <wp:extent cx="5906324" cy="1657581"/>
+            <wp:effectExtent l="0" t="0" r="0" b="0"/>
+            <wp:docPr id="117" name="Imagem 117"/>
+            <wp:cNvGraphicFramePr>
+              <a:graphicFrameLocks xmlns:a="http://schemas.openxmlformats.org/drawingml/2006/main" noChangeAspect="1"/>
+            </wp:cNvGraphicFramePr>
+            <a:graphic xmlns:a="http://schemas.openxmlformats.org/drawingml/2006/main">
+              <a:graphicData uri="http://schemas.openxmlformats.org/drawingml/2006/picture">
+                <pic:pic xmlns:pic="http://schemas.openxmlformats.org/drawingml/2006/picture">
+                  <pic:nvPicPr>
+                    <pic:cNvPr id="1" name=""/>
+                    <pic:cNvPicPr/>
+                  </pic:nvPicPr>
+                  <pic:blipFill>
+                    <a:blip r:embed="rId102"/>
+                    <a:stretch>
+                      <a:fillRect/>
+                    </a:stretch>
+                  </pic:blipFill>
+                  <pic:spPr>
+                    <a:xfrm>
+                      <a:off x="0" y="0"/>
+                      <a:ext cx="5906324" cy="1657581"/>
+                    </a:xfrm>
+                    <a:prstGeom prst="rect">
+                      <a:avLst/>
+                    </a:prstGeom>
+                  </pic:spPr>
+                </pic:pic>
+              </a:graphicData>
+            </a:graphic>
+          </wp:inline>
+        </w:drawing>
+      </w:r>
+    </w:p>
+    <w:p>
+      <w:r>
+        <w:t xml:space="preserve">59 </w:t>
+      </w:r>
+      <w:r>
+        <w:t>–</w:t>
+      </w:r>
+      <w:r>
+        <w:t xml:space="preserve"> </w:t>
+      </w:r>
+      <w:r>
+        <w:t xml:space="preserve">Para centralizar o conteúdo dentro do </w:t>
+      </w:r>
+      <w:proofErr w:type="spellStart"/>
+      <w:r>
+        <w:t>main</w:t>
+      </w:r>
+      <w:proofErr w:type="spellEnd"/>
+      <w:r>
+        <w:t xml:space="preserve"> demos uma largura e utilizamos o </w:t>
+      </w:r>
+      <w:proofErr w:type="spellStart"/>
+      <w:r>
+        <w:t>margin</w:t>
+      </w:r>
+      <w:proofErr w:type="spellEnd"/>
+      <w:r>
+        <w:t>: 0 auto conforme imagem:</w:t>
+      </w:r>
+    </w:p>
+    <w:p>
+      <w:r>
+        <w:drawing>
+          <wp:inline distT="0" distB="0" distL="0" distR="0" wp14:anchorId="10739C81" wp14:editId="3E47C1D4">
+            <wp:extent cx="2876951" cy="1428949"/>
+            <wp:effectExtent l="0" t="0" r="0" b="0"/>
+            <wp:docPr id="120" name="Imagem 120"/>
+            <wp:cNvGraphicFramePr>
+              <a:graphicFrameLocks xmlns:a="http://schemas.openxmlformats.org/drawingml/2006/main" noChangeAspect="1"/>
+            </wp:cNvGraphicFramePr>
+            <a:graphic xmlns:a="http://schemas.openxmlformats.org/drawingml/2006/main">
+              <a:graphicData uri="http://schemas.openxmlformats.org/drawingml/2006/picture">
+                <pic:pic xmlns:pic="http://schemas.openxmlformats.org/drawingml/2006/picture">
+                  <pic:nvPicPr>
+                    <pic:cNvPr id="1" name=""/>
+                    <pic:cNvPicPr/>
+                  </pic:nvPicPr>
+                  <pic:blipFill>
+                    <a:blip r:embed="rId103"/>
+                    <a:stretch>
+                      <a:fillRect/>
+                    </a:stretch>
+                  </pic:blipFill>
+                  <pic:spPr>
+                    <a:xfrm>
+                      <a:off x="0" y="0"/>
+                      <a:ext cx="2876951" cy="1428949"/>
+                    </a:xfrm>
+                    <a:prstGeom prst="rect">
+                      <a:avLst/>
+                    </a:prstGeom>
+                  </pic:spPr>
+                </pic:pic>
+              </a:graphicData>
+            </a:graphic>
+          </wp:inline>
+        </w:drawing>
+      </w:r>
+    </w:p>
+    <w:p>
+      <w:r>
+        <w:t xml:space="preserve">60 – Observamos que o nosso formulário estava apertado entre o cabeçalho e o rodapé </w:t>
+      </w:r>
+      <w:r>
+        <w:t>inserimos uma altura tanto para cima com para baixo.</w:t>
+      </w:r>
+    </w:p>
+    <w:p>
+      <w:r>
+        <w:drawing>
+          <wp:inline distT="0" distB="0" distL="0" distR="0" wp14:anchorId="7ACC778A" wp14:editId="1112F600">
+            <wp:extent cx="3334215" cy="1143160"/>
+            <wp:effectExtent l="0" t="0" r="0" b="0"/>
+            <wp:docPr id="121" name="Imagem 121"/>
+            <wp:cNvGraphicFramePr>
+              <a:graphicFrameLocks xmlns:a="http://schemas.openxmlformats.org/drawingml/2006/main" noChangeAspect="1"/>
+            </wp:cNvGraphicFramePr>
+            <a:graphic xmlns:a="http://schemas.openxmlformats.org/drawingml/2006/main">
+              <a:graphicData uri="http://schemas.openxmlformats.org/drawingml/2006/picture">
+                <pic:pic xmlns:pic="http://schemas.openxmlformats.org/drawingml/2006/picture">
+                  <pic:nvPicPr>
+                    <pic:cNvPr id="1" name=""/>
+                    <pic:cNvPicPr/>
+                  </pic:nvPicPr>
+                  <pic:blipFill>
+                    <a:blip r:embed="rId104"/>
+                    <a:stretch>
+                      <a:fillRect/>
+                    </a:stretch>
+                  </pic:blipFill>
+                  <pic:spPr>
+                    <a:xfrm>
+                      <a:off x="0" y="0"/>
+                      <a:ext cx="3334215" cy="1143160"/>
+                    </a:xfrm>
+                    <a:prstGeom prst="rect">
+                      <a:avLst/>
+                    </a:prstGeom>
+                  </pic:spPr>
+                </pic:pic>
+              </a:graphicData>
+            </a:graphic>
+          </wp:inline>
+        </w:drawing>
+      </w:r>
+      <w:r>
+        <w:drawing>
+          <wp:inline distT="0" distB="0" distL="0" distR="0" wp14:anchorId="7E4B73AB" wp14:editId="50E6DAD1">
+            <wp:extent cx="3445635" cy="1565201"/>
+            <wp:effectExtent l="0" t="0" r="2540" b="0"/>
+            <wp:docPr id="122" name="Imagem 122"/>
+            <wp:cNvGraphicFramePr>
+              <a:graphicFrameLocks xmlns:a="http://schemas.openxmlformats.org/drawingml/2006/main" noChangeAspect="1"/>
+            </wp:cNvGraphicFramePr>
+            <a:graphic xmlns:a="http://schemas.openxmlformats.org/drawingml/2006/main">
+              <a:graphicData uri="http://schemas.openxmlformats.org/drawingml/2006/picture">
+                <pic:pic xmlns:pic="http://schemas.openxmlformats.org/drawingml/2006/picture">
+                  <pic:nvPicPr>
+                    <pic:cNvPr id="1" name=""/>
+                    <pic:cNvPicPr/>
+                  </pic:nvPicPr>
+                  <pic:blipFill>
+                    <a:blip r:embed="rId105"/>
+                    <a:stretch>
+                      <a:fillRect/>
+                    </a:stretch>
+                  </pic:blipFill>
+                  <pic:spPr>
+                    <a:xfrm>
+                      <a:off x="0" y="0"/>
+                      <a:ext cx="3551444" cy="1613265"/>
+                    </a:xfrm>
+                    <a:prstGeom prst="rect">
+                      <a:avLst/>
+                    </a:prstGeom>
+                  </pic:spPr>
+                </pic:pic>
+              </a:graphicData>
+            </a:graphic>
+          </wp:inline>
+        </w:drawing>
+      </w:r>
+    </w:p>
+    <w:p/>
+    <w:p>
+      <w:r>
+        <w:t xml:space="preserve"> </w:t>
+      </w:r>
+    </w:p>
+    <w:p>
+      <w:r>
+        <w:t xml:space="preserve">61 </w:t>
+      </w:r>
+      <w:r>
+        <w:t>–</w:t>
+      </w:r>
+      <w:r>
+        <w:t xml:space="preserve"> </w:t>
+      </w:r>
+      <w:r>
+        <w:t xml:space="preserve">Podemos avaliar que o nosso formulário tem um tipo de comportamento mesmo colocando um elemento em baixo do outro no </w:t>
+      </w:r>
+      <w:proofErr w:type="spellStart"/>
+      <w:r>
+        <w:t>html</w:t>
+      </w:r>
+      <w:proofErr w:type="spellEnd"/>
+      <w:r>
+        <w:t xml:space="preserve"> </w:t>
+      </w:r>
+      <w:r>
+        <w:t xml:space="preserve">ao </w:t>
+      </w:r>
+      <w:proofErr w:type="spellStart"/>
+      <w:r>
+        <w:t>renderizar</w:t>
+      </w:r>
+      <w:proofErr w:type="spellEnd"/>
+      <w:r>
+        <w:t xml:space="preserve"> a página os elementos (</w:t>
+      </w:r>
+      <w:proofErr w:type="spellStart"/>
+      <w:r>
+        <w:t>label</w:t>
+      </w:r>
+      <w:proofErr w:type="spellEnd"/>
+      <w:r>
+        <w:t xml:space="preserve"> e input)ficam um ao lado do outro</w:t>
+      </w:r>
+      <w:r>
+        <w:t xml:space="preserve">. Para mudar essa situação mudamos a natureza do </w:t>
+      </w:r>
+      <w:proofErr w:type="spellStart"/>
+      <w:r>
+        <w:t>label</w:t>
+      </w:r>
+      <w:proofErr w:type="spellEnd"/>
+      <w:r>
+        <w:t xml:space="preserve"> e input conforme código abaixo.</w:t>
+      </w:r>
+    </w:p>
+    <w:p>
+      <w:r>
+        <w:drawing>
+          <wp:inline distT="0" distB="0" distL="0" distR="0" wp14:anchorId="0B59CD61" wp14:editId="0F28AC20">
+            <wp:extent cx="2924583" cy="2124371"/>
+            <wp:effectExtent l="0" t="0" r="9525" b="9525"/>
+            <wp:docPr id="123" name="Imagem 123"/>
+            <wp:cNvGraphicFramePr>
+              <a:graphicFrameLocks xmlns:a="http://schemas.openxmlformats.org/drawingml/2006/main" noChangeAspect="1"/>
+            </wp:cNvGraphicFramePr>
+            <a:graphic xmlns:a="http://schemas.openxmlformats.org/drawingml/2006/main">
+              <a:graphicData uri="http://schemas.openxmlformats.org/drawingml/2006/picture">
+                <pic:pic xmlns:pic="http://schemas.openxmlformats.org/drawingml/2006/picture">
+                  <pic:nvPicPr>
+                    <pic:cNvPr id="1" name=""/>
+                    <pic:cNvPicPr/>
+                  </pic:nvPicPr>
+                  <pic:blipFill>
+                    <a:blip r:embed="rId106"/>
+                    <a:stretch>
+                      <a:fillRect/>
+                    </a:stretch>
+                  </pic:blipFill>
+                  <pic:spPr>
+                    <a:xfrm>
+                      <a:off x="0" y="0"/>
+                      <a:ext cx="2924583" cy="2124371"/>
+                    </a:xfrm>
+                    <a:prstGeom prst="rect">
+                      <a:avLst/>
+                    </a:prstGeom>
+                  </pic:spPr>
+                </pic:pic>
+              </a:graphicData>
+            </a:graphic>
+          </wp:inline>
+        </w:drawing>
+      </w:r>
+      <w:r>
+        <w:drawing>
+          <wp:inline distT="0" distB="0" distL="0" distR="0" wp14:anchorId="1543D0C1" wp14:editId="65AC41B8">
+            <wp:extent cx="3112253" cy="1412941"/>
+            <wp:effectExtent l="0" t="0" r="0" b="0"/>
+            <wp:docPr id="124" name="Imagem 124"/>
+            <wp:cNvGraphicFramePr>
+              <a:graphicFrameLocks xmlns:a="http://schemas.openxmlformats.org/drawingml/2006/main" noChangeAspect="1"/>
+            </wp:cNvGraphicFramePr>
+            <a:graphic xmlns:a="http://schemas.openxmlformats.org/drawingml/2006/main">
+              <a:graphicData uri="http://schemas.openxmlformats.org/drawingml/2006/picture">
+                <pic:pic xmlns:pic="http://schemas.openxmlformats.org/drawingml/2006/picture">
+                  <pic:nvPicPr>
+                    <pic:cNvPr id="1" name=""/>
+                    <pic:cNvPicPr/>
+                  </pic:nvPicPr>
+                  <pic:blipFill>
+                    <a:blip r:embed="rId107"/>
+                    <a:stretch>
+                      <a:fillRect/>
+                    </a:stretch>
+                  </pic:blipFill>
+                  <pic:spPr>
+                    <a:xfrm>
+                      <a:off x="0" y="0"/>
+                      <a:ext cx="3150313" cy="1430220"/>
+                    </a:xfrm>
+                    <a:prstGeom prst="rect">
+                      <a:avLst/>
+                    </a:prstGeom>
+                  </pic:spPr>
+                </pic:pic>
+              </a:graphicData>
+            </a:graphic>
+          </wp:inline>
+        </w:drawing>
+      </w:r>
       <w:bookmarkStart w:id="0" w:name="_GoBack"/>
       <w:bookmarkEnd w:id="0"/>
     </w:p>
     <w:p/>
-    <w:p>
-      <w:r>
-        <w:t xml:space="preserve"> </w:t>
-      </w:r>
-    </w:p>
     <w:p/>
     <w:sectPr>
       <w:pgSz w:w="11906" w:h="16838"/>
@@ -8608,7 +9176,7 @@
 </file>
 
 <file path=customXml/itemProps4.xml><?xml version="1.0" encoding="utf-8"?>
-<ds:datastoreItem xmlns:ds="http://schemas.openxmlformats.org/officeDocument/2006/customXml" ds:itemID="{3A0F5C4C-A51E-451E-B35F-7E2D8141D8D5}">
+<ds:datastoreItem xmlns:ds="http://schemas.openxmlformats.org/officeDocument/2006/customXml" ds:itemID="{3DE1BCDE-E2C5-4816-B9BA-762E800564D3}">
   <ds:schemaRefs>
     <ds:schemaRef ds:uri="http://schemas.openxmlformats.org/officeDocument/2006/bibliography"/>
   </ds:schemaRefs>

</xml_diff>

<commit_message>
atualização da aula dia 17/09/2026
</commit_message>
<xml_diff>
--- a/apostila/Projeto Space for me3.docx
+++ b/apostila/Projeto Space for me3.docx
@@ -7233,6 +7233,9 @@
     </w:p>
     <w:p>
       <w:r>
+        <w:rPr>
+          <w:noProof/>
+        </w:rPr>
         <w:drawing>
           <wp:inline distT="0" distB="0" distL="0" distR="0" wp14:anchorId="2870196B" wp14:editId="204C3C51">
             <wp:extent cx="4987402" cy="2242043"/>
@@ -7430,6 +7433,9 @@
     </w:p>
     <w:p>
       <w:r>
+        <w:rPr>
+          <w:noProof/>
+        </w:rPr>
         <w:drawing>
           <wp:inline distT="0" distB="0" distL="0" distR="0" wp14:anchorId="0AF45C8B" wp14:editId="5B8EF505">
             <wp:extent cx="5906324" cy="1657581"/>
@@ -7499,6 +7505,9 @@
     </w:p>
     <w:p>
       <w:r>
+        <w:rPr>
+          <w:noProof/>
+        </w:rPr>
         <w:drawing>
           <wp:inline distT="0" distB="0" distL="0" distR="0" wp14:anchorId="10739C81" wp14:editId="3E47C1D4">
             <wp:extent cx="2876951" cy="1428949"/>
@@ -7546,6 +7555,9 @@
     </w:p>
     <w:p>
       <w:r>
+        <w:rPr>
+          <w:noProof/>
+        </w:rPr>
         <w:drawing>
           <wp:inline distT="0" distB="0" distL="0" distR="0" wp14:anchorId="7ACC778A" wp14:editId="1112F600">
             <wp:extent cx="3334215" cy="1143160"/>
@@ -7583,6 +7595,9 @@
         </w:drawing>
       </w:r>
       <w:r>
+        <w:rPr>
+          <w:noProof/>
+        </w:rPr>
         <w:drawing>
           <wp:inline distT="0" distB="0" distL="0" distR="0" wp14:anchorId="7E4B73AB" wp14:editId="50E6DAD1">
             <wp:extent cx="3445635" cy="1565201"/>
@@ -7680,6 +7695,9 @@
     </w:p>
     <w:p>
       <w:r>
+        <w:rPr>
+          <w:noProof/>
+        </w:rPr>
         <w:drawing>
           <wp:inline distT="0" distB="0" distL="0" distR="0" wp14:anchorId="0B59CD61" wp14:editId="0F28AC20">
             <wp:extent cx="2924583" cy="2124371"/>
@@ -7717,6 +7735,9 @@
         </w:drawing>
       </w:r>
       <w:r>
+        <w:rPr>
+          <w:noProof/>
+        </w:rPr>
         <w:drawing>
           <wp:inline distT="0" distB="0" distL="0" distR="0" wp14:anchorId="1543D0C1" wp14:editId="65AC41B8">
             <wp:extent cx="3112253" cy="1412941"/>
@@ -7753,10 +7774,1868 @@
           </wp:inline>
         </w:drawing>
       </w:r>
+    </w:p>
+    <w:p/>
+    <w:p>
+      <w:r>
+        <w:t xml:space="preserve">62 </w:t>
+      </w:r>
+      <w:r>
+        <w:t>–</w:t>
+      </w:r>
+      <w:r>
+        <w:t xml:space="preserve"> </w:t>
+      </w:r>
+      <w:r>
+        <w:t xml:space="preserve">Demos um espaço para lado de baixo da </w:t>
+      </w:r>
+      <w:proofErr w:type="spellStart"/>
+      <w:r>
+        <w:t>label</w:t>
+      </w:r>
+      <w:proofErr w:type="spellEnd"/>
+      <w:r>
+        <w:t xml:space="preserve"> de margin:20px </w:t>
+      </w:r>
+      <w:r>
+        <w:t xml:space="preserve"> e aumentamos o tamanho da fonte, o input também acrescentamos um espaço do lado de baixo </w:t>
+      </w:r>
+      <w:r>
+        <w:t>e aumentos o espaço interno tanto na parte cima, baixo, direita e esquerda.</w:t>
+      </w:r>
+    </w:p>
+    <w:p/>
+    <w:p>
+      <w:r>
+        <w:rPr>
+          <w:noProof/>
+        </w:rPr>
+        <mc:AlternateContent>
+          <mc:Choice Requires="wps">
+            <w:drawing>
+              <wp:anchor distT="0" distB="0" distL="114300" distR="114300" simplePos="0" relativeHeight="251689984" behindDoc="0" locked="0" layoutInCell="1" allowOverlap="1" wp14:anchorId="79DDDDCB" wp14:editId="3CE2EFBF">
+                <wp:simplePos x="0" y="0"/>
+                <wp:positionH relativeFrom="column">
+                  <wp:posOffset>2967990</wp:posOffset>
+                </wp:positionH>
+                <wp:positionV relativeFrom="paragraph">
+                  <wp:posOffset>2780665</wp:posOffset>
+                </wp:positionV>
+                <wp:extent cx="647700" cy="40640"/>
+                <wp:effectExtent l="38100" t="38100" r="19050" b="92710"/>
+                <wp:wrapNone/>
+                <wp:docPr id="129" name="Conector de Seta Reta 129"/>
+                <wp:cNvGraphicFramePr/>
+                <a:graphic xmlns:a="http://schemas.openxmlformats.org/drawingml/2006/main">
+                  <a:graphicData uri="http://schemas.microsoft.com/office/word/2010/wordprocessingShape">
+                    <wps:wsp>
+                      <wps:cNvCnPr/>
+                      <wps:spPr>
+                        <a:xfrm flipH="1">
+                          <a:off x="0" y="0"/>
+                          <a:ext cx="647700" cy="40640"/>
+                        </a:xfrm>
+                        <a:prstGeom prst="straightConnector1">
+                          <a:avLst/>
+                        </a:prstGeom>
+                        <a:ln>
+                          <a:tailEnd type="triangle"/>
+                        </a:ln>
+                      </wps:spPr>
+                      <wps:style>
+                        <a:lnRef idx="1">
+                          <a:schemeClr val="accent1"/>
+                        </a:lnRef>
+                        <a:fillRef idx="0">
+                          <a:schemeClr val="accent1"/>
+                        </a:fillRef>
+                        <a:effectRef idx="0">
+                          <a:schemeClr val="accent1"/>
+                        </a:effectRef>
+                        <a:fontRef idx="minor">
+                          <a:schemeClr val="tx1"/>
+                        </a:fontRef>
+                      </wps:style>
+                      <wps:bodyPr/>
+                    </wps:wsp>
+                  </a:graphicData>
+                </a:graphic>
+              </wp:anchor>
+            </w:drawing>
+          </mc:Choice>
+          <mc:Fallback>
+            <w:pict>
+              <v:shapetype w14:anchorId="60C91561" id="_x0000_t32" coordsize="21600,21600" o:spt="32" o:oned="t" path="m,l21600,21600e" filled="f">
+                <v:path arrowok="t" fillok="f" o:connecttype="none"/>
+                <o:lock v:ext="edit" shapetype="t"/>
+              </v:shapetype>
+              <v:shape id="Conector de Seta Reta 129" o:spid="_x0000_s1026" type="#_x0000_t32" style="position:absolute;margin-left:233.7pt;margin-top:218.95pt;width:51pt;height:3.2pt;flip:x;z-index:251689984;visibility:visible;mso-wrap-style:square;mso-wrap-distance-left:9pt;mso-wrap-distance-top:0;mso-wrap-distance-right:9pt;mso-wrap-distance-bottom:0;mso-position-horizontal:absolute;mso-position-horizontal-relative:text;mso-position-vertical:absolute;mso-position-vertical-relative:text" o:gfxdata="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" strokecolor="#4472c4 [3204]" strokeweight=".5pt">
+                <v:stroke endarrow="block" joinstyle="miter"/>
+              </v:shape>
+            </w:pict>
+          </mc:Fallback>
+        </mc:AlternateContent>
+      </w:r>
+      <w:r>
+        <w:rPr>
+          <w:noProof/>
+        </w:rPr>
+        <mc:AlternateContent>
+          <mc:Choice Requires="wps">
+            <w:drawing>
+              <wp:anchor distT="0" distB="0" distL="114300" distR="114300" simplePos="0" relativeHeight="251688960" behindDoc="0" locked="0" layoutInCell="1" allowOverlap="1" wp14:anchorId="38FFDDFB" wp14:editId="5B45527A">
+                <wp:simplePos x="0" y="0"/>
+                <wp:positionH relativeFrom="column">
+                  <wp:posOffset>2830830</wp:posOffset>
+                </wp:positionH>
+                <wp:positionV relativeFrom="paragraph">
+                  <wp:posOffset>2303780</wp:posOffset>
+                </wp:positionV>
+                <wp:extent cx="791210" cy="115570"/>
+                <wp:effectExtent l="38100" t="0" r="27940" b="74930"/>
+                <wp:wrapNone/>
+                <wp:docPr id="128" name="Conector de Seta Reta 128"/>
+                <wp:cNvGraphicFramePr/>
+                <a:graphic xmlns:a="http://schemas.openxmlformats.org/drawingml/2006/main">
+                  <a:graphicData uri="http://schemas.microsoft.com/office/word/2010/wordprocessingShape">
+                    <wps:wsp>
+                      <wps:cNvCnPr/>
+                      <wps:spPr>
+                        <a:xfrm flipH="1">
+                          <a:off x="0" y="0"/>
+                          <a:ext cx="791210" cy="115570"/>
+                        </a:xfrm>
+                        <a:prstGeom prst="straightConnector1">
+                          <a:avLst/>
+                        </a:prstGeom>
+                        <a:ln>
+                          <a:tailEnd type="triangle"/>
+                        </a:ln>
+                      </wps:spPr>
+                      <wps:style>
+                        <a:lnRef idx="1">
+                          <a:schemeClr val="accent1"/>
+                        </a:lnRef>
+                        <a:fillRef idx="0">
+                          <a:schemeClr val="accent1"/>
+                        </a:fillRef>
+                        <a:effectRef idx="0">
+                          <a:schemeClr val="accent1"/>
+                        </a:effectRef>
+                        <a:fontRef idx="minor">
+                          <a:schemeClr val="tx1"/>
+                        </a:fontRef>
+                      </wps:style>
+                      <wps:bodyPr/>
+                    </wps:wsp>
+                  </a:graphicData>
+                </a:graphic>
+              </wp:anchor>
+            </w:drawing>
+          </mc:Choice>
+          <mc:Fallback>
+            <w:pict>
+              <v:shape w14:anchorId="3B5AE50D" id="Conector de Seta Reta 128" o:spid="_x0000_s1026" type="#_x0000_t32" style="position:absolute;margin-left:222.9pt;margin-top:181.4pt;width:62.3pt;height:9.1pt;flip:x;z-index:251688960;visibility:visible;mso-wrap-style:square;mso-wrap-distance-left:9pt;mso-wrap-distance-top:0;mso-wrap-distance-right:9pt;mso-wrap-distance-bottom:0;mso-position-horizontal:absolute;mso-position-horizontal-relative:text;mso-position-vertical:absolute;mso-position-vertical-relative:text" o:gfxdata="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" strokecolor="#4472c4 [3204]" strokeweight=".5pt">
+                <v:stroke endarrow="block" joinstyle="miter"/>
+              </v:shape>
+            </w:pict>
+          </mc:Fallback>
+        </mc:AlternateContent>
+      </w:r>
+      <w:r>
+        <w:rPr>
+          <w:noProof/>
+        </w:rPr>
+        <mc:AlternateContent>
+          <mc:Choice Requires="wps">
+            <w:drawing>
+              <wp:anchor distT="0" distB="0" distL="114300" distR="114300" simplePos="0" relativeHeight="251686912" behindDoc="0" locked="0" layoutInCell="1" allowOverlap="1" wp14:anchorId="6B642A30" wp14:editId="41FBC5FD">
+                <wp:simplePos x="0" y="0"/>
+                <wp:positionH relativeFrom="column">
+                  <wp:posOffset>2701290</wp:posOffset>
+                </wp:positionH>
+                <wp:positionV relativeFrom="paragraph">
+                  <wp:posOffset>426720</wp:posOffset>
+                </wp:positionV>
+                <wp:extent cx="920750" cy="429895"/>
+                <wp:effectExtent l="38100" t="0" r="31750" b="65405"/>
+                <wp:wrapNone/>
+                <wp:docPr id="126" name="Conector de Seta Reta 126"/>
+                <wp:cNvGraphicFramePr/>
+                <a:graphic xmlns:a="http://schemas.openxmlformats.org/drawingml/2006/main">
+                  <a:graphicData uri="http://schemas.microsoft.com/office/word/2010/wordprocessingShape">
+                    <wps:wsp>
+                      <wps:cNvCnPr/>
+                      <wps:spPr>
+                        <a:xfrm flipH="1">
+                          <a:off x="0" y="0"/>
+                          <a:ext cx="920750" cy="429895"/>
+                        </a:xfrm>
+                        <a:prstGeom prst="straightConnector1">
+                          <a:avLst/>
+                        </a:prstGeom>
+                        <a:ln>
+                          <a:tailEnd type="triangle"/>
+                        </a:ln>
+                      </wps:spPr>
+                      <wps:style>
+                        <a:lnRef idx="1">
+                          <a:schemeClr val="accent1"/>
+                        </a:lnRef>
+                        <a:fillRef idx="0">
+                          <a:schemeClr val="accent1"/>
+                        </a:fillRef>
+                        <a:effectRef idx="0">
+                          <a:schemeClr val="accent1"/>
+                        </a:effectRef>
+                        <a:fontRef idx="minor">
+                          <a:schemeClr val="tx1"/>
+                        </a:fontRef>
+                      </wps:style>
+                      <wps:bodyPr/>
+                    </wps:wsp>
+                  </a:graphicData>
+                </a:graphic>
+              </wp:anchor>
+            </w:drawing>
+          </mc:Choice>
+          <mc:Fallback>
+            <w:pict>
+              <v:shape w14:anchorId="373C5BE2" id="Conector de Seta Reta 126" o:spid="_x0000_s1026" type="#_x0000_t32" style="position:absolute;margin-left:212.7pt;margin-top:33.6pt;width:72.5pt;height:33.85pt;flip:x;z-index:251686912;visibility:visible;mso-wrap-style:square;mso-wrap-distance-left:9pt;mso-wrap-distance-top:0;mso-wrap-distance-right:9pt;mso-wrap-distance-bottom:0;mso-position-horizontal:absolute;mso-position-horizontal-relative:text;mso-position-vertical:absolute;mso-position-vertical-relative:text" o:gfxdata="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" strokecolor="#4472c4 [3204]" strokeweight=".5pt">
+                <v:stroke endarrow="block" joinstyle="miter"/>
+              </v:shape>
+            </w:pict>
+          </mc:Fallback>
+        </mc:AlternateContent>
+      </w:r>
+      <w:r>
+        <w:rPr>
+          <w:noProof/>
+        </w:rPr>
+        <mc:AlternateContent>
+          <mc:Choice Requires="wps">
+            <w:drawing>
+              <wp:anchor distT="0" distB="0" distL="114300" distR="114300" simplePos="0" relativeHeight="251687936" behindDoc="0" locked="0" layoutInCell="1" allowOverlap="1" wp14:anchorId="6046F036" wp14:editId="2DD074DE">
+                <wp:simplePos x="0" y="0"/>
+                <wp:positionH relativeFrom="column">
+                  <wp:posOffset>2709327</wp:posOffset>
+                </wp:positionH>
+                <wp:positionV relativeFrom="paragraph">
+                  <wp:posOffset>905406</wp:posOffset>
+                </wp:positionV>
+                <wp:extent cx="934872" cy="190983"/>
+                <wp:effectExtent l="38100" t="0" r="17780" b="76200"/>
+                <wp:wrapNone/>
+                <wp:docPr id="127" name="Conector de Seta Reta 127"/>
+                <wp:cNvGraphicFramePr/>
+                <a:graphic xmlns:a="http://schemas.openxmlformats.org/drawingml/2006/main">
+                  <a:graphicData uri="http://schemas.microsoft.com/office/word/2010/wordprocessingShape">
+                    <wps:wsp>
+                      <wps:cNvCnPr/>
+                      <wps:spPr>
+                        <a:xfrm flipH="1">
+                          <a:off x="0" y="0"/>
+                          <a:ext cx="934872" cy="190983"/>
+                        </a:xfrm>
+                        <a:prstGeom prst="straightConnector1">
+                          <a:avLst/>
+                        </a:prstGeom>
+                        <a:ln>
+                          <a:tailEnd type="triangle"/>
+                        </a:ln>
+                      </wps:spPr>
+                      <wps:style>
+                        <a:lnRef idx="1">
+                          <a:schemeClr val="accent1"/>
+                        </a:lnRef>
+                        <a:fillRef idx="0">
+                          <a:schemeClr val="accent1"/>
+                        </a:fillRef>
+                        <a:effectRef idx="0">
+                          <a:schemeClr val="accent1"/>
+                        </a:effectRef>
+                        <a:fontRef idx="minor">
+                          <a:schemeClr val="tx1"/>
+                        </a:fontRef>
+                      </wps:style>
+                      <wps:bodyPr/>
+                    </wps:wsp>
+                  </a:graphicData>
+                </a:graphic>
+                <wp14:sizeRelH relativeFrom="margin">
+                  <wp14:pctWidth>0</wp14:pctWidth>
+                </wp14:sizeRelH>
+                <wp14:sizeRelV relativeFrom="margin">
+                  <wp14:pctHeight>0</wp14:pctHeight>
+                </wp14:sizeRelV>
+              </wp:anchor>
+            </w:drawing>
+          </mc:Choice>
+          <mc:Fallback>
+            <w:pict>
+              <v:shape w14:anchorId="6280E892" id="Conector de Seta Reta 127" o:spid="_x0000_s1026" type="#_x0000_t32" style="position:absolute;margin-left:213.35pt;margin-top:71.3pt;width:73.6pt;height:15.05pt;flip:x;z-index:251687936;visibility:visible;mso-wrap-style:square;mso-width-percent:0;mso-height-percent:0;mso-wrap-distance-left:9pt;mso-wrap-distance-top:0;mso-wrap-distance-right:9pt;mso-wrap-distance-bottom:0;mso-position-horizontal:absolute;mso-position-horizontal-relative:text;mso-position-vertical:absolute;mso-position-vertical-relative:text;mso-width-percent:0;mso-height-percent:0;mso-width-relative:margin;mso-height-relative:margin" o:gfxdata="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" strokecolor="#4472c4 [3204]" strokeweight=".5pt">
+                <v:stroke endarrow="block" joinstyle="miter"/>
+              </v:shape>
+            </w:pict>
+          </mc:Fallback>
+        </mc:AlternateContent>
+      </w:r>
+      <w:r>
+        <w:drawing>
+          <wp:inline distT="0" distB="0" distL="0" distR="0" wp14:anchorId="46B50213" wp14:editId="6FA2E30F">
+            <wp:extent cx="3758871" cy="3369718"/>
+            <wp:effectExtent l="0" t="0" r="0" b="2540"/>
+            <wp:docPr id="125" name="Imagem 125"/>
+            <wp:cNvGraphicFramePr>
+              <a:graphicFrameLocks xmlns:a="http://schemas.openxmlformats.org/drawingml/2006/main" noChangeAspect="1"/>
+            </wp:cNvGraphicFramePr>
+            <a:graphic xmlns:a="http://schemas.openxmlformats.org/drawingml/2006/main">
+              <a:graphicData uri="http://schemas.openxmlformats.org/drawingml/2006/picture">
+                <pic:pic xmlns:pic="http://schemas.openxmlformats.org/drawingml/2006/picture">
+                  <pic:nvPicPr>
+                    <pic:cNvPr id="1" name=""/>
+                    <pic:cNvPicPr/>
+                  </pic:nvPicPr>
+                  <pic:blipFill>
+                    <a:blip r:embed="rId108"/>
+                    <a:stretch>
+                      <a:fillRect/>
+                    </a:stretch>
+                  </pic:blipFill>
+                  <pic:spPr>
+                    <a:xfrm>
+                      <a:off x="0" y="0"/>
+                      <a:ext cx="3767817" cy="3377738"/>
+                    </a:xfrm>
+                    <a:prstGeom prst="rect">
+                      <a:avLst/>
+                    </a:prstGeom>
+                  </pic:spPr>
+                </pic:pic>
+              </a:graphicData>
+            </a:graphic>
+          </wp:inline>
+        </w:drawing>
+      </w:r>
+      <w:r>
+        <w:drawing>
+          <wp:inline distT="0" distB="0" distL="0" distR="0" wp14:anchorId="581BEB6B" wp14:editId="092ED908">
+            <wp:extent cx="2437580" cy="3332878"/>
+            <wp:effectExtent l="0" t="0" r="1270" b="1270"/>
+            <wp:docPr id="130" name="Imagem 130"/>
+            <wp:cNvGraphicFramePr>
+              <a:graphicFrameLocks xmlns:a="http://schemas.openxmlformats.org/drawingml/2006/main" noChangeAspect="1"/>
+            </wp:cNvGraphicFramePr>
+            <a:graphic xmlns:a="http://schemas.openxmlformats.org/drawingml/2006/main">
+              <a:graphicData uri="http://schemas.openxmlformats.org/drawingml/2006/picture">
+                <pic:pic xmlns:pic="http://schemas.openxmlformats.org/drawingml/2006/picture">
+                  <pic:nvPicPr>
+                    <pic:cNvPr id="1" name=""/>
+                    <pic:cNvPicPr/>
+                  </pic:nvPicPr>
+                  <pic:blipFill>
+                    <a:blip r:embed="rId109"/>
+                    <a:stretch>
+                      <a:fillRect/>
+                    </a:stretch>
+                  </pic:blipFill>
+                  <pic:spPr>
+                    <a:xfrm>
+                      <a:off x="0" y="0"/>
+                      <a:ext cx="2489629" cy="3404044"/>
+                    </a:xfrm>
+                    <a:prstGeom prst="rect">
+                      <a:avLst/>
+                    </a:prstGeom>
+                  </pic:spPr>
+                </pic:pic>
+              </a:graphicData>
+            </a:graphic>
+          </wp:inline>
+        </w:drawing>
+      </w:r>
+    </w:p>
+    <w:p/>
+    <w:p>
+      <w:r>
+        <w:t xml:space="preserve">63 -  </w:t>
+      </w:r>
+      <w:r>
+        <w:t>Incluímos uma porcentagem de 50% para cada inputs do nosso formulário</w:t>
+      </w:r>
+    </w:p>
+    <w:p>
+      <w:r>
+        <w:rPr>
+          <w:noProof/>
+        </w:rPr>
+        <mc:AlternateContent>
+          <mc:Choice Requires="wps">
+            <w:drawing>
+              <wp:anchor distT="0" distB="0" distL="114300" distR="114300" simplePos="0" relativeHeight="251691008" behindDoc="0" locked="0" layoutInCell="1" allowOverlap="1" wp14:anchorId="7DF0555C" wp14:editId="77D1E0BC">
+                <wp:simplePos x="0" y="0"/>
+                <wp:positionH relativeFrom="column">
+                  <wp:posOffset>2327190</wp:posOffset>
+                </wp:positionH>
+                <wp:positionV relativeFrom="paragraph">
+                  <wp:posOffset>1614151</wp:posOffset>
+                </wp:positionV>
+                <wp:extent cx="1433015" cy="395785"/>
+                <wp:effectExtent l="38100" t="57150" r="15240" b="23495"/>
+                <wp:wrapNone/>
+                <wp:docPr id="132" name="Conector de Seta Reta 132"/>
+                <wp:cNvGraphicFramePr/>
+                <a:graphic xmlns:a="http://schemas.openxmlformats.org/drawingml/2006/main">
+                  <a:graphicData uri="http://schemas.microsoft.com/office/word/2010/wordprocessingShape">
+                    <wps:wsp>
+                      <wps:cNvCnPr/>
+                      <wps:spPr>
+                        <a:xfrm flipH="1" flipV="1">
+                          <a:off x="0" y="0"/>
+                          <a:ext cx="1433015" cy="395785"/>
+                        </a:xfrm>
+                        <a:prstGeom prst="straightConnector1">
+                          <a:avLst/>
+                        </a:prstGeom>
+                        <a:ln>
+                          <a:tailEnd type="triangle"/>
+                        </a:ln>
+                      </wps:spPr>
+                      <wps:style>
+                        <a:lnRef idx="1">
+                          <a:schemeClr val="accent1"/>
+                        </a:lnRef>
+                        <a:fillRef idx="0">
+                          <a:schemeClr val="accent1"/>
+                        </a:fillRef>
+                        <a:effectRef idx="0">
+                          <a:schemeClr val="accent1"/>
+                        </a:effectRef>
+                        <a:fontRef idx="minor">
+                          <a:schemeClr val="tx1"/>
+                        </a:fontRef>
+                      </wps:style>
+                      <wps:bodyPr/>
+                    </wps:wsp>
+                  </a:graphicData>
+                </a:graphic>
+              </wp:anchor>
+            </w:drawing>
+          </mc:Choice>
+          <mc:Fallback>
+            <w:pict>
+              <v:shape w14:anchorId="2B3D534A" id="Conector de Seta Reta 132" o:spid="_x0000_s1026" type="#_x0000_t32" style="position:absolute;margin-left:183.25pt;margin-top:127.1pt;width:112.85pt;height:31.15pt;flip:x y;z-index:251691008;visibility:visible;mso-wrap-style:square;mso-wrap-distance-left:9pt;mso-wrap-distance-top:0;mso-wrap-distance-right:9pt;mso-wrap-distance-bottom:0;mso-position-horizontal:absolute;mso-position-horizontal-relative:text;mso-position-vertical:absolute;mso-position-vertical-relative:text" o:gfxdata="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" strokecolor="#4472c4 [3204]" strokeweight=".5pt">
+                <v:stroke endarrow="block" joinstyle="miter"/>
+              </v:shape>
+            </w:pict>
+          </mc:Fallback>
+        </mc:AlternateContent>
+      </w:r>
+      <w:r>
+        <w:drawing>
+          <wp:inline distT="0" distB="0" distL="0" distR="0" wp14:anchorId="1E33FB31" wp14:editId="4B3839AD">
+            <wp:extent cx="3867690" cy="2534004"/>
+            <wp:effectExtent l="0" t="0" r="0" b="0"/>
+            <wp:docPr id="131" name="Imagem 131"/>
+            <wp:cNvGraphicFramePr>
+              <a:graphicFrameLocks xmlns:a="http://schemas.openxmlformats.org/drawingml/2006/main" noChangeAspect="1"/>
+            </wp:cNvGraphicFramePr>
+            <a:graphic xmlns:a="http://schemas.openxmlformats.org/drawingml/2006/main">
+              <a:graphicData uri="http://schemas.openxmlformats.org/drawingml/2006/picture">
+                <pic:pic xmlns:pic="http://schemas.openxmlformats.org/drawingml/2006/picture">
+                  <pic:nvPicPr>
+                    <pic:cNvPr id="1" name=""/>
+                    <pic:cNvPicPr/>
+                  </pic:nvPicPr>
+                  <pic:blipFill>
+                    <a:blip r:embed="rId110"/>
+                    <a:stretch>
+                      <a:fillRect/>
+                    </a:stretch>
+                  </pic:blipFill>
+                  <pic:spPr>
+                    <a:xfrm>
+                      <a:off x="0" y="0"/>
+                      <a:ext cx="3867690" cy="2534004"/>
+                    </a:xfrm>
+                    <a:prstGeom prst="rect">
+                      <a:avLst/>
+                    </a:prstGeom>
+                  </pic:spPr>
+                </pic:pic>
+              </a:graphicData>
+            </a:graphic>
+          </wp:inline>
+        </w:drawing>
+      </w:r>
+      <w:r>
+        <w:drawing>
+          <wp:inline distT="0" distB="0" distL="0" distR="0" wp14:anchorId="3F04415B" wp14:editId="09360D52">
+            <wp:extent cx="3829753" cy="2279615"/>
+            <wp:effectExtent l="0" t="0" r="0" b="6985"/>
+            <wp:docPr id="133" name="Imagem 133"/>
+            <wp:cNvGraphicFramePr>
+              <a:graphicFrameLocks xmlns:a="http://schemas.openxmlformats.org/drawingml/2006/main" noChangeAspect="1"/>
+            </wp:cNvGraphicFramePr>
+            <a:graphic xmlns:a="http://schemas.openxmlformats.org/drawingml/2006/main">
+              <a:graphicData uri="http://schemas.openxmlformats.org/drawingml/2006/picture">
+                <pic:pic xmlns:pic="http://schemas.openxmlformats.org/drawingml/2006/picture">
+                  <pic:nvPicPr>
+                    <pic:cNvPr id="1" name=""/>
+                    <pic:cNvPicPr/>
+                  </pic:nvPicPr>
+                  <pic:blipFill>
+                    <a:blip r:embed="rId111"/>
+                    <a:stretch>
+                      <a:fillRect/>
+                    </a:stretch>
+                  </pic:blipFill>
+                  <pic:spPr>
+                    <a:xfrm>
+                      <a:off x="0" y="0"/>
+                      <a:ext cx="3861702" cy="2298632"/>
+                    </a:xfrm>
+                    <a:prstGeom prst="rect">
+                      <a:avLst/>
+                    </a:prstGeom>
+                  </pic:spPr>
+                </pic:pic>
+              </a:graphicData>
+            </a:graphic>
+          </wp:inline>
+        </w:drawing>
+      </w:r>
+    </w:p>
+    <w:p>
+      <w:r>
+        <w:t xml:space="preserve">                                              </w:t>
+      </w:r>
+    </w:p>
+    <w:p>
+      <w:r>
+        <w:t xml:space="preserve"> </w:t>
+      </w:r>
+      <w:r>
+        <w:t xml:space="preserve">64 </w:t>
+      </w:r>
+      <w:r>
+        <w:t>–</w:t>
+      </w:r>
+      <w:r>
+        <w:t xml:space="preserve"> </w:t>
+      </w:r>
+      <w:r>
+        <w:t xml:space="preserve">Inserimos um </w:t>
+      </w:r>
+      <w:proofErr w:type="spellStart"/>
+      <w:r>
+        <w:t>textarea</w:t>
+      </w:r>
+      <w:proofErr w:type="spellEnd"/>
+      <w:r>
+        <w:t xml:space="preserve">(Inputs de mensagem)em baixo do input telefone e aumentamos o tamanho da coluna </w:t>
+      </w:r>
+      <w:r>
+        <w:t>para ficar alinhado com outros inputs.</w:t>
+      </w:r>
+    </w:p>
+    <w:p/>
+    <w:p>
+      <w:r>
+        <w:rPr>
+          <w:noProof/>
+        </w:rPr>
+        <mc:AlternateContent>
+          <mc:Choice Requires="wps">
+            <w:drawing>
+              <wp:anchor distT="0" distB="0" distL="114300" distR="114300" simplePos="0" relativeHeight="251693056" behindDoc="0" locked="0" layoutInCell="1" allowOverlap="1" wp14:anchorId="3CDC2389" wp14:editId="26B8D3D2">
+                <wp:simplePos x="0" y="0"/>
+                <wp:positionH relativeFrom="column">
+                  <wp:posOffset>4067279</wp:posOffset>
+                </wp:positionH>
+                <wp:positionV relativeFrom="paragraph">
+                  <wp:posOffset>1721248</wp:posOffset>
+                </wp:positionV>
+                <wp:extent cx="545911" cy="68239"/>
+                <wp:effectExtent l="0" t="0" r="64135" b="84455"/>
+                <wp:wrapNone/>
+                <wp:docPr id="137" name="Conector de Seta Reta 137"/>
+                <wp:cNvGraphicFramePr/>
+                <a:graphic xmlns:a="http://schemas.openxmlformats.org/drawingml/2006/main">
+                  <a:graphicData uri="http://schemas.microsoft.com/office/word/2010/wordprocessingShape">
+                    <wps:wsp>
+                      <wps:cNvCnPr/>
+                      <wps:spPr>
+                        <a:xfrm>
+                          <a:off x="0" y="0"/>
+                          <a:ext cx="545911" cy="68239"/>
+                        </a:xfrm>
+                        <a:prstGeom prst="straightConnector1">
+                          <a:avLst/>
+                        </a:prstGeom>
+                        <a:ln>
+                          <a:tailEnd type="triangle"/>
+                        </a:ln>
+                      </wps:spPr>
+                      <wps:style>
+                        <a:lnRef idx="1">
+                          <a:schemeClr val="accent1"/>
+                        </a:lnRef>
+                        <a:fillRef idx="0">
+                          <a:schemeClr val="accent1"/>
+                        </a:fillRef>
+                        <a:effectRef idx="0">
+                          <a:schemeClr val="accent1"/>
+                        </a:effectRef>
+                        <a:fontRef idx="minor">
+                          <a:schemeClr val="tx1"/>
+                        </a:fontRef>
+                      </wps:style>
+                      <wps:bodyPr/>
+                    </wps:wsp>
+                  </a:graphicData>
+                </a:graphic>
+              </wp:anchor>
+            </w:drawing>
+          </mc:Choice>
+          <mc:Fallback>
+            <w:pict>
+              <v:shape w14:anchorId="2DB03FA9" id="Conector de Seta Reta 137" o:spid="_x0000_s1026" type="#_x0000_t32" style="position:absolute;margin-left:320.25pt;margin-top:135.55pt;width:43pt;height:5.35pt;z-index:251693056;visibility:visible;mso-wrap-style:square;mso-wrap-distance-left:9pt;mso-wrap-distance-top:0;mso-wrap-distance-right:9pt;mso-wrap-distance-bottom:0;mso-position-horizontal:absolute;mso-position-horizontal-relative:text;mso-position-vertical:absolute;mso-position-vertical-relative:text" o:gfxdata="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" strokecolor="#4472c4 [3204]" strokeweight=".5pt">
+                <v:stroke endarrow="block" joinstyle="miter"/>
+              </v:shape>
+            </w:pict>
+          </mc:Fallback>
+        </mc:AlternateContent>
+      </w:r>
+      <w:r>
+        <w:rPr>
+          <w:noProof/>
+        </w:rPr>
+        <mc:AlternateContent>
+          <mc:Choice Requires="wps">
+            <w:drawing>
+              <wp:anchor distT="0" distB="0" distL="114300" distR="114300" simplePos="0" relativeHeight="251692032" behindDoc="0" locked="0" layoutInCell="1" allowOverlap="1" wp14:anchorId="4D07C2D0" wp14:editId="2FEAEF05">
+                <wp:simplePos x="0" y="0"/>
+                <wp:positionH relativeFrom="column">
+                  <wp:posOffset>798195</wp:posOffset>
+                </wp:positionH>
+                <wp:positionV relativeFrom="paragraph">
+                  <wp:posOffset>14605</wp:posOffset>
+                </wp:positionV>
+                <wp:extent cx="3343275" cy="1589405"/>
+                <wp:effectExtent l="38100" t="0" r="28575" b="67945"/>
+                <wp:wrapNone/>
+                <wp:docPr id="135" name="Conector de Seta Reta 135"/>
+                <wp:cNvGraphicFramePr/>
+                <a:graphic xmlns:a="http://schemas.openxmlformats.org/drawingml/2006/main">
+                  <a:graphicData uri="http://schemas.microsoft.com/office/word/2010/wordprocessingShape">
+                    <wps:wsp>
+                      <wps:cNvCnPr/>
+                      <wps:spPr>
+                        <a:xfrm flipH="1">
+                          <a:off x="0" y="0"/>
+                          <a:ext cx="3343275" cy="1589405"/>
+                        </a:xfrm>
+                        <a:prstGeom prst="straightConnector1">
+                          <a:avLst/>
+                        </a:prstGeom>
+                        <a:ln>
+                          <a:tailEnd type="triangle"/>
+                        </a:ln>
+                      </wps:spPr>
+                      <wps:style>
+                        <a:lnRef idx="1">
+                          <a:schemeClr val="accent1"/>
+                        </a:lnRef>
+                        <a:fillRef idx="0">
+                          <a:schemeClr val="accent1"/>
+                        </a:fillRef>
+                        <a:effectRef idx="0">
+                          <a:schemeClr val="accent1"/>
+                        </a:effectRef>
+                        <a:fontRef idx="minor">
+                          <a:schemeClr val="tx1"/>
+                        </a:fontRef>
+                      </wps:style>
+                      <wps:bodyPr/>
+                    </wps:wsp>
+                  </a:graphicData>
+                </a:graphic>
+                <wp14:sizeRelH relativeFrom="margin">
+                  <wp14:pctWidth>0</wp14:pctWidth>
+                </wp14:sizeRelH>
+                <wp14:sizeRelV relativeFrom="margin">
+                  <wp14:pctHeight>0</wp14:pctHeight>
+                </wp14:sizeRelV>
+              </wp:anchor>
+            </w:drawing>
+          </mc:Choice>
+          <mc:Fallback>
+            <w:pict>
+              <v:shape w14:anchorId="5A9CCD4B" id="Conector de Seta Reta 135" o:spid="_x0000_s1026" type="#_x0000_t32" style="position:absolute;margin-left:62.85pt;margin-top:1.15pt;width:263.25pt;height:125.15pt;flip:x;z-index:251692032;visibility:visible;mso-wrap-style:square;mso-width-percent:0;mso-height-percent:0;mso-wrap-distance-left:9pt;mso-wrap-distance-top:0;mso-wrap-distance-right:9pt;mso-wrap-distance-bottom:0;mso-position-horizontal:absolute;mso-position-horizontal-relative:text;mso-position-vertical:absolute;mso-position-vertical-relative:text;mso-width-percent:0;mso-height-percent:0;mso-width-relative:margin;mso-height-relative:margin" o:gfxdata="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" strokecolor="#4472c4 [3204]" strokeweight=".5pt">
+                <v:stroke endarrow="block" joinstyle="miter"/>
+              </v:shape>
+            </w:pict>
+          </mc:Fallback>
+        </mc:AlternateContent>
+      </w:r>
+      <w:r>
+        <w:drawing>
+          <wp:inline distT="0" distB="0" distL="0" distR="0" wp14:anchorId="5ABE938A" wp14:editId="53C0E838">
+            <wp:extent cx="4430333" cy="2570082"/>
+            <wp:effectExtent l="0" t="0" r="8890" b="1905"/>
+            <wp:docPr id="134" name="Imagem 134"/>
+            <wp:cNvGraphicFramePr>
+              <a:graphicFrameLocks xmlns:a="http://schemas.openxmlformats.org/drawingml/2006/main" noChangeAspect="1"/>
+            </wp:cNvGraphicFramePr>
+            <a:graphic xmlns:a="http://schemas.openxmlformats.org/drawingml/2006/main">
+              <a:graphicData uri="http://schemas.openxmlformats.org/drawingml/2006/picture">
+                <pic:pic xmlns:pic="http://schemas.openxmlformats.org/drawingml/2006/picture">
+                  <pic:nvPicPr>
+                    <pic:cNvPr id="1" name=""/>
+                    <pic:cNvPicPr/>
+                  </pic:nvPicPr>
+                  <pic:blipFill>
+                    <a:blip r:embed="rId112"/>
+                    <a:stretch>
+                      <a:fillRect/>
+                    </a:stretch>
+                  </pic:blipFill>
+                  <pic:spPr>
+                    <a:xfrm>
+                      <a:off x="0" y="0"/>
+                      <a:ext cx="4480546" cy="2599211"/>
+                    </a:xfrm>
+                    <a:prstGeom prst="rect">
+                      <a:avLst/>
+                    </a:prstGeom>
+                  </pic:spPr>
+                </pic:pic>
+              </a:graphicData>
+            </a:graphic>
+          </wp:inline>
+        </w:drawing>
+      </w:r>
+      <w:r>
+        <w:drawing>
+          <wp:inline distT="0" distB="0" distL="0" distR="0" wp14:anchorId="7F6E44CC" wp14:editId="4452305C">
+            <wp:extent cx="2407867" cy="2568044"/>
+            <wp:effectExtent l="0" t="0" r="0" b="3810"/>
+            <wp:docPr id="136" name="Imagem 136"/>
+            <wp:cNvGraphicFramePr>
+              <a:graphicFrameLocks xmlns:a="http://schemas.openxmlformats.org/drawingml/2006/main" noChangeAspect="1"/>
+            </wp:cNvGraphicFramePr>
+            <a:graphic xmlns:a="http://schemas.openxmlformats.org/drawingml/2006/main">
+              <a:graphicData uri="http://schemas.openxmlformats.org/drawingml/2006/picture">
+                <pic:pic xmlns:pic="http://schemas.openxmlformats.org/drawingml/2006/picture">
+                  <pic:nvPicPr>
+                    <pic:cNvPr id="1" name=""/>
+                    <pic:cNvPicPr/>
+                  </pic:nvPicPr>
+                  <pic:blipFill>
+                    <a:blip r:embed="rId113"/>
+                    <a:stretch>
+                      <a:fillRect/>
+                    </a:stretch>
+                  </pic:blipFill>
+                  <pic:spPr>
+                    <a:xfrm>
+                      <a:off x="0" y="0"/>
+                      <a:ext cx="2452709" cy="2615869"/>
+                    </a:xfrm>
+                    <a:prstGeom prst="rect">
+                      <a:avLst/>
+                    </a:prstGeom>
+                  </pic:spPr>
+                </pic:pic>
+              </a:graphicData>
+            </a:graphic>
+          </wp:inline>
+        </w:drawing>
+      </w:r>
+    </w:p>
+    <w:p/>
+    <w:p>
+      <w:r>
+        <w:t xml:space="preserve">65 </w:t>
+      </w:r>
+      <w:r>
+        <w:t>–</w:t>
+      </w:r>
+      <w:r>
+        <w:t xml:space="preserve"> </w:t>
+      </w:r>
+      <w:r>
+        <w:t xml:space="preserve">Trabalhando com o input </w:t>
+      </w:r>
+      <w:proofErr w:type="spellStart"/>
+      <w:r>
+        <w:t>radio</w:t>
+      </w:r>
+      <w:proofErr w:type="spellEnd"/>
+      <w:r>
+        <w:t xml:space="preserve"> em nosso formulário inserimos os </w:t>
+      </w:r>
+      <w:proofErr w:type="spellStart"/>
+      <w:r>
+        <w:t>label</w:t>
+      </w:r>
+      <w:proofErr w:type="spellEnd"/>
+      <w:r>
+        <w:t xml:space="preserve"> e os inputs radio conforme código a baixo</w:t>
+      </w:r>
+      <w:r>
+        <w:t xml:space="preserve"> e transformamos que somente uma opção pode ser escolhida utilizando o mesmo nome  na palavra </w:t>
+      </w:r>
+      <w:proofErr w:type="spellStart"/>
+      <w:r>
+        <w:t>name</w:t>
+      </w:r>
+      <w:proofErr w:type="spellEnd"/>
+      <w:r>
+        <w:t xml:space="preserve"> do código.</w:t>
+      </w:r>
+    </w:p>
+    <w:p/>
+    <w:p>
+      <w:r>
+        <w:rPr>
+          <w:noProof/>
+        </w:rPr>
+        <mc:AlternateContent>
+          <mc:Choice Requires="wps">
+            <w:drawing>
+              <wp:anchor distT="0" distB="0" distL="114300" distR="114300" simplePos="0" relativeHeight="251699200" behindDoc="0" locked="0" layoutInCell="1" allowOverlap="1" wp14:anchorId="171E7477" wp14:editId="0BB27EB3">
+                <wp:simplePos x="0" y="0"/>
+                <wp:positionH relativeFrom="column">
+                  <wp:posOffset>3739733</wp:posOffset>
+                </wp:positionH>
+                <wp:positionV relativeFrom="paragraph">
+                  <wp:posOffset>2076213</wp:posOffset>
+                </wp:positionV>
+                <wp:extent cx="1009934" cy="184245"/>
+                <wp:effectExtent l="38100" t="0" r="19050" b="82550"/>
+                <wp:wrapNone/>
+                <wp:docPr id="146" name="Conector de Seta Reta 146"/>
+                <wp:cNvGraphicFramePr/>
+                <a:graphic xmlns:a="http://schemas.openxmlformats.org/drawingml/2006/main">
+                  <a:graphicData uri="http://schemas.microsoft.com/office/word/2010/wordprocessingShape">
+                    <wps:wsp>
+                      <wps:cNvCnPr/>
+                      <wps:spPr>
+                        <a:xfrm flipH="1">
+                          <a:off x="0" y="0"/>
+                          <a:ext cx="1009934" cy="184245"/>
+                        </a:xfrm>
+                        <a:prstGeom prst="straightConnector1">
+                          <a:avLst/>
+                        </a:prstGeom>
+                        <a:ln>
+                          <a:tailEnd type="triangle"/>
+                        </a:ln>
+                      </wps:spPr>
+                      <wps:style>
+                        <a:lnRef idx="1">
+                          <a:schemeClr val="accent1"/>
+                        </a:lnRef>
+                        <a:fillRef idx="0">
+                          <a:schemeClr val="accent1"/>
+                        </a:fillRef>
+                        <a:effectRef idx="0">
+                          <a:schemeClr val="accent1"/>
+                        </a:effectRef>
+                        <a:fontRef idx="minor">
+                          <a:schemeClr val="tx1"/>
+                        </a:fontRef>
+                      </wps:style>
+                      <wps:bodyPr/>
+                    </wps:wsp>
+                  </a:graphicData>
+                </a:graphic>
+              </wp:anchor>
+            </w:drawing>
+          </mc:Choice>
+          <mc:Fallback>
+            <w:pict>
+              <v:shape w14:anchorId="7F1364DD" id="Conector de Seta Reta 146" o:spid="_x0000_s1026" type="#_x0000_t32" style="position:absolute;margin-left:294.45pt;margin-top:163.5pt;width:79.5pt;height:14.5pt;flip:x;z-index:251699200;visibility:visible;mso-wrap-style:square;mso-wrap-distance-left:9pt;mso-wrap-distance-top:0;mso-wrap-distance-right:9pt;mso-wrap-distance-bottom:0;mso-position-horizontal:absolute;mso-position-horizontal-relative:text;mso-position-vertical:absolute;mso-position-vertical-relative:text" o:gfxdata="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" strokecolor="#4472c4 [3204]" strokeweight=".5pt">
+                <v:stroke endarrow="block" joinstyle="miter"/>
+              </v:shape>
+            </w:pict>
+          </mc:Fallback>
+        </mc:AlternateContent>
+      </w:r>
+      <w:r>
+        <w:rPr>
+          <w:noProof/>
+        </w:rPr>
+        <mc:AlternateContent>
+          <mc:Choice Requires="wps">
+            <w:drawing>
+              <wp:anchor distT="0" distB="0" distL="114300" distR="114300" simplePos="0" relativeHeight="251698176" behindDoc="0" locked="0" layoutInCell="1" allowOverlap="1" wp14:anchorId="45077561" wp14:editId="7DD229D1">
+                <wp:simplePos x="0" y="0"/>
+                <wp:positionH relativeFrom="column">
+                  <wp:posOffset>3064169</wp:posOffset>
+                </wp:positionH>
+                <wp:positionV relativeFrom="paragraph">
+                  <wp:posOffset>1919264</wp:posOffset>
+                </wp:positionV>
+                <wp:extent cx="1753737" cy="218364"/>
+                <wp:effectExtent l="38100" t="0" r="18415" b="86995"/>
+                <wp:wrapNone/>
+                <wp:docPr id="145" name="Conector de Seta Reta 145"/>
+                <wp:cNvGraphicFramePr/>
+                <a:graphic xmlns:a="http://schemas.openxmlformats.org/drawingml/2006/main">
+                  <a:graphicData uri="http://schemas.microsoft.com/office/word/2010/wordprocessingShape">
+                    <wps:wsp>
+                      <wps:cNvCnPr/>
+                      <wps:spPr>
+                        <a:xfrm flipH="1">
+                          <a:off x="0" y="0"/>
+                          <a:ext cx="1753737" cy="218364"/>
+                        </a:xfrm>
+                        <a:prstGeom prst="straightConnector1">
+                          <a:avLst/>
+                        </a:prstGeom>
+                        <a:ln>
+                          <a:tailEnd type="triangle"/>
+                        </a:ln>
+                      </wps:spPr>
+                      <wps:style>
+                        <a:lnRef idx="1">
+                          <a:schemeClr val="accent1"/>
+                        </a:lnRef>
+                        <a:fillRef idx="0">
+                          <a:schemeClr val="accent1"/>
+                        </a:fillRef>
+                        <a:effectRef idx="0">
+                          <a:schemeClr val="accent1"/>
+                        </a:effectRef>
+                        <a:fontRef idx="minor">
+                          <a:schemeClr val="tx1"/>
+                        </a:fontRef>
+                      </wps:style>
+                      <wps:bodyPr/>
+                    </wps:wsp>
+                  </a:graphicData>
+                </a:graphic>
+              </wp:anchor>
+            </w:drawing>
+          </mc:Choice>
+          <mc:Fallback>
+            <w:pict>
+              <v:shape w14:anchorId="33F7BDAA" id="Conector de Seta Reta 145" o:spid="_x0000_s1026" type="#_x0000_t32" style="position:absolute;margin-left:241.25pt;margin-top:151.1pt;width:138.1pt;height:17.2pt;flip:x;z-index:251698176;visibility:visible;mso-wrap-style:square;mso-wrap-distance-left:9pt;mso-wrap-distance-top:0;mso-wrap-distance-right:9pt;mso-wrap-distance-bottom:0;mso-position-horizontal:absolute;mso-position-horizontal-relative:text;mso-position-vertical:absolute;mso-position-vertical-relative:text" o:gfxdata="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" strokecolor="#4472c4 [3204]" strokeweight=".5pt">
+                <v:stroke endarrow="block" joinstyle="miter"/>
+              </v:shape>
+            </w:pict>
+          </mc:Fallback>
+        </mc:AlternateContent>
+      </w:r>
+      <w:r>
+        <w:rPr>
+          <w:noProof/>
+        </w:rPr>
+        <mc:AlternateContent>
+          <mc:Choice Requires="wps">
+            <w:drawing>
+              <wp:anchor distT="0" distB="0" distL="114300" distR="114300" simplePos="0" relativeHeight="251697152" behindDoc="0" locked="0" layoutInCell="1" allowOverlap="1" wp14:anchorId="7731B00D" wp14:editId="3A9E3C67">
+                <wp:simplePos x="0" y="0"/>
+                <wp:positionH relativeFrom="column">
+                  <wp:posOffset>3992217</wp:posOffset>
+                </wp:positionH>
+                <wp:positionV relativeFrom="paragraph">
+                  <wp:posOffset>3215801</wp:posOffset>
+                </wp:positionV>
+                <wp:extent cx="825689" cy="68239"/>
+                <wp:effectExtent l="0" t="57150" r="12700" b="27305"/>
+                <wp:wrapNone/>
+                <wp:docPr id="144" name="Conector de Seta Reta 144"/>
+                <wp:cNvGraphicFramePr/>
+                <a:graphic xmlns:a="http://schemas.openxmlformats.org/drawingml/2006/main">
+                  <a:graphicData uri="http://schemas.microsoft.com/office/word/2010/wordprocessingShape">
+                    <wps:wsp>
+                      <wps:cNvCnPr/>
+                      <wps:spPr>
+                        <a:xfrm flipH="1" flipV="1">
+                          <a:off x="0" y="0"/>
+                          <a:ext cx="825689" cy="68239"/>
+                        </a:xfrm>
+                        <a:prstGeom prst="straightConnector1">
+                          <a:avLst/>
+                        </a:prstGeom>
+                        <a:ln>
+                          <a:tailEnd type="triangle"/>
+                        </a:ln>
+                      </wps:spPr>
+                      <wps:style>
+                        <a:lnRef idx="1">
+                          <a:schemeClr val="accent1"/>
+                        </a:lnRef>
+                        <a:fillRef idx="0">
+                          <a:schemeClr val="accent1"/>
+                        </a:fillRef>
+                        <a:effectRef idx="0">
+                          <a:schemeClr val="accent1"/>
+                        </a:effectRef>
+                        <a:fontRef idx="minor">
+                          <a:schemeClr val="tx1"/>
+                        </a:fontRef>
+                      </wps:style>
+                      <wps:bodyPr/>
+                    </wps:wsp>
+                  </a:graphicData>
+                </a:graphic>
+              </wp:anchor>
+            </w:drawing>
+          </mc:Choice>
+          <mc:Fallback>
+            <w:pict>
+              <v:shape w14:anchorId="218ADDC8" id="Conector de Seta Reta 144" o:spid="_x0000_s1026" type="#_x0000_t32" style="position:absolute;margin-left:314.35pt;margin-top:253.2pt;width:65pt;height:5.35pt;flip:x y;z-index:251697152;visibility:visible;mso-wrap-style:square;mso-wrap-distance-left:9pt;mso-wrap-distance-top:0;mso-wrap-distance-right:9pt;mso-wrap-distance-bottom:0;mso-position-horizontal:absolute;mso-position-horizontal-relative:text;mso-position-vertical:absolute;mso-position-vertical-relative:text" o:gfxdata="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" strokecolor="#4472c4 [3204]" strokeweight=".5pt">
+                <v:stroke endarrow="block" joinstyle="miter"/>
+              </v:shape>
+            </w:pict>
+          </mc:Fallback>
+        </mc:AlternateContent>
+      </w:r>
+      <w:r>
+        <w:rPr>
+          <w:noProof/>
+        </w:rPr>
+        <mc:AlternateContent>
+          <mc:Choice Requires="wps">
+            <w:drawing>
+              <wp:anchor distT="0" distB="0" distL="114300" distR="114300" simplePos="0" relativeHeight="251696128" behindDoc="0" locked="0" layoutInCell="1" allowOverlap="1" wp14:anchorId="5775CA82" wp14:editId="7C7BE75A">
+                <wp:simplePos x="0" y="0"/>
+                <wp:positionH relativeFrom="column">
+                  <wp:posOffset>3384891</wp:posOffset>
+                </wp:positionH>
+                <wp:positionV relativeFrom="paragraph">
+                  <wp:posOffset>2949670</wp:posOffset>
+                </wp:positionV>
+                <wp:extent cx="1262418" cy="68239"/>
+                <wp:effectExtent l="38100" t="0" r="13970" b="84455"/>
+                <wp:wrapNone/>
+                <wp:docPr id="143" name="Conector de Seta Reta 143"/>
+                <wp:cNvGraphicFramePr/>
+                <a:graphic xmlns:a="http://schemas.openxmlformats.org/drawingml/2006/main">
+                  <a:graphicData uri="http://schemas.microsoft.com/office/word/2010/wordprocessingShape">
+                    <wps:wsp>
+                      <wps:cNvCnPr/>
+                      <wps:spPr>
+                        <a:xfrm flipH="1">
+                          <a:off x="0" y="0"/>
+                          <a:ext cx="1262418" cy="68239"/>
+                        </a:xfrm>
+                        <a:prstGeom prst="straightConnector1">
+                          <a:avLst/>
+                        </a:prstGeom>
+                        <a:ln>
+                          <a:tailEnd type="triangle"/>
+                        </a:ln>
+                      </wps:spPr>
+                      <wps:style>
+                        <a:lnRef idx="1">
+                          <a:schemeClr val="accent1"/>
+                        </a:lnRef>
+                        <a:fillRef idx="0">
+                          <a:schemeClr val="accent1"/>
+                        </a:fillRef>
+                        <a:effectRef idx="0">
+                          <a:schemeClr val="accent1"/>
+                        </a:effectRef>
+                        <a:fontRef idx="minor">
+                          <a:schemeClr val="tx1"/>
+                        </a:fontRef>
+                      </wps:style>
+                      <wps:bodyPr/>
+                    </wps:wsp>
+                  </a:graphicData>
+                </a:graphic>
+              </wp:anchor>
+            </w:drawing>
+          </mc:Choice>
+          <mc:Fallback>
+            <w:pict>
+              <v:shape w14:anchorId="3C14F62E" id="Conector de Seta Reta 143" o:spid="_x0000_s1026" type="#_x0000_t32" style="position:absolute;margin-left:266.55pt;margin-top:232.25pt;width:99.4pt;height:5.35pt;flip:x;z-index:251696128;visibility:visible;mso-wrap-style:square;mso-wrap-distance-left:9pt;mso-wrap-distance-top:0;mso-wrap-distance-right:9pt;mso-wrap-distance-bottom:0;mso-position-horizontal:absolute;mso-position-horizontal-relative:text;mso-position-vertical:absolute;mso-position-vertical-relative:text" o:gfxdata="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" strokecolor="#4472c4 [3204]" strokeweight=".5pt">
+                <v:stroke endarrow="block" joinstyle="miter"/>
+              </v:shape>
+            </w:pict>
+          </mc:Fallback>
+        </mc:AlternateContent>
+      </w:r>
+      <w:r>
+        <w:rPr>
+          <w:noProof/>
+        </w:rPr>
+        <mc:AlternateContent>
+          <mc:Choice Requires="wps">
+            <w:drawing>
+              <wp:anchor distT="0" distB="0" distL="114300" distR="114300" simplePos="0" relativeHeight="251695104" behindDoc="0" locked="0" layoutInCell="1" allowOverlap="1" wp14:anchorId="17E04127" wp14:editId="19E835A6">
+                <wp:simplePos x="0" y="0"/>
+                <wp:positionH relativeFrom="column">
+                  <wp:posOffset>3978569</wp:posOffset>
+                </wp:positionH>
+                <wp:positionV relativeFrom="paragraph">
+                  <wp:posOffset>2465174</wp:posOffset>
+                </wp:positionV>
+                <wp:extent cx="859809" cy="279779"/>
+                <wp:effectExtent l="38100" t="0" r="16510" b="63500"/>
+                <wp:wrapNone/>
+                <wp:docPr id="142" name="Conector de Seta Reta 142"/>
+                <wp:cNvGraphicFramePr/>
+                <a:graphic xmlns:a="http://schemas.openxmlformats.org/drawingml/2006/main">
+                  <a:graphicData uri="http://schemas.microsoft.com/office/word/2010/wordprocessingShape">
+                    <wps:wsp>
+                      <wps:cNvCnPr/>
+                      <wps:spPr>
+                        <a:xfrm flipH="1">
+                          <a:off x="0" y="0"/>
+                          <a:ext cx="859809" cy="279779"/>
+                        </a:xfrm>
+                        <a:prstGeom prst="straightConnector1">
+                          <a:avLst/>
+                        </a:prstGeom>
+                        <a:ln>
+                          <a:tailEnd type="triangle"/>
+                        </a:ln>
+                      </wps:spPr>
+                      <wps:style>
+                        <a:lnRef idx="1">
+                          <a:schemeClr val="accent1"/>
+                        </a:lnRef>
+                        <a:fillRef idx="0">
+                          <a:schemeClr val="accent1"/>
+                        </a:fillRef>
+                        <a:effectRef idx="0">
+                          <a:schemeClr val="accent1"/>
+                        </a:effectRef>
+                        <a:fontRef idx="minor">
+                          <a:schemeClr val="tx1"/>
+                        </a:fontRef>
+                      </wps:style>
+                      <wps:bodyPr/>
+                    </wps:wsp>
+                  </a:graphicData>
+                </a:graphic>
+              </wp:anchor>
+            </w:drawing>
+          </mc:Choice>
+          <mc:Fallback>
+            <w:pict>
+              <v:shape w14:anchorId="378031E8" id="Conector de Seta Reta 142" o:spid="_x0000_s1026" type="#_x0000_t32" style="position:absolute;margin-left:313.25pt;margin-top:194.1pt;width:67.7pt;height:22.05pt;flip:x;z-index:251695104;visibility:visible;mso-wrap-style:square;mso-wrap-distance-left:9pt;mso-wrap-distance-top:0;mso-wrap-distance-right:9pt;mso-wrap-distance-bottom:0;mso-position-horizontal:absolute;mso-position-horizontal-relative:text;mso-position-vertical:absolute;mso-position-vertical-relative:text" o:gfxdata="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" strokecolor="#4472c4 [3204]" strokeweight=".5pt">
+                <v:stroke endarrow="block" joinstyle="miter"/>
+              </v:shape>
+            </w:pict>
+          </mc:Fallback>
+        </mc:AlternateContent>
+      </w:r>
+      <w:r>
+        <w:rPr>
+          <w:noProof/>
+        </w:rPr>
+        <mc:AlternateContent>
+          <mc:Choice Requires="wps">
+            <w:drawing>
+              <wp:anchor distT="0" distB="0" distL="114300" distR="114300" simplePos="0" relativeHeight="251694080" behindDoc="0" locked="0" layoutInCell="1" allowOverlap="1" wp14:anchorId="0FD6D55C" wp14:editId="12C975C2">
+                <wp:simplePos x="0" y="0"/>
+                <wp:positionH relativeFrom="column">
+                  <wp:posOffset>3282533</wp:posOffset>
+                </wp:positionH>
+                <wp:positionV relativeFrom="paragraph">
+                  <wp:posOffset>2185395</wp:posOffset>
+                </wp:positionV>
+                <wp:extent cx="1426191" cy="382137"/>
+                <wp:effectExtent l="38100" t="0" r="22225" b="75565"/>
+                <wp:wrapNone/>
+                <wp:docPr id="141" name="Conector de Seta Reta 141"/>
+                <wp:cNvGraphicFramePr/>
+                <a:graphic xmlns:a="http://schemas.openxmlformats.org/drawingml/2006/main">
+                  <a:graphicData uri="http://schemas.microsoft.com/office/word/2010/wordprocessingShape">
+                    <wps:wsp>
+                      <wps:cNvCnPr/>
+                      <wps:spPr>
+                        <a:xfrm flipH="1">
+                          <a:off x="0" y="0"/>
+                          <a:ext cx="1426191" cy="382137"/>
+                        </a:xfrm>
+                        <a:prstGeom prst="straightConnector1">
+                          <a:avLst/>
+                        </a:prstGeom>
+                        <a:ln>
+                          <a:tailEnd type="triangle"/>
+                        </a:ln>
+                      </wps:spPr>
+                      <wps:style>
+                        <a:lnRef idx="1">
+                          <a:schemeClr val="accent1"/>
+                        </a:lnRef>
+                        <a:fillRef idx="0">
+                          <a:schemeClr val="accent1"/>
+                        </a:fillRef>
+                        <a:effectRef idx="0">
+                          <a:schemeClr val="accent1"/>
+                        </a:effectRef>
+                        <a:fontRef idx="minor">
+                          <a:schemeClr val="tx1"/>
+                        </a:fontRef>
+                      </wps:style>
+                      <wps:bodyPr/>
+                    </wps:wsp>
+                  </a:graphicData>
+                </a:graphic>
+              </wp:anchor>
+            </w:drawing>
+          </mc:Choice>
+          <mc:Fallback>
+            <w:pict>
+              <v:shape w14:anchorId="029DB25C" id="Conector de Seta Reta 141" o:spid="_x0000_s1026" type="#_x0000_t32" style="position:absolute;margin-left:258.45pt;margin-top:172.1pt;width:112.3pt;height:30.1pt;flip:x;z-index:251694080;visibility:visible;mso-wrap-style:square;mso-wrap-distance-left:9pt;mso-wrap-distance-top:0;mso-wrap-distance-right:9pt;mso-wrap-distance-bottom:0;mso-position-horizontal:absolute;mso-position-horizontal-relative:text;mso-position-vertical:absolute;mso-position-vertical-relative:text" o:gfxdata="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" strokecolor="#4472c4 [3204]" strokeweight=".5pt">
+                <v:stroke endarrow="block" joinstyle="miter"/>
+              </v:shape>
+            </w:pict>
+          </mc:Fallback>
+        </mc:AlternateContent>
+      </w:r>
+      <w:r>
+        <w:drawing>
+          <wp:inline distT="0" distB="0" distL="0" distR="0" wp14:anchorId="08F84725" wp14:editId="37CDFE27">
+            <wp:extent cx="4906060" cy="4372585"/>
+            <wp:effectExtent l="0" t="0" r="8890" b="9525"/>
+            <wp:docPr id="140" name="Imagem 140"/>
+            <wp:cNvGraphicFramePr>
+              <a:graphicFrameLocks xmlns:a="http://schemas.openxmlformats.org/drawingml/2006/main" noChangeAspect="1"/>
+            </wp:cNvGraphicFramePr>
+            <a:graphic xmlns:a="http://schemas.openxmlformats.org/drawingml/2006/main">
+              <a:graphicData uri="http://schemas.openxmlformats.org/drawingml/2006/picture">
+                <pic:pic xmlns:pic="http://schemas.openxmlformats.org/drawingml/2006/picture">
+                  <pic:nvPicPr>
+                    <pic:cNvPr id="1" name=""/>
+                    <pic:cNvPicPr/>
+                  </pic:nvPicPr>
+                  <pic:blipFill>
+                    <a:blip r:embed="rId114"/>
+                    <a:stretch>
+                      <a:fillRect/>
+                    </a:stretch>
+                  </pic:blipFill>
+                  <pic:spPr>
+                    <a:xfrm>
+                      <a:off x="0" y="0"/>
+                      <a:ext cx="4906060" cy="4372585"/>
+                    </a:xfrm>
+                    <a:prstGeom prst="rect">
+                      <a:avLst/>
+                    </a:prstGeom>
+                  </pic:spPr>
+                </pic:pic>
+              </a:graphicData>
+            </a:graphic>
+          </wp:inline>
+        </w:drawing>
+      </w:r>
+      <w:r>
+        <w:drawing>
+          <wp:inline distT="0" distB="0" distL="0" distR="0" wp14:anchorId="2741D73D" wp14:editId="23EB12A2">
+            <wp:extent cx="2424151" cy="1468983"/>
+            <wp:effectExtent l="0" t="0" r="0" b="0"/>
+            <wp:docPr id="147" name="Imagem 147"/>
+            <wp:cNvGraphicFramePr>
+              <a:graphicFrameLocks xmlns:a="http://schemas.openxmlformats.org/drawingml/2006/main" noChangeAspect="1"/>
+            </wp:cNvGraphicFramePr>
+            <a:graphic xmlns:a="http://schemas.openxmlformats.org/drawingml/2006/main">
+              <a:graphicData uri="http://schemas.openxmlformats.org/drawingml/2006/picture">
+                <pic:pic xmlns:pic="http://schemas.openxmlformats.org/drawingml/2006/picture">
+                  <pic:nvPicPr>
+                    <pic:cNvPr id="1" name=""/>
+                    <pic:cNvPicPr/>
+                  </pic:nvPicPr>
+                  <pic:blipFill>
+                    <a:blip r:embed="rId115"/>
+                    <a:stretch>
+                      <a:fillRect/>
+                    </a:stretch>
+                  </pic:blipFill>
+                  <pic:spPr>
+                    <a:xfrm>
+                      <a:off x="0" y="0"/>
+                      <a:ext cx="2439311" cy="1478169"/>
+                    </a:xfrm>
+                    <a:prstGeom prst="rect">
+                      <a:avLst/>
+                    </a:prstGeom>
+                  </pic:spPr>
+                </pic:pic>
+              </a:graphicData>
+            </a:graphic>
+          </wp:inline>
+        </w:drawing>
+      </w:r>
+    </w:p>
+    <w:p/>
+    <w:p>
+      <w:r>
+        <w:rPr>
+          <w:noProof/>
+        </w:rPr>
+        <mc:AlternateContent>
+          <mc:Choice Requires="wps">
+            <w:drawing>
+              <wp:anchor distT="0" distB="0" distL="114300" distR="114300" simplePos="0" relativeHeight="251700224" behindDoc="0" locked="0" layoutInCell="1" allowOverlap="1" wp14:anchorId="77867CC2" wp14:editId="65091BED">
+                <wp:simplePos x="0" y="0"/>
+                <wp:positionH relativeFrom="column">
+                  <wp:posOffset>218611</wp:posOffset>
+                </wp:positionH>
+                <wp:positionV relativeFrom="paragraph">
+                  <wp:posOffset>158627</wp:posOffset>
+                </wp:positionV>
+                <wp:extent cx="334370" cy="409433"/>
+                <wp:effectExtent l="0" t="0" r="66040" b="48260"/>
+                <wp:wrapNone/>
+                <wp:docPr id="149" name="Conector de Seta Reta 149"/>
+                <wp:cNvGraphicFramePr/>
+                <a:graphic xmlns:a="http://schemas.openxmlformats.org/drawingml/2006/main">
+                  <a:graphicData uri="http://schemas.microsoft.com/office/word/2010/wordprocessingShape">
+                    <wps:wsp>
+                      <wps:cNvCnPr/>
+                      <wps:spPr>
+                        <a:xfrm>
+                          <a:off x="0" y="0"/>
+                          <a:ext cx="334370" cy="409433"/>
+                        </a:xfrm>
+                        <a:prstGeom prst="straightConnector1">
+                          <a:avLst/>
+                        </a:prstGeom>
+                        <a:ln>
+                          <a:tailEnd type="triangle"/>
+                        </a:ln>
+                      </wps:spPr>
+                      <wps:style>
+                        <a:lnRef idx="1">
+                          <a:schemeClr val="accent1"/>
+                        </a:lnRef>
+                        <a:fillRef idx="0">
+                          <a:schemeClr val="accent1"/>
+                        </a:fillRef>
+                        <a:effectRef idx="0">
+                          <a:schemeClr val="accent1"/>
+                        </a:effectRef>
+                        <a:fontRef idx="minor">
+                          <a:schemeClr val="tx1"/>
+                        </a:fontRef>
+                      </wps:style>
+                      <wps:bodyPr/>
+                    </wps:wsp>
+                  </a:graphicData>
+                </a:graphic>
+              </wp:anchor>
+            </w:drawing>
+          </mc:Choice>
+          <mc:Fallback>
+            <w:pict>
+              <v:shape w14:anchorId="7332D657" id="Conector de Seta Reta 149" o:spid="_x0000_s1026" type="#_x0000_t32" style="position:absolute;margin-left:17.2pt;margin-top:12.5pt;width:26.35pt;height:32.25pt;z-index:251700224;visibility:visible;mso-wrap-style:square;mso-wrap-distance-left:9pt;mso-wrap-distance-top:0;mso-wrap-distance-right:9pt;mso-wrap-distance-bottom:0;mso-position-horizontal:absolute;mso-position-horizontal-relative:text;mso-position-vertical:absolute;mso-position-vertical-relative:text" o:gfxdata="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" strokecolor="#4472c4 [3204]" strokeweight=".5pt">
+                <v:stroke endarrow="block" joinstyle="miter"/>
+              </v:shape>
+            </w:pict>
+          </mc:Fallback>
+        </mc:AlternateContent>
+      </w:r>
+      <w:r>
+        <w:t xml:space="preserve">66- </w:t>
+      </w:r>
+      <w:r>
+        <w:t xml:space="preserve">Inserimos um parágrafo em cima da </w:t>
+      </w:r>
+      <w:proofErr w:type="spellStart"/>
+      <w:r>
+        <w:t>label</w:t>
+      </w:r>
+      <w:proofErr w:type="spellEnd"/>
+      <w:r>
+        <w:t xml:space="preserve"> radio-box telefone</w:t>
+      </w:r>
+      <w:r>
+        <w:t>.</w:t>
+      </w:r>
+    </w:p>
+    <w:p>
+      <w:r>
+        <w:drawing>
+          <wp:inline distT="0" distB="0" distL="0" distR="0" wp14:anchorId="727D47E4" wp14:editId="4B3BEB51">
+            <wp:extent cx="6182588" cy="1286054"/>
+            <wp:effectExtent l="0" t="0" r="8890" b="9525"/>
+            <wp:docPr id="148" name="Imagem 148"/>
+            <wp:cNvGraphicFramePr>
+              <a:graphicFrameLocks xmlns:a="http://schemas.openxmlformats.org/drawingml/2006/main" noChangeAspect="1"/>
+            </wp:cNvGraphicFramePr>
+            <a:graphic xmlns:a="http://schemas.openxmlformats.org/drawingml/2006/main">
+              <a:graphicData uri="http://schemas.openxmlformats.org/drawingml/2006/picture">
+                <pic:pic xmlns:pic="http://schemas.openxmlformats.org/drawingml/2006/picture">
+                  <pic:nvPicPr>
+                    <pic:cNvPr id="1" name=""/>
+                    <pic:cNvPicPr/>
+                  </pic:nvPicPr>
+                  <pic:blipFill>
+                    <a:blip r:embed="rId116"/>
+                    <a:stretch>
+                      <a:fillRect/>
+                    </a:stretch>
+                  </pic:blipFill>
+                  <pic:spPr>
+                    <a:xfrm>
+                      <a:off x="0" y="0"/>
+                      <a:ext cx="6182588" cy="1286054"/>
+                    </a:xfrm>
+                    <a:prstGeom prst="rect">
+                      <a:avLst/>
+                    </a:prstGeom>
+                  </pic:spPr>
+                </pic:pic>
+              </a:graphicData>
+            </a:graphic>
+          </wp:inline>
+        </w:drawing>
+      </w:r>
+    </w:p>
+    <w:p/>
+    <w:p/>
+    <w:p>
+      <w:r>
+        <w:t xml:space="preserve">67 – Adicionamos uma </w:t>
+      </w:r>
+      <w:proofErr w:type="spellStart"/>
+      <w:r>
+        <w:t>div</w:t>
+      </w:r>
+      <w:proofErr w:type="spellEnd"/>
+      <w:r>
+        <w:t xml:space="preserve"> envolvendo o parágrafo como prefere o nosso contato e as </w:t>
+      </w:r>
+      <w:proofErr w:type="spellStart"/>
+      <w:r>
+        <w:t>label</w:t>
+      </w:r>
+      <w:proofErr w:type="spellEnd"/>
+      <w:r>
+        <w:t xml:space="preserve"> e inputs </w:t>
+      </w:r>
+      <w:r>
+        <w:t>rádio</w:t>
+      </w:r>
+      <w:r>
+        <w:t>.</w:t>
+      </w:r>
+    </w:p>
+    <w:p>
+      <w:r>
+        <w:drawing>
+          <wp:inline distT="0" distB="0" distL="0" distR="0" wp14:anchorId="73BAF8CB" wp14:editId="66E77676">
+            <wp:extent cx="6725589" cy="3238952"/>
+            <wp:effectExtent l="0" t="0" r="0" b="0"/>
+            <wp:docPr id="150" name="Imagem 150"/>
+            <wp:cNvGraphicFramePr>
+              <a:graphicFrameLocks xmlns:a="http://schemas.openxmlformats.org/drawingml/2006/main" noChangeAspect="1"/>
+            </wp:cNvGraphicFramePr>
+            <a:graphic xmlns:a="http://schemas.openxmlformats.org/drawingml/2006/main">
+              <a:graphicData uri="http://schemas.openxmlformats.org/drawingml/2006/picture">
+                <pic:pic xmlns:pic="http://schemas.openxmlformats.org/drawingml/2006/picture">
+                  <pic:nvPicPr>
+                    <pic:cNvPr id="1" name=""/>
+                    <pic:cNvPicPr/>
+                  </pic:nvPicPr>
+                  <pic:blipFill>
+                    <a:blip r:embed="rId117"/>
+                    <a:stretch>
+                      <a:fillRect/>
+                    </a:stretch>
+                  </pic:blipFill>
+                  <pic:spPr>
+                    <a:xfrm>
+                      <a:off x="0" y="0"/>
+                      <a:ext cx="6725589" cy="3238952"/>
+                    </a:xfrm>
+                    <a:prstGeom prst="rect">
+                      <a:avLst/>
+                    </a:prstGeom>
+                  </pic:spPr>
+                </pic:pic>
+              </a:graphicData>
+            </a:graphic>
+          </wp:inline>
+        </w:drawing>
+      </w:r>
+    </w:p>
+    <w:p>
+      <w:r>
+        <w:t xml:space="preserve">68- Posterior </w:t>
+      </w:r>
+      <w:r>
+        <w:t xml:space="preserve">adicionamos um </w:t>
+      </w:r>
+      <w:proofErr w:type="spellStart"/>
+      <w:r>
+        <w:t>label</w:t>
+      </w:r>
+      <w:proofErr w:type="spellEnd"/>
+      <w:r>
+        <w:t xml:space="preserve"> com </w:t>
+      </w:r>
+      <w:proofErr w:type="gramStart"/>
+      <w:r>
+        <w:t>o inputs</w:t>
+      </w:r>
+      <w:proofErr w:type="gramEnd"/>
+      <w:r>
+        <w:t xml:space="preserve"> </w:t>
+      </w:r>
+      <w:proofErr w:type="spellStart"/>
+      <w:r>
+        <w:t>checkbox</w:t>
+      </w:r>
+      <w:proofErr w:type="spellEnd"/>
+      <w:r>
+        <w:t xml:space="preserve"> </w:t>
+      </w:r>
+    </w:p>
+    <w:p>
+      <w:r>
+        <w:drawing>
+          <wp:inline distT="0" distB="0" distL="0" distR="0" wp14:anchorId="16466004" wp14:editId="24DE3360">
+            <wp:extent cx="7245541" cy="783302"/>
+            <wp:effectExtent l="0" t="0" r="0" b="0"/>
+            <wp:docPr id="151" name="Imagem 151"/>
+            <wp:cNvGraphicFramePr>
+              <a:graphicFrameLocks xmlns:a="http://schemas.openxmlformats.org/drawingml/2006/main" noChangeAspect="1"/>
+            </wp:cNvGraphicFramePr>
+            <a:graphic xmlns:a="http://schemas.openxmlformats.org/drawingml/2006/main">
+              <a:graphicData uri="http://schemas.openxmlformats.org/drawingml/2006/picture">
+                <pic:pic xmlns:pic="http://schemas.openxmlformats.org/drawingml/2006/picture">
+                  <pic:nvPicPr>
+                    <pic:cNvPr id="1" name=""/>
+                    <pic:cNvPicPr/>
+                  </pic:nvPicPr>
+                  <pic:blipFill>
+                    <a:blip r:embed="rId118"/>
+                    <a:stretch>
+                      <a:fillRect/>
+                    </a:stretch>
+                  </pic:blipFill>
+                  <pic:spPr>
+                    <a:xfrm>
+                      <a:off x="0" y="0"/>
+                      <a:ext cx="7332270" cy="792678"/>
+                    </a:xfrm>
+                    <a:prstGeom prst="rect">
+                      <a:avLst/>
+                    </a:prstGeom>
+                  </pic:spPr>
+                </pic:pic>
+              </a:graphicData>
+            </a:graphic>
+          </wp:inline>
+        </w:drawing>
+      </w:r>
+    </w:p>
+    <w:p>
+      <w:r>
+        <w:drawing>
+          <wp:inline distT="0" distB="0" distL="0" distR="0" wp14:anchorId="7F018EBE" wp14:editId="79CE1944">
+            <wp:extent cx="4563112" cy="800212"/>
+            <wp:effectExtent l="0" t="0" r="0" b="0"/>
+            <wp:docPr id="153" name="Imagem 153"/>
+            <wp:cNvGraphicFramePr>
+              <a:graphicFrameLocks xmlns:a="http://schemas.openxmlformats.org/drawingml/2006/main" noChangeAspect="1"/>
+            </wp:cNvGraphicFramePr>
+            <a:graphic xmlns:a="http://schemas.openxmlformats.org/drawingml/2006/main">
+              <a:graphicData uri="http://schemas.openxmlformats.org/drawingml/2006/picture">
+                <pic:pic xmlns:pic="http://schemas.openxmlformats.org/drawingml/2006/picture">
+                  <pic:nvPicPr>
+                    <pic:cNvPr id="1" name=""/>
+                    <pic:cNvPicPr/>
+                  </pic:nvPicPr>
+                  <pic:blipFill>
+                    <a:blip r:embed="rId119"/>
+                    <a:stretch>
+                      <a:fillRect/>
+                    </a:stretch>
+                  </pic:blipFill>
+                  <pic:spPr>
+                    <a:xfrm>
+                      <a:off x="0" y="0"/>
+                      <a:ext cx="4563112" cy="800212"/>
+                    </a:xfrm>
+                    <a:prstGeom prst="rect">
+                      <a:avLst/>
+                    </a:prstGeom>
+                  </pic:spPr>
+                </pic:pic>
+              </a:graphicData>
+            </a:graphic>
+          </wp:inline>
+        </w:drawing>
+      </w:r>
+    </w:p>
+    <w:p>
+      <w:r>
+        <w:t xml:space="preserve">69 </w:t>
+      </w:r>
+      <w:r>
+        <w:t>–</w:t>
+      </w:r>
+      <w:r>
+        <w:t xml:space="preserve"> </w:t>
+      </w:r>
+      <w:r>
+        <w:t xml:space="preserve">Para colocar os inputs radio-box e </w:t>
+      </w:r>
+      <w:proofErr w:type="spellStart"/>
+      <w:r>
+        <w:t>checkbox</w:t>
+      </w:r>
+      <w:proofErr w:type="spellEnd"/>
+      <w:r>
+        <w:t xml:space="preserve"> ao lado da </w:t>
+      </w:r>
+      <w:proofErr w:type="spellStart"/>
+      <w:r>
+        <w:t>label</w:t>
+      </w:r>
+      <w:proofErr w:type="spellEnd"/>
+      <w:r>
+        <w:t xml:space="preserve"> precisamos adicionar </w:t>
+      </w:r>
+      <w:proofErr w:type="gramStart"/>
+      <w:r>
+        <w:t>o inputs</w:t>
+      </w:r>
+      <w:proofErr w:type="gramEnd"/>
+      <w:r>
+        <w:t xml:space="preserve"> dentro da </w:t>
+      </w:r>
+      <w:proofErr w:type="spellStart"/>
+      <w:r>
+        <w:t>label</w:t>
+      </w:r>
+      <w:proofErr w:type="spellEnd"/>
+      <w:r>
+        <w:t xml:space="preserve"> conforme imagem abaixo.</w:t>
+      </w:r>
+    </w:p>
+    <w:p>
+      <w:r>
+        <w:drawing>
+          <wp:inline distT="0" distB="0" distL="0" distR="0" wp14:anchorId="19E3BAB3" wp14:editId="507E32CD">
+            <wp:extent cx="9373908" cy="2715004"/>
+            <wp:effectExtent l="0" t="0" r="0" b="9525"/>
+            <wp:docPr id="154" name="Imagem 154"/>
+            <wp:cNvGraphicFramePr>
+              <a:graphicFrameLocks xmlns:a="http://schemas.openxmlformats.org/drawingml/2006/main" noChangeAspect="1"/>
+            </wp:cNvGraphicFramePr>
+            <a:graphic xmlns:a="http://schemas.openxmlformats.org/drawingml/2006/main">
+              <a:graphicData uri="http://schemas.openxmlformats.org/drawingml/2006/picture">
+                <pic:pic xmlns:pic="http://schemas.openxmlformats.org/drawingml/2006/picture">
+                  <pic:nvPicPr>
+                    <pic:cNvPr id="1" name=""/>
+                    <pic:cNvPicPr/>
+                  </pic:nvPicPr>
+                  <pic:blipFill>
+                    <a:blip r:embed="rId120"/>
+                    <a:stretch>
+                      <a:fillRect/>
+                    </a:stretch>
+                  </pic:blipFill>
+                  <pic:spPr>
+                    <a:xfrm>
+                      <a:off x="0" y="0"/>
+                      <a:ext cx="9373908" cy="2715004"/>
+                    </a:xfrm>
+                    <a:prstGeom prst="rect">
+                      <a:avLst/>
+                    </a:prstGeom>
+                  </pic:spPr>
+                </pic:pic>
+              </a:graphicData>
+            </a:graphic>
+          </wp:inline>
+        </w:drawing>
+      </w:r>
+    </w:p>
+    <w:p/>
+    <w:p>
+      <w:r>
+        <w:drawing>
+          <wp:inline distT="0" distB="0" distL="0" distR="0" wp14:anchorId="27A98C86" wp14:editId="2E80BE62">
+            <wp:extent cx="5087060" cy="1495634"/>
+            <wp:effectExtent l="0" t="0" r="0" b="9525"/>
+            <wp:docPr id="155" name="Imagem 155"/>
+            <wp:cNvGraphicFramePr>
+              <a:graphicFrameLocks xmlns:a="http://schemas.openxmlformats.org/drawingml/2006/main" noChangeAspect="1"/>
+            </wp:cNvGraphicFramePr>
+            <a:graphic xmlns:a="http://schemas.openxmlformats.org/drawingml/2006/main">
+              <a:graphicData uri="http://schemas.openxmlformats.org/drawingml/2006/picture">
+                <pic:pic xmlns:pic="http://schemas.openxmlformats.org/drawingml/2006/picture">
+                  <pic:nvPicPr>
+                    <pic:cNvPr id="1" name=""/>
+                    <pic:cNvPicPr/>
+                  </pic:nvPicPr>
+                  <pic:blipFill>
+                    <a:blip r:embed="rId121"/>
+                    <a:stretch>
+                      <a:fillRect/>
+                    </a:stretch>
+                  </pic:blipFill>
+                  <pic:spPr>
+                    <a:xfrm>
+                      <a:off x="0" y="0"/>
+                      <a:ext cx="5087060" cy="1495634"/>
+                    </a:xfrm>
+                    <a:prstGeom prst="rect">
+                      <a:avLst/>
+                    </a:prstGeom>
+                  </pic:spPr>
+                </pic:pic>
+              </a:graphicData>
+            </a:graphic>
+          </wp:inline>
+        </w:drawing>
+      </w:r>
+    </w:p>
+    <w:p/>
+    <w:p>
+      <w:r>
+        <w:t xml:space="preserve">70 </w:t>
+      </w:r>
+      <w:r>
+        <w:t>–</w:t>
+      </w:r>
+      <w:r>
+        <w:t xml:space="preserve"> </w:t>
+      </w:r>
+      <w:r>
+        <w:t xml:space="preserve">Notamos que  em nosso caso o </w:t>
+      </w:r>
+      <w:proofErr w:type="spellStart"/>
+      <w:r>
+        <w:t>form</w:t>
+      </w:r>
+      <w:proofErr w:type="spellEnd"/>
+      <w:r>
+        <w:t xml:space="preserve"> inputs estava configurando como display: </w:t>
+      </w:r>
+      <w:proofErr w:type="spellStart"/>
+      <w:r>
+        <w:t>block</w:t>
+      </w:r>
+      <w:proofErr w:type="spellEnd"/>
+      <w:r>
+        <w:t xml:space="preserve"> impedido que as</w:t>
+      </w:r>
+      <w:r>
+        <w:t xml:space="preserve"> </w:t>
+      </w:r>
+      <w:proofErr w:type="spellStart"/>
+      <w:r>
+        <w:t>label</w:t>
+      </w:r>
+      <w:proofErr w:type="spellEnd"/>
+      <w:r>
+        <w:t xml:space="preserve"> e os inputs de ficarem um ao lado do outro. Para resolver essa situação mudamos onde antigamente era </w:t>
+      </w:r>
+      <w:proofErr w:type="spellStart"/>
+      <w:r>
+        <w:t>form</w:t>
+      </w:r>
+      <w:proofErr w:type="spellEnd"/>
+      <w:r>
+        <w:t xml:space="preserve"> inputs trocamos para uma </w:t>
+      </w:r>
+      <w:proofErr w:type="spellStart"/>
+      <w:r>
+        <w:t>class</w:t>
+      </w:r>
+      <w:proofErr w:type="spellEnd"/>
+      <w:r>
+        <w:t xml:space="preserve"> </w:t>
+      </w:r>
+      <w:r>
+        <w:t>inputs-padrão e acionamos nos inputs os quais queríamos que ficassem um a baixo do outro.</w:t>
+      </w:r>
+    </w:p>
+    <w:p>
+      <w:r>
+        <w:drawing>
+          <wp:inline distT="0" distB="0" distL="0" distR="0" wp14:anchorId="66FB775E" wp14:editId="581F3E8B">
+            <wp:extent cx="2896004" cy="1695687"/>
+            <wp:effectExtent l="0" t="0" r="0" b="0"/>
+            <wp:docPr id="156" name="Imagem 156"/>
+            <wp:cNvGraphicFramePr>
+              <a:graphicFrameLocks xmlns:a="http://schemas.openxmlformats.org/drawingml/2006/main" noChangeAspect="1"/>
+            </wp:cNvGraphicFramePr>
+            <a:graphic xmlns:a="http://schemas.openxmlformats.org/drawingml/2006/main">
+              <a:graphicData uri="http://schemas.openxmlformats.org/drawingml/2006/picture">
+                <pic:pic xmlns:pic="http://schemas.openxmlformats.org/drawingml/2006/picture">
+                  <pic:nvPicPr>
+                    <pic:cNvPr id="1" name=""/>
+                    <pic:cNvPicPr/>
+                  </pic:nvPicPr>
+                  <pic:blipFill>
+                    <a:blip r:embed="rId122"/>
+                    <a:stretch>
+                      <a:fillRect/>
+                    </a:stretch>
+                  </pic:blipFill>
+                  <pic:spPr>
+                    <a:xfrm>
+                      <a:off x="0" y="0"/>
+                      <a:ext cx="2896004" cy="1695687"/>
+                    </a:xfrm>
+                    <a:prstGeom prst="rect">
+                      <a:avLst/>
+                    </a:prstGeom>
+                  </pic:spPr>
+                </pic:pic>
+              </a:graphicData>
+            </a:graphic>
+          </wp:inline>
+        </w:drawing>
+      </w:r>
       <w:bookmarkStart w:id="0" w:name="_GoBack"/>
+      <w:r>
+        <w:drawing>
+          <wp:inline distT="0" distB="0" distL="0" distR="0" wp14:anchorId="720AF03F" wp14:editId="63B5FC03">
+            <wp:extent cx="4607240" cy="1661757"/>
+            <wp:effectExtent l="0" t="0" r="3175" b="0"/>
+            <wp:docPr id="157" name="Imagem 157"/>
+            <wp:cNvGraphicFramePr>
+              <a:graphicFrameLocks xmlns:a="http://schemas.openxmlformats.org/drawingml/2006/main" noChangeAspect="1"/>
+            </wp:cNvGraphicFramePr>
+            <a:graphic xmlns:a="http://schemas.openxmlformats.org/drawingml/2006/main">
+              <a:graphicData uri="http://schemas.openxmlformats.org/drawingml/2006/picture">
+                <pic:pic xmlns:pic="http://schemas.openxmlformats.org/drawingml/2006/picture">
+                  <pic:nvPicPr>
+                    <pic:cNvPr id="1" name=""/>
+                    <pic:cNvPicPr/>
+                  </pic:nvPicPr>
+                  <pic:blipFill>
+                    <a:blip r:embed="rId123"/>
+                    <a:stretch>
+                      <a:fillRect/>
+                    </a:stretch>
+                  </pic:blipFill>
+                  <pic:spPr>
+                    <a:xfrm>
+                      <a:off x="0" y="0"/>
+                      <a:ext cx="4633272" cy="1671146"/>
+                    </a:xfrm>
+                    <a:prstGeom prst="rect">
+                      <a:avLst/>
+                    </a:prstGeom>
+                  </pic:spPr>
+                </pic:pic>
+              </a:graphicData>
+            </a:graphic>
+          </wp:inline>
+        </w:drawing>
+      </w:r>
       <w:bookmarkEnd w:id="0"/>
     </w:p>
-    <w:p/>
     <w:p/>
     <w:sectPr>
       <w:pgSz w:w="11906" w:h="16838"/>
@@ -9176,7 +11055,7 @@
 </file>
 
 <file path=customXml/itemProps4.xml><?xml version="1.0" encoding="utf-8"?>
-<ds:datastoreItem xmlns:ds="http://schemas.openxmlformats.org/officeDocument/2006/customXml" ds:itemID="{3DE1BCDE-E2C5-4816-B9BA-762E800564D3}">
+<ds:datastoreItem xmlns:ds="http://schemas.openxmlformats.org/officeDocument/2006/customXml" ds:itemID="{16363CEE-7148-40C2-9B43-2D5E818E05E2}">
   <ds:schemaRefs>
     <ds:schemaRef ds:uri="http://schemas.openxmlformats.org/officeDocument/2006/bibliography"/>
   </ds:schemaRefs>

</xml_diff>

<commit_message>
atualização da aula dia 22/09/2026
</commit_message>
<xml_diff>
--- a/apostila/Projeto Space for me3.docx
+++ b/apostila/Projeto Space for me3.docx
@@ -9713,6 +9713,9 @@
     </w:p>
     <w:p>
       <w:r>
+        <w:rPr>
+          <w:noProof/>
+        </w:rPr>
         <w:drawing>
           <wp:inline distT="0" distB="0" distL="0" distR="0" wp14:anchorId="7C2669AF" wp14:editId="68B160F3">
             <wp:extent cx="10640910" cy="695422"/>
@@ -9822,6 +9825,9 @@
         </mc:AlternateContent>
       </w:r>
       <w:r>
+        <w:rPr>
+          <w:noProof/>
+        </w:rPr>
         <w:drawing>
           <wp:inline distT="0" distB="0" distL="0" distR="0" wp14:anchorId="1CA6FBD5" wp14:editId="4D17E109">
             <wp:extent cx="2638793" cy="1190791"/>
@@ -9859,6 +9865,9 @@
         </w:drawing>
       </w:r>
       <w:r>
+        <w:rPr>
+          <w:noProof/>
+        </w:rPr>
         <w:drawing>
           <wp:inline distT="0" distB="0" distL="0" distR="0" wp14:anchorId="5705FAB8" wp14:editId="1B704AF9">
             <wp:extent cx="5163271" cy="2105319"/>
@@ -9946,6 +9955,9 @@
     </w:p>
     <w:p>
       <w:r>
+        <w:rPr>
+          <w:noProof/>
+        </w:rPr>
         <w:drawing>
           <wp:inline distT="0" distB="0" distL="0" distR="0" wp14:anchorId="1014E4B7" wp14:editId="4ECCE646">
             <wp:extent cx="4433844" cy="2228992"/>
@@ -10172,6 +10184,7 @@
       <w:r>
         <w:rPr>
           <w:i/>
+          <w:noProof/>
         </w:rPr>
         <w:drawing>
           <wp:inline distT="0" distB="0" distL="0" distR="0" wp14:anchorId="350E4EC9" wp14:editId="00F14054">
@@ -10335,6 +10348,7 @@
       <w:r>
         <w:rPr>
           <w:i/>
+          <w:noProof/>
         </w:rPr>
         <w:drawing>
           <wp:inline distT="0" distB="0" distL="0" distR="0" wp14:anchorId="1BF9355D" wp14:editId="4280E2C3">
@@ -10416,6 +10430,7 @@
       <w:r>
         <w:rPr>
           <w:i/>
+          <w:noProof/>
         </w:rPr>
         <w:drawing>
           <wp:inline distT="0" distB="0" distL="0" distR="0" wp14:anchorId="172F5BC4" wp14:editId="7A44D1FE">
@@ -10463,6 +10478,7 @@
       <w:r>
         <w:rPr>
           <w:i/>
+          <w:noProof/>
         </w:rPr>
         <w:drawing>
           <wp:inline distT="0" distB="0" distL="0" distR="0" wp14:anchorId="06B19EF4" wp14:editId="672BA17F">
@@ -10625,6 +10641,7 @@
       <w:r>
         <w:rPr>
           <w:i/>
+          <w:noProof/>
         </w:rPr>
         <w:drawing>
           <wp:inline distT="0" distB="0" distL="0" distR="0" wp14:anchorId="629E82EA" wp14:editId="76113255">
@@ -10671,6 +10688,7 @@
       <w:r>
         <w:rPr>
           <w:i/>
+          <w:noProof/>
         </w:rPr>
         <w:drawing>
           <wp:inline distT="0" distB="0" distL="0" distR="0" wp14:anchorId="3C057624" wp14:editId="38921A98">
@@ -10803,6 +10821,7 @@
       <w:r>
         <w:rPr>
           <w:i/>
+          <w:noProof/>
         </w:rPr>
         <w:drawing>
           <wp:inline distT="0" distB="0" distL="0" distR="0" wp14:anchorId="7DEC2FA5" wp14:editId="68ECBAC9">
@@ -10850,6 +10869,7 @@
       <w:r>
         <w:rPr>
           <w:i/>
+          <w:noProof/>
         </w:rPr>
         <w:drawing>
           <wp:inline distT="0" distB="0" distL="0" distR="0" wp14:anchorId="32134926" wp14:editId="28E9F6F2">
@@ -10966,8 +10986,6 @@
         </w:rPr>
         <w:t>Mudamos a cor da letra para branco</w:t>
       </w:r>
-      <w:bookmarkStart w:id="0" w:name="_GoBack"/>
-      <w:bookmarkEnd w:id="0"/>
     </w:p>
     <w:p>
       <w:pPr>
@@ -11046,10 +11064,25 @@
         </w:rPr>
         <w:br/>
       </w:r>
-      <w:r>
+    </w:p>
+    <w:p>
+      <w:pPr>
+        <w:pStyle w:val="PargrafodaLista"/>
+        <w:numPr>
+          <w:ilvl w:val="0"/>
+          <w:numId w:val="3"/>
+        </w:numPr>
+        <w:rPr>
+          <w:i/>
+        </w:rPr>
+      </w:pPr>
+      <w:r>
+        <w:rPr>
+          <w:noProof/>
+        </w:rPr>
         <w:drawing>
-          <wp:inline distT="0" distB="0" distL="0" distR="0" wp14:anchorId="2884AAE2" wp14:editId="049C6963">
-            <wp:extent cx="4058216" cy="3048425"/>
+          <wp:inline distT="0" distB="0" distL="0" distR="0" wp14:anchorId="2884AAE2" wp14:editId="3AB525CF">
+            <wp:extent cx="4057650" cy="2838734"/>
             <wp:effectExtent l="0" t="0" r="0" b="0"/>
             <wp:docPr id="170" name="Imagem 170"/>
             <wp:cNvGraphicFramePr>
@@ -11071,7 +11104,7 @@
                   <pic:spPr>
                     <a:xfrm>
                       <a:off x="0" y="0"/>
-                      <a:ext cx="4058216" cy="3048425"/>
+                      <a:ext cx="4060964" cy="2841052"/>
                     </a:xfrm>
                     <a:prstGeom prst="rect">
                       <a:avLst/>
@@ -11090,6 +11123,112 @@
           <w:i/>
         </w:rPr>
       </w:pPr>
+      <w:r>
+        <w:rPr>
+          <w:i/>
+        </w:rPr>
+        <w:t xml:space="preserve">79 </w:t>
+      </w:r>
+      <w:r>
+        <w:rPr>
+          <w:i/>
+        </w:rPr>
+        <w:t>–</w:t>
+      </w:r>
+      <w:r>
+        <w:rPr>
+          <w:i/>
+        </w:rPr>
+        <w:t xml:space="preserve"> </w:t>
+      </w:r>
+      <w:r>
+        <w:rPr>
+          <w:i/>
+        </w:rPr>
+        <w:t xml:space="preserve">Trabalhando com </w:t>
+      </w:r>
+      <w:proofErr w:type="spellStart"/>
+      <w:r>
+        <w:rPr>
+          <w:i/>
+        </w:rPr>
+        <w:t>hover</w:t>
+      </w:r>
+      <w:proofErr w:type="spellEnd"/>
+      <w:r>
+        <w:rPr>
+          <w:i/>
+        </w:rPr>
+        <w:t xml:space="preserve"> no botão enviar </w:t>
+      </w:r>
+      <w:r>
+        <w:rPr>
+          <w:i/>
+        </w:rPr>
+        <w:t>mudamos a cor de fundo ao passar o mouse utilizando background-color</w:t>
+      </w:r>
+      <w:r>
+        <w:rPr>
+          <w:i/>
+        </w:rPr>
+        <w:t xml:space="preserve">, e também criamos uma animação com </w:t>
+      </w:r>
+      <w:proofErr w:type="spellStart"/>
+      <w:r>
+        <w:rPr>
+          <w:i/>
+        </w:rPr>
+        <w:t>transform</w:t>
+      </w:r>
+      <w:proofErr w:type="spellEnd"/>
+      <w:r>
+        <w:rPr>
+          <w:i/>
+        </w:rPr>
+        <w:t xml:space="preserve"> </w:t>
+      </w:r>
+      <w:proofErr w:type="spellStart"/>
+      <w:r>
+        <w:rPr>
+          <w:i/>
+        </w:rPr>
+        <w:t>rotate</w:t>
+      </w:r>
+      <w:proofErr w:type="spellEnd"/>
+      <w:r>
+        <w:rPr>
+          <w:i/>
+        </w:rPr>
+        <w:t xml:space="preserve"> e </w:t>
+      </w:r>
+      <w:proofErr w:type="spellStart"/>
+      <w:r>
+        <w:rPr>
+          <w:i/>
+        </w:rPr>
+        <w:t>scale</w:t>
+      </w:r>
+      <w:proofErr w:type="spellEnd"/>
+      <w:r>
+        <w:rPr>
+          <w:i/>
+        </w:rPr>
+        <w:t xml:space="preserve"> que ao passar o mouse ele realiza uma rotação e o </w:t>
+      </w:r>
+      <w:proofErr w:type="spellStart"/>
+      <w:r>
+        <w:rPr>
+          <w:i/>
+        </w:rPr>
+        <w:t>scale</w:t>
+      </w:r>
+      <w:proofErr w:type="spellEnd"/>
+      <w:r>
+        <w:rPr>
+          <w:i/>
+        </w:rPr>
+        <w:t xml:space="preserve"> aumenta o tamanho do botão.</w:t>
+      </w:r>
     </w:p>
     <w:p>
       <w:pPr>
@@ -11097,6 +11236,478 @@
           <w:i/>
         </w:rPr>
       </w:pPr>
+      <w:proofErr w:type="spellStart"/>
+      <w:r>
+        <w:rPr>
+          <w:i/>
+        </w:rPr>
+        <w:t>Obs</w:t>
+      </w:r>
+      <w:proofErr w:type="spellEnd"/>
+      <w:r>
+        <w:rPr>
+          <w:i/>
+        </w:rPr>
+        <w:t xml:space="preserve">(não podemos deixar de esquece de colocar uma </w:t>
+      </w:r>
+      <w:proofErr w:type="spellStart"/>
+      <w:r>
+        <w:rPr>
+          <w:i/>
+        </w:rPr>
+        <w:t>transition</w:t>
+      </w:r>
+      <w:proofErr w:type="spellEnd"/>
+      <w:r>
+        <w:rPr>
+          <w:i/>
+        </w:rPr>
+        <w:t xml:space="preserve"> na </w:t>
+      </w:r>
+      <w:proofErr w:type="spellStart"/>
+      <w:r>
+        <w:rPr>
+          <w:i/>
+        </w:rPr>
+        <w:t>class</w:t>
+      </w:r>
+      <w:proofErr w:type="spellEnd"/>
+      <w:r>
+        <w:rPr>
+          <w:i/>
+        </w:rPr>
+        <w:t xml:space="preserve"> enviar </w:t>
+      </w:r>
+      <w:r>
+        <w:rPr>
+          <w:i/>
+        </w:rPr>
+        <w:t>para controlar o tempo da animação)</w:t>
+      </w:r>
+    </w:p>
+    <w:p>
+      <w:pPr>
+        <w:rPr>
+          <w:i/>
+        </w:rPr>
+      </w:pPr>
+      <w:r>
+        <w:rPr>
+          <w:i/>
+        </w:rPr>
+        <w:drawing>
+          <wp:inline distT="0" distB="0" distL="0" distR="0" wp14:anchorId="6812706C" wp14:editId="266FCCC8">
+            <wp:extent cx="3734321" cy="3839111"/>
+            <wp:effectExtent l="0" t="0" r="0" b="9525"/>
+            <wp:docPr id="171" name="Imagem 171"/>
+            <wp:cNvGraphicFramePr>
+              <a:graphicFrameLocks xmlns:a="http://schemas.openxmlformats.org/drawingml/2006/main" noChangeAspect="1"/>
+            </wp:cNvGraphicFramePr>
+            <a:graphic xmlns:a="http://schemas.openxmlformats.org/drawingml/2006/main">
+              <a:graphicData uri="http://schemas.openxmlformats.org/drawingml/2006/picture">
+                <pic:pic xmlns:pic="http://schemas.openxmlformats.org/drawingml/2006/picture">
+                  <pic:nvPicPr>
+                    <pic:cNvPr id="1" name=""/>
+                    <pic:cNvPicPr/>
+                  </pic:nvPicPr>
+                  <pic:blipFill>
+                    <a:blip r:embed="rId137"/>
+                    <a:stretch>
+                      <a:fillRect/>
+                    </a:stretch>
+                  </pic:blipFill>
+                  <pic:spPr>
+                    <a:xfrm>
+                      <a:off x="0" y="0"/>
+                      <a:ext cx="3734321" cy="3839111"/>
+                    </a:xfrm>
+                    <a:prstGeom prst="rect">
+                      <a:avLst/>
+                    </a:prstGeom>
+                  </pic:spPr>
+                </pic:pic>
+              </a:graphicData>
+            </a:graphic>
+          </wp:inline>
+        </w:drawing>
+      </w:r>
+    </w:p>
+    <w:p>
+      <w:pPr>
+        <w:rPr>
+          <w:i/>
+        </w:rPr>
+      </w:pPr>
+    </w:p>
+    <w:p>
+      <w:pPr>
+        <w:rPr>
+          <w:i/>
+        </w:rPr>
+      </w:pPr>
+      <w:r>
+        <w:rPr>
+          <w:i/>
+        </w:rPr>
+        <w:t xml:space="preserve">80 </w:t>
+      </w:r>
+      <w:r>
+        <w:rPr>
+          <w:i/>
+        </w:rPr>
+        <w:t>–</w:t>
+      </w:r>
+      <w:r>
+        <w:rPr>
+          <w:i/>
+        </w:rPr>
+        <w:t xml:space="preserve"> </w:t>
+      </w:r>
+      <w:r>
+        <w:rPr>
+          <w:i/>
+        </w:rPr>
+        <w:t xml:space="preserve">Na página de contato adicionamos uma tabela onde iniciamos utilizando as </w:t>
+      </w:r>
+      <w:proofErr w:type="spellStart"/>
+      <w:r>
+        <w:rPr>
+          <w:i/>
+        </w:rPr>
+        <w:t>tag</w:t>
+      </w:r>
+      <w:r>
+        <w:rPr>
+          <w:i/>
+        </w:rPr>
+        <w:t>s</w:t>
+      </w:r>
+      <w:proofErr w:type="spellEnd"/>
+      <w:r>
+        <w:rPr>
+          <w:i/>
+        </w:rPr>
+        <w:t xml:space="preserve"> TR -&gt; linha da tabela e as </w:t>
+      </w:r>
+      <w:proofErr w:type="spellStart"/>
+      <w:r>
+        <w:rPr>
+          <w:i/>
+        </w:rPr>
+        <w:t>tags</w:t>
+      </w:r>
+      <w:proofErr w:type="spellEnd"/>
+      <w:r>
+        <w:rPr>
+          <w:i/>
+        </w:rPr>
+        <w:t xml:space="preserve"> TD </w:t>
+      </w:r>
+      <w:r>
+        <w:rPr>
+          <w:i/>
+        </w:rPr>
+        <w:t>-&gt; dados da tabela conforme código abaixo:</w:t>
+      </w:r>
+    </w:p>
+    <w:p>
+      <w:pPr>
+        <w:rPr>
+          <w:i/>
+        </w:rPr>
+      </w:pPr>
+      <w:r>
+        <w:rPr>
+          <w:i/>
+        </w:rPr>
+        <w:drawing>
+          <wp:inline distT="0" distB="0" distL="0" distR="0" wp14:anchorId="323236FF" wp14:editId="4B74B1FF">
+            <wp:extent cx="2381582" cy="3543795"/>
+            <wp:effectExtent l="0" t="0" r="0" b="0"/>
+            <wp:docPr id="172" name="Imagem 172"/>
+            <wp:cNvGraphicFramePr>
+              <a:graphicFrameLocks xmlns:a="http://schemas.openxmlformats.org/drawingml/2006/main" noChangeAspect="1"/>
+            </wp:cNvGraphicFramePr>
+            <a:graphic xmlns:a="http://schemas.openxmlformats.org/drawingml/2006/main">
+              <a:graphicData uri="http://schemas.openxmlformats.org/drawingml/2006/picture">
+                <pic:pic xmlns:pic="http://schemas.openxmlformats.org/drawingml/2006/picture">
+                  <pic:nvPicPr>
+                    <pic:cNvPr id="1" name=""/>
+                    <pic:cNvPicPr/>
+                  </pic:nvPicPr>
+                  <pic:blipFill>
+                    <a:blip r:embed="rId138"/>
+                    <a:stretch>
+                      <a:fillRect/>
+                    </a:stretch>
+                  </pic:blipFill>
+                  <pic:spPr>
+                    <a:xfrm>
+                      <a:off x="0" y="0"/>
+                      <a:ext cx="2381582" cy="3543795"/>
+                    </a:xfrm>
+                    <a:prstGeom prst="rect">
+                      <a:avLst/>
+                    </a:prstGeom>
+                  </pic:spPr>
+                </pic:pic>
+              </a:graphicData>
+            </a:graphic>
+          </wp:inline>
+        </w:drawing>
+      </w:r>
+    </w:p>
+    <w:p>
+      <w:pPr>
+        <w:rPr>
+          <w:i/>
+        </w:rPr>
+      </w:pPr>
+      <w:r>
+        <w:rPr>
+          <w:i/>
+        </w:rPr>
+        <w:t xml:space="preserve">81 – Na tabela adicionamos o </w:t>
+      </w:r>
+      <w:proofErr w:type="spellStart"/>
+      <w:r>
+        <w:rPr>
+          <w:i/>
+        </w:rPr>
+        <w:t>thead</w:t>
+      </w:r>
+      <w:proofErr w:type="spellEnd"/>
+      <w:r>
+        <w:rPr>
+          <w:i/>
+        </w:rPr>
+        <w:t xml:space="preserve"> </w:t>
+      </w:r>
+      <w:r>
+        <w:rPr>
+          <w:i/>
+        </w:rPr>
+        <w:t xml:space="preserve">-&gt; o cabeçalho da tabela e </w:t>
+      </w:r>
+      <w:proofErr w:type="spellStart"/>
+      <w:r>
+        <w:rPr>
+          <w:i/>
+        </w:rPr>
+        <w:t>th</w:t>
+      </w:r>
+      <w:proofErr w:type="spellEnd"/>
+      <w:r>
+        <w:rPr>
+          <w:i/>
+        </w:rPr>
+        <w:t xml:space="preserve"> -&gt; dados do cabeçalho e </w:t>
+      </w:r>
+      <w:proofErr w:type="spellStart"/>
+      <w:r>
+        <w:rPr>
+          <w:i/>
+        </w:rPr>
+        <w:t>tbody</w:t>
+      </w:r>
+      <w:proofErr w:type="spellEnd"/>
+      <w:r>
+        <w:rPr>
+          <w:i/>
+        </w:rPr>
+        <w:t>-&gt;</w:t>
+      </w:r>
+      <w:r>
+        <w:rPr>
+          <w:i/>
+        </w:rPr>
+        <w:t xml:space="preserve"> o corpo da tabela</w:t>
+      </w:r>
+      <w:r>
+        <w:rPr>
+          <w:i/>
+        </w:rPr>
+        <w:t>.</w:t>
+      </w:r>
+    </w:p>
+    <w:p>
+      <w:pPr>
+        <w:rPr>
+          <w:i/>
+        </w:rPr>
+      </w:pPr>
+      <w:r>
+        <w:rPr>
+          <w:i/>
+        </w:rPr>
+        <w:drawing>
+          <wp:inline distT="0" distB="0" distL="0" distR="0" wp14:anchorId="65DB5935" wp14:editId="2AFA403D">
+            <wp:extent cx="2819794" cy="4267796"/>
+            <wp:effectExtent l="0" t="0" r="0" b="0"/>
+            <wp:docPr id="173" name="Imagem 173"/>
+            <wp:cNvGraphicFramePr>
+              <a:graphicFrameLocks xmlns:a="http://schemas.openxmlformats.org/drawingml/2006/main" noChangeAspect="1"/>
+            </wp:cNvGraphicFramePr>
+            <a:graphic xmlns:a="http://schemas.openxmlformats.org/drawingml/2006/main">
+              <a:graphicData uri="http://schemas.openxmlformats.org/drawingml/2006/picture">
+                <pic:pic xmlns:pic="http://schemas.openxmlformats.org/drawingml/2006/picture">
+                  <pic:nvPicPr>
+                    <pic:cNvPr id="1" name=""/>
+                    <pic:cNvPicPr/>
+                  </pic:nvPicPr>
+                  <pic:blipFill>
+                    <a:blip r:embed="rId139"/>
+                    <a:stretch>
+                      <a:fillRect/>
+                    </a:stretch>
+                  </pic:blipFill>
+                  <pic:spPr>
+                    <a:xfrm>
+                      <a:off x="0" y="0"/>
+                      <a:ext cx="2819794" cy="4267796"/>
+                    </a:xfrm>
+                    <a:prstGeom prst="rect">
+                      <a:avLst/>
+                    </a:prstGeom>
+                  </pic:spPr>
+                </pic:pic>
+              </a:graphicData>
+            </a:graphic>
+          </wp:inline>
+        </w:drawing>
+      </w:r>
+    </w:p>
+    <w:p>
+      <w:pPr>
+        <w:rPr>
+          <w:i/>
+        </w:rPr>
+      </w:pPr>
+    </w:p>
+    <w:p>
+      <w:pPr>
+        <w:rPr>
+          <w:i/>
+        </w:rPr>
+      </w:pPr>
+      <w:r>
+        <w:rPr>
+          <w:i/>
+        </w:rPr>
+        <w:t xml:space="preserve">82 </w:t>
+      </w:r>
+      <w:r>
+        <w:rPr>
+          <w:i/>
+        </w:rPr>
+        <w:t>–</w:t>
+      </w:r>
+      <w:r>
+        <w:rPr>
+          <w:i/>
+        </w:rPr>
+        <w:t xml:space="preserve"> </w:t>
+      </w:r>
+      <w:r>
+        <w:rPr>
+          <w:i/>
+        </w:rPr>
+        <w:t>Adicionei uma cor de fundo no cabeçalho da tabela</w:t>
+      </w:r>
+      <w:r>
+        <w:rPr>
+          <w:i/>
+        </w:rPr>
+        <w:t>, mudamos a cor da letra para branco e encorpamos o texto.</w:t>
+      </w:r>
+    </w:p>
+    <w:p>
+      <w:pPr>
+        <w:rPr>
+          <w:i/>
+        </w:rPr>
+      </w:pPr>
+      <w:r>
+        <w:rPr>
+          <w:i/>
+        </w:rPr>
+        <w:t xml:space="preserve">No </w:t>
+      </w:r>
+      <w:proofErr w:type="spellStart"/>
+      <w:r>
+        <w:rPr>
+          <w:i/>
+        </w:rPr>
+        <w:t>td,th</w:t>
+      </w:r>
+      <w:proofErr w:type="spellEnd"/>
+      <w:r>
+        <w:rPr>
+          <w:i/>
+        </w:rPr>
+        <w:t xml:space="preserve"> -&gt; </w:t>
+      </w:r>
+      <w:r>
+        <w:rPr>
+          <w:i/>
+        </w:rPr>
+        <w:t>inserimos uma borda solida e aumentamos o espaço interno tanto para cima como para baixo e do lado direito e esquerdo.</w:t>
+      </w:r>
+      <w:bookmarkStart w:id="0" w:name="_GoBack"/>
+      <w:bookmarkEnd w:id="0"/>
+    </w:p>
+    <w:p>
+      <w:pPr>
+        <w:rPr>
+          <w:i/>
+        </w:rPr>
+      </w:pPr>
+      <w:r>
+        <w:rPr>
+          <w:i/>
+        </w:rPr>
+        <w:drawing>
+          <wp:inline distT="0" distB="0" distL="0" distR="0" wp14:anchorId="5D225D15" wp14:editId="0A59C39A">
+            <wp:extent cx="4810796" cy="3515216"/>
+            <wp:effectExtent l="0" t="0" r="0" b="9525"/>
+            <wp:docPr id="174" name="Imagem 174"/>
+            <wp:cNvGraphicFramePr>
+              <a:graphicFrameLocks xmlns:a="http://schemas.openxmlformats.org/drawingml/2006/main" noChangeAspect="1"/>
+            </wp:cNvGraphicFramePr>
+            <a:graphic xmlns:a="http://schemas.openxmlformats.org/drawingml/2006/main">
+              <a:graphicData uri="http://schemas.openxmlformats.org/drawingml/2006/picture">
+                <pic:pic xmlns:pic="http://schemas.openxmlformats.org/drawingml/2006/picture">
+                  <pic:nvPicPr>
+                    <pic:cNvPr id="1" name=""/>
+                    <pic:cNvPicPr/>
+                  </pic:nvPicPr>
+                  <pic:blipFill>
+                    <a:blip r:embed="rId140"/>
+                    <a:stretch>
+                      <a:fillRect/>
+                    </a:stretch>
+                  </pic:blipFill>
+                  <pic:spPr>
+                    <a:xfrm>
+                      <a:off x="0" y="0"/>
+                      <a:ext cx="4810796" cy="3515216"/>
+                    </a:xfrm>
+                    <a:prstGeom prst="rect">
+                      <a:avLst/>
+                    </a:prstGeom>
+                  </pic:spPr>
+                </pic:pic>
+              </a:graphicData>
+            </a:graphic>
+          </wp:inline>
+        </w:drawing>
+      </w:r>
+      <w:r>
+        <w:rPr>
+          <w:i/>
+        </w:rPr>
+        <w:t xml:space="preserve"> </w:t>
+      </w:r>
     </w:p>
     <w:sectPr>
       <w:pgSz w:w="11906" w:h="16838"/>
@@ -12516,7 +13127,7 @@
 </file>
 
 <file path=customXml/itemProps4.xml><?xml version="1.0" encoding="utf-8"?>
-<ds:datastoreItem xmlns:ds="http://schemas.openxmlformats.org/officeDocument/2006/customXml" ds:itemID="{28C10093-4848-4221-90FB-A7A2A1DD870D}">
+<ds:datastoreItem xmlns:ds="http://schemas.openxmlformats.org/officeDocument/2006/customXml" ds:itemID="{BA4A678F-6EE6-4CDB-9241-A7D3189F38F5}">
   <ds:schemaRefs>
     <ds:schemaRef ds:uri="http://schemas.openxmlformats.org/officeDocument/2006/bibliography"/>
   </ds:schemaRefs>

</xml_diff>